<commit_message>
Jacks addition to LoFi UI doc
Jack new contributions to LoFi UI design document
</commit_message>
<xml_diff>
--- a/CAB302-Assessment1-LoFi.docx
+++ b/CAB302-Assessment1-LoFi.docx
@@ -27,12 +27,6 @@
         <w:gridCol w:w="6120"/>
       </w:tblGrid>
       <w:tr>
-        <w:tblPrEx>
-          <w:tblCellMar>
-            <w:top w:w="0" w:type="dxa"/>
-            <w:bottom w:w="0" w:type="dxa"/>
-          </w:tblCellMar>
-        </w:tblPrEx>
         <w:trPr>
           <w:cantSplit/>
           <w:trHeight w:hRule="exact" w:val="7920"/>
@@ -49,6 +43,788 @@
                 <w:szCs w:val="18"/>
               </w:rPr>
             </w:pPr>
+            <w:r>
+              <w:rPr>
+                <w:b/>
+                <w:bCs/>
+                <w:sz w:val="18"/>
+                <w:szCs w:val="18"/>
+              </w:rPr>
+              <w:t>User Story 1</w:t>
+            </w:r>
+            <w:r>
+              <w:rPr>
+                <w:sz w:val="18"/>
+                <w:szCs w:val="18"/>
+              </w:rPr>
+              <w:t xml:space="preserve"> – As a police officer, </w:t>
+            </w:r>
+            <w:r>
+              <w:rPr>
+                <w:sz w:val="18"/>
+                <w:szCs w:val="18"/>
+              </w:rPr>
+              <w:t>I want the app to generate an AI summary of criminal activity in a selected area so that I can quickly understand local crime patterns without reading every individual report.</w:t>
+            </w:r>
+          </w:p>
+          <w:p>
+            <w:pPr>
+              <w:ind w:left="144" w:right="144"/>
+              <w:rPr>
+                <w:b/>
+                <w:bCs/>
+                <w:sz w:val="18"/>
+                <w:szCs w:val="18"/>
+              </w:rPr>
+            </w:pPr>
+            <w:r>
+              <w:rPr>
+                <w:b/>
+                <w:bCs/>
+                <w:sz w:val="18"/>
+                <w:szCs w:val="18"/>
+              </w:rPr>
+              <w:t xml:space="preserve">Author: </w:t>
+            </w:r>
+            <w:r>
+              <w:rPr>
+                <w:sz w:val="18"/>
+                <w:szCs w:val="18"/>
+              </w:rPr>
+              <w:t>Jack</w:t>
+            </w:r>
+          </w:p>
+          <w:p>
+            <w:pPr>
+              <w:ind w:left="144" w:right="144"/>
+              <w:rPr>
+                <w:b/>
+                <w:bCs/>
+                <w:sz w:val="18"/>
+                <w:szCs w:val="18"/>
+              </w:rPr>
+            </w:pPr>
+          </w:p>
+          <w:p>
+            <w:pPr>
+              <w:ind w:left="144" w:right="144"/>
+              <w:rPr>
+                <w:b/>
+                <w:bCs/>
+                <w:sz w:val="18"/>
+                <w:szCs w:val="18"/>
+              </w:rPr>
+            </w:pPr>
+            <w:r>
+              <w:rPr>
+                <w:b/>
+                <w:bCs/>
+                <w:noProof/>
+                <w:sz w:val="18"/>
+                <w:szCs w:val="18"/>
+              </w:rPr>
+              <mc:AlternateContent>
+                <mc:Choice Requires="wps">
+                  <w:drawing>
+                    <wp:anchor distT="45720" distB="45720" distL="114300" distR="114300" simplePos="0" relativeHeight="251766784" behindDoc="0" locked="0" layoutInCell="1" allowOverlap="1" wp14:anchorId="0AB8B848" wp14:editId="4FF54ACD">
+                      <wp:simplePos x="0" y="0"/>
+                      <wp:positionH relativeFrom="column">
+                        <wp:posOffset>71120</wp:posOffset>
+                      </wp:positionH>
+                      <wp:positionV relativeFrom="paragraph">
+                        <wp:posOffset>2072005</wp:posOffset>
+                      </wp:positionV>
+                      <wp:extent cx="1037590" cy="1704975"/>
+                      <wp:effectExtent l="0" t="0" r="0" b="0"/>
+                      <wp:wrapNone/>
+                      <wp:docPr id="1551555335" name="Text Box 2"/>
+                      <wp:cNvGraphicFramePr>
+                        <a:graphicFrameLocks xmlns:a="http://schemas.openxmlformats.org/drawingml/2006/main"/>
+                      </wp:cNvGraphicFramePr>
+                      <a:graphic xmlns:a="http://schemas.openxmlformats.org/drawingml/2006/main">
+                        <a:graphicData uri="http://schemas.microsoft.com/office/word/2010/wordprocessingShape">
+                          <wps:wsp>
+                            <wps:cNvSpPr txBox="1">
+                              <a:spLocks noChangeArrowheads="1"/>
+                            </wps:cNvSpPr>
+                            <wps:spPr bwMode="auto">
+                              <a:xfrm>
+                                <a:off x="0" y="0"/>
+                                <a:ext cx="1037590" cy="1704975"/>
+                              </a:xfrm>
+                              <a:prstGeom prst="rect">
+                                <a:avLst/>
+                              </a:prstGeom>
+                              <a:noFill/>
+                              <a:ln w="9525">
+                                <a:noFill/>
+                                <a:miter lim="800000"/>
+                                <a:headEnd/>
+                                <a:tailEnd/>
+                              </a:ln>
+                            </wps:spPr>
+                            <wps:txbx>
+                              <w:txbxContent>
+                                <w:p>
+                                  <w:pPr>
+                                    <w:rPr>
+                                      <w:sz w:val="16"/>
+                                      <w:szCs w:val="16"/>
+                                      <w:lang w:val="en-GB"/>
+                                    </w:rPr>
+                                  </w:pPr>
+                                  <w:r>
+                                    <w:rPr>
+                                      <w:sz w:val="16"/>
+                                      <w:szCs w:val="16"/>
+                                      <w:lang w:val="en-GB"/>
+                                    </w:rPr>
+                                    <w:t xml:space="preserve">AI section summarises the area the officer has selected, allowing for a quick assessment of the area without needing to view every individual report. </w:t>
+                                  </w:r>
+                                </w:p>
+                              </w:txbxContent>
+                            </wps:txbx>
+                            <wps:bodyPr rot="0" vert="horz" wrap="square" lIns="91440" tIns="45720" rIns="91440" bIns="45720" anchor="t" anchorCtr="0">
+                              <a:noAutofit/>
+                            </wps:bodyPr>
+                          </wps:wsp>
+                        </a:graphicData>
+                      </a:graphic>
+                      <wp14:sizeRelH relativeFrom="margin">
+                        <wp14:pctWidth>0</wp14:pctWidth>
+                      </wp14:sizeRelH>
+                      <wp14:sizeRelV relativeFrom="margin">
+                        <wp14:pctHeight>0</wp14:pctHeight>
+                      </wp14:sizeRelV>
+                    </wp:anchor>
+                  </w:drawing>
+                </mc:Choice>
+                <mc:Fallback>
+                  <w:pict>
+                    <v:shapetype w14:anchorId="0AB8B848" id="_x0000_t202" coordsize="21600,21600" o:spt="202" path="m,l,21600r21600,l21600,xe">
+                      <v:stroke joinstyle="miter"/>
+                      <v:path gradientshapeok="t" o:connecttype="rect"/>
+                    </v:shapetype>
+                    <v:shape id="Text Box 2" o:spid="_x0000_s1026" type="#_x0000_t202" style="position:absolute;left:0;text-align:left;margin-left:5.6pt;margin-top:163.15pt;width:81.7pt;height:134.25pt;z-index:251766784;visibility:visible;mso-wrap-style:square;mso-width-percent:0;mso-height-percent:0;mso-wrap-distance-left:9pt;mso-wrap-distance-top:3.6pt;mso-wrap-distance-right:9pt;mso-wrap-distance-bottom:3.6pt;mso-position-horizontal:absolute;mso-position-horizontal-relative:text;mso-position-vertical:absolute;mso-position-vertical-relative:text;mso-width-percent:0;mso-height-percent:0;mso-width-relative:margin;mso-height-relative:margin;v-text-anchor:top" o:gfxdata="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" filled="f" stroked="f">
+                      <v:textbox>
+                        <w:txbxContent>
+                          <w:p>
+                            <w:pPr>
+                              <w:rPr>
+                                <w:sz w:val="16"/>
+                                <w:szCs w:val="16"/>
+                                <w:lang w:val="en-GB"/>
+                              </w:rPr>
+                            </w:pPr>
+                            <w:r>
+                              <w:rPr>
+                                <w:sz w:val="16"/>
+                                <w:szCs w:val="16"/>
+                                <w:lang w:val="en-GB"/>
+                              </w:rPr>
+                              <w:t xml:space="preserve">AI section summarises the area the officer has selected, allowing for a quick assessment of the area without needing to view every individual report. </w:t>
+                            </w:r>
+                          </w:p>
+                        </w:txbxContent>
+                      </v:textbox>
+                    </v:shape>
+                  </w:pict>
+                </mc:Fallback>
+              </mc:AlternateContent>
+            </w:r>
+            <w:r>
+              <w:rPr>
+                <w:b/>
+                <w:bCs/>
+                <w:noProof/>
+                <w:sz w:val="18"/>
+                <w:szCs w:val="18"/>
+              </w:rPr>
+              <mc:AlternateContent>
+                <mc:Choice Requires="wps">
+                  <w:drawing>
+                    <wp:anchor distT="0" distB="0" distL="114300" distR="114300" simplePos="0" relativeHeight="251767808" behindDoc="0" locked="0" layoutInCell="1" allowOverlap="1" wp14:anchorId="03412C56" wp14:editId="40EFF0CA">
+                      <wp:simplePos x="0" y="0"/>
+                      <wp:positionH relativeFrom="column">
+                        <wp:posOffset>1028864</wp:posOffset>
+                      </wp:positionH>
+                      <wp:positionV relativeFrom="paragraph">
+                        <wp:posOffset>2504027</wp:posOffset>
+                      </wp:positionV>
+                      <wp:extent cx="305435" cy="192784"/>
+                      <wp:effectExtent l="12700" t="12700" r="37465" b="23495"/>
+                      <wp:wrapNone/>
+                      <wp:docPr id="378651878" name="Straight Arrow Connector 6"/>
+                      <wp:cNvGraphicFramePr/>
+                      <a:graphic xmlns:a="http://schemas.openxmlformats.org/drawingml/2006/main">
+                        <a:graphicData uri="http://schemas.microsoft.com/office/word/2010/wordprocessingShape">
+                          <wps:wsp>
+                            <wps:cNvCnPr/>
+                            <wps:spPr>
+                              <a:xfrm>
+                                <a:off x="0" y="0"/>
+                                <a:ext cx="305435" cy="192784"/>
+                              </a:xfrm>
+                              <a:prstGeom prst="straightConnector1">
+                                <a:avLst/>
+                              </a:prstGeom>
+                              <a:ln>
+                                <a:solidFill>
+                                  <a:srgbClr val="EE0000"/>
+                                </a:solidFill>
+                                <a:tailEnd type="triangle"/>
+                              </a:ln>
+                            </wps:spPr>
+                            <wps:style>
+                              <a:lnRef idx="2">
+                                <a:schemeClr val="accent1"/>
+                              </a:lnRef>
+                              <a:fillRef idx="0">
+                                <a:schemeClr val="accent1"/>
+                              </a:fillRef>
+                              <a:effectRef idx="1">
+                                <a:schemeClr val="accent1"/>
+                              </a:effectRef>
+                              <a:fontRef idx="minor">
+                                <a:schemeClr val="tx1"/>
+                              </a:fontRef>
+                            </wps:style>
+                            <wps:bodyPr/>
+                          </wps:wsp>
+                        </a:graphicData>
+                      </a:graphic>
+                      <wp14:sizeRelH relativeFrom="margin">
+                        <wp14:pctWidth>0</wp14:pctWidth>
+                      </wp14:sizeRelH>
+                      <wp14:sizeRelV relativeFrom="margin">
+                        <wp14:pctHeight>0</wp14:pctHeight>
+                      </wp14:sizeRelV>
+                    </wp:anchor>
+                  </w:drawing>
+                </mc:Choice>
+                <mc:Fallback>
+                  <w:pict>
+                    <v:shapetype w14:anchorId="1933B894" id="_x0000_t32" coordsize="21600,21600" o:spt="32" o:oned="t" path="m,l21600,21600e" filled="f">
+                      <v:path arrowok="t" fillok="f" o:connecttype="none"/>
+                      <o:lock v:ext="edit" shapetype="t"/>
+                    </v:shapetype>
+                    <v:shape id="Straight Arrow Connector 6" o:spid="_x0000_s1026" type="#_x0000_t32" style="position:absolute;margin-left:81pt;margin-top:197.15pt;width:24.05pt;height:15.2pt;z-index:251767808;visibility:visible;mso-wrap-style:square;mso-width-percent:0;mso-height-percent:0;mso-wrap-distance-left:9pt;mso-wrap-distance-top:0;mso-wrap-distance-right:9pt;mso-wrap-distance-bottom:0;mso-position-horizontal:absolute;mso-position-horizontal-relative:text;mso-position-vertical:absolute;mso-position-vertical-relative:text;mso-width-percent:0;mso-height-percent:0;mso-width-relative:margin;mso-height-relative:margin" o:gfxdata="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" strokecolor="#e00" strokeweight="1.5pt">
+                      <v:stroke endarrow="block" joinstyle="miter"/>
+                    </v:shape>
+                  </w:pict>
+                </mc:Fallback>
+              </mc:AlternateContent>
+            </w:r>
+            <w:r>
+              <w:rPr>
+                <w:b/>
+                <w:bCs/>
+                <w:noProof/>
+                <w:sz w:val="18"/>
+                <w:szCs w:val="18"/>
+              </w:rPr>
+              <mc:AlternateContent>
+                <mc:Choice Requires="wps">
+                  <w:drawing>
+                    <wp:anchor distT="0" distB="0" distL="114300" distR="114300" simplePos="0" relativeHeight="251764736" behindDoc="0" locked="0" layoutInCell="1" allowOverlap="1" wp14:anchorId="7BBD54BB" wp14:editId="3A418456">
+                      <wp:simplePos x="0" y="0"/>
+                      <wp:positionH relativeFrom="column">
+                        <wp:posOffset>2711450</wp:posOffset>
+                      </wp:positionH>
+                      <wp:positionV relativeFrom="paragraph">
+                        <wp:posOffset>1337310</wp:posOffset>
+                      </wp:positionV>
+                      <wp:extent cx="249555" cy="190500"/>
+                      <wp:effectExtent l="25400" t="12700" r="17145" b="25400"/>
+                      <wp:wrapNone/>
+                      <wp:docPr id="339467780" name="Straight Arrow Connector 6"/>
+                      <wp:cNvGraphicFramePr/>
+                      <a:graphic xmlns:a="http://schemas.openxmlformats.org/drawingml/2006/main">
+                        <a:graphicData uri="http://schemas.microsoft.com/office/word/2010/wordprocessingShape">
+                          <wps:wsp>
+                            <wps:cNvCnPr/>
+                            <wps:spPr>
+                              <a:xfrm flipH="1">
+                                <a:off x="0" y="0"/>
+                                <a:ext cx="249555" cy="190500"/>
+                              </a:xfrm>
+                              <a:prstGeom prst="straightConnector1">
+                                <a:avLst/>
+                              </a:prstGeom>
+                              <a:ln>
+                                <a:solidFill>
+                                  <a:srgbClr val="EE0000"/>
+                                </a:solidFill>
+                                <a:tailEnd type="triangle"/>
+                              </a:ln>
+                            </wps:spPr>
+                            <wps:style>
+                              <a:lnRef idx="2">
+                                <a:schemeClr val="accent1"/>
+                              </a:lnRef>
+                              <a:fillRef idx="0">
+                                <a:schemeClr val="accent1"/>
+                              </a:fillRef>
+                              <a:effectRef idx="1">
+                                <a:schemeClr val="accent1"/>
+                              </a:effectRef>
+                              <a:fontRef idx="minor">
+                                <a:schemeClr val="tx1"/>
+                              </a:fontRef>
+                            </wps:style>
+                            <wps:bodyPr/>
+                          </wps:wsp>
+                        </a:graphicData>
+                      </a:graphic>
+                      <wp14:sizeRelH relativeFrom="margin">
+                        <wp14:pctWidth>0</wp14:pctWidth>
+                      </wp14:sizeRelH>
+                      <wp14:sizeRelV relativeFrom="margin">
+                        <wp14:pctHeight>0</wp14:pctHeight>
+                      </wp14:sizeRelV>
+                    </wp:anchor>
+                  </w:drawing>
+                </mc:Choice>
+                <mc:Fallback>
+                  <w:pict>
+                    <v:shape w14:anchorId="5EC805E6" id="Straight Arrow Connector 6" o:spid="_x0000_s1026" type="#_x0000_t32" style="position:absolute;margin-left:213.5pt;margin-top:105.3pt;width:19.65pt;height:15pt;flip:x;z-index:251764736;visibility:visible;mso-wrap-style:square;mso-width-percent:0;mso-height-percent:0;mso-wrap-distance-left:9pt;mso-wrap-distance-top:0;mso-wrap-distance-right:9pt;mso-wrap-distance-bottom:0;mso-position-horizontal:absolute;mso-position-horizontal-relative:text;mso-position-vertical:absolute;mso-position-vertical-relative:text;mso-width-percent:0;mso-height-percent:0;mso-width-relative:margin;mso-height-relative:margin" o:gfxdata="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" strokecolor="#e00" strokeweight="1.5pt">
+                      <v:stroke endarrow="block" joinstyle="miter"/>
+                    </v:shape>
+                  </w:pict>
+                </mc:Fallback>
+              </mc:AlternateContent>
+            </w:r>
+            <w:r>
+              <w:rPr>
+                <w:b/>
+                <w:bCs/>
+                <w:noProof/>
+                <w:sz w:val="18"/>
+                <w:szCs w:val="18"/>
+              </w:rPr>
+              <mc:AlternateContent>
+                <mc:Choice Requires="wps">
+                  <w:drawing>
+                    <wp:anchor distT="45720" distB="45720" distL="114300" distR="114300" simplePos="0" relativeHeight="251763712" behindDoc="0" locked="0" layoutInCell="1" allowOverlap="1" wp14:anchorId="2D6AF764" wp14:editId="7E9DB115">
+                      <wp:simplePos x="0" y="0"/>
+                      <wp:positionH relativeFrom="column">
+                        <wp:posOffset>2909227</wp:posOffset>
+                      </wp:positionH>
+                      <wp:positionV relativeFrom="paragraph">
+                        <wp:posOffset>835025</wp:posOffset>
+                      </wp:positionV>
+                      <wp:extent cx="899129" cy="1404620"/>
+                      <wp:effectExtent l="0" t="0" r="0" b="0"/>
+                      <wp:wrapNone/>
+                      <wp:docPr id="122903112" name="Text Box 2"/>
+                      <wp:cNvGraphicFramePr>
+                        <a:graphicFrameLocks xmlns:a="http://schemas.openxmlformats.org/drawingml/2006/main"/>
+                      </wp:cNvGraphicFramePr>
+                      <a:graphic xmlns:a="http://schemas.openxmlformats.org/drawingml/2006/main">
+                        <a:graphicData uri="http://schemas.microsoft.com/office/word/2010/wordprocessingShape">
+                          <wps:wsp>
+                            <wps:cNvSpPr txBox="1">
+                              <a:spLocks noChangeArrowheads="1"/>
+                            </wps:cNvSpPr>
+                            <wps:spPr bwMode="auto">
+                              <a:xfrm>
+                                <a:off x="0" y="0"/>
+                                <a:ext cx="899129" cy="1404620"/>
+                              </a:xfrm>
+                              <a:prstGeom prst="rect">
+                                <a:avLst/>
+                              </a:prstGeom>
+                              <a:noFill/>
+                              <a:ln w="9525">
+                                <a:noFill/>
+                                <a:miter lim="800000"/>
+                                <a:headEnd/>
+                                <a:tailEnd/>
+                              </a:ln>
+                            </wps:spPr>
+                            <wps:txbx>
+                              <w:txbxContent>
+                                <w:p>
+                                  <w:pPr>
+                                    <w:rPr>
+                                      <w:sz w:val="16"/>
+                                      <w:szCs w:val="16"/>
+                                      <w:lang w:val="en-GB"/>
+                                    </w:rPr>
+                                  </w:pPr>
+                                  <w:r>
+                                    <w:rPr>
+                                      <w:sz w:val="16"/>
+                                      <w:szCs w:val="16"/>
+                                      <w:lang w:val="en-GB"/>
+                                    </w:rPr>
+                                    <w:t>Placeholder for a geographic map where officers can select specific hotspots (</w:t>
+                                  </w:r>
+                                  <w:proofErr w:type="gramStart"/>
+                                  <w:r>
+                                    <w:rPr>
+                                      <w:sz w:val="16"/>
+                                      <w:szCs w:val="16"/>
+                                      <w:lang w:val="en-GB"/>
+                                    </w:rPr>
+                                    <w:t>similar to</w:t>
+                                  </w:r>
+                                  <w:proofErr w:type="gramEnd"/>
+                                  <w:r>
+                                    <w:rPr>
+                                      <w:sz w:val="16"/>
+                                      <w:szCs w:val="16"/>
+                                      <w:lang w:val="en-GB"/>
+                                    </w:rPr>
+                                    <w:t xml:space="preserve"> the public view)</w:t>
+                                  </w:r>
+                                </w:p>
+                              </w:txbxContent>
+                            </wps:txbx>
+                            <wps:bodyPr rot="0" vert="horz" wrap="square" lIns="91440" tIns="45720" rIns="91440" bIns="45720" anchor="t" anchorCtr="0">
+                              <a:spAutoFit/>
+                            </wps:bodyPr>
+                          </wps:wsp>
+                        </a:graphicData>
+                      </a:graphic>
+                      <wp14:sizeRelH relativeFrom="margin">
+                        <wp14:pctWidth>0</wp14:pctWidth>
+                      </wp14:sizeRelH>
+                      <wp14:sizeRelV relativeFrom="margin">
+                        <wp14:pctHeight>20000</wp14:pctHeight>
+                      </wp14:sizeRelV>
+                    </wp:anchor>
+                  </w:drawing>
+                </mc:Choice>
+                <mc:Fallback>
+                  <w:pict>
+                    <v:shape w14:anchorId="2D6AF764" id="_x0000_s1027" type="#_x0000_t202" style="position:absolute;left:0;text-align:left;margin-left:229.05pt;margin-top:65.75pt;width:70.8pt;height:110.6pt;z-index:251763712;visibility:visible;mso-wrap-style:square;mso-width-percent:0;mso-height-percent:200;mso-wrap-distance-left:9pt;mso-wrap-distance-top:3.6pt;mso-wrap-distance-right:9pt;mso-wrap-distance-bottom:3.6pt;mso-position-horizontal:absolute;mso-position-horizontal-relative:text;mso-position-vertical:absolute;mso-position-vertical-relative:text;mso-width-percent:0;mso-height-percent:200;mso-width-relative:margin;mso-height-relative:margin;v-text-anchor:top" o:gfxdata="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" filled="f" stroked="f">
+                      <v:textbox style="mso-fit-shape-to-text:t">
+                        <w:txbxContent>
+                          <w:p>
+                            <w:pPr>
+                              <w:rPr>
+                                <w:sz w:val="16"/>
+                                <w:szCs w:val="16"/>
+                                <w:lang w:val="en-GB"/>
+                              </w:rPr>
+                            </w:pPr>
+                            <w:r>
+                              <w:rPr>
+                                <w:sz w:val="16"/>
+                                <w:szCs w:val="16"/>
+                                <w:lang w:val="en-GB"/>
+                              </w:rPr>
+                              <w:t>Placeholder for a geographic map where officers can select specific hotspots (</w:t>
+                            </w:r>
+                            <w:proofErr w:type="gramStart"/>
+                            <w:r>
+                              <w:rPr>
+                                <w:sz w:val="16"/>
+                                <w:szCs w:val="16"/>
+                                <w:lang w:val="en-GB"/>
+                              </w:rPr>
+                              <w:t>similar to</w:t>
+                            </w:r>
+                            <w:proofErr w:type="gramEnd"/>
+                            <w:r>
+                              <w:rPr>
+                                <w:sz w:val="16"/>
+                                <w:szCs w:val="16"/>
+                                <w:lang w:val="en-GB"/>
+                              </w:rPr>
+                              <w:t xml:space="preserve"> the public view)</w:t>
+                            </w:r>
+                          </w:p>
+                        </w:txbxContent>
+                      </v:textbox>
+                    </v:shape>
+                  </w:pict>
+                </mc:Fallback>
+              </mc:AlternateContent>
+            </w:r>
+            <w:r>
+              <w:rPr>
+                <w:b/>
+                <w:bCs/>
+                <w:noProof/>
+                <w:sz w:val="18"/>
+                <w:szCs w:val="18"/>
+              </w:rPr>
+              <mc:AlternateContent>
+                <mc:Choice Requires="wps">
+                  <w:drawing>
+                    <wp:anchor distT="45720" distB="45720" distL="114300" distR="114300" simplePos="0" relativeHeight="251735040" behindDoc="0" locked="0" layoutInCell="1" allowOverlap="1" wp14:anchorId="118C16D0" wp14:editId="4D58082C">
+                      <wp:simplePos x="0" y="0"/>
+                      <wp:positionH relativeFrom="column">
+                        <wp:posOffset>71919</wp:posOffset>
+                      </wp:positionH>
+                      <wp:positionV relativeFrom="paragraph">
+                        <wp:posOffset>52148</wp:posOffset>
+                      </wp:positionV>
+                      <wp:extent cx="1037590" cy="1705511"/>
+                      <wp:effectExtent l="0" t="0" r="0" b="0"/>
+                      <wp:wrapNone/>
+                      <wp:docPr id="1342057369" name="Text Box 2"/>
+                      <wp:cNvGraphicFramePr>
+                        <a:graphicFrameLocks xmlns:a="http://schemas.openxmlformats.org/drawingml/2006/main"/>
+                      </wp:cNvGraphicFramePr>
+                      <a:graphic xmlns:a="http://schemas.openxmlformats.org/drawingml/2006/main">
+                        <a:graphicData uri="http://schemas.microsoft.com/office/word/2010/wordprocessingShape">
+                          <wps:wsp>
+                            <wps:cNvSpPr txBox="1">
+                              <a:spLocks noChangeArrowheads="1"/>
+                            </wps:cNvSpPr>
+                            <wps:spPr bwMode="auto">
+                              <a:xfrm>
+                                <a:off x="0" y="0"/>
+                                <a:ext cx="1037590" cy="1705511"/>
+                              </a:xfrm>
+                              <a:prstGeom prst="rect">
+                                <a:avLst/>
+                              </a:prstGeom>
+                              <a:noFill/>
+                              <a:ln w="9525">
+                                <a:noFill/>
+                                <a:miter lim="800000"/>
+                                <a:headEnd/>
+                                <a:tailEnd/>
+                              </a:ln>
+                            </wps:spPr>
+                            <wps:txbx>
+                              <w:txbxContent>
+                                <w:p>
+                                  <w:pPr>
+                                    <w:rPr>
+                                      <w:sz w:val="16"/>
+                                      <w:szCs w:val="16"/>
+                                      <w:lang w:val="en-GB"/>
+                                    </w:rPr>
+                                  </w:pPr>
+                                  <w:r>
+                                    <w:rPr>
+                                      <w:sz w:val="16"/>
+                                      <w:szCs w:val="16"/>
+                                      <w:lang w:val="en-GB"/>
+                                    </w:rPr>
+                                    <w:t xml:space="preserve">Global header contains a hamburger menu for app navigation and settings. </w:t>
+                                  </w:r>
+                                  <w:r>
+                                    <w:rPr>
+                                      <w:sz w:val="16"/>
+                                      <w:szCs w:val="16"/>
+                                      <w:lang w:val="en-GB"/>
+                                    </w:rPr>
+                                    <w:br/>
+                                    <w:t xml:space="preserve">The header also includes a search icon which feature is relative to the user’s screen.  </w:t>
+                                  </w:r>
+                                </w:p>
+                              </w:txbxContent>
+                            </wps:txbx>
+                            <wps:bodyPr rot="0" vert="horz" wrap="square" lIns="91440" tIns="45720" rIns="91440" bIns="45720" anchor="t" anchorCtr="0">
+                              <a:noAutofit/>
+                            </wps:bodyPr>
+                          </wps:wsp>
+                        </a:graphicData>
+                      </a:graphic>
+                      <wp14:sizeRelH relativeFrom="margin">
+                        <wp14:pctWidth>0</wp14:pctWidth>
+                      </wp14:sizeRelH>
+                      <wp14:sizeRelV relativeFrom="margin">
+                        <wp14:pctHeight>0</wp14:pctHeight>
+                      </wp14:sizeRelV>
+                    </wp:anchor>
+                  </w:drawing>
+                </mc:Choice>
+                <mc:Fallback>
+                  <w:pict>
+                    <v:shape w14:anchorId="118C16D0" id="_x0000_s1028" type="#_x0000_t202" style="position:absolute;left:0;text-align:left;margin-left:5.65pt;margin-top:4.1pt;width:81.7pt;height:134.3pt;z-index:251735040;visibility:visible;mso-wrap-style:square;mso-width-percent:0;mso-height-percent:0;mso-wrap-distance-left:9pt;mso-wrap-distance-top:3.6pt;mso-wrap-distance-right:9pt;mso-wrap-distance-bottom:3.6pt;mso-position-horizontal:absolute;mso-position-horizontal-relative:text;mso-position-vertical:absolute;mso-position-vertical-relative:text;mso-width-percent:0;mso-height-percent:0;mso-width-relative:margin;mso-height-relative:margin;v-text-anchor:top" o:gfxdata="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" filled="f" stroked="f">
+                      <v:textbox>
+                        <w:txbxContent>
+                          <w:p>
+                            <w:pPr>
+                              <w:rPr>
+                                <w:sz w:val="16"/>
+                                <w:szCs w:val="16"/>
+                                <w:lang w:val="en-GB"/>
+                              </w:rPr>
+                            </w:pPr>
+                            <w:r>
+                              <w:rPr>
+                                <w:sz w:val="16"/>
+                                <w:szCs w:val="16"/>
+                                <w:lang w:val="en-GB"/>
+                              </w:rPr>
+                              <w:t xml:space="preserve">Global header contains a hamburger menu for app navigation and settings. </w:t>
+                            </w:r>
+                            <w:r>
+                              <w:rPr>
+                                <w:sz w:val="16"/>
+                                <w:szCs w:val="16"/>
+                                <w:lang w:val="en-GB"/>
+                              </w:rPr>
+                              <w:br/>
+                              <w:t xml:space="preserve">The header also includes a search icon which feature is relative to the user’s screen.  </w:t>
+                            </w:r>
+                          </w:p>
+                        </w:txbxContent>
+                      </v:textbox>
+                    </v:shape>
+                  </w:pict>
+                </mc:Fallback>
+              </mc:AlternateContent>
+            </w:r>
+            <w:r>
+              <w:rPr>
+                <w:b/>
+                <w:bCs/>
+                <w:noProof/>
+                <w:sz w:val="18"/>
+                <w:szCs w:val="18"/>
+              </w:rPr>
+              <mc:AlternateContent>
+                <mc:Choice Requires="wps">
+                  <w:drawing>
+                    <wp:anchor distT="0" distB="0" distL="114300" distR="114300" simplePos="0" relativeHeight="251736064" behindDoc="0" locked="0" layoutInCell="1" allowOverlap="1" wp14:anchorId="1C19C5E0" wp14:editId="7522016C">
+                      <wp:simplePos x="0" y="0"/>
+                      <wp:positionH relativeFrom="column">
+                        <wp:posOffset>1029842</wp:posOffset>
+                      </wp:positionH>
+                      <wp:positionV relativeFrom="paragraph">
+                        <wp:posOffset>516911</wp:posOffset>
+                      </wp:positionV>
+                      <wp:extent cx="305435" cy="192784"/>
+                      <wp:effectExtent l="12700" t="12700" r="37465" b="23495"/>
+                      <wp:wrapNone/>
+                      <wp:docPr id="1429287654" name="Straight Arrow Connector 6"/>
+                      <wp:cNvGraphicFramePr/>
+                      <a:graphic xmlns:a="http://schemas.openxmlformats.org/drawingml/2006/main">
+                        <a:graphicData uri="http://schemas.microsoft.com/office/word/2010/wordprocessingShape">
+                          <wps:wsp>
+                            <wps:cNvCnPr/>
+                            <wps:spPr>
+                              <a:xfrm>
+                                <a:off x="0" y="0"/>
+                                <a:ext cx="305435" cy="192784"/>
+                              </a:xfrm>
+                              <a:prstGeom prst="straightConnector1">
+                                <a:avLst/>
+                              </a:prstGeom>
+                              <a:ln>
+                                <a:solidFill>
+                                  <a:srgbClr val="EE0000"/>
+                                </a:solidFill>
+                                <a:tailEnd type="triangle"/>
+                              </a:ln>
+                            </wps:spPr>
+                            <wps:style>
+                              <a:lnRef idx="2">
+                                <a:schemeClr val="accent1"/>
+                              </a:lnRef>
+                              <a:fillRef idx="0">
+                                <a:schemeClr val="accent1"/>
+                              </a:fillRef>
+                              <a:effectRef idx="1">
+                                <a:schemeClr val="accent1"/>
+                              </a:effectRef>
+                              <a:fontRef idx="minor">
+                                <a:schemeClr val="tx1"/>
+                              </a:fontRef>
+                            </wps:style>
+                            <wps:bodyPr/>
+                          </wps:wsp>
+                        </a:graphicData>
+                      </a:graphic>
+                      <wp14:sizeRelH relativeFrom="margin">
+                        <wp14:pctWidth>0</wp14:pctWidth>
+                      </wp14:sizeRelH>
+                      <wp14:sizeRelV relativeFrom="margin">
+                        <wp14:pctHeight>0</wp14:pctHeight>
+                      </wp14:sizeRelV>
+                    </wp:anchor>
+                  </w:drawing>
+                </mc:Choice>
+                <mc:Fallback>
+                  <w:pict>
+                    <v:shape w14:anchorId="1B5A6216" id="Straight Arrow Connector 6" o:spid="_x0000_s1026" type="#_x0000_t32" style="position:absolute;margin-left:81.1pt;margin-top:40.7pt;width:24.05pt;height:15.2pt;z-index:251736064;visibility:visible;mso-wrap-style:square;mso-width-percent:0;mso-height-percent:0;mso-wrap-distance-left:9pt;mso-wrap-distance-top:0;mso-wrap-distance-right:9pt;mso-wrap-distance-bottom:0;mso-position-horizontal:absolute;mso-position-horizontal-relative:text;mso-position-vertical:absolute;mso-position-vertical-relative:text;mso-width-percent:0;mso-height-percent:0;mso-width-relative:margin;mso-height-relative:margin" o:gfxdata="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" strokecolor="#e00" strokeweight="1.5pt">
+                      <v:stroke endarrow="block" joinstyle="miter"/>
+                    </v:shape>
+                  </w:pict>
+                </mc:Fallback>
+              </mc:AlternateContent>
+            </w:r>
+            <w:r>
+              <w:rPr>
+                <w:b/>
+                <w:bCs/>
+                <w:noProof/>
+                <w:sz w:val="18"/>
+                <w:szCs w:val="18"/>
+              </w:rPr>
+              <w:drawing>
+                <wp:anchor distT="0" distB="0" distL="114300" distR="114300" simplePos="0" relativeHeight="251732992" behindDoc="1" locked="0" layoutInCell="1" allowOverlap="1" wp14:anchorId="07E7C5CA" wp14:editId="4ACA09CA">
+                  <wp:simplePos x="0" y="0"/>
+                  <wp:positionH relativeFrom="column">
+                    <wp:posOffset>1110330</wp:posOffset>
+                  </wp:positionH>
+                  <wp:positionV relativeFrom="page">
+                    <wp:posOffset>1378326</wp:posOffset>
+                  </wp:positionV>
+                  <wp:extent cx="1707502" cy="3010173"/>
+                  <wp:effectExtent l="0" t="0" r="0" b="0"/>
+                  <wp:wrapTight wrapText="bothSides">
+                    <wp:wrapPolygon edited="0">
+                      <wp:start x="0" y="0"/>
+                      <wp:lineTo x="0" y="21509"/>
+                      <wp:lineTo x="21375" y="21509"/>
+                      <wp:lineTo x="21375" y="0"/>
+                      <wp:lineTo x="0" y="0"/>
+                    </wp:wrapPolygon>
+                  </wp:wrapTight>
+                  <wp:docPr id="901849540" name="Picture 34" descr="A screenshot of a phone&#10;&#10;AI-generated content may be incorrect."/>
+                  <wp:cNvGraphicFramePr>
+                    <a:graphicFrameLocks xmlns:a="http://schemas.openxmlformats.org/drawingml/2006/main" noChangeAspect="1"/>
+                  </wp:cNvGraphicFramePr>
+                  <a:graphic xmlns:a="http://schemas.openxmlformats.org/drawingml/2006/main">
+                    <a:graphicData uri="http://schemas.openxmlformats.org/drawingml/2006/picture">
+                      <pic:pic xmlns:pic="http://schemas.openxmlformats.org/drawingml/2006/picture">
+                        <pic:nvPicPr>
+                          <pic:cNvPr id="901849540" name="Picture 34" descr="A screenshot of a phone&#10;&#10;AI-generated content may be incorrect."/>
+                          <pic:cNvPicPr/>
+                        </pic:nvPicPr>
+                        <pic:blipFill>
+                          <a:blip r:embed="rId5">
+                            <a:extLst>
+                              <a:ext uri="{28A0092B-C50C-407E-A947-70E740481C1C}">
+                                <a14:useLocalDpi xmlns:a14="http://schemas.microsoft.com/office/drawing/2010/main" val="0"/>
+                              </a:ext>
+                            </a:extLst>
+                          </a:blip>
+                          <a:stretch>
+                            <a:fillRect/>
+                          </a:stretch>
+                        </pic:blipFill>
+                        <pic:spPr>
+                          <a:xfrm>
+                            <a:off x="0" y="0"/>
+                            <a:ext cx="1707502" cy="3010173"/>
+                          </a:xfrm>
+                          <a:prstGeom prst="rect">
+                            <a:avLst/>
+                          </a:prstGeom>
+                        </pic:spPr>
+                      </pic:pic>
+                    </a:graphicData>
+                  </a:graphic>
+                  <wp14:sizeRelH relativeFrom="page">
+                    <wp14:pctWidth>0</wp14:pctWidth>
+                  </wp14:sizeRelH>
+                  <wp14:sizeRelV relativeFrom="page">
+                    <wp14:pctHeight>0</wp14:pctHeight>
+                  </wp14:sizeRelV>
+                </wp:anchor>
+              </w:drawing>
+            </w:r>
           </w:p>
         </w:tc>
         <w:tc>
@@ -63,16 +839,768 @@
                 <w:szCs w:val="18"/>
               </w:rPr>
             </w:pPr>
+            <w:r>
+              <w:rPr>
+                <w:b/>
+                <w:bCs/>
+                <w:sz w:val="18"/>
+                <w:szCs w:val="18"/>
+              </w:rPr>
+              <w:t xml:space="preserve">User Story 2 </w:t>
+            </w:r>
+            <w:r>
+              <w:rPr>
+                <w:sz w:val="18"/>
+                <w:szCs w:val="18"/>
+              </w:rPr>
+              <w:t xml:space="preserve">– As </w:t>
+            </w:r>
+            <w:r>
+              <w:rPr>
+                <w:sz w:val="18"/>
+                <w:szCs w:val="18"/>
+              </w:rPr>
+              <w:t>an administrator, I want to manage police officer accounts so that I can control who has access to sensitive report data.</w:t>
+            </w:r>
+          </w:p>
+          <w:p>
+            <w:pPr>
+              <w:ind w:left="144" w:right="144"/>
+              <w:rPr>
+                <w:b/>
+                <w:bCs/>
+                <w:sz w:val="18"/>
+                <w:szCs w:val="18"/>
+              </w:rPr>
+            </w:pPr>
+            <w:r>
+              <w:rPr>
+                <w:b/>
+                <w:bCs/>
+                <w:sz w:val="18"/>
+                <w:szCs w:val="18"/>
+              </w:rPr>
+              <w:t xml:space="preserve">Author: </w:t>
+            </w:r>
+            <w:r>
+              <w:rPr>
+                <w:sz w:val="18"/>
+                <w:szCs w:val="18"/>
+              </w:rPr>
+              <w:t>Jack</w:t>
+            </w:r>
+            <w:r>
+              <w:rPr>
+                <w:b/>
+                <w:bCs/>
+                <w:sz w:val="18"/>
+                <w:szCs w:val="18"/>
+              </w:rPr>
+              <w:t xml:space="preserve"> </w:t>
+            </w:r>
+          </w:p>
+          <w:p>
+            <w:pPr>
+              <w:ind w:left="144" w:right="144"/>
+              <w:rPr>
+                <w:b/>
+                <w:bCs/>
+                <w:sz w:val="18"/>
+                <w:szCs w:val="18"/>
+              </w:rPr>
+            </w:pPr>
+          </w:p>
+          <w:p>
+            <w:pPr>
+              <w:ind w:left="144" w:right="144"/>
+              <w:rPr>
+                <w:b/>
+                <w:bCs/>
+                <w:sz w:val="18"/>
+                <w:szCs w:val="18"/>
+              </w:rPr>
+            </w:pPr>
+          </w:p>
+          <w:p>
+            <w:pPr>
+              <w:ind w:left="144" w:right="144"/>
+              <w:rPr>
+                <w:b/>
+                <w:bCs/>
+                <w:sz w:val="18"/>
+                <w:szCs w:val="18"/>
+              </w:rPr>
+            </w:pPr>
+            <w:r>
+              <w:rPr>
+                <w:b/>
+                <w:bCs/>
+                <w:noProof/>
+                <w:sz w:val="18"/>
+                <w:szCs w:val="18"/>
+              </w:rPr>
+              <mc:AlternateContent>
+                <mc:Choice Requires="wps">
+                  <w:drawing>
+                    <wp:anchor distT="45720" distB="45720" distL="114300" distR="114300" simplePos="0" relativeHeight="251760640" behindDoc="0" locked="0" layoutInCell="1" allowOverlap="1" wp14:anchorId="1CCB0DE9" wp14:editId="5A85D5D3">
+                      <wp:simplePos x="0" y="0"/>
+                      <wp:positionH relativeFrom="column">
+                        <wp:posOffset>2934478</wp:posOffset>
+                      </wp:positionH>
+                      <wp:positionV relativeFrom="paragraph">
+                        <wp:posOffset>2390568</wp:posOffset>
+                      </wp:positionV>
+                      <wp:extent cx="898525" cy="1404620"/>
+                      <wp:effectExtent l="0" t="0" r="0" b="0"/>
+                      <wp:wrapNone/>
+                      <wp:docPr id="619208854" name="Text Box 2"/>
+                      <wp:cNvGraphicFramePr>
+                        <a:graphicFrameLocks xmlns:a="http://schemas.openxmlformats.org/drawingml/2006/main"/>
+                      </wp:cNvGraphicFramePr>
+                      <a:graphic xmlns:a="http://schemas.openxmlformats.org/drawingml/2006/main">
+                        <a:graphicData uri="http://schemas.microsoft.com/office/word/2010/wordprocessingShape">
+                          <wps:wsp>
+                            <wps:cNvSpPr txBox="1">
+                              <a:spLocks noChangeArrowheads="1"/>
+                            </wps:cNvSpPr>
+                            <wps:spPr bwMode="auto">
+                              <a:xfrm>
+                                <a:off x="0" y="0"/>
+                                <a:ext cx="898525" cy="1404620"/>
+                              </a:xfrm>
+                              <a:prstGeom prst="rect">
+                                <a:avLst/>
+                              </a:prstGeom>
+                              <a:noFill/>
+                              <a:ln w="9525">
+                                <a:noFill/>
+                                <a:miter lim="800000"/>
+                                <a:headEnd/>
+                                <a:tailEnd/>
+                              </a:ln>
+                            </wps:spPr>
+                            <wps:txbx>
+                              <w:txbxContent>
+                                <w:p>
+                                  <w:pPr>
+                                    <w:rPr>
+                                      <w:sz w:val="16"/>
+                                      <w:szCs w:val="16"/>
+                                      <w:lang w:val="en-GB"/>
+                                    </w:rPr>
+                                  </w:pPr>
+                                  <w:r>
+                                    <w:rPr>
+                                      <w:sz w:val="16"/>
+                                      <w:szCs w:val="16"/>
+                                      <w:lang w:val="en-GB"/>
+                                    </w:rPr>
+                                    <w:t xml:space="preserve">“Previous” and “Next” buttons with arrows indicate navigation through the database list of officers. </w:t>
+                                  </w:r>
+                                </w:p>
+                              </w:txbxContent>
+                            </wps:txbx>
+                            <wps:bodyPr rot="0" vert="horz" wrap="square" lIns="91440" tIns="45720" rIns="91440" bIns="45720" anchor="t" anchorCtr="0">
+                              <a:spAutoFit/>
+                            </wps:bodyPr>
+                          </wps:wsp>
+                        </a:graphicData>
+                      </a:graphic>
+                      <wp14:sizeRelH relativeFrom="margin">
+                        <wp14:pctWidth>0</wp14:pctWidth>
+                      </wp14:sizeRelH>
+                      <wp14:sizeRelV relativeFrom="margin">
+                        <wp14:pctHeight>20000</wp14:pctHeight>
+                      </wp14:sizeRelV>
+                    </wp:anchor>
+                  </w:drawing>
+                </mc:Choice>
+                <mc:Fallback>
+                  <w:pict>
+                    <v:shape w14:anchorId="1CCB0DE9" id="_x0000_s1029" type="#_x0000_t202" style="position:absolute;left:0;text-align:left;margin-left:231.05pt;margin-top:188.25pt;width:70.75pt;height:110.6pt;z-index:251760640;visibility:visible;mso-wrap-style:square;mso-width-percent:0;mso-height-percent:200;mso-wrap-distance-left:9pt;mso-wrap-distance-top:3.6pt;mso-wrap-distance-right:9pt;mso-wrap-distance-bottom:3.6pt;mso-position-horizontal:absolute;mso-position-horizontal-relative:text;mso-position-vertical:absolute;mso-position-vertical-relative:text;mso-width-percent:0;mso-height-percent:200;mso-width-relative:margin;mso-height-relative:margin;v-text-anchor:top" o:gfxdata="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" filled="f" stroked="f">
+                      <v:textbox style="mso-fit-shape-to-text:t">
+                        <w:txbxContent>
+                          <w:p>
+                            <w:pPr>
+                              <w:rPr>
+                                <w:sz w:val="16"/>
+                                <w:szCs w:val="16"/>
+                                <w:lang w:val="en-GB"/>
+                              </w:rPr>
+                            </w:pPr>
+                            <w:r>
+                              <w:rPr>
+                                <w:sz w:val="16"/>
+                                <w:szCs w:val="16"/>
+                                <w:lang w:val="en-GB"/>
+                              </w:rPr>
+                              <w:t xml:space="preserve">“Previous” and “Next” buttons with arrows indicate navigation through the database list of officers. </w:t>
+                            </w:r>
+                          </w:p>
+                        </w:txbxContent>
+                      </v:textbox>
+                    </v:shape>
+                  </w:pict>
+                </mc:Fallback>
+              </mc:AlternateContent>
+            </w:r>
+            <w:r>
+              <w:rPr>
+                <w:b/>
+                <w:bCs/>
+                <w:noProof/>
+                <w:sz w:val="18"/>
+                <w:szCs w:val="18"/>
+              </w:rPr>
+              <mc:AlternateContent>
+                <mc:Choice Requires="wps">
+                  <w:drawing>
+                    <wp:anchor distT="0" distB="0" distL="114300" distR="114300" simplePos="0" relativeHeight="251761664" behindDoc="0" locked="0" layoutInCell="1" allowOverlap="1" wp14:anchorId="481C60CA" wp14:editId="5B68E09C">
+                      <wp:simplePos x="0" y="0"/>
+                      <wp:positionH relativeFrom="column">
+                        <wp:posOffset>2514600</wp:posOffset>
+                      </wp:positionH>
+                      <wp:positionV relativeFrom="paragraph">
+                        <wp:posOffset>2897790</wp:posOffset>
+                      </wp:positionV>
+                      <wp:extent cx="470898" cy="190547"/>
+                      <wp:effectExtent l="25400" t="12700" r="12065" b="38100"/>
+                      <wp:wrapNone/>
+                      <wp:docPr id="1036018971" name="Straight Arrow Connector 6"/>
+                      <wp:cNvGraphicFramePr/>
+                      <a:graphic xmlns:a="http://schemas.openxmlformats.org/drawingml/2006/main">
+                        <a:graphicData uri="http://schemas.microsoft.com/office/word/2010/wordprocessingShape">
+                          <wps:wsp>
+                            <wps:cNvCnPr/>
+                            <wps:spPr>
+                              <a:xfrm flipH="1">
+                                <a:off x="0" y="0"/>
+                                <a:ext cx="470898" cy="190547"/>
+                              </a:xfrm>
+                              <a:prstGeom prst="straightConnector1">
+                                <a:avLst/>
+                              </a:prstGeom>
+                              <a:ln>
+                                <a:solidFill>
+                                  <a:srgbClr val="EE0000"/>
+                                </a:solidFill>
+                                <a:tailEnd type="triangle"/>
+                              </a:ln>
+                            </wps:spPr>
+                            <wps:style>
+                              <a:lnRef idx="2">
+                                <a:schemeClr val="accent1"/>
+                              </a:lnRef>
+                              <a:fillRef idx="0">
+                                <a:schemeClr val="accent1"/>
+                              </a:fillRef>
+                              <a:effectRef idx="1">
+                                <a:schemeClr val="accent1"/>
+                              </a:effectRef>
+                              <a:fontRef idx="minor">
+                                <a:schemeClr val="tx1"/>
+                              </a:fontRef>
+                            </wps:style>
+                            <wps:bodyPr/>
+                          </wps:wsp>
+                        </a:graphicData>
+                      </a:graphic>
+                      <wp14:sizeRelH relativeFrom="margin">
+                        <wp14:pctWidth>0</wp14:pctWidth>
+                      </wp14:sizeRelH>
+                      <wp14:sizeRelV relativeFrom="margin">
+                        <wp14:pctHeight>0</wp14:pctHeight>
+                      </wp14:sizeRelV>
+                    </wp:anchor>
+                  </w:drawing>
+                </mc:Choice>
+                <mc:Fallback>
+                  <w:pict>
+                    <v:shape w14:anchorId="6F92ECB5" id="Straight Arrow Connector 6" o:spid="_x0000_s1026" type="#_x0000_t32" style="position:absolute;margin-left:198pt;margin-top:228.15pt;width:37.1pt;height:15pt;flip:x;z-index:251761664;visibility:visible;mso-wrap-style:square;mso-width-percent:0;mso-height-percent:0;mso-wrap-distance-left:9pt;mso-wrap-distance-top:0;mso-wrap-distance-right:9pt;mso-wrap-distance-bottom:0;mso-position-horizontal:absolute;mso-position-horizontal-relative:text;mso-position-vertical:absolute;mso-position-vertical-relative:text;mso-width-percent:0;mso-height-percent:0;mso-width-relative:margin;mso-height-relative:margin" o:gfxdata="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" strokecolor="#e00" strokeweight="1.5pt">
+                      <v:stroke endarrow="block" joinstyle="miter"/>
+                    </v:shape>
+                  </w:pict>
+                </mc:Fallback>
+              </mc:AlternateContent>
+            </w:r>
+            <w:r>
+              <w:rPr>
+                <w:b/>
+                <w:bCs/>
+                <w:noProof/>
+                <w:sz w:val="18"/>
+                <w:szCs w:val="18"/>
+              </w:rPr>
+              <mc:AlternateContent>
+                <mc:Choice Requires="wps">
+                  <w:drawing>
+                    <wp:anchor distT="0" distB="0" distL="114300" distR="114300" simplePos="0" relativeHeight="251758592" behindDoc="0" locked="0" layoutInCell="1" allowOverlap="1" wp14:anchorId="79182EEC" wp14:editId="1E19316F">
+                      <wp:simplePos x="0" y="0"/>
+                      <wp:positionH relativeFrom="column">
+                        <wp:posOffset>2785110</wp:posOffset>
+                      </wp:positionH>
+                      <wp:positionV relativeFrom="paragraph">
+                        <wp:posOffset>1123950</wp:posOffset>
+                      </wp:positionV>
+                      <wp:extent cx="249555" cy="190500"/>
+                      <wp:effectExtent l="25400" t="12700" r="17145" b="25400"/>
+                      <wp:wrapNone/>
+                      <wp:docPr id="521386657" name="Straight Arrow Connector 6"/>
+                      <wp:cNvGraphicFramePr/>
+                      <a:graphic xmlns:a="http://schemas.openxmlformats.org/drawingml/2006/main">
+                        <a:graphicData uri="http://schemas.microsoft.com/office/word/2010/wordprocessingShape">
+                          <wps:wsp>
+                            <wps:cNvCnPr/>
+                            <wps:spPr>
+                              <a:xfrm flipH="1">
+                                <a:off x="0" y="0"/>
+                                <a:ext cx="249555" cy="190500"/>
+                              </a:xfrm>
+                              <a:prstGeom prst="straightConnector1">
+                                <a:avLst/>
+                              </a:prstGeom>
+                              <a:ln>
+                                <a:solidFill>
+                                  <a:srgbClr val="EE0000"/>
+                                </a:solidFill>
+                                <a:tailEnd type="triangle"/>
+                              </a:ln>
+                            </wps:spPr>
+                            <wps:style>
+                              <a:lnRef idx="2">
+                                <a:schemeClr val="accent1"/>
+                              </a:lnRef>
+                              <a:fillRef idx="0">
+                                <a:schemeClr val="accent1"/>
+                              </a:fillRef>
+                              <a:effectRef idx="1">
+                                <a:schemeClr val="accent1"/>
+                              </a:effectRef>
+                              <a:fontRef idx="minor">
+                                <a:schemeClr val="tx1"/>
+                              </a:fontRef>
+                            </wps:style>
+                            <wps:bodyPr/>
+                          </wps:wsp>
+                        </a:graphicData>
+                      </a:graphic>
+                      <wp14:sizeRelH relativeFrom="margin">
+                        <wp14:pctWidth>0</wp14:pctWidth>
+                      </wp14:sizeRelH>
+                      <wp14:sizeRelV relativeFrom="margin">
+                        <wp14:pctHeight>0</wp14:pctHeight>
+                      </wp14:sizeRelV>
+                    </wp:anchor>
+                  </w:drawing>
+                </mc:Choice>
+                <mc:Fallback>
+                  <w:pict>
+                    <v:shape w14:anchorId="3E5DFD87" id="Straight Arrow Connector 6" o:spid="_x0000_s1026" type="#_x0000_t32" style="position:absolute;margin-left:219.3pt;margin-top:88.5pt;width:19.65pt;height:15pt;flip:x;z-index:251758592;visibility:visible;mso-wrap-style:square;mso-width-percent:0;mso-height-percent:0;mso-wrap-distance-left:9pt;mso-wrap-distance-top:0;mso-wrap-distance-right:9pt;mso-wrap-distance-bottom:0;mso-position-horizontal:absolute;mso-position-horizontal-relative:text;mso-position-vertical:absolute;mso-position-vertical-relative:text;mso-width-percent:0;mso-height-percent:0;mso-width-relative:margin;mso-height-relative:margin" o:gfxdata="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" strokecolor="#e00" strokeweight="1.5pt">
+                      <v:stroke endarrow="block" joinstyle="miter"/>
+                    </v:shape>
+                  </w:pict>
+                </mc:Fallback>
+              </mc:AlternateContent>
+            </w:r>
+            <w:r>
+              <w:rPr>
+                <w:b/>
+                <w:bCs/>
+                <w:noProof/>
+                <w:sz w:val="18"/>
+                <w:szCs w:val="18"/>
+              </w:rPr>
+              <mc:AlternateContent>
+                <mc:Choice Requires="wps">
+                  <w:drawing>
+                    <wp:anchor distT="45720" distB="45720" distL="114300" distR="114300" simplePos="0" relativeHeight="251757568" behindDoc="0" locked="0" layoutInCell="1" allowOverlap="1" wp14:anchorId="653B4ED0" wp14:editId="2055FEB5">
+                      <wp:simplePos x="0" y="0"/>
+                      <wp:positionH relativeFrom="column">
+                        <wp:posOffset>2982893</wp:posOffset>
+                      </wp:positionH>
+                      <wp:positionV relativeFrom="paragraph">
+                        <wp:posOffset>622067</wp:posOffset>
+                      </wp:positionV>
+                      <wp:extent cx="899129" cy="1404620"/>
+                      <wp:effectExtent l="0" t="0" r="0" b="0"/>
+                      <wp:wrapNone/>
+                      <wp:docPr id="1647135820" name="Text Box 2"/>
+                      <wp:cNvGraphicFramePr>
+                        <a:graphicFrameLocks xmlns:a="http://schemas.openxmlformats.org/drawingml/2006/main"/>
+                      </wp:cNvGraphicFramePr>
+                      <a:graphic xmlns:a="http://schemas.openxmlformats.org/drawingml/2006/main">
+                        <a:graphicData uri="http://schemas.microsoft.com/office/word/2010/wordprocessingShape">
+                          <wps:wsp>
+                            <wps:cNvSpPr txBox="1">
+                              <a:spLocks noChangeArrowheads="1"/>
+                            </wps:cNvSpPr>
+                            <wps:spPr bwMode="auto">
+                              <a:xfrm>
+                                <a:off x="0" y="0"/>
+                                <a:ext cx="899129" cy="1404620"/>
+                              </a:xfrm>
+                              <a:prstGeom prst="rect">
+                                <a:avLst/>
+                              </a:prstGeom>
+                              <a:noFill/>
+                              <a:ln w="9525">
+                                <a:noFill/>
+                                <a:miter lim="800000"/>
+                                <a:headEnd/>
+                                <a:tailEnd/>
+                              </a:ln>
+                            </wps:spPr>
+                            <wps:txbx>
+                              <w:txbxContent>
+                                <w:p>
+                                  <w:pPr>
+                                    <w:rPr>
+                                      <w:sz w:val="16"/>
+                                      <w:szCs w:val="16"/>
+                                      <w:lang w:val="en-GB"/>
+                                    </w:rPr>
+                                  </w:pPr>
+                                  <w:r>
+                                    <w:rPr>
+                                      <w:sz w:val="16"/>
+                                      <w:szCs w:val="16"/>
+                                      <w:lang w:val="en-GB"/>
+                                    </w:rPr>
+                                    <w:t xml:space="preserve">Right facing arrows indicate each row is interactive, leading to detailed permissions management for that specific user. </w:t>
+                                  </w:r>
+                                </w:p>
+                              </w:txbxContent>
+                            </wps:txbx>
+                            <wps:bodyPr rot="0" vert="horz" wrap="square" lIns="91440" tIns="45720" rIns="91440" bIns="45720" anchor="t" anchorCtr="0">
+                              <a:spAutoFit/>
+                            </wps:bodyPr>
+                          </wps:wsp>
+                        </a:graphicData>
+                      </a:graphic>
+                      <wp14:sizeRelH relativeFrom="margin">
+                        <wp14:pctWidth>0</wp14:pctWidth>
+                      </wp14:sizeRelH>
+                      <wp14:sizeRelV relativeFrom="margin">
+                        <wp14:pctHeight>20000</wp14:pctHeight>
+                      </wp14:sizeRelV>
+                    </wp:anchor>
+                  </w:drawing>
+                </mc:Choice>
+                <mc:Fallback>
+                  <w:pict>
+                    <v:shape w14:anchorId="653B4ED0" id="_x0000_s1030" type="#_x0000_t202" style="position:absolute;left:0;text-align:left;margin-left:234.85pt;margin-top:49pt;width:70.8pt;height:110.6pt;z-index:251757568;visibility:visible;mso-wrap-style:square;mso-width-percent:0;mso-height-percent:200;mso-wrap-distance-left:9pt;mso-wrap-distance-top:3.6pt;mso-wrap-distance-right:9pt;mso-wrap-distance-bottom:3.6pt;mso-position-horizontal:absolute;mso-position-horizontal-relative:text;mso-position-vertical:absolute;mso-position-vertical-relative:text;mso-width-percent:0;mso-height-percent:200;mso-width-relative:margin;mso-height-relative:margin;v-text-anchor:top" o:gfxdata="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" filled="f" stroked="f">
+                      <v:textbox style="mso-fit-shape-to-text:t">
+                        <w:txbxContent>
+                          <w:p>
+                            <w:pPr>
+                              <w:rPr>
+                                <w:sz w:val="16"/>
+                                <w:szCs w:val="16"/>
+                                <w:lang w:val="en-GB"/>
+                              </w:rPr>
+                            </w:pPr>
+                            <w:r>
+                              <w:rPr>
+                                <w:sz w:val="16"/>
+                                <w:szCs w:val="16"/>
+                                <w:lang w:val="en-GB"/>
+                              </w:rPr>
+                              <w:t xml:space="preserve">Right facing arrows indicate each row is interactive, leading to detailed permissions management for that specific user. </w:t>
+                            </w:r>
+                          </w:p>
+                        </w:txbxContent>
+                      </v:textbox>
+                    </v:shape>
+                  </w:pict>
+                </mc:Fallback>
+              </mc:AlternateContent>
+            </w:r>
+            <w:r>
+              <w:rPr>
+                <w:b/>
+                <w:bCs/>
+                <w:noProof/>
+                <w:sz w:val="18"/>
+                <w:szCs w:val="18"/>
+              </w:rPr>
+              <mc:AlternateContent>
+                <mc:Choice Requires="wps">
+                  <w:drawing>
+                    <wp:anchor distT="45720" distB="45720" distL="114300" distR="114300" simplePos="0" relativeHeight="251754496" behindDoc="0" locked="0" layoutInCell="1" allowOverlap="1" wp14:anchorId="0EC614DE" wp14:editId="6BA1726C">
+                      <wp:simplePos x="0" y="0"/>
+                      <wp:positionH relativeFrom="column">
+                        <wp:posOffset>-4445</wp:posOffset>
+                      </wp:positionH>
+                      <wp:positionV relativeFrom="paragraph">
+                        <wp:posOffset>704850</wp:posOffset>
+                      </wp:positionV>
+                      <wp:extent cx="1183640" cy="1282700"/>
+                      <wp:effectExtent l="0" t="0" r="0" b="0"/>
+                      <wp:wrapNone/>
+                      <wp:docPr id="47719294" name="Text Box 2"/>
+                      <wp:cNvGraphicFramePr>
+                        <a:graphicFrameLocks xmlns:a="http://schemas.openxmlformats.org/drawingml/2006/main"/>
+                      </wp:cNvGraphicFramePr>
+                      <a:graphic xmlns:a="http://schemas.openxmlformats.org/drawingml/2006/main">
+                        <a:graphicData uri="http://schemas.microsoft.com/office/word/2010/wordprocessingShape">
+                          <wps:wsp>
+                            <wps:cNvSpPr txBox="1">
+                              <a:spLocks noChangeArrowheads="1"/>
+                            </wps:cNvSpPr>
+                            <wps:spPr bwMode="auto">
+                              <a:xfrm>
+                                <a:off x="0" y="0"/>
+                                <a:ext cx="1183640" cy="1282700"/>
+                              </a:xfrm>
+                              <a:prstGeom prst="rect">
+                                <a:avLst/>
+                              </a:prstGeom>
+                              <a:noFill/>
+                              <a:ln w="9525">
+                                <a:noFill/>
+                                <a:miter lim="800000"/>
+                                <a:headEnd/>
+                                <a:tailEnd/>
+                              </a:ln>
+                            </wps:spPr>
+                            <wps:txbx>
+                              <w:txbxContent>
+                                <w:p>
+                                  <w:pPr>
+                                    <w:rPr>
+                                      <w:sz w:val="16"/>
+                                      <w:szCs w:val="16"/>
+                                      <w:lang w:val="en-GB"/>
+                                    </w:rPr>
+                                  </w:pPr>
+                                  <w:r>
+                                    <w:rPr>
+                                      <w:sz w:val="16"/>
+                                      <w:szCs w:val="16"/>
+                                      <w:lang w:val="en-GB"/>
+                                    </w:rPr>
+                                    <w:t xml:space="preserve">Displays officer names and unique IDs to ensure easy identification and security. </w:t>
+                                  </w:r>
+                                  <w:r>
+                                    <w:rPr>
+                                      <w:sz w:val="16"/>
+                                      <w:szCs w:val="16"/>
+                                      <w:lang w:val="en-GB"/>
+                                    </w:rPr>
+                                    <w:br/>
+                                    <w:t>placeholder icon represents potential officer photograph.</w:t>
+                                  </w:r>
+                                </w:p>
+                              </w:txbxContent>
+                            </wps:txbx>
+                            <wps:bodyPr rot="0" vert="horz" wrap="square" lIns="91440" tIns="45720" rIns="91440" bIns="45720" anchor="t" anchorCtr="0">
+                              <a:noAutofit/>
+                            </wps:bodyPr>
+                          </wps:wsp>
+                        </a:graphicData>
+                      </a:graphic>
+                      <wp14:sizeRelH relativeFrom="margin">
+                        <wp14:pctWidth>0</wp14:pctWidth>
+                      </wp14:sizeRelH>
+                      <wp14:sizeRelV relativeFrom="margin">
+                        <wp14:pctHeight>0</wp14:pctHeight>
+                      </wp14:sizeRelV>
+                    </wp:anchor>
+                  </w:drawing>
+                </mc:Choice>
+                <mc:Fallback>
+                  <w:pict>
+                    <v:shape w14:anchorId="0EC614DE" id="_x0000_s1031" type="#_x0000_t202" style="position:absolute;left:0;text-align:left;margin-left:-.35pt;margin-top:55.5pt;width:93.2pt;height:101pt;z-index:251754496;visibility:visible;mso-wrap-style:square;mso-width-percent:0;mso-height-percent:0;mso-wrap-distance-left:9pt;mso-wrap-distance-top:3.6pt;mso-wrap-distance-right:9pt;mso-wrap-distance-bottom:3.6pt;mso-position-horizontal:absolute;mso-position-horizontal-relative:text;mso-position-vertical:absolute;mso-position-vertical-relative:text;mso-width-percent:0;mso-height-percent:0;mso-width-relative:margin;mso-height-relative:margin;v-text-anchor:top" o:gfxdata="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" filled="f" stroked="f">
+                      <v:textbox>
+                        <w:txbxContent>
+                          <w:p>
+                            <w:pPr>
+                              <w:rPr>
+                                <w:sz w:val="16"/>
+                                <w:szCs w:val="16"/>
+                                <w:lang w:val="en-GB"/>
+                              </w:rPr>
+                            </w:pPr>
+                            <w:r>
+                              <w:rPr>
+                                <w:sz w:val="16"/>
+                                <w:szCs w:val="16"/>
+                                <w:lang w:val="en-GB"/>
+                              </w:rPr>
+                              <w:t xml:space="preserve">Displays officer names and unique IDs to ensure easy identification and security. </w:t>
+                            </w:r>
+                            <w:r>
+                              <w:rPr>
+                                <w:sz w:val="16"/>
+                                <w:szCs w:val="16"/>
+                                <w:lang w:val="en-GB"/>
+                              </w:rPr>
+                              <w:br/>
+                              <w:t>placeholder icon represents potential officer photograph.</w:t>
+                            </w:r>
+                          </w:p>
+                        </w:txbxContent>
+                      </v:textbox>
+                    </v:shape>
+                  </w:pict>
+                </mc:Fallback>
+              </mc:AlternateContent>
+            </w:r>
+            <w:r>
+              <w:rPr>
+                <w:b/>
+                <w:bCs/>
+                <w:noProof/>
+                <w:sz w:val="18"/>
+                <w:szCs w:val="18"/>
+              </w:rPr>
+              <mc:AlternateContent>
+                <mc:Choice Requires="wps">
+                  <w:drawing>
+                    <wp:anchor distT="0" distB="0" distL="114300" distR="114300" simplePos="0" relativeHeight="251755520" behindDoc="0" locked="0" layoutInCell="1" allowOverlap="1" wp14:anchorId="123FCDE2" wp14:editId="2BAF7A91">
+                      <wp:simplePos x="0" y="0"/>
+                      <wp:positionH relativeFrom="column">
+                        <wp:posOffset>1001395</wp:posOffset>
+                      </wp:positionH>
+                      <wp:positionV relativeFrom="paragraph">
+                        <wp:posOffset>1189925</wp:posOffset>
+                      </wp:positionV>
+                      <wp:extent cx="331160" cy="161364"/>
+                      <wp:effectExtent l="12700" t="12700" r="37465" b="29210"/>
+                      <wp:wrapNone/>
+                      <wp:docPr id="257054952" name="Straight Arrow Connector 6"/>
+                      <wp:cNvGraphicFramePr/>
+                      <a:graphic xmlns:a="http://schemas.openxmlformats.org/drawingml/2006/main">
+                        <a:graphicData uri="http://schemas.microsoft.com/office/word/2010/wordprocessingShape">
+                          <wps:wsp>
+                            <wps:cNvCnPr/>
+                            <wps:spPr>
+                              <a:xfrm>
+                                <a:off x="0" y="0"/>
+                                <a:ext cx="331160" cy="161364"/>
+                              </a:xfrm>
+                              <a:prstGeom prst="straightConnector1">
+                                <a:avLst/>
+                              </a:prstGeom>
+                              <a:ln>
+                                <a:solidFill>
+                                  <a:srgbClr val="EE0000"/>
+                                </a:solidFill>
+                                <a:tailEnd type="triangle"/>
+                              </a:ln>
+                            </wps:spPr>
+                            <wps:style>
+                              <a:lnRef idx="2">
+                                <a:schemeClr val="accent1"/>
+                              </a:lnRef>
+                              <a:fillRef idx="0">
+                                <a:schemeClr val="accent1"/>
+                              </a:fillRef>
+                              <a:effectRef idx="1">
+                                <a:schemeClr val="accent1"/>
+                              </a:effectRef>
+                              <a:fontRef idx="minor">
+                                <a:schemeClr val="tx1"/>
+                              </a:fontRef>
+                            </wps:style>
+                            <wps:bodyPr/>
+                          </wps:wsp>
+                        </a:graphicData>
+                      </a:graphic>
+                      <wp14:sizeRelH relativeFrom="margin">
+                        <wp14:pctWidth>0</wp14:pctWidth>
+                      </wp14:sizeRelH>
+                      <wp14:sizeRelV relativeFrom="margin">
+                        <wp14:pctHeight>0</wp14:pctHeight>
+                      </wp14:sizeRelV>
+                    </wp:anchor>
+                  </w:drawing>
+                </mc:Choice>
+                <mc:Fallback>
+                  <w:pict>
+                    <v:shape w14:anchorId="4D9844A5" id="Straight Arrow Connector 6" o:spid="_x0000_s1026" type="#_x0000_t32" style="position:absolute;margin-left:78.85pt;margin-top:93.7pt;width:26.1pt;height:12.7pt;z-index:251755520;visibility:visible;mso-wrap-style:square;mso-width-percent:0;mso-height-percent:0;mso-wrap-distance-left:9pt;mso-wrap-distance-top:0;mso-wrap-distance-right:9pt;mso-wrap-distance-bottom:0;mso-position-horizontal:absolute;mso-position-horizontal-relative:text;mso-position-vertical:absolute;mso-position-vertical-relative:text;mso-width-percent:0;mso-height-percent:0;mso-width-relative:margin;mso-height-relative:margin" o:gfxdata="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" strokecolor="#e00" strokeweight="1.5pt">
+                      <v:stroke endarrow="block" joinstyle="miter"/>
+                    </v:shape>
+                  </w:pict>
+                </mc:Fallback>
+              </mc:AlternateContent>
+            </w:r>
+            <w:r>
+              <w:rPr>
+                <w:b/>
+                <w:bCs/>
+                <w:noProof/>
+                <w:sz w:val="18"/>
+                <w:szCs w:val="18"/>
+              </w:rPr>
+              <w:drawing>
+                <wp:anchor distT="0" distB="0" distL="114300" distR="114300" simplePos="0" relativeHeight="251737088" behindDoc="1" locked="0" layoutInCell="1" allowOverlap="1" wp14:anchorId="3CDC4A66" wp14:editId="63E96360">
+                  <wp:simplePos x="0" y="0"/>
+                  <wp:positionH relativeFrom="column">
+                    <wp:posOffset>1176655</wp:posOffset>
+                  </wp:positionH>
+                  <wp:positionV relativeFrom="page">
+                    <wp:posOffset>1295400</wp:posOffset>
+                  </wp:positionV>
+                  <wp:extent cx="1706245" cy="3027045"/>
+                  <wp:effectExtent l="0" t="0" r="0" b="0"/>
+                  <wp:wrapTight wrapText="bothSides">
+                    <wp:wrapPolygon edited="0">
+                      <wp:start x="0" y="0"/>
+                      <wp:lineTo x="0" y="21478"/>
+                      <wp:lineTo x="21383" y="21478"/>
+                      <wp:lineTo x="21383" y="0"/>
+                      <wp:lineTo x="0" y="0"/>
+                    </wp:wrapPolygon>
+                  </wp:wrapTight>
+                  <wp:docPr id="403337382" name="Picture 35" descr="A screenshot of a cell phone&#10;&#10;AI-generated content may be incorrect."/>
+                  <wp:cNvGraphicFramePr>
+                    <a:graphicFrameLocks xmlns:a="http://schemas.openxmlformats.org/drawingml/2006/main" noChangeAspect="1"/>
+                  </wp:cNvGraphicFramePr>
+                  <a:graphic xmlns:a="http://schemas.openxmlformats.org/drawingml/2006/main">
+                    <a:graphicData uri="http://schemas.openxmlformats.org/drawingml/2006/picture">
+                      <pic:pic xmlns:pic="http://schemas.openxmlformats.org/drawingml/2006/picture">
+                        <pic:nvPicPr>
+                          <pic:cNvPr id="403337382" name="Picture 35" descr="A screenshot of a cell phone&#10;&#10;AI-generated content may be incorrect."/>
+                          <pic:cNvPicPr/>
+                        </pic:nvPicPr>
+                        <pic:blipFill>
+                          <a:blip r:embed="rId6">
+                            <a:extLst>
+                              <a:ext uri="{28A0092B-C50C-407E-A947-70E740481C1C}">
+                                <a14:useLocalDpi xmlns:a14="http://schemas.microsoft.com/office/drawing/2010/main" val="0"/>
+                              </a:ext>
+                            </a:extLst>
+                          </a:blip>
+                          <a:stretch>
+                            <a:fillRect/>
+                          </a:stretch>
+                        </pic:blipFill>
+                        <pic:spPr>
+                          <a:xfrm>
+                            <a:off x="0" y="0"/>
+                            <a:ext cx="1706245" cy="3027045"/>
+                          </a:xfrm>
+                          <a:prstGeom prst="rect">
+                            <a:avLst/>
+                          </a:prstGeom>
+                        </pic:spPr>
+                      </pic:pic>
+                    </a:graphicData>
+                  </a:graphic>
+                  <wp14:sizeRelH relativeFrom="page">
+                    <wp14:pctWidth>0</wp14:pctWidth>
+                  </wp14:sizeRelH>
+                  <wp14:sizeRelV relativeFrom="page">
+                    <wp14:pctHeight>0</wp14:pctHeight>
+                  </wp14:sizeRelV>
+                </wp:anchor>
+              </w:drawing>
+            </w:r>
           </w:p>
         </w:tc>
       </w:tr>
       <w:tr>
-        <w:tblPrEx>
-          <w:tblCellMar>
-            <w:top w:w="0" w:type="dxa"/>
-            <w:bottom w:w="0" w:type="dxa"/>
-          </w:tblCellMar>
-        </w:tblPrEx>
         <w:trPr>
           <w:cantSplit/>
           <w:trHeight w:hRule="exact" w:val="7920"/>
@@ -89,6 +1617,742 @@
                 <w:szCs w:val="18"/>
               </w:rPr>
             </w:pPr>
+            <w:r>
+              <w:rPr>
+                <w:b/>
+                <w:bCs/>
+                <w:sz w:val="18"/>
+                <w:szCs w:val="18"/>
+              </w:rPr>
+              <w:t>User Story 3</w:t>
+            </w:r>
+            <w:r>
+              <w:rPr>
+                <w:sz w:val="18"/>
+                <w:szCs w:val="18"/>
+              </w:rPr>
+              <w:t xml:space="preserve"> – As </w:t>
+            </w:r>
+            <w:r>
+              <w:rPr>
+                <w:sz w:val="18"/>
+                <w:szCs w:val="18"/>
+              </w:rPr>
+              <w:t>a public user, I want to receive a reference number after submitting a report so that I can follow up on it later.</w:t>
+            </w:r>
+          </w:p>
+          <w:p>
+            <w:pPr>
+              <w:ind w:left="144" w:right="144"/>
+              <w:rPr>
+                <w:b/>
+                <w:bCs/>
+                <w:sz w:val="18"/>
+                <w:szCs w:val="18"/>
+              </w:rPr>
+            </w:pPr>
+            <w:r>
+              <w:rPr>
+                <w:b/>
+                <w:bCs/>
+                <w:sz w:val="18"/>
+                <w:szCs w:val="18"/>
+              </w:rPr>
+              <w:t xml:space="preserve">Author: </w:t>
+            </w:r>
+            <w:r>
+              <w:rPr>
+                <w:sz w:val="18"/>
+                <w:szCs w:val="18"/>
+              </w:rPr>
+              <w:t>Jack</w:t>
+            </w:r>
+          </w:p>
+          <w:p>
+            <w:pPr>
+              <w:ind w:left="144" w:right="144"/>
+              <w:rPr>
+                <w:b/>
+                <w:bCs/>
+                <w:sz w:val="18"/>
+                <w:szCs w:val="18"/>
+              </w:rPr>
+            </w:pPr>
+          </w:p>
+          <w:p>
+            <w:pPr>
+              <w:ind w:left="144" w:right="144"/>
+              <w:rPr>
+                <w:b/>
+                <w:bCs/>
+                <w:sz w:val="18"/>
+                <w:szCs w:val="18"/>
+              </w:rPr>
+            </w:pPr>
+            <w:r>
+              <w:rPr>
+                <w:b/>
+                <w:bCs/>
+                <w:noProof/>
+                <w:sz w:val="18"/>
+                <w:szCs w:val="18"/>
+              </w:rPr>
+              <mc:AlternateContent>
+                <mc:Choice Requires="wps">
+                  <w:drawing>
+                    <wp:anchor distT="0" distB="0" distL="114300" distR="114300" simplePos="0" relativeHeight="251777024" behindDoc="0" locked="0" layoutInCell="1" allowOverlap="1" wp14:anchorId="3AC5C63C" wp14:editId="0851B8BA">
+                      <wp:simplePos x="0" y="0"/>
+                      <wp:positionH relativeFrom="column">
+                        <wp:posOffset>1019567</wp:posOffset>
+                      </wp:positionH>
+                      <wp:positionV relativeFrom="paragraph">
+                        <wp:posOffset>2200446</wp:posOffset>
+                      </wp:positionV>
+                      <wp:extent cx="387993" cy="94893"/>
+                      <wp:effectExtent l="12700" t="50800" r="0" b="19685"/>
+                      <wp:wrapNone/>
+                      <wp:docPr id="192896975" name="Straight Arrow Connector 6"/>
+                      <wp:cNvGraphicFramePr/>
+                      <a:graphic xmlns:a="http://schemas.openxmlformats.org/drawingml/2006/main">
+                        <a:graphicData uri="http://schemas.microsoft.com/office/word/2010/wordprocessingShape">
+                          <wps:wsp>
+                            <wps:cNvCnPr/>
+                            <wps:spPr>
+                              <a:xfrm flipV="1">
+                                <a:off x="0" y="0"/>
+                                <a:ext cx="387993" cy="94893"/>
+                              </a:xfrm>
+                              <a:prstGeom prst="straightConnector1">
+                                <a:avLst/>
+                              </a:prstGeom>
+                              <a:ln>
+                                <a:solidFill>
+                                  <a:srgbClr val="EE0000"/>
+                                </a:solidFill>
+                                <a:tailEnd type="triangle"/>
+                              </a:ln>
+                            </wps:spPr>
+                            <wps:style>
+                              <a:lnRef idx="2">
+                                <a:schemeClr val="accent1"/>
+                              </a:lnRef>
+                              <a:fillRef idx="0">
+                                <a:schemeClr val="accent1"/>
+                              </a:fillRef>
+                              <a:effectRef idx="1">
+                                <a:schemeClr val="accent1"/>
+                              </a:effectRef>
+                              <a:fontRef idx="minor">
+                                <a:schemeClr val="tx1"/>
+                              </a:fontRef>
+                            </wps:style>
+                            <wps:bodyPr/>
+                          </wps:wsp>
+                        </a:graphicData>
+                      </a:graphic>
+                      <wp14:sizeRelH relativeFrom="margin">
+                        <wp14:pctWidth>0</wp14:pctWidth>
+                      </wp14:sizeRelH>
+                      <wp14:sizeRelV relativeFrom="margin">
+                        <wp14:pctHeight>0</wp14:pctHeight>
+                      </wp14:sizeRelV>
+                    </wp:anchor>
+                  </w:drawing>
+                </mc:Choice>
+                <mc:Fallback>
+                  <w:pict>
+                    <v:shape w14:anchorId="4FC23DE8" id="Straight Arrow Connector 6" o:spid="_x0000_s1026" type="#_x0000_t32" style="position:absolute;margin-left:80.3pt;margin-top:173.25pt;width:30.55pt;height:7.45pt;flip:y;z-index:251777024;visibility:visible;mso-wrap-style:square;mso-width-percent:0;mso-height-percent:0;mso-wrap-distance-left:9pt;mso-wrap-distance-top:0;mso-wrap-distance-right:9pt;mso-wrap-distance-bottom:0;mso-position-horizontal:absolute;mso-position-horizontal-relative:text;mso-position-vertical:absolute;mso-position-vertical-relative:text;mso-width-percent:0;mso-height-percent:0;mso-width-relative:margin;mso-height-relative:margin" o:gfxdata="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" strokecolor="#e00" strokeweight="1.5pt">
+                      <v:stroke endarrow="block" joinstyle="miter"/>
+                    </v:shape>
+                  </w:pict>
+                </mc:Fallback>
+              </mc:AlternateContent>
+            </w:r>
+            <w:r>
+              <w:rPr>
+                <w:b/>
+                <w:bCs/>
+                <w:noProof/>
+                <w:sz w:val="18"/>
+                <w:szCs w:val="18"/>
+              </w:rPr>
+              <mc:AlternateContent>
+                <mc:Choice Requires="wps">
+                  <w:drawing>
+                    <wp:anchor distT="45720" distB="45720" distL="114300" distR="114300" simplePos="0" relativeHeight="251776000" behindDoc="0" locked="0" layoutInCell="1" allowOverlap="1" wp14:anchorId="266719B1" wp14:editId="38D2C163">
+                      <wp:simplePos x="0" y="0"/>
+                      <wp:positionH relativeFrom="column">
+                        <wp:posOffset>61645</wp:posOffset>
+                      </wp:positionH>
+                      <wp:positionV relativeFrom="paragraph">
+                        <wp:posOffset>1902496</wp:posOffset>
+                      </wp:positionV>
+                      <wp:extent cx="1037590" cy="1119883"/>
+                      <wp:effectExtent l="0" t="0" r="0" b="0"/>
+                      <wp:wrapNone/>
+                      <wp:docPr id="1615379670" name="Text Box 2"/>
+                      <wp:cNvGraphicFramePr>
+                        <a:graphicFrameLocks xmlns:a="http://schemas.openxmlformats.org/drawingml/2006/main"/>
+                      </wp:cNvGraphicFramePr>
+                      <a:graphic xmlns:a="http://schemas.openxmlformats.org/drawingml/2006/main">
+                        <a:graphicData uri="http://schemas.microsoft.com/office/word/2010/wordprocessingShape">
+                          <wps:wsp>
+                            <wps:cNvSpPr txBox="1">
+                              <a:spLocks noChangeArrowheads="1"/>
+                            </wps:cNvSpPr>
+                            <wps:spPr bwMode="auto">
+                              <a:xfrm>
+                                <a:off x="0" y="0"/>
+                                <a:ext cx="1037590" cy="1119883"/>
+                              </a:xfrm>
+                              <a:prstGeom prst="rect">
+                                <a:avLst/>
+                              </a:prstGeom>
+                              <a:noFill/>
+                              <a:ln w="9525">
+                                <a:noFill/>
+                                <a:miter lim="800000"/>
+                                <a:headEnd/>
+                                <a:tailEnd/>
+                              </a:ln>
+                            </wps:spPr>
+                            <wps:txbx>
+                              <w:txbxContent>
+                                <w:p>
+                                  <w:pPr>
+                                    <w:rPr>
+                                      <w:sz w:val="16"/>
+                                      <w:szCs w:val="16"/>
+                                      <w:lang w:val="en-GB"/>
+                                    </w:rPr>
+                                  </w:pPr>
+                                  <w:r>
+                                    <w:rPr>
+                                      <w:sz w:val="16"/>
+                                      <w:szCs w:val="16"/>
+                                      <w:lang w:val="en-GB"/>
+                                    </w:rPr>
+                                    <w:t xml:space="preserve">Submission details establish an official record of the submission for both the user and the officers. </w:t>
+                                  </w:r>
+                                </w:p>
+                              </w:txbxContent>
+                            </wps:txbx>
+                            <wps:bodyPr rot="0" vert="horz" wrap="square" lIns="91440" tIns="45720" rIns="91440" bIns="45720" anchor="t" anchorCtr="0">
+                              <a:noAutofit/>
+                            </wps:bodyPr>
+                          </wps:wsp>
+                        </a:graphicData>
+                      </a:graphic>
+                      <wp14:sizeRelH relativeFrom="margin">
+                        <wp14:pctWidth>0</wp14:pctWidth>
+                      </wp14:sizeRelH>
+                      <wp14:sizeRelV relativeFrom="margin">
+                        <wp14:pctHeight>0</wp14:pctHeight>
+                      </wp14:sizeRelV>
+                    </wp:anchor>
+                  </w:drawing>
+                </mc:Choice>
+                <mc:Fallback>
+                  <w:pict>
+                    <v:shape w14:anchorId="266719B1" id="_x0000_s1032" type="#_x0000_t202" style="position:absolute;left:0;text-align:left;margin-left:4.85pt;margin-top:149.8pt;width:81.7pt;height:88.2pt;z-index:251776000;visibility:visible;mso-wrap-style:square;mso-width-percent:0;mso-height-percent:0;mso-wrap-distance-left:9pt;mso-wrap-distance-top:3.6pt;mso-wrap-distance-right:9pt;mso-wrap-distance-bottom:3.6pt;mso-position-horizontal:absolute;mso-position-horizontal-relative:text;mso-position-vertical:absolute;mso-position-vertical-relative:text;mso-width-percent:0;mso-height-percent:0;mso-width-relative:margin;mso-height-relative:margin;v-text-anchor:top" o:gfxdata="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" filled="f" stroked="f">
+                      <v:textbox>
+                        <w:txbxContent>
+                          <w:p>
+                            <w:pPr>
+                              <w:rPr>
+                                <w:sz w:val="16"/>
+                                <w:szCs w:val="16"/>
+                                <w:lang w:val="en-GB"/>
+                              </w:rPr>
+                            </w:pPr>
+                            <w:r>
+                              <w:rPr>
+                                <w:sz w:val="16"/>
+                                <w:szCs w:val="16"/>
+                                <w:lang w:val="en-GB"/>
+                              </w:rPr>
+                              <w:t xml:space="preserve">Submission details establish an official record of the submission for both the user and the officers. </w:t>
+                            </w:r>
+                          </w:p>
+                        </w:txbxContent>
+                      </v:textbox>
+                    </v:shape>
+                  </w:pict>
+                </mc:Fallback>
+              </mc:AlternateContent>
+            </w:r>
+            <w:r>
+              <w:rPr>
+                <w:b/>
+                <w:bCs/>
+                <w:noProof/>
+                <w:sz w:val="18"/>
+                <w:szCs w:val="18"/>
+              </w:rPr>
+              <mc:AlternateContent>
+                <mc:Choice Requires="wps">
+                  <w:drawing>
+                    <wp:anchor distT="0" distB="0" distL="114300" distR="114300" simplePos="0" relativeHeight="251773952" behindDoc="0" locked="0" layoutInCell="1" allowOverlap="1" wp14:anchorId="0D443C14" wp14:editId="31B9D95E">
+                      <wp:simplePos x="0" y="0"/>
+                      <wp:positionH relativeFrom="column">
+                        <wp:posOffset>2383155</wp:posOffset>
+                      </wp:positionH>
+                      <wp:positionV relativeFrom="paragraph">
+                        <wp:posOffset>1633855</wp:posOffset>
+                      </wp:positionV>
+                      <wp:extent cx="418465" cy="84455"/>
+                      <wp:effectExtent l="0" t="50800" r="13335" b="17145"/>
+                      <wp:wrapNone/>
+                      <wp:docPr id="516516437" name="Straight Arrow Connector 6"/>
+                      <wp:cNvGraphicFramePr/>
+                      <a:graphic xmlns:a="http://schemas.openxmlformats.org/drawingml/2006/main">
+                        <a:graphicData uri="http://schemas.microsoft.com/office/word/2010/wordprocessingShape">
+                          <wps:wsp>
+                            <wps:cNvCnPr/>
+                            <wps:spPr>
+                              <a:xfrm flipH="1" flipV="1">
+                                <a:off x="0" y="0"/>
+                                <a:ext cx="418465" cy="84455"/>
+                              </a:xfrm>
+                              <a:prstGeom prst="straightConnector1">
+                                <a:avLst/>
+                              </a:prstGeom>
+                              <a:ln>
+                                <a:solidFill>
+                                  <a:srgbClr val="EE0000"/>
+                                </a:solidFill>
+                                <a:tailEnd type="triangle"/>
+                              </a:ln>
+                            </wps:spPr>
+                            <wps:style>
+                              <a:lnRef idx="2">
+                                <a:schemeClr val="accent1"/>
+                              </a:lnRef>
+                              <a:fillRef idx="0">
+                                <a:schemeClr val="accent1"/>
+                              </a:fillRef>
+                              <a:effectRef idx="1">
+                                <a:schemeClr val="accent1"/>
+                              </a:effectRef>
+                              <a:fontRef idx="minor">
+                                <a:schemeClr val="tx1"/>
+                              </a:fontRef>
+                            </wps:style>
+                            <wps:bodyPr/>
+                          </wps:wsp>
+                        </a:graphicData>
+                      </a:graphic>
+                      <wp14:sizeRelH relativeFrom="margin">
+                        <wp14:pctWidth>0</wp14:pctWidth>
+                      </wp14:sizeRelH>
+                      <wp14:sizeRelV relativeFrom="margin">
+                        <wp14:pctHeight>0</wp14:pctHeight>
+                      </wp14:sizeRelV>
+                    </wp:anchor>
+                  </w:drawing>
+                </mc:Choice>
+                <mc:Fallback>
+                  <w:pict>
+                    <v:shape w14:anchorId="54C059BE" id="Straight Arrow Connector 6" o:spid="_x0000_s1026" type="#_x0000_t32" style="position:absolute;margin-left:187.65pt;margin-top:128.65pt;width:32.95pt;height:6.65pt;flip:x y;z-index:251773952;visibility:visible;mso-wrap-style:square;mso-width-percent:0;mso-height-percent:0;mso-wrap-distance-left:9pt;mso-wrap-distance-top:0;mso-wrap-distance-right:9pt;mso-wrap-distance-bottom:0;mso-position-horizontal:absolute;mso-position-horizontal-relative:text;mso-position-vertical:absolute;mso-position-vertical-relative:text;mso-width-percent:0;mso-height-percent:0;mso-width-relative:margin;mso-height-relative:margin" o:gfxdata="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" strokecolor="#e00" strokeweight="1.5pt">
+                      <v:stroke endarrow="block" joinstyle="miter"/>
+                    </v:shape>
+                  </w:pict>
+                </mc:Fallback>
+              </mc:AlternateContent>
+            </w:r>
+            <w:r>
+              <w:rPr>
+                <w:b/>
+                <w:bCs/>
+                <w:noProof/>
+                <w:sz w:val="18"/>
+                <w:szCs w:val="18"/>
+              </w:rPr>
+              <mc:AlternateContent>
+                <mc:Choice Requires="wps">
+                  <w:drawing>
+                    <wp:anchor distT="45720" distB="45720" distL="114300" distR="114300" simplePos="0" relativeHeight="251772928" behindDoc="0" locked="0" layoutInCell="1" allowOverlap="1" wp14:anchorId="4B96C39F" wp14:editId="41D4AECF">
+                      <wp:simplePos x="0" y="0"/>
+                      <wp:positionH relativeFrom="column">
+                        <wp:posOffset>2854076</wp:posOffset>
+                      </wp:positionH>
+                      <wp:positionV relativeFrom="paragraph">
+                        <wp:posOffset>1207485</wp:posOffset>
+                      </wp:positionV>
+                      <wp:extent cx="949895" cy="1404620"/>
+                      <wp:effectExtent l="0" t="0" r="0" b="0"/>
+                      <wp:wrapNone/>
+                      <wp:docPr id="583698153" name="Text Box 2"/>
+                      <wp:cNvGraphicFramePr>
+                        <a:graphicFrameLocks xmlns:a="http://schemas.openxmlformats.org/drawingml/2006/main"/>
+                      </wp:cNvGraphicFramePr>
+                      <a:graphic xmlns:a="http://schemas.openxmlformats.org/drawingml/2006/main">
+                        <a:graphicData uri="http://schemas.microsoft.com/office/word/2010/wordprocessingShape">
+                          <wps:wsp>
+                            <wps:cNvSpPr txBox="1">
+                              <a:spLocks noChangeArrowheads="1"/>
+                            </wps:cNvSpPr>
+                            <wps:spPr bwMode="auto">
+                              <a:xfrm>
+                                <a:off x="0" y="0"/>
+                                <a:ext cx="949895" cy="1404620"/>
+                              </a:xfrm>
+                              <a:prstGeom prst="rect">
+                                <a:avLst/>
+                              </a:prstGeom>
+                              <a:noFill/>
+                              <a:ln w="9525">
+                                <a:noFill/>
+                                <a:miter lim="800000"/>
+                                <a:headEnd/>
+                                <a:tailEnd/>
+                              </a:ln>
+                            </wps:spPr>
+                            <wps:txbx>
+                              <w:txbxContent>
+                                <w:p>
+                                  <w:pPr>
+                                    <w:rPr>
+                                      <w:sz w:val="16"/>
+                                      <w:szCs w:val="16"/>
+                                      <w:lang w:val="en-GB"/>
+                                    </w:rPr>
+                                  </w:pPr>
+                                  <w:r>
+                                    <w:rPr>
+                                      <w:sz w:val="16"/>
+                                      <w:szCs w:val="16"/>
+                                      <w:lang w:val="en-GB"/>
+                                    </w:rPr>
+                                    <w:t xml:space="preserve">A unique code is generated and provided so the public user can reference the report for future communication with the police. </w:t>
+                                  </w:r>
+                                </w:p>
+                              </w:txbxContent>
+                            </wps:txbx>
+                            <wps:bodyPr rot="0" vert="horz" wrap="square" lIns="91440" tIns="45720" rIns="91440" bIns="45720" anchor="t" anchorCtr="0">
+                              <a:spAutoFit/>
+                            </wps:bodyPr>
+                          </wps:wsp>
+                        </a:graphicData>
+                      </a:graphic>
+                      <wp14:sizeRelH relativeFrom="margin">
+                        <wp14:pctWidth>0</wp14:pctWidth>
+                      </wp14:sizeRelH>
+                      <wp14:sizeRelV relativeFrom="margin">
+                        <wp14:pctHeight>20000</wp14:pctHeight>
+                      </wp14:sizeRelV>
+                    </wp:anchor>
+                  </w:drawing>
+                </mc:Choice>
+                <mc:Fallback>
+                  <w:pict>
+                    <v:shape w14:anchorId="4B96C39F" id="_x0000_s1033" type="#_x0000_t202" style="position:absolute;left:0;text-align:left;margin-left:224.75pt;margin-top:95.1pt;width:74.8pt;height:110.6pt;z-index:251772928;visibility:visible;mso-wrap-style:square;mso-width-percent:0;mso-height-percent:200;mso-wrap-distance-left:9pt;mso-wrap-distance-top:3.6pt;mso-wrap-distance-right:9pt;mso-wrap-distance-bottom:3.6pt;mso-position-horizontal:absolute;mso-position-horizontal-relative:text;mso-position-vertical:absolute;mso-position-vertical-relative:text;mso-width-percent:0;mso-height-percent:200;mso-width-relative:margin;mso-height-relative:margin;v-text-anchor:top" o:gfxdata="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" filled="f" stroked="f">
+                      <v:textbox style="mso-fit-shape-to-text:t">
+                        <w:txbxContent>
+                          <w:p>
+                            <w:pPr>
+                              <w:rPr>
+                                <w:sz w:val="16"/>
+                                <w:szCs w:val="16"/>
+                                <w:lang w:val="en-GB"/>
+                              </w:rPr>
+                            </w:pPr>
+                            <w:r>
+                              <w:rPr>
+                                <w:sz w:val="16"/>
+                                <w:szCs w:val="16"/>
+                                <w:lang w:val="en-GB"/>
+                              </w:rPr>
+                              <w:t xml:space="preserve">A unique code is generated and provided so the public user can reference the report for future communication with the police. </w:t>
+                            </w:r>
+                          </w:p>
+                        </w:txbxContent>
+                      </v:textbox>
+                    </v:shape>
+                  </w:pict>
+                </mc:Fallback>
+              </mc:AlternateContent>
+            </w:r>
+            <w:r>
+              <w:rPr>
+                <w:b/>
+                <w:bCs/>
+                <w:noProof/>
+                <w:sz w:val="18"/>
+                <w:szCs w:val="18"/>
+              </w:rPr>
+              <mc:AlternateContent>
+                <mc:Choice Requires="wps">
+                  <w:drawing>
+                    <wp:anchor distT="45720" distB="45720" distL="114300" distR="114300" simplePos="0" relativeHeight="251769856" behindDoc="0" locked="0" layoutInCell="1" allowOverlap="1" wp14:anchorId="7212F7D0" wp14:editId="10E9FC46">
+                      <wp:simplePos x="0" y="0"/>
+                      <wp:positionH relativeFrom="column">
+                        <wp:posOffset>61645</wp:posOffset>
+                      </wp:positionH>
+                      <wp:positionV relativeFrom="paragraph">
+                        <wp:posOffset>618226</wp:posOffset>
+                      </wp:positionV>
+                      <wp:extent cx="1037590" cy="1119883"/>
+                      <wp:effectExtent l="0" t="0" r="0" b="0"/>
+                      <wp:wrapNone/>
+                      <wp:docPr id="23990063" name="Text Box 2"/>
+                      <wp:cNvGraphicFramePr>
+                        <a:graphicFrameLocks xmlns:a="http://schemas.openxmlformats.org/drawingml/2006/main"/>
+                      </wp:cNvGraphicFramePr>
+                      <a:graphic xmlns:a="http://schemas.openxmlformats.org/drawingml/2006/main">
+                        <a:graphicData uri="http://schemas.microsoft.com/office/word/2010/wordprocessingShape">
+                          <wps:wsp>
+                            <wps:cNvSpPr txBox="1">
+                              <a:spLocks noChangeArrowheads="1"/>
+                            </wps:cNvSpPr>
+                            <wps:spPr bwMode="auto">
+                              <a:xfrm>
+                                <a:off x="0" y="0"/>
+                                <a:ext cx="1037590" cy="1119883"/>
+                              </a:xfrm>
+                              <a:prstGeom prst="rect">
+                                <a:avLst/>
+                              </a:prstGeom>
+                              <a:noFill/>
+                              <a:ln w="9525">
+                                <a:noFill/>
+                                <a:miter lim="800000"/>
+                                <a:headEnd/>
+                                <a:tailEnd/>
+                              </a:ln>
+                            </wps:spPr>
+                            <wps:txbx>
+                              <w:txbxContent>
+                                <w:p>
+                                  <w:pPr>
+                                    <w:rPr>
+                                      <w:sz w:val="16"/>
+                                      <w:szCs w:val="16"/>
+                                      <w:lang w:val="en-GB"/>
+                                    </w:rPr>
+                                  </w:pPr>
+                                  <w:r>
+                                    <w:rPr>
+                                      <w:sz w:val="16"/>
+                                      <w:szCs w:val="16"/>
+                                      <w:lang w:val="en-GB"/>
+                                    </w:rPr>
+                                    <w:t>An overlay pop-up that appears after a submission, providing instant feedback that the report was received.</w:t>
+                                  </w:r>
+                                  <w:r>
+                                    <w:rPr>
+                                      <w:sz w:val="16"/>
+                                      <w:szCs w:val="16"/>
+                                      <w:lang w:val="en-GB"/>
+                                    </w:rPr>
+                                    <w:t xml:space="preserve">  </w:t>
+                                  </w:r>
+                                </w:p>
+                              </w:txbxContent>
+                            </wps:txbx>
+                            <wps:bodyPr rot="0" vert="horz" wrap="square" lIns="91440" tIns="45720" rIns="91440" bIns="45720" anchor="t" anchorCtr="0">
+                              <a:noAutofit/>
+                            </wps:bodyPr>
+                          </wps:wsp>
+                        </a:graphicData>
+                      </a:graphic>
+                      <wp14:sizeRelH relativeFrom="margin">
+                        <wp14:pctWidth>0</wp14:pctWidth>
+                      </wp14:sizeRelH>
+                      <wp14:sizeRelV relativeFrom="margin">
+                        <wp14:pctHeight>0</wp14:pctHeight>
+                      </wp14:sizeRelV>
+                    </wp:anchor>
+                  </w:drawing>
+                </mc:Choice>
+                <mc:Fallback>
+                  <w:pict>
+                    <v:shape w14:anchorId="7212F7D0" id="_x0000_s1034" type="#_x0000_t202" style="position:absolute;left:0;text-align:left;margin-left:4.85pt;margin-top:48.7pt;width:81.7pt;height:88.2pt;z-index:251769856;visibility:visible;mso-wrap-style:square;mso-width-percent:0;mso-height-percent:0;mso-wrap-distance-left:9pt;mso-wrap-distance-top:3.6pt;mso-wrap-distance-right:9pt;mso-wrap-distance-bottom:3.6pt;mso-position-horizontal:absolute;mso-position-horizontal-relative:text;mso-position-vertical:absolute;mso-position-vertical-relative:text;mso-width-percent:0;mso-height-percent:0;mso-width-relative:margin;mso-height-relative:margin;v-text-anchor:top" o:gfxdata="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" filled="f" stroked="f">
+                      <v:textbox>
+                        <w:txbxContent>
+                          <w:p>
+                            <w:pPr>
+                              <w:rPr>
+                                <w:sz w:val="16"/>
+                                <w:szCs w:val="16"/>
+                                <w:lang w:val="en-GB"/>
+                              </w:rPr>
+                            </w:pPr>
+                            <w:r>
+                              <w:rPr>
+                                <w:sz w:val="16"/>
+                                <w:szCs w:val="16"/>
+                                <w:lang w:val="en-GB"/>
+                              </w:rPr>
+                              <w:t>An overlay pop-up that appears after a submission, providing instant feedback that the report was received.</w:t>
+                            </w:r>
+                            <w:r>
+                              <w:rPr>
+                                <w:sz w:val="16"/>
+                                <w:szCs w:val="16"/>
+                                <w:lang w:val="en-GB"/>
+                              </w:rPr>
+                              <w:t xml:space="preserve">  </w:t>
+                            </w:r>
+                          </w:p>
+                        </w:txbxContent>
+                      </v:textbox>
+                    </v:shape>
+                  </w:pict>
+                </mc:Fallback>
+              </mc:AlternateContent>
+            </w:r>
+            <w:r>
+              <w:rPr>
+                <w:b/>
+                <w:bCs/>
+                <w:noProof/>
+                <w:sz w:val="18"/>
+                <w:szCs w:val="18"/>
+              </w:rPr>
+              <mc:AlternateContent>
+                <mc:Choice Requires="wps">
+                  <w:drawing>
+                    <wp:anchor distT="0" distB="0" distL="114300" distR="114300" simplePos="0" relativeHeight="251770880" behindDoc="0" locked="0" layoutInCell="1" allowOverlap="1" wp14:anchorId="5FEB6093" wp14:editId="7B7FC4B2">
+                      <wp:simplePos x="0" y="0"/>
+                      <wp:positionH relativeFrom="column">
+                        <wp:posOffset>1019567</wp:posOffset>
+                      </wp:positionH>
+                      <wp:positionV relativeFrom="paragraph">
+                        <wp:posOffset>1041893</wp:posOffset>
+                      </wp:positionV>
+                      <wp:extent cx="501008" cy="92468"/>
+                      <wp:effectExtent l="12700" t="12700" r="20320" b="47625"/>
+                      <wp:wrapNone/>
+                      <wp:docPr id="750530311" name="Straight Arrow Connector 6"/>
+                      <wp:cNvGraphicFramePr/>
+                      <a:graphic xmlns:a="http://schemas.openxmlformats.org/drawingml/2006/main">
+                        <a:graphicData uri="http://schemas.microsoft.com/office/word/2010/wordprocessingShape">
+                          <wps:wsp>
+                            <wps:cNvCnPr/>
+                            <wps:spPr>
+                              <a:xfrm>
+                                <a:off x="0" y="0"/>
+                                <a:ext cx="501008" cy="92468"/>
+                              </a:xfrm>
+                              <a:prstGeom prst="straightConnector1">
+                                <a:avLst/>
+                              </a:prstGeom>
+                              <a:ln>
+                                <a:solidFill>
+                                  <a:srgbClr val="EE0000"/>
+                                </a:solidFill>
+                                <a:tailEnd type="triangle"/>
+                              </a:ln>
+                            </wps:spPr>
+                            <wps:style>
+                              <a:lnRef idx="2">
+                                <a:schemeClr val="accent1"/>
+                              </a:lnRef>
+                              <a:fillRef idx="0">
+                                <a:schemeClr val="accent1"/>
+                              </a:fillRef>
+                              <a:effectRef idx="1">
+                                <a:schemeClr val="accent1"/>
+                              </a:effectRef>
+                              <a:fontRef idx="minor">
+                                <a:schemeClr val="tx1"/>
+                              </a:fontRef>
+                            </wps:style>
+                            <wps:bodyPr/>
+                          </wps:wsp>
+                        </a:graphicData>
+                      </a:graphic>
+                      <wp14:sizeRelH relativeFrom="margin">
+                        <wp14:pctWidth>0</wp14:pctWidth>
+                      </wp14:sizeRelH>
+                      <wp14:sizeRelV relativeFrom="margin">
+                        <wp14:pctHeight>0</wp14:pctHeight>
+                      </wp14:sizeRelV>
+                    </wp:anchor>
+                  </w:drawing>
+                </mc:Choice>
+                <mc:Fallback>
+                  <w:pict>
+                    <v:shape w14:anchorId="56AAFC5B" id="Straight Arrow Connector 6" o:spid="_x0000_s1026" type="#_x0000_t32" style="position:absolute;margin-left:80.3pt;margin-top:82.05pt;width:39.45pt;height:7.3pt;z-index:251770880;visibility:visible;mso-wrap-style:square;mso-width-percent:0;mso-height-percent:0;mso-wrap-distance-left:9pt;mso-wrap-distance-top:0;mso-wrap-distance-right:9pt;mso-wrap-distance-bottom:0;mso-position-horizontal:absolute;mso-position-horizontal-relative:text;mso-position-vertical:absolute;mso-position-vertical-relative:text;mso-width-percent:0;mso-height-percent:0;mso-width-relative:margin;mso-height-relative:margin" o:gfxdata="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" strokecolor="#e00" strokeweight="1.5pt">
+                      <v:stroke endarrow="block" joinstyle="miter"/>
+                    </v:shape>
+                  </w:pict>
+                </mc:Fallback>
+              </mc:AlternateContent>
+            </w:r>
+            <w:r>
+              <w:rPr>
+                <w:b/>
+                <w:bCs/>
+                <w:noProof/>
+                <w:sz w:val="18"/>
+                <w:szCs w:val="18"/>
+              </w:rPr>
+              <w:drawing>
+                <wp:anchor distT="0" distB="0" distL="114300" distR="114300" simplePos="0" relativeHeight="251738112" behindDoc="1" locked="0" layoutInCell="1" allowOverlap="1" wp14:anchorId="7ECB9CCD" wp14:editId="1727DA3C">
+                  <wp:simplePos x="0" y="0"/>
+                  <wp:positionH relativeFrom="column">
+                    <wp:posOffset>1104797</wp:posOffset>
+                  </wp:positionH>
+                  <wp:positionV relativeFrom="paragraph">
+                    <wp:posOffset>472794</wp:posOffset>
+                  </wp:positionV>
+                  <wp:extent cx="1710699" cy="3009600"/>
+                  <wp:effectExtent l="0" t="0" r="3810" b="635"/>
+                  <wp:wrapTight wrapText="bothSides">
+                    <wp:wrapPolygon edited="0">
+                      <wp:start x="0" y="0"/>
+                      <wp:lineTo x="0" y="21513"/>
+                      <wp:lineTo x="21488" y="21513"/>
+                      <wp:lineTo x="21488" y="0"/>
+                      <wp:lineTo x="0" y="0"/>
+                    </wp:wrapPolygon>
+                  </wp:wrapTight>
+                  <wp:docPr id="745327928" name="Picture 36" descr="A screenshot of a phone&#10;&#10;AI-generated content may be incorrect."/>
+                  <wp:cNvGraphicFramePr>
+                    <a:graphicFrameLocks xmlns:a="http://schemas.openxmlformats.org/drawingml/2006/main" noChangeAspect="1"/>
+                  </wp:cNvGraphicFramePr>
+                  <a:graphic xmlns:a="http://schemas.openxmlformats.org/drawingml/2006/main">
+                    <a:graphicData uri="http://schemas.openxmlformats.org/drawingml/2006/picture">
+                      <pic:pic xmlns:pic="http://schemas.openxmlformats.org/drawingml/2006/picture">
+                        <pic:nvPicPr>
+                          <pic:cNvPr id="745327928" name="Picture 36" descr="A screenshot of a phone&#10;&#10;AI-generated content may be incorrect."/>
+                          <pic:cNvPicPr/>
+                        </pic:nvPicPr>
+                        <pic:blipFill>
+                          <a:blip r:embed="rId7" cstate="print">
+                            <a:extLst>
+                              <a:ext uri="{28A0092B-C50C-407E-A947-70E740481C1C}">
+                                <a14:useLocalDpi xmlns:a14="http://schemas.microsoft.com/office/drawing/2010/main" val="0"/>
+                              </a:ext>
+                            </a:extLst>
+                          </a:blip>
+                          <a:stretch>
+                            <a:fillRect/>
+                          </a:stretch>
+                        </pic:blipFill>
+                        <pic:spPr>
+                          <a:xfrm>
+                            <a:off x="0" y="0"/>
+                            <a:ext cx="1710699" cy="3009600"/>
+                          </a:xfrm>
+                          <a:prstGeom prst="rect">
+                            <a:avLst/>
+                          </a:prstGeom>
+                        </pic:spPr>
+                      </pic:pic>
+                    </a:graphicData>
+                  </a:graphic>
+                  <wp14:sizeRelH relativeFrom="page">
+                    <wp14:pctWidth>0</wp14:pctWidth>
+                  </wp14:sizeRelH>
+                  <wp14:sizeRelV relativeFrom="page">
+                    <wp14:pctHeight>0</wp14:pctHeight>
+                  </wp14:sizeRelV>
+                </wp:anchor>
+              </w:drawing>
+            </w:r>
           </w:p>
         </w:tc>
         <w:tc>
@@ -103,6 +2367,952 @@
                 <w:szCs w:val="18"/>
               </w:rPr>
             </w:pPr>
+            <w:r>
+              <w:rPr>
+                <w:b/>
+                <w:bCs/>
+                <w:sz w:val="18"/>
+                <w:szCs w:val="18"/>
+              </w:rPr>
+              <w:t>User Story 4</w:t>
+            </w:r>
+            <w:r>
+              <w:rPr>
+                <w:sz w:val="18"/>
+                <w:szCs w:val="18"/>
+              </w:rPr>
+              <w:t xml:space="preserve"> – As </w:t>
+            </w:r>
+            <w:r>
+              <w:rPr>
+                <w:sz w:val="18"/>
+                <w:szCs w:val="18"/>
+              </w:rPr>
+              <w:t>a police officer, I want to filter reports by crime type and severity so that I can focus on the most serious incidents first.</w:t>
+            </w:r>
+          </w:p>
+          <w:p>
+            <w:pPr>
+              <w:ind w:left="144" w:right="144"/>
+              <w:rPr>
+                <w:sz w:val="18"/>
+                <w:szCs w:val="18"/>
+              </w:rPr>
+            </w:pPr>
+            <w:r>
+              <w:rPr>
+                <w:b/>
+                <w:bCs/>
+                <w:noProof/>
+                <w:sz w:val="18"/>
+                <w:szCs w:val="18"/>
+              </w:rPr>
+              <mc:AlternateContent>
+                <mc:Choice Requires="wps">
+                  <w:drawing>
+                    <wp:anchor distT="45720" distB="45720" distL="114300" distR="114300" simplePos="0" relativeHeight="251748352" behindDoc="0" locked="0" layoutInCell="1" allowOverlap="1" wp14:anchorId="592FCA11" wp14:editId="6F10E684">
+                      <wp:simplePos x="0" y="0"/>
+                      <wp:positionH relativeFrom="column">
+                        <wp:posOffset>2930912</wp:posOffset>
+                      </wp:positionH>
+                      <wp:positionV relativeFrom="paragraph">
+                        <wp:posOffset>118962</wp:posOffset>
+                      </wp:positionV>
+                      <wp:extent cx="899129" cy="1404620"/>
+                      <wp:effectExtent l="0" t="0" r="0" b="0"/>
+                      <wp:wrapNone/>
+                      <wp:docPr id="1078184218" name="Text Box 2"/>
+                      <wp:cNvGraphicFramePr>
+                        <a:graphicFrameLocks xmlns:a="http://schemas.openxmlformats.org/drawingml/2006/main"/>
+                      </wp:cNvGraphicFramePr>
+                      <a:graphic xmlns:a="http://schemas.openxmlformats.org/drawingml/2006/main">
+                        <a:graphicData uri="http://schemas.microsoft.com/office/word/2010/wordprocessingShape">
+                          <wps:wsp>
+                            <wps:cNvSpPr txBox="1">
+                              <a:spLocks noChangeArrowheads="1"/>
+                            </wps:cNvSpPr>
+                            <wps:spPr bwMode="auto">
+                              <a:xfrm>
+                                <a:off x="0" y="0"/>
+                                <a:ext cx="899129" cy="1404620"/>
+                              </a:xfrm>
+                              <a:prstGeom prst="rect">
+                                <a:avLst/>
+                              </a:prstGeom>
+                              <a:noFill/>
+                              <a:ln w="9525">
+                                <a:noFill/>
+                                <a:miter lim="800000"/>
+                                <a:headEnd/>
+                                <a:tailEnd/>
+                              </a:ln>
+                            </wps:spPr>
+                            <wps:txbx>
+                              <w:txbxContent>
+                                <w:p>
+                                  <w:pPr>
+                                    <w:rPr>
+                                      <w:sz w:val="16"/>
+                                      <w:szCs w:val="16"/>
+                                      <w:lang w:val="en-GB"/>
+                                    </w:rPr>
+                                  </w:pPr>
+                                  <w:r>
+                                    <w:rPr>
+                                      <w:sz w:val="16"/>
+                                      <w:szCs w:val="16"/>
+                                      <w:lang w:val="en-GB"/>
+                                    </w:rPr>
+                                    <w:t>Quick search feature allows officers to see any crime report instantly.</w:t>
+                                  </w:r>
+                                </w:p>
+                              </w:txbxContent>
+                            </wps:txbx>
+                            <wps:bodyPr rot="0" vert="horz" wrap="square" lIns="91440" tIns="45720" rIns="91440" bIns="45720" anchor="t" anchorCtr="0">
+                              <a:spAutoFit/>
+                            </wps:bodyPr>
+                          </wps:wsp>
+                        </a:graphicData>
+                      </a:graphic>
+                      <wp14:sizeRelH relativeFrom="margin">
+                        <wp14:pctWidth>0</wp14:pctWidth>
+                      </wp14:sizeRelH>
+                      <wp14:sizeRelV relativeFrom="margin">
+                        <wp14:pctHeight>20000</wp14:pctHeight>
+                      </wp14:sizeRelV>
+                    </wp:anchor>
+                  </w:drawing>
+                </mc:Choice>
+                <mc:Fallback>
+                  <w:pict>
+                    <v:shape w14:anchorId="592FCA11" id="_x0000_s1035" type="#_x0000_t202" style="position:absolute;left:0;text-align:left;margin-left:230.8pt;margin-top:9.35pt;width:70.8pt;height:110.6pt;z-index:251748352;visibility:visible;mso-wrap-style:square;mso-width-percent:0;mso-height-percent:200;mso-wrap-distance-left:9pt;mso-wrap-distance-top:3.6pt;mso-wrap-distance-right:9pt;mso-wrap-distance-bottom:3.6pt;mso-position-horizontal:absolute;mso-position-horizontal-relative:text;mso-position-vertical:absolute;mso-position-vertical-relative:text;mso-width-percent:0;mso-height-percent:200;mso-width-relative:margin;mso-height-relative:margin;v-text-anchor:top" o:gfxdata="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" filled="f" stroked="f">
+                      <v:textbox style="mso-fit-shape-to-text:t">
+                        <w:txbxContent>
+                          <w:p>
+                            <w:pPr>
+                              <w:rPr>
+                                <w:sz w:val="16"/>
+                                <w:szCs w:val="16"/>
+                                <w:lang w:val="en-GB"/>
+                              </w:rPr>
+                            </w:pPr>
+                            <w:r>
+                              <w:rPr>
+                                <w:sz w:val="16"/>
+                                <w:szCs w:val="16"/>
+                                <w:lang w:val="en-GB"/>
+                              </w:rPr>
+                              <w:t>Quick search feature allows officers to see any crime report instantly.</w:t>
+                            </w:r>
+                          </w:p>
+                        </w:txbxContent>
+                      </v:textbox>
+                    </v:shape>
+                  </w:pict>
+                </mc:Fallback>
+              </mc:AlternateContent>
+            </w:r>
+            <w:r>
+              <w:rPr>
+                <w:b/>
+                <w:bCs/>
+                <w:sz w:val="18"/>
+                <w:szCs w:val="18"/>
+              </w:rPr>
+              <w:t xml:space="preserve">Author: </w:t>
+            </w:r>
+            <w:r>
+              <w:rPr>
+                <w:sz w:val="18"/>
+                <w:szCs w:val="18"/>
+              </w:rPr>
+              <w:t>Jack</w:t>
+            </w:r>
+          </w:p>
+          <w:p>
+            <w:pPr>
+              <w:ind w:left="144" w:right="144"/>
+              <w:rPr>
+                <w:b/>
+                <w:bCs/>
+                <w:sz w:val="18"/>
+                <w:szCs w:val="18"/>
+              </w:rPr>
+            </w:pPr>
+          </w:p>
+          <w:p>
+            <w:pPr>
+              <w:ind w:left="144" w:right="144"/>
+              <w:rPr>
+                <w:b/>
+                <w:bCs/>
+                <w:sz w:val="18"/>
+                <w:szCs w:val="18"/>
+              </w:rPr>
+            </w:pPr>
+            <w:r>
+              <w:rPr>
+                <w:b/>
+                <w:bCs/>
+                <w:noProof/>
+                <w:sz w:val="18"/>
+                <w:szCs w:val="18"/>
+              </w:rPr>
+              <mc:AlternateContent>
+                <mc:Choice Requires="wps">
+                  <w:drawing>
+                    <wp:anchor distT="45720" distB="45720" distL="114300" distR="114300" simplePos="0" relativeHeight="251751424" behindDoc="0" locked="0" layoutInCell="1" allowOverlap="1" wp14:anchorId="3FBAE0CB" wp14:editId="71C77429">
+                      <wp:simplePos x="0" y="0"/>
+                      <wp:positionH relativeFrom="column">
+                        <wp:posOffset>2984578</wp:posOffset>
+                      </wp:positionH>
+                      <wp:positionV relativeFrom="paragraph">
+                        <wp:posOffset>2867660</wp:posOffset>
+                      </wp:positionV>
+                      <wp:extent cx="949895" cy="1404620"/>
+                      <wp:effectExtent l="0" t="0" r="0" b="0"/>
+                      <wp:wrapNone/>
+                      <wp:docPr id="220116394" name="Text Box 2"/>
+                      <wp:cNvGraphicFramePr>
+                        <a:graphicFrameLocks xmlns:a="http://schemas.openxmlformats.org/drawingml/2006/main"/>
+                      </wp:cNvGraphicFramePr>
+                      <a:graphic xmlns:a="http://schemas.openxmlformats.org/drawingml/2006/main">
+                        <a:graphicData uri="http://schemas.microsoft.com/office/word/2010/wordprocessingShape">
+                          <wps:wsp>
+                            <wps:cNvSpPr txBox="1">
+                              <a:spLocks noChangeArrowheads="1"/>
+                            </wps:cNvSpPr>
+                            <wps:spPr bwMode="auto">
+                              <a:xfrm>
+                                <a:off x="0" y="0"/>
+                                <a:ext cx="949895" cy="1404620"/>
+                              </a:xfrm>
+                              <a:prstGeom prst="rect">
+                                <a:avLst/>
+                              </a:prstGeom>
+                              <a:noFill/>
+                              <a:ln w="9525">
+                                <a:noFill/>
+                                <a:miter lim="800000"/>
+                                <a:headEnd/>
+                                <a:tailEnd/>
+                              </a:ln>
+                            </wps:spPr>
+                            <wps:txbx>
+                              <w:txbxContent>
+                                <w:p>
+                                  <w:pPr>
+                                    <w:rPr>
+                                      <w:sz w:val="16"/>
+                                      <w:szCs w:val="16"/>
+                                      <w:lang w:val="en-GB"/>
+                                    </w:rPr>
+                                  </w:pPr>
+                                  <w:r>
+                                    <w:rPr>
+                                      <w:sz w:val="16"/>
+                                      <w:szCs w:val="16"/>
+                                      <w:lang w:val="en-GB"/>
+                                    </w:rPr>
+                                    <w:t>Global icons allow for quick switching between the features of the app (map, list, profile)</w:t>
+                                  </w:r>
+                                </w:p>
+                              </w:txbxContent>
+                            </wps:txbx>
+                            <wps:bodyPr rot="0" vert="horz" wrap="square" lIns="91440" tIns="45720" rIns="91440" bIns="45720" anchor="t" anchorCtr="0">
+                              <a:spAutoFit/>
+                            </wps:bodyPr>
+                          </wps:wsp>
+                        </a:graphicData>
+                      </a:graphic>
+                      <wp14:sizeRelH relativeFrom="margin">
+                        <wp14:pctWidth>0</wp14:pctWidth>
+                      </wp14:sizeRelH>
+                      <wp14:sizeRelV relativeFrom="margin">
+                        <wp14:pctHeight>20000</wp14:pctHeight>
+                      </wp14:sizeRelV>
+                    </wp:anchor>
+                  </w:drawing>
+                </mc:Choice>
+                <mc:Fallback>
+                  <w:pict>
+                    <v:shape w14:anchorId="3FBAE0CB" id="_x0000_s1036" type="#_x0000_t202" style="position:absolute;left:0;text-align:left;margin-left:235pt;margin-top:225.8pt;width:74.8pt;height:110.6pt;z-index:251751424;visibility:visible;mso-wrap-style:square;mso-width-percent:0;mso-height-percent:200;mso-wrap-distance-left:9pt;mso-wrap-distance-top:3.6pt;mso-wrap-distance-right:9pt;mso-wrap-distance-bottom:3.6pt;mso-position-horizontal:absolute;mso-position-horizontal-relative:text;mso-position-vertical:absolute;mso-position-vertical-relative:text;mso-width-percent:0;mso-height-percent:200;mso-width-relative:margin;mso-height-relative:margin;v-text-anchor:top" o:gfxdata="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" filled="f" stroked="f">
+                      <v:textbox style="mso-fit-shape-to-text:t">
+                        <w:txbxContent>
+                          <w:p>
+                            <w:pPr>
+                              <w:rPr>
+                                <w:sz w:val="16"/>
+                                <w:szCs w:val="16"/>
+                                <w:lang w:val="en-GB"/>
+                              </w:rPr>
+                            </w:pPr>
+                            <w:r>
+                              <w:rPr>
+                                <w:sz w:val="16"/>
+                                <w:szCs w:val="16"/>
+                                <w:lang w:val="en-GB"/>
+                              </w:rPr>
+                              <w:t>Global icons allow for quick switching between the features of the app (map, list, profile)</w:t>
+                            </w:r>
+                          </w:p>
+                        </w:txbxContent>
+                      </v:textbox>
+                    </v:shape>
+                  </w:pict>
+                </mc:Fallback>
+              </mc:AlternateContent>
+            </w:r>
+            <w:r>
+              <w:rPr>
+                <w:b/>
+                <w:bCs/>
+                <w:noProof/>
+                <w:sz w:val="18"/>
+                <w:szCs w:val="18"/>
+              </w:rPr>
+              <mc:AlternateContent>
+                <mc:Choice Requires="wps">
+                  <w:drawing>
+                    <wp:anchor distT="0" distB="0" distL="114300" distR="114300" simplePos="0" relativeHeight="251752448" behindDoc="0" locked="0" layoutInCell="1" allowOverlap="1" wp14:anchorId="0558F282" wp14:editId="566F838D">
+                      <wp:simplePos x="0" y="0"/>
+                      <wp:positionH relativeFrom="column">
+                        <wp:posOffset>2514599</wp:posOffset>
+                      </wp:positionH>
+                      <wp:positionV relativeFrom="paragraph">
+                        <wp:posOffset>3289507</wp:posOffset>
+                      </wp:positionV>
+                      <wp:extent cx="418793" cy="84619"/>
+                      <wp:effectExtent l="0" t="50800" r="13335" b="17145"/>
+                      <wp:wrapNone/>
+                      <wp:docPr id="1773696569" name="Straight Arrow Connector 6"/>
+                      <wp:cNvGraphicFramePr/>
+                      <a:graphic xmlns:a="http://schemas.openxmlformats.org/drawingml/2006/main">
+                        <a:graphicData uri="http://schemas.microsoft.com/office/word/2010/wordprocessingShape">
+                          <wps:wsp>
+                            <wps:cNvCnPr/>
+                            <wps:spPr>
+                              <a:xfrm flipH="1" flipV="1">
+                                <a:off x="0" y="0"/>
+                                <a:ext cx="418793" cy="84619"/>
+                              </a:xfrm>
+                              <a:prstGeom prst="straightConnector1">
+                                <a:avLst/>
+                              </a:prstGeom>
+                              <a:ln>
+                                <a:solidFill>
+                                  <a:srgbClr val="EE0000"/>
+                                </a:solidFill>
+                                <a:tailEnd type="triangle"/>
+                              </a:ln>
+                            </wps:spPr>
+                            <wps:style>
+                              <a:lnRef idx="2">
+                                <a:schemeClr val="accent1"/>
+                              </a:lnRef>
+                              <a:fillRef idx="0">
+                                <a:schemeClr val="accent1"/>
+                              </a:fillRef>
+                              <a:effectRef idx="1">
+                                <a:schemeClr val="accent1"/>
+                              </a:effectRef>
+                              <a:fontRef idx="minor">
+                                <a:schemeClr val="tx1"/>
+                              </a:fontRef>
+                            </wps:style>
+                            <wps:bodyPr/>
+                          </wps:wsp>
+                        </a:graphicData>
+                      </a:graphic>
+                      <wp14:sizeRelH relativeFrom="margin">
+                        <wp14:pctWidth>0</wp14:pctWidth>
+                      </wp14:sizeRelH>
+                      <wp14:sizeRelV relativeFrom="margin">
+                        <wp14:pctHeight>0</wp14:pctHeight>
+                      </wp14:sizeRelV>
+                    </wp:anchor>
+                  </w:drawing>
+                </mc:Choice>
+                <mc:Fallback>
+                  <w:pict>
+                    <v:shape w14:anchorId="089FE53E" id="Straight Arrow Connector 6" o:spid="_x0000_s1026" type="#_x0000_t32" style="position:absolute;margin-left:198pt;margin-top:259pt;width:33pt;height:6.65pt;flip:x y;z-index:251752448;visibility:visible;mso-wrap-style:square;mso-width-percent:0;mso-height-percent:0;mso-wrap-distance-left:9pt;mso-wrap-distance-top:0;mso-wrap-distance-right:9pt;mso-wrap-distance-bottom:0;mso-position-horizontal:absolute;mso-position-horizontal-relative:text;mso-position-vertical:absolute;mso-position-vertical-relative:text;mso-width-percent:0;mso-height-percent:0;mso-width-relative:margin;mso-height-relative:margin" o:gfxdata="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" strokecolor="#e00" strokeweight="1.5pt">
+                      <v:stroke endarrow="block" joinstyle="miter"/>
+                    </v:shape>
+                  </w:pict>
+                </mc:Fallback>
+              </mc:AlternateContent>
+            </w:r>
+            <w:r>
+              <w:rPr>
+                <w:b/>
+                <w:bCs/>
+                <w:noProof/>
+                <w:sz w:val="18"/>
+                <w:szCs w:val="18"/>
+              </w:rPr>
+              <mc:AlternateContent>
+                <mc:Choice Requires="wps">
+                  <w:drawing>
+                    <wp:anchor distT="0" distB="0" distL="114300" distR="114300" simplePos="0" relativeHeight="251749376" behindDoc="0" locked="0" layoutInCell="1" allowOverlap="1" wp14:anchorId="3EB5E483" wp14:editId="73060563">
+                      <wp:simplePos x="0" y="0"/>
+                      <wp:positionH relativeFrom="column">
+                        <wp:posOffset>2733287</wp:posOffset>
+                      </wp:positionH>
+                      <wp:positionV relativeFrom="paragraph">
+                        <wp:posOffset>374820</wp:posOffset>
+                      </wp:positionV>
+                      <wp:extent cx="249663" cy="190547"/>
+                      <wp:effectExtent l="25400" t="12700" r="17145" b="25400"/>
+                      <wp:wrapNone/>
+                      <wp:docPr id="164715093" name="Straight Arrow Connector 6"/>
+                      <wp:cNvGraphicFramePr/>
+                      <a:graphic xmlns:a="http://schemas.openxmlformats.org/drawingml/2006/main">
+                        <a:graphicData uri="http://schemas.microsoft.com/office/word/2010/wordprocessingShape">
+                          <wps:wsp>
+                            <wps:cNvCnPr/>
+                            <wps:spPr>
+                              <a:xfrm flipH="1">
+                                <a:off x="0" y="0"/>
+                                <a:ext cx="249663" cy="190547"/>
+                              </a:xfrm>
+                              <a:prstGeom prst="straightConnector1">
+                                <a:avLst/>
+                              </a:prstGeom>
+                              <a:ln>
+                                <a:solidFill>
+                                  <a:srgbClr val="EE0000"/>
+                                </a:solidFill>
+                                <a:tailEnd type="triangle"/>
+                              </a:ln>
+                            </wps:spPr>
+                            <wps:style>
+                              <a:lnRef idx="2">
+                                <a:schemeClr val="accent1"/>
+                              </a:lnRef>
+                              <a:fillRef idx="0">
+                                <a:schemeClr val="accent1"/>
+                              </a:fillRef>
+                              <a:effectRef idx="1">
+                                <a:schemeClr val="accent1"/>
+                              </a:effectRef>
+                              <a:fontRef idx="minor">
+                                <a:schemeClr val="tx1"/>
+                              </a:fontRef>
+                            </wps:style>
+                            <wps:bodyPr/>
+                          </wps:wsp>
+                        </a:graphicData>
+                      </a:graphic>
+                      <wp14:sizeRelH relativeFrom="margin">
+                        <wp14:pctWidth>0</wp14:pctWidth>
+                      </wp14:sizeRelH>
+                      <wp14:sizeRelV relativeFrom="margin">
+                        <wp14:pctHeight>0</wp14:pctHeight>
+                      </wp14:sizeRelV>
+                    </wp:anchor>
+                  </w:drawing>
+                </mc:Choice>
+                <mc:Fallback>
+                  <w:pict>
+                    <v:shape w14:anchorId="78D7F28C" id="Straight Arrow Connector 6" o:spid="_x0000_s1026" type="#_x0000_t32" style="position:absolute;margin-left:215.2pt;margin-top:29.5pt;width:19.65pt;height:15pt;flip:x;z-index:251749376;visibility:visible;mso-wrap-style:square;mso-width-percent:0;mso-height-percent:0;mso-wrap-distance-left:9pt;mso-wrap-distance-top:0;mso-wrap-distance-right:9pt;mso-wrap-distance-bottom:0;mso-position-horizontal:absolute;mso-position-horizontal-relative:text;mso-position-vertical:absolute;mso-position-vertical-relative:text;mso-width-percent:0;mso-height-percent:0;mso-width-relative:margin;mso-height-relative:margin" o:gfxdata="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" strokecolor="#e00" strokeweight="1.5pt">
+                      <v:stroke endarrow="block" joinstyle="miter"/>
+                    </v:shape>
+                  </w:pict>
+                </mc:Fallback>
+              </mc:AlternateContent>
+            </w:r>
+            <w:r>
+              <w:rPr>
+                <w:b/>
+                <w:bCs/>
+                <w:noProof/>
+                <w:sz w:val="18"/>
+                <w:szCs w:val="18"/>
+              </w:rPr>
+              <mc:AlternateContent>
+                <mc:Choice Requires="wps">
+                  <w:drawing>
+                    <wp:anchor distT="0" distB="0" distL="114300" distR="114300" simplePos="0" relativeHeight="251746304" behindDoc="0" locked="0" layoutInCell="1" allowOverlap="1" wp14:anchorId="1A38C75E" wp14:editId="73E0B7E4">
+                      <wp:simplePos x="0" y="0"/>
+                      <wp:positionH relativeFrom="column">
+                        <wp:posOffset>1060007</wp:posOffset>
+                      </wp:positionH>
+                      <wp:positionV relativeFrom="paragraph">
+                        <wp:posOffset>2321782</wp:posOffset>
+                      </wp:positionV>
+                      <wp:extent cx="274128" cy="86537"/>
+                      <wp:effectExtent l="12700" t="12700" r="31115" b="40640"/>
+                      <wp:wrapNone/>
+                      <wp:docPr id="54717309" name="Straight Arrow Connector 6"/>
+                      <wp:cNvGraphicFramePr/>
+                      <a:graphic xmlns:a="http://schemas.openxmlformats.org/drawingml/2006/main">
+                        <a:graphicData uri="http://schemas.microsoft.com/office/word/2010/wordprocessingShape">
+                          <wps:wsp>
+                            <wps:cNvCnPr/>
+                            <wps:spPr>
+                              <a:xfrm>
+                                <a:off x="0" y="0"/>
+                                <a:ext cx="274128" cy="86537"/>
+                              </a:xfrm>
+                              <a:prstGeom prst="straightConnector1">
+                                <a:avLst/>
+                              </a:prstGeom>
+                              <a:ln>
+                                <a:solidFill>
+                                  <a:srgbClr val="EE0000"/>
+                                </a:solidFill>
+                                <a:tailEnd type="triangle"/>
+                              </a:ln>
+                            </wps:spPr>
+                            <wps:style>
+                              <a:lnRef idx="2">
+                                <a:schemeClr val="accent1"/>
+                              </a:lnRef>
+                              <a:fillRef idx="0">
+                                <a:schemeClr val="accent1"/>
+                              </a:fillRef>
+                              <a:effectRef idx="1">
+                                <a:schemeClr val="accent1"/>
+                              </a:effectRef>
+                              <a:fontRef idx="minor">
+                                <a:schemeClr val="tx1"/>
+                              </a:fontRef>
+                            </wps:style>
+                            <wps:bodyPr/>
+                          </wps:wsp>
+                        </a:graphicData>
+                      </a:graphic>
+                      <wp14:sizeRelH relativeFrom="margin">
+                        <wp14:pctWidth>0</wp14:pctWidth>
+                      </wp14:sizeRelH>
+                      <wp14:sizeRelV relativeFrom="margin">
+                        <wp14:pctHeight>0</wp14:pctHeight>
+                      </wp14:sizeRelV>
+                    </wp:anchor>
+                  </w:drawing>
+                </mc:Choice>
+                <mc:Fallback>
+                  <w:pict>
+                    <v:shape w14:anchorId="775D0471" id="Straight Arrow Connector 6" o:spid="_x0000_s1026" type="#_x0000_t32" style="position:absolute;margin-left:83.45pt;margin-top:182.8pt;width:21.6pt;height:6.8pt;z-index:251746304;visibility:visible;mso-wrap-style:square;mso-width-percent:0;mso-height-percent:0;mso-wrap-distance-left:9pt;mso-wrap-distance-top:0;mso-wrap-distance-right:9pt;mso-wrap-distance-bottom:0;mso-position-horizontal:absolute;mso-position-horizontal-relative:text;mso-position-vertical:absolute;mso-position-vertical-relative:text;mso-width-percent:0;mso-height-percent:0;mso-width-relative:margin;mso-height-relative:margin" o:gfxdata="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" strokecolor="#e00" strokeweight="1.5pt">
+                      <v:stroke endarrow="block" joinstyle="miter"/>
+                    </v:shape>
+                  </w:pict>
+                </mc:Fallback>
+              </mc:AlternateContent>
+            </w:r>
+            <w:r>
+              <w:rPr>
+                <w:b/>
+                <w:bCs/>
+                <w:noProof/>
+                <w:sz w:val="18"/>
+                <w:szCs w:val="18"/>
+              </w:rPr>
+              <mc:AlternateContent>
+                <mc:Choice Requires="wps">
+                  <w:drawing>
+                    <wp:anchor distT="45720" distB="45720" distL="114300" distR="114300" simplePos="0" relativeHeight="251745280" behindDoc="0" locked="0" layoutInCell="1" allowOverlap="1" wp14:anchorId="1BC29829" wp14:editId="10BA3F4A">
+                      <wp:simplePos x="0" y="0"/>
+                      <wp:positionH relativeFrom="column">
+                        <wp:posOffset>40758</wp:posOffset>
+                      </wp:positionH>
+                      <wp:positionV relativeFrom="paragraph">
+                        <wp:posOffset>1862514</wp:posOffset>
+                      </wp:positionV>
+                      <wp:extent cx="1134110" cy="1619944"/>
+                      <wp:effectExtent l="0" t="0" r="0" b="0"/>
+                      <wp:wrapNone/>
+                      <wp:docPr id="1347019936" name="Text Box 2"/>
+                      <wp:cNvGraphicFramePr>
+                        <a:graphicFrameLocks xmlns:a="http://schemas.openxmlformats.org/drawingml/2006/main"/>
+                      </wp:cNvGraphicFramePr>
+                      <a:graphic xmlns:a="http://schemas.openxmlformats.org/drawingml/2006/main">
+                        <a:graphicData uri="http://schemas.microsoft.com/office/word/2010/wordprocessingShape">
+                          <wps:wsp>
+                            <wps:cNvSpPr txBox="1">
+                              <a:spLocks noChangeArrowheads="1"/>
+                            </wps:cNvSpPr>
+                            <wps:spPr bwMode="auto">
+                              <a:xfrm>
+                                <a:off x="0" y="0"/>
+                                <a:ext cx="1134110" cy="1619944"/>
+                              </a:xfrm>
+                              <a:prstGeom prst="rect">
+                                <a:avLst/>
+                              </a:prstGeom>
+                              <a:noFill/>
+                              <a:ln w="9525">
+                                <a:noFill/>
+                                <a:miter lim="800000"/>
+                                <a:headEnd/>
+                                <a:tailEnd/>
+                              </a:ln>
+                            </wps:spPr>
+                            <wps:txbx>
+                              <w:txbxContent>
+                                <w:p>
+                                  <w:pPr>
+                                    <w:rPr>
+                                      <w:sz w:val="16"/>
+                                      <w:szCs w:val="16"/>
+                                      <w:lang w:val="en-GB"/>
+                                    </w:rPr>
+                                  </w:pPr>
+                                  <w:r>
+                                    <w:rPr>
+                                      <w:sz w:val="16"/>
+                                      <w:szCs w:val="16"/>
+                                      <w:lang w:val="en-GB"/>
+                                    </w:rPr>
+                                    <w:t xml:space="preserve">Each card contains metadata such as; Type, Location, Details and Severity. </w:t>
+                                  </w:r>
+                                  <w:r>
+                                    <w:rPr>
+                                      <w:sz w:val="16"/>
+                                      <w:szCs w:val="16"/>
+                                      <w:lang w:val="en-GB"/>
+                                    </w:rPr>
+                                    <w:br/>
+                                    <w:t>If the officer clicks a card, the card will be expanded displaying more data and provided images from the reporter.</w:t>
+                                  </w:r>
+                                </w:p>
+                                <w:p>
+                                  <w:pPr>
+                                    <w:rPr>
+                                      <w:sz w:val="16"/>
+                                      <w:szCs w:val="16"/>
+                                      <w:lang w:val="en-GB"/>
+                                    </w:rPr>
+                                  </w:pPr>
+                                </w:p>
+                              </w:txbxContent>
+                            </wps:txbx>
+                            <wps:bodyPr rot="0" vert="horz" wrap="square" lIns="91440" tIns="45720" rIns="91440" bIns="45720" anchor="t" anchorCtr="0">
+                              <a:noAutofit/>
+                            </wps:bodyPr>
+                          </wps:wsp>
+                        </a:graphicData>
+                      </a:graphic>
+                      <wp14:sizeRelH relativeFrom="margin">
+                        <wp14:pctWidth>0</wp14:pctWidth>
+                      </wp14:sizeRelH>
+                      <wp14:sizeRelV relativeFrom="margin">
+                        <wp14:pctHeight>0</wp14:pctHeight>
+                      </wp14:sizeRelV>
+                    </wp:anchor>
+                  </w:drawing>
+                </mc:Choice>
+                <mc:Fallback>
+                  <w:pict>
+                    <v:shape w14:anchorId="1BC29829" id="_x0000_s1037" type="#_x0000_t202" style="position:absolute;left:0;text-align:left;margin-left:3.2pt;margin-top:146.65pt;width:89.3pt;height:127.55pt;z-index:251745280;visibility:visible;mso-wrap-style:square;mso-width-percent:0;mso-height-percent:0;mso-wrap-distance-left:9pt;mso-wrap-distance-top:3.6pt;mso-wrap-distance-right:9pt;mso-wrap-distance-bottom:3.6pt;mso-position-horizontal:absolute;mso-position-horizontal-relative:text;mso-position-vertical:absolute;mso-position-vertical-relative:text;mso-width-percent:0;mso-height-percent:0;mso-width-relative:margin;mso-height-relative:margin;v-text-anchor:top" o:gfxdata="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" filled="f" stroked="f">
+                      <v:textbox>
+                        <w:txbxContent>
+                          <w:p>
+                            <w:pPr>
+                              <w:rPr>
+                                <w:sz w:val="16"/>
+                                <w:szCs w:val="16"/>
+                                <w:lang w:val="en-GB"/>
+                              </w:rPr>
+                            </w:pPr>
+                            <w:r>
+                              <w:rPr>
+                                <w:sz w:val="16"/>
+                                <w:szCs w:val="16"/>
+                                <w:lang w:val="en-GB"/>
+                              </w:rPr>
+                              <w:t xml:space="preserve">Each card contains metadata such as; Type, Location, Details and Severity. </w:t>
+                            </w:r>
+                            <w:r>
+                              <w:rPr>
+                                <w:sz w:val="16"/>
+                                <w:szCs w:val="16"/>
+                                <w:lang w:val="en-GB"/>
+                              </w:rPr>
+                              <w:br/>
+                              <w:t>If the officer clicks a card, the card will be expanded displaying more data and provided images from the reporter.</w:t>
+                            </w:r>
+                          </w:p>
+                          <w:p>
+                            <w:pPr>
+                              <w:rPr>
+                                <w:sz w:val="16"/>
+                                <w:szCs w:val="16"/>
+                                <w:lang w:val="en-GB"/>
+                              </w:rPr>
+                            </w:pPr>
+                          </w:p>
+                        </w:txbxContent>
+                      </v:textbox>
+                    </v:shape>
+                  </w:pict>
+                </mc:Fallback>
+              </mc:AlternateContent>
+            </w:r>
+            <w:r>
+              <w:rPr>
+                <w:b/>
+                <w:bCs/>
+                <w:noProof/>
+                <w:sz w:val="18"/>
+                <w:szCs w:val="18"/>
+              </w:rPr>
+              <mc:AlternateContent>
+                <mc:Choice Requires="wps">
+                  <w:drawing>
+                    <wp:anchor distT="0" distB="0" distL="114300" distR="114300" simplePos="0" relativeHeight="251743232" behindDoc="0" locked="0" layoutInCell="1" allowOverlap="1" wp14:anchorId="2651245E" wp14:editId="0C97AF8D">
+                      <wp:simplePos x="0" y="0"/>
+                      <wp:positionH relativeFrom="column">
+                        <wp:posOffset>1004777</wp:posOffset>
+                      </wp:positionH>
+                      <wp:positionV relativeFrom="paragraph">
+                        <wp:posOffset>1139500</wp:posOffset>
+                      </wp:positionV>
+                      <wp:extent cx="331160" cy="161364"/>
+                      <wp:effectExtent l="12700" t="12700" r="37465" b="29210"/>
+                      <wp:wrapNone/>
+                      <wp:docPr id="629602694" name="Straight Arrow Connector 6"/>
+                      <wp:cNvGraphicFramePr/>
+                      <a:graphic xmlns:a="http://schemas.openxmlformats.org/drawingml/2006/main">
+                        <a:graphicData uri="http://schemas.microsoft.com/office/word/2010/wordprocessingShape">
+                          <wps:wsp>
+                            <wps:cNvCnPr/>
+                            <wps:spPr>
+                              <a:xfrm>
+                                <a:off x="0" y="0"/>
+                                <a:ext cx="331160" cy="161364"/>
+                              </a:xfrm>
+                              <a:prstGeom prst="straightConnector1">
+                                <a:avLst/>
+                              </a:prstGeom>
+                              <a:ln>
+                                <a:solidFill>
+                                  <a:srgbClr val="EE0000"/>
+                                </a:solidFill>
+                                <a:tailEnd type="triangle"/>
+                              </a:ln>
+                            </wps:spPr>
+                            <wps:style>
+                              <a:lnRef idx="2">
+                                <a:schemeClr val="accent1"/>
+                              </a:lnRef>
+                              <a:fillRef idx="0">
+                                <a:schemeClr val="accent1"/>
+                              </a:fillRef>
+                              <a:effectRef idx="1">
+                                <a:schemeClr val="accent1"/>
+                              </a:effectRef>
+                              <a:fontRef idx="minor">
+                                <a:schemeClr val="tx1"/>
+                              </a:fontRef>
+                            </wps:style>
+                            <wps:bodyPr/>
+                          </wps:wsp>
+                        </a:graphicData>
+                      </a:graphic>
+                      <wp14:sizeRelH relativeFrom="margin">
+                        <wp14:pctWidth>0</wp14:pctWidth>
+                      </wp14:sizeRelH>
+                      <wp14:sizeRelV relativeFrom="margin">
+                        <wp14:pctHeight>0</wp14:pctHeight>
+                      </wp14:sizeRelV>
+                    </wp:anchor>
+                  </w:drawing>
+                </mc:Choice>
+                <mc:Fallback>
+                  <w:pict>
+                    <v:shape w14:anchorId="00AF8DB2" id="Straight Arrow Connector 6" o:spid="_x0000_s1026" type="#_x0000_t32" style="position:absolute;margin-left:79.1pt;margin-top:89.7pt;width:26.1pt;height:12.7pt;z-index:251743232;visibility:visible;mso-wrap-style:square;mso-width-percent:0;mso-height-percent:0;mso-wrap-distance-left:9pt;mso-wrap-distance-top:0;mso-wrap-distance-right:9pt;mso-wrap-distance-bottom:0;mso-position-horizontal:absolute;mso-position-horizontal-relative:text;mso-position-vertical:absolute;mso-position-vertical-relative:text;mso-width-percent:0;mso-height-percent:0;mso-width-relative:margin;mso-height-relative:margin" o:gfxdata="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" strokecolor="#e00" strokeweight="1.5pt">
+                      <v:stroke endarrow="block" joinstyle="miter"/>
+                    </v:shape>
+                  </w:pict>
+                </mc:Fallback>
+              </mc:AlternateContent>
+            </w:r>
+            <w:r>
+              <w:rPr>
+                <w:b/>
+                <w:bCs/>
+                <w:noProof/>
+                <w:sz w:val="18"/>
+                <w:szCs w:val="18"/>
+              </w:rPr>
+              <mc:AlternateContent>
+                <mc:Choice Requires="wps">
+                  <w:drawing>
+                    <wp:anchor distT="45720" distB="45720" distL="114300" distR="114300" simplePos="0" relativeHeight="251742208" behindDoc="0" locked="0" layoutInCell="1" allowOverlap="1" wp14:anchorId="643BFB18" wp14:editId="71BCEB8D">
+                      <wp:simplePos x="0" y="0"/>
+                      <wp:positionH relativeFrom="column">
+                        <wp:posOffset>-1771</wp:posOffset>
+                      </wp:positionH>
+                      <wp:positionV relativeFrom="paragraph">
+                        <wp:posOffset>622049</wp:posOffset>
+                      </wp:positionV>
+                      <wp:extent cx="1183758" cy="1282995"/>
+                      <wp:effectExtent l="0" t="0" r="0" b="0"/>
+                      <wp:wrapNone/>
+                      <wp:docPr id="509355675" name="Text Box 2"/>
+                      <wp:cNvGraphicFramePr>
+                        <a:graphicFrameLocks xmlns:a="http://schemas.openxmlformats.org/drawingml/2006/main"/>
+                      </wp:cNvGraphicFramePr>
+                      <a:graphic xmlns:a="http://schemas.openxmlformats.org/drawingml/2006/main">
+                        <a:graphicData uri="http://schemas.microsoft.com/office/word/2010/wordprocessingShape">
+                          <wps:wsp>
+                            <wps:cNvSpPr txBox="1">
+                              <a:spLocks noChangeArrowheads="1"/>
+                            </wps:cNvSpPr>
+                            <wps:spPr bwMode="auto">
+                              <a:xfrm>
+                                <a:off x="0" y="0"/>
+                                <a:ext cx="1183758" cy="1282995"/>
+                              </a:xfrm>
+                              <a:prstGeom prst="rect">
+                                <a:avLst/>
+                              </a:prstGeom>
+                              <a:noFill/>
+                              <a:ln w="9525">
+                                <a:noFill/>
+                                <a:miter lim="800000"/>
+                                <a:headEnd/>
+                                <a:tailEnd/>
+                              </a:ln>
+                            </wps:spPr>
+                            <wps:txbx>
+                              <w:txbxContent>
+                                <w:p>
+                                  <w:pPr>
+                                    <w:rPr>
+                                      <w:sz w:val="16"/>
+                                      <w:szCs w:val="16"/>
+                                      <w:lang w:val="en-GB"/>
+                                    </w:rPr>
+                                  </w:pPr>
+                                  <w:r>
+                                    <w:rPr>
+                                      <w:sz w:val="16"/>
+                                      <w:szCs w:val="16"/>
+                                      <w:lang w:val="en-GB"/>
+                                    </w:rPr>
+                                    <w:t xml:space="preserve">A “Select” menu allows officers to categorise lists by crime type, time or severity to prioritise serious incidents. </w:t>
+                                  </w:r>
+                                </w:p>
+                              </w:txbxContent>
+                            </wps:txbx>
+                            <wps:bodyPr rot="0" vert="horz" wrap="square" lIns="91440" tIns="45720" rIns="91440" bIns="45720" anchor="t" anchorCtr="0">
+                              <a:noAutofit/>
+                            </wps:bodyPr>
+                          </wps:wsp>
+                        </a:graphicData>
+                      </a:graphic>
+                      <wp14:sizeRelH relativeFrom="margin">
+                        <wp14:pctWidth>0</wp14:pctWidth>
+                      </wp14:sizeRelH>
+                      <wp14:sizeRelV relativeFrom="margin">
+                        <wp14:pctHeight>0</wp14:pctHeight>
+                      </wp14:sizeRelV>
+                    </wp:anchor>
+                  </w:drawing>
+                </mc:Choice>
+                <mc:Fallback>
+                  <w:pict>
+                    <v:shape w14:anchorId="643BFB18" id="_x0000_s1038" type="#_x0000_t202" style="position:absolute;left:0;text-align:left;margin-left:-.15pt;margin-top:49pt;width:93.2pt;height:101pt;z-index:251742208;visibility:visible;mso-wrap-style:square;mso-width-percent:0;mso-height-percent:0;mso-wrap-distance-left:9pt;mso-wrap-distance-top:3.6pt;mso-wrap-distance-right:9pt;mso-wrap-distance-bottom:3.6pt;mso-position-horizontal:absolute;mso-position-horizontal-relative:text;mso-position-vertical:absolute;mso-position-vertical-relative:text;mso-width-percent:0;mso-height-percent:0;mso-width-relative:margin;mso-height-relative:margin;v-text-anchor:top" o:gfxdata="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" filled="f" stroked="f">
+                      <v:textbox>
+                        <w:txbxContent>
+                          <w:p>
+                            <w:pPr>
+                              <w:rPr>
+                                <w:sz w:val="16"/>
+                                <w:szCs w:val="16"/>
+                                <w:lang w:val="en-GB"/>
+                              </w:rPr>
+                            </w:pPr>
+                            <w:r>
+                              <w:rPr>
+                                <w:sz w:val="16"/>
+                                <w:szCs w:val="16"/>
+                                <w:lang w:val="en-GB"/>
+                              </w:rPr>
+                              <w:t xml:space="preserve">A “Select” menu allows officers to categorise lists by crime type, time or severity to prioritise serious incidents. </w:t>
+                            </w:r>
+                          </w:p>
+                        </w:txbxContent>
+                      </v:textbox>
+                    </v:shape>
+                  </w:pict>
+                </mc:Fallback>
+              </mc:AlternateContent>
+            </w:r>
+            <w:r>
+              <w:rPr>
+                <w:b/>
+                <w:bCs/>
+                <w:noProof/>
+                <w:sz w:val="18"/>
+                <w:szCs w:val="18"/>
+              </w:rPr>
+              <w:drawing>
+                <wp:anchor distT="0" distB="0" distL="114300" distR="114300" simplePos="0" relativeHeight="251739136" behindDoc="1" locked="0" layoutInCell="1" allowOverlap="1" wp14:anchorId="70D6CEC2" wp14:editId="0895DA44">
+                  <wp:simplePos x="0" y="0"/>
+                  <wp:positionH relativeFrom="column">
+                    <wp:posOffset>1179801</wp:posOffset>
+                  </wp:positionH>
+                  <wp:positionV relativeFrom="page">
+                    <wp:posOffset>1030605</wp:posOffset>
+                  </wp:positionV>
+                  <wp:extent cx="1696085" cy="3009265"/>
+                  <wp:effectExtent l="0" t="0" r="5715" b="635"/>
+                  <wp:wrapTight wrapText="bothSides">
+                    <wp:wrapPolygon edited="0">
+                      <wp:start x="0" y="0"/>
+                      <wp:lineTo x="0" y="21513"/>
+                      <wp:lineTo x="21511" y="21513"/>
+                      <wp:lineTo x="21511" y="0"/>
+                      <wp:lineTo x="0" y="0"/>
+                    </wp:wrapPolygon>
+                  </wp:wrapTight>
+                  <wp:docPr id="638678984" name="Picture 37" descr="A screenshot of a computer&#10;&#10;AI-generated content may be incorrect."/>
+                  <wp:cNvGraphicFramePr>
+                    <a:graphicFrameLocks xmlns:a="http://schemas.openxmlformats.org/drawingml/2006/main" noChangeAspect="1"/>
+                  </wp:cNvGraphicFramePr>
+                  <a:graphic xmlns:a="http://schemas.openxmlformats.org/drawingml/2006/main">
+                    <a:graphicData uri="http://schemas.openxmlformats.org/drawingml/2006/picture">
+                      <pic:pic xmlns:pic="http://schemas.openxmlformats.org/drawingml/2006/picture">
+                        <pic:nvPicPr>
+                          <pic:cNvPr id="638678984" name="Picture 37" descr="A screenshot of a computer&#10;&#10;AI-generated content may be incorrect."/>
+                          <pic:cNvPicPr/>
+                        </pic:nvPicPr>
+                        <pic:blipFill>
+                          <a:blip r:embed="rId8">
+                            <a:extLst>
+                              <a:ext uri="{28A0092B-C50C-407E-A947-70E740481C1C}">
+                                <a14:useLocalDpi xmlns:a14="http://schemas.microsoft.com/office/drawing/2010/main" val="0"/>
+                              </a:ext>
+                            </a:extLst>
+                          </a:blip>
+                          <a:stretch>
+                            <a:fillRect/>
+                          </a:stretch>
+                        </pic:blipFill>
+                        <pic:spPr>
+                          <a:xfrm>
+                            <a:off x="0" y="0"/>
+                            <a:ext cx="1696085" cy="3009265"/>
+                          </a:xfrm>
+                          <a:prstGeom prst="rect">
+                            <a:avLst/>
+                          </a:prstGeom>
+                        </pic:spPr>
+                      </pic:pic>
+                    </a:graphicData>
+                  </a:graphic>
+                  <wp14:sizeRelH relativeFrom="page">
+                    <wp14:pctWidth>0</wp14:pctWidth>
+                  </wp14:sizeRelH>
+                  <wp14:sizeRelV relativeFrom="page">
+                    <wp14:pctHeight>0</wp14:pctHeight>
+                  </wp14:sizeRelV>
+                </wp:anchor>
+              </w:drawing>
+            </w:r>
           </w:p>
         </w:tc>
       </w:tr>
@@ -142,12 +3352,6 @@
         <w:gridCol w:w="6120"/>
       </w:tblGrid>
       <w:tr>
-        <w:tblPrEx>
-          <w:tblCellMar>
-            <w:top w:w="0" w:type="dxa"/>
-            <w:bottom w:w="0" w:type="dxa"/>
-          </w:tblCellMar>
-        </w:tblPrEx>
         <w:trPr>
           <w:cantSplit/>
           <w:trHeight w:hRule="exact" w:val="7920"/>
@@ -164,6 +3368,957 @@
                 <w:szCs w:val="18"/>
               </w:rPr>
             </w:pPr>
+            <w:r>
+              <w:rPr>
+                <w:b/>
+                <w:bCs/>
+                <w:sz w:val="18"/>
+                <w:szCs w:val="18"/>
+              </w:rPr>
+              <w:lastRenderedPageBreak/>
+              <w:t>User Story 5</w:t>
+            </w:r>
+            <w:r>
+              <w:rPr>
+                <w:sz w:val="18"/>
+                <w:szCs w:val="18"/>
+              </w:rPr>
+              <w:t xml:space="preserve"> – As </w:t>
+            </w:r>
+            <w:r>
+              <w:rPr>
+                <w:sz w:val="18"/>
+                <w:szCs w:val="18"/>
+              </w:rPr>
+              <w:t>a public user, I want to see a hotspot map so that I can check which areas have more reports.</w:t>
+            </w:r>
+            <w:r>
+              <w:rPr>
+                <w:sz w:val="18"/>
+                <w:szCs w:val="18"/>
+              </w:rPr>
+              <w:br/>
+            </w:r>
+            <w:r>
+              <w:rPr>
+                <w:b/>
+                <w:bCs/>
+                <w:sz w:val="18"/>
+                <w:szCs w:val="18"/>
+              </w:rPr>
+              <w:t xml:space="preserve">Author: </w:t>
+            </w:r>
+            <w:r>
+              <w:rPr>
+                <w:sz w:val="18"/>
+                <w:szCs w:val="18"/>
+              </w:rPr>
+              <w:t>Jack</w:t>
+            </w:r>
+          </w:p>
+          <w:p>
+            <w:pPr>
+              <w:ind w:left="144" w:right="144"/>
+              <w:rPr>
+                <w:sz w:val="18"/>
+                <w:szCs w:val="18"/>
+              </w:rPr>
+            </w:pPr>
+          </w:p>
+          <w:p>
+            <w:pPr>
+              <w:ind w:left="144" w:right="144"/>
+              <w:rPr>
+                <w:sz w:val="18"/>
+                <w:szCs w:val="18"/>
+              </w:rPr>
+            </w:pPr>
+            <w:r>
+              <w:rPr>
+                <w:b/>
+                <w:bCs/>
+                <w:noProof/>
+                <w:sz w:val="18"/>
+                <w:szCs w:val="18"/>
+              </w:rPr>
+              <mc:AlternateContent>
+                <mc:Choice Requires="wps">
+                  <w:drawing>
+                    <wp:anchor distT="0" distB="0" distL="114300" distR="114300" simplePos="0" relativeHeight="251789312" behindDoc="0" locked="0" layoutInCell="1" allowOverlap="1" wp14:anchorId="648DC17A" wp14:editId="16AB98A0">
+                      <wp:simplePos x="0" y="0"/>
+                      <wp:positionH relativeFrom="column">
+                        <wp:posOffset>2426677</wp:posOffset>
+                      </wp:positionH>
+                      <wp:positionV relativeFrom="paragraph">
+                        <wp:posOffset>2949134</wp:posOffset>
+                      </wp:positionV>
+                      <wp:extent cx="344512" cy="59300"/>
+                      <wp:effectExtent l="25400" t="25400" r="11430" b="55245"/>
+                      <wp:wrapNone/>
+                      <wp:docPr id="1889142737" name="Straight Arrow Connector 6"/>
+                      <wp:cNvGraphicFramePr/>
+                      <a:graphic xmlns:a="http://schemas.openxmlformats.org/drawingml/2006/main">
+                        <a:graphicData uri="http://schemas.microsoft.com/office/word/2010/wordprocessingShape">
+                          <wps:wsp>
+                            <wps:cNvCnPr/>
+                            <wps:spPr>
+                              <a:xfrm flipH="1">
+                                <a:off x="0" y="0"/>
+                                <a:ext cx="344512" cy="59300"/>
+                              </a:xfrm>
+                              <a:prstGeom prst="straightConnector1">
+                                <a:avLst/>
+                              </a:prstGeom>
+                              <a:ln>
+                                <a:solidFill>
+                                  <a:srgbClr val="EE0000"/>
+                                </a:solidFill>
+                                <a:tailEnd type="triangle"/>
+                              </a:ln>
+                            </wps:spPr>
+                            <wps:style>
+                              <a:lnRef idx="2">
+                                <a:schemeClr val="accent1"/>
+                              </a:lnRef>
+                              <a:fillRef idx="0">
+                                <a:schemeClr val="accent1"/>
+                              </a:fillRef>
+                              <a:effectRef idx="1">
+                                <a:schemeClr val="accent1"/>
+                              </a:effectRef>
+                              <a:fontRef idx="minor">
+                                <a:schemeClr val="tx1"/>
+                              </a:fontRef>
+                            </wps:style>
+                            <wps:bodyPr/>
+                          </wps:wsp>
+                        </a:graphicData>
+                      </a:graphic>
+                      <wp14:sizeRelH relativeFrom="margin">
+                        <wp14:pctWidth>0</wp14:pctWidth>
+                      </wp14:sizeRelH>
+                      <wp14:sizeRelV relativeFrom="margin">
+                        <wp14:pctHeight>0</wp14:pctHeight>
+                      </wp14:sizeRelV>
+                    </wp:anchor>
+                  </w:drawing>
+                </mc:Choice>
+                <mc:Fallback>
+                  <w:pict>
+                    <v:shape w14:anchorId="5AE2C5C8" id="Straight Arrow Connector 6" o:spid="_x0000_s1026" type="#_x0000_t32" style="position:absolute;margin-left:191.1pt;margin-top:232.2pt;width:27.15pt;height:4.65pt;flip:x;z-index:251789312;visibility:visible;mso-wrap-style:square;mso-width-percent:0;mso-height-percent:0;mso-wrap-distance-left:9pt;mso-wrap-distance-top:0;mso-wrap-distance-right:9pt;mso-wrap-distance-bottom:0;mso-position-horizontal:absolute;mso-position-horizontal-relative:text;mso-position-vertical:absolute;mso-position-vertical-relative:text;mso-width-percent:0;mso-height-percent:0;mso-width-relative:margin;mso-height-relative:margin" o:gfxdata="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" strokecolor="#e00" strokeweight="1.5pt">
+                      <v:stroke endarrow="block" joinstyle="miter"/>
+                    </v:shape>
+                  </w:pict>
+                </mc:Fallback>
+              </mc:AlternateContent>
+            </w:r>
+            <w:r>
+              <w:rPr>
+                <w:b/>
+                <w:bCs/>
+                <w:noProof/>
+                <w:sz w:val="18"/>
+                <w:szCs w:val="18"/>
+              </w:rPr>
+              <mc:AlternateContent>
+                <mc:Choice Requires="wps">
+                  <w:drawing>
+                    <wp:anchor distT="45720" distB="45720" distL="114300" distR="114300" simplePos="0" relativeHeight="251788288" behindDoc="0" locked="0" layoutInCell="1" allowOverlap="1" wp14:anchorId="36390698" wp14:editId="4B83B460">
+                      <wp:simplePos x="0" y="0"/>
+                      <wp:positionH relativeFrom="column">
+                        <wp:posOffset>2769577</wp:posOffset>
+                      </wp:positionH>
+                      <wp:positionV relativeFrom="paragraph">
+                        <wp:posOffset>2431220</wp:posOffset>
+                      </wp:positionV>
+                      <wp:extent cx="949895" cy="1404620"/>
+                      <wp:effectExtent l="0" t="0" r="0" b="0"/>
+                      <wp:wrapNone/>
+                      <wp:docPr id="192363678" name="Text Box 2"/>
+                      <wp:cNvGraphicFramePr>
+                        <a:graphicFrameLocks xmlns:a="http://schemas.openxmlformats.org/drawingml/2006/main"/>
+                      </wp:cNvGraphicFramePr>
+                      <a:graphic xmlns:a="http://schemas.openxmlformats.org/drawingml/2006/main">
+                        <a:graphicData uri="http://schemas.microsoft.com/office/word/2010/wordprocessingShape">
+                          <wps:wsp>
+                            <wps:cNvSpPr txBox="1">
+                              <a:spLocks noChangeArrowheads="1"/>
+                            </wps:cNvSpPr>
+                            <wps:spPr bwMode="auto">
+                              <a:xfrm>
+                                <a:off x="0" y="0"/>
+                                <a:ext cx="949895" cy="1404620"/>
+                              </a:xfrm>
+                              <a:prstGeom prst="rect">
+                                <a:avLst/>
+                              </a:prstGeom>
+                              <a:noFill/>
+                              <a:ln w="9525">
+                                <a:noFill/>
+                                <a:miter lim="800000"/>
+                                <a:headEnd/>
+                                <a:tailEnd/>
+                              </a:ln>
+                            </wps:spPr>
+                            <wps:txbx>
+                              <w:txbxContent>
+                                <w:p>
+                                  <w:pPr>
+                                    <w:rPr>
+                                      <w:sz w:val="16"/>
+                                      <w:szCs w:val="16"/>
+                                      <w:lang w:val="en-GB"/>
+                                    </w:rPr>
+                                  </w:pPr>
+                                  <w:r>
+                                    <w:rPr>
+                                      <w:sz w:val="16"/>
+                                      <w:szCs w:val="16"/>
+                                      <w:lang w:val="en-GB"/>
+                                    </w:rPr>
+                                    <w:t>“SUBMIT REPORT” button encourages public users to report crimes they have witnessed, providing the real-time crowd sourced data.</w:t>
+                                  </w:r>
+                                </w:p>
+                              </w:txbxContent>
+                            </wps:txbx>
+                            <wps:bodyPr rot="0" vert="horz" wrap="square" lIns="91440" tIns="45720" rIns="91440" bIns="45720" anchor="t" anchorCtr="0">
+                              <a:spAutoFit/>
+                            </wps:bodyPr>
+                          </wps:wsp>
+                        </a:graphicData>
+                      </a:graphic>
+                      <wp14:sizeRelH relativeFrom="margin">
+                        <wp14:pctWidth>0</wp14:pctWidth>
+                      </wp14:sizeRelH>
+                      <wp14:sizeRelV relativeFrom="margin">
+                        <wp14:pctHeight>20000</wp14:pctHeight>
+                      </wp14:sizeRelV>
+                    </wp:anchor>
+                  </w:drawing>
+                </mc:Choice>
+                <mc:Fallback>
+                  <w:pict>
+                    <v:shape w14:anchorId="36390698" id="_x0000_s1039" type="#_x0000_t202" style="position:absolute;left:0;text-align:left;margin-left:218.1pt;margin-top:191.45pt;width:74.8pt;height:110.6pt;z-index:251788288;visibility:visible;mso-wrap-style:square;mso-width-percent:0;mso-height-percent:200;mso-wrap-distance-left:9pt;mso-wrap-distance-top:3.6pt;mso-wrap-distance-right:9pt;mso-wrap-distance-bottom:3.6pt;mso-position-horizontal:absolute;mso-position-horizontal-relative:text;mso-position-vertical:absolute;mso-position-vertical-relative:text;mso-width-percent:0;mso-height-percent:200;mso-width-relative:margin;mso-height-relative:margin;v-text-anchor:top" o:gfxdata="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" filled="f" stroked="f">
+                      <v:textbox style="mso-fit-shape-to-text:t">
+                        <w:txbxContent>
+                          <w:p>
+                            <w:pPr>
+                              <w:rPr>
+                                <w:sz w:val="16"/>
+                                <w:szCs w:val="16"/>
+                                <w:lang w:val="en-GB"/>
+                              </w:rPr>
+                            </w:pPr>
+                            <w:r>
+                              <w:rPr>
+                                <w:sz w:val="16"/>
+                                <w:szCs w:val="16"/>
+                                <w:lang w:val="en-GB"/>
+                              </w:rPr>
+                              <w:t>“SUBMIT REPORT” button encourages public users to report crimes they have witnessed, providing the real-time crowd sourced data.</w:t>
+                            </w:r>
+                          </w:p>
+                        </w:txbxContent>
+                      </v:textbox>
+                    </v:shape>
+                  </w:pict>
+                </mc:Fallback>
+              </mc:AlternateContent>
+            </w:r>
+            <w:r>
+              <w:rPr>
+                <w:b/>
+                <w:bCs/>
+                <w:noProof/>
+                <w:sz w:val="18"/>
+                <w:szCs w:val="18"/>
+              </w:rPr>
+              <mc:AlternateContent>
+                <mc:Choice Requires="wps">
+                  <w:drawing>
+                    <wp:anchor distT="45720" distB="45720" distL="114300" distR="114300" simplePos="0" relativeHeight="251785216" behindDoc="0" locked="0" layoutInCell="1" allowOverlap="1" wp14:anchorId="7624B96C" wp14:editId="661997BC">
+                      <wp:simplePos x="0" y="0"/>
+                      <wp:positionH relativeFrom="column">
+                        <wp:posOffset>0</wp:posOffset>
+                      </wp:positionH>
+                      <wp:positionV relativeFrom="paragraph">
+                        <wp:posOffset>2607066</wp:posOffset>
+                      </wp:positionV>
+                      <wp:extent cx="1037590" cy="1119505"/>
+                      <wp:effectExtent l="0" t="0" r="0" b="0"/>
+                      <wp:wrapNone/>
+                      <wp:docPr id="382517062" name="Text Box 2"/>
+                      <wp:cNvGraphicFramePr>
+                        <a:graphicFrameLocks xmlns:a="http://schemas.openxmlformats.org/drawingml/2006/main"/>
+                      </wp:cNvGraphicFramePr>
+                      <a:graphic xmlns:a="http://schemas.openxmlformats.org/drawingml/2006/main">
+                        <a:graphicData uri="http://schemas.microsoft.com/office/word/2010/wordprocessingShape">
+                          <wps:wsp>
+                            <wps:cNvSpPr txBox="1">
+                              <a:spLocks noChangeArrowheads="1"/>
+                            </wps:cNvSpPr>
+                            <wps:spPr bwMode="auto">
+                              <a:xfrm>
+                                <a:off x="0" y="0"/>
+                                <a:ext cx="1037590" cy="1119505"/>
+                              </a:xfrm>
+                              <a:prstGeom prst="rect">
+                                <a:avLst/>
+                              </a:prstGeom>
+                              <a:noFill/>
+                              <a:ln w="9525">
+                                <a:noFill/>
+                                <a:miter lim="800000"/>
+                                <a:headEnd/>
+                                <a:tailEnd/>
+                              </a:ln>
+                            </wps:spPr>
+                            <wps:txbx>
+                              <w:txbxContent>
+                                <w:p>
+                                  <w:pPr>
+                                    <w:rPr>
+                                      <w:sz w:val="16"/>
+                                      <w:szCs w:val="16"/>
+                                      <w:lang w:val="en-GB"/>
+                                    </w:rPr>
+                                  </w:pPr>
+                                  <w:r>
+                                    <w:rPr>
+                                      <w:sz w:val="16"/>
+                                      <w:szCs w:val="16"/>
+                                      <w:lang w:val="en-GB"/>
+                                    </w:rPr>
+                                    <w:t xml:space="preserve">Simple legend explaining the map symbols so the user can understand the map functionality. </w:t>
+                                  </w:r>
+                                  <w:r>
+                                    <w:rPr>
+                                      <w:sz w:val="16"/>
+                                      <w:szCs w:val="16"/>
+                                      <w:lang w:val="en-GB"/>
+                                    </w:rPr>
+                                    <w:t xml:space="preserve"> </w:t>
+                                  </w:r>
+                                </w:p>
+                              </w:txbxContent>
+                            </wps:txbx>
+                            <wps:bodyPr rot="0" vert="horz" wrap="square" lIns="91440" tIns="45720" rIns="91440" bIns="45720" anchor="t" anchorCtr="0">
+                              <a:noAutofit/>
+                            </wps:bodyPr>
+                          </wps:wsp>
+                        </a:graphicData>
+                      </a:graphic>
+                      <wp14:sizeRelH relativeFrom="margin">
+                        <wp14:pctWidth>0</wp14:pctWidth>
+                      </wp14:sizeRelH>
+                      <wp14:sizeRelV relativeFrom="margin">
+                        <wp14:pctHeight>0</wp14:pctHeight>
+                      </wp14:sizeRelV>
+                    </wp:anchor>
+                  </w:drawing>
+                </mc:Choice>
+                <mc:Fallback>
+                  <w:pict>
+                    <v:shape w14:anchorId="7624B96C" id="_x0000_s1040" type="#_x0000_t202" style="position:absolute;left:0;text-align:left;margin-left:0;margin-top:205.3pt;width:81.7pt;height:88.15pt;z-index:251785216;visibility:visible;mso-wrap-style:square;mso-width-percent:0;mso-height-percent:0;mso-wrap-distance-left:9pt;mso-wrap-distance-top:3.6pt;mso-wrap-distance-right:9pt;mso-wrap-distance-bottom:3.6pt;mso-position-horizontal:absolute;mso-position-horizontal-relative:text;mso-position-vertical:absolute;mso-position-vertical-relative:text;mso-width-percent:0;mso-height-percent:0;mso-width-relative:margin;mso-height-relative:margin;v-text-anchor:top" o:gfxdata="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" filled="f" stroked="f">
+                      <v:textbox>
+                        <w:txbxContent>
+                          <w:p>
+                            <w:pPr>
+                              <w:rPr>
+                                <w:sz w:val="16"/>
+                                <w:szCs w:val="16"/>
+                                <w:lang w:val="en-GB"/>
+                              </w:rPr>
+                            </w:pPr>
+                            <w:r>
+                              <w:rPr>
+                                <w:sz w:val="16"/>
+                                <w:szCs w:val="16"/>
+                                <w:lang w:val="en-GB"/>
+                              </w:rPr>
+                              <w:t xml:space="preserve">Simple legend explaining the map symbols so the user can understand the map functionality. </w:t>
+                            </w:r>
+                            <w:r>
+                              <w:rPr>
+                                <w:sz w:val="16"/>
+                                <w:szCs w:val="16"/>
+                                <w:lang w:val="en-GB"/>
+                              </w:rPr>
+                              <w:t xml:space="preserve"> </w:t>
+                            </w:r>
+                          </w:p>
+                        </w:txbxContent>
+                      </v:textbox>
+                    </v:shape>
+                  </w:pict>
+                </mc:Fallback>
+              </mc:AlternateContent>
+            </w:r>
+            <w:r>
+              <w:rPr>
+                <w:b/>
+                <w:bCs/>
+                <w:noProof/>
+                <w:sz w:val="18"/>
+                <w:szCs w:val="18"/>
+              </w:rPr>
+              <mc:AlternateContent>
+                <mc:Choice Requires="wps">
+                  <w:drawing>
+                    <wp:anchor distT="0" distB="0" distL="114300" distR="114300" simplePos="0" relativeHeight="251786240" behindDoc="0" locked="0" layoutInCell="1" allowOverlap="1" wp14:anchorId="30442CA0" wp14:editId="7EDEFEA7">
+                      <wp:simplePos x="0" y="0"/>
+                      <wp:positionH relativeFrom="column">
+                        <wp:posOffset>962270</wp:posOffset>
+                      </wp:positionH>
+                      <wp:positionV relativeFrom="paragraph">
+                        <wp:posOffset>2912842</wp:posOffset>
+                      </wp:positionV>
+                      <wp:extent cx="164514" cy="94893"/>
+                      <wp:effectExtent l="12700" t="25400" r="26035" b="19685"/>
+                      <wp:wrapNone/>
+                      <wp:docPr id="368477674" name="Straight Arrow Connector 6"/>
+                      <wp:cNvGraphicFramePr/>
+                      <a:graphic xmlns:a="http://schemas.openxmlformats.org/drawingml/2006/main">
+                        <a:graphicData uri="http://schemas.microsoft.com/office/word/2010/wordprocessingShape">
+                          <wps:wsp>
+                            <wps:cNvCnPr/>
+                            <wps:spPr>
+                              <a:xfrm flipV="1">
+                                <a:off x="0" y="0"/>
+                                <a:ext cx="164514" cy="94893"/>
+                              </a:xfrm>
+                              <a:prstGeom prst="straightConnector1">
+                                <a:avLst/>
+                              </a:prstGeom>
+                              <a:ln>
+                                <a:solidFill>
+                                  <a:srgbClr val="EE0000"/>
+                                </a:solidFill>
+                                <a:tailEnd type="triangle"/>
+                              </a:ln>
+                            </wps:spPr>
+                            <wps:style>
+                              <a:lnRef idx="2">
+                                <a:schemeClr val="accent1"/>
+                              </a:lnRef>
+                              <a:fillRef idx="0">
+                                <a:schemeClr val="accent1"/>
+                              </a:fillRef>
+                              <a:effectRef idx="1">
+                                <a:schemeClr val="accent1"/>
+                              </a:effectRef>
+                              <a:fontRef idx="minor">
+                                <a:schemeClr val="tx1"/>
+                              </a:fontRef>
+                            </wps:style>
+                            <wps:bodyPr/>
+                          </wps:wsp>
+                        </a:graphicData>
+                      </a:graphic>
+                      <wp14:sizeRelH relativeFrom="margin">
+                        <wp14:pctWidth>0</wp14:pctWidth>
+                      </wp14:sizeRelH>
+                      <wp14:sizeRelV relativeFrom="margin">
+                        <wp14:pctHeight>0</wp14:pctHeight>
+                      </wp14:sizeRelV>
+                    </wp:anchor>
+                  </w:drawing>
+                </mc:Choice>
+                <mc:Fallback>
+                  <w:pict>
+                    <v:shape w14:anchorId="22432F5D" id="Straight Arrow Connector 6" o:spid="_x0000_s1026" type="#_x0000_t32" style="position:absolute;margin-left:75.75pt;margin-top:229.35pt;width:12.95pt;height:7.45pt;flip:y;z-index:251786240;visibility:visible;mso-wrap-style:square;mso-width-percent:0;mso-height-percent:0;mso-wrap-distance-left:9pt;mso-wrap-distance-top:0;mso-wrap-distance-right:9pt;mso-wrap-distance-bottom:0;mso-position-horizontal:absolute;mso-position-horizontal-relative:text;mso-position-vertical:absolute;mso-position-vertical-relative:text;mso-width-percent:0;mso-height-percent:0;mso-width-relative:margin;mso-height-relative:margin" o:gfxdata="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" strokecolor="#e00" strokeweight="1.5pt">
+                      <v:stroke endarrow="block" joinstyle="miter"/>
+                    </v:shape>
+                  </w:pict>
+                </mc:Fallback>
+              </mc:AlternateContent>
+            </w:r>
+            <w:r>
+              <w:rPr>
+                <w:b/>
+                <w:bCs/>
+                <w:noProof/>
+                <w:sz w:val="18"/>
+                <w:szCs w:val="18"/>
+              </w:rPr>
+              <mc:AlternateContent>
+                <mc:Choice Requires="wps">
+                  <w:drawing>
+                    <wp:anchor distT="45720" distB="45720" distL="114300" distR="114300" simplePos="0" relativeHeight="251782144" behindDoc="0" locked="0" layoutInCell="1" allowOverlap="1" wp14:anchorId="24CE9348" wp14:editId="2C8D1083">
+                      <wp:simplePos x="0" y="0"/>
+                      <wp:positionH relativeFrom="column">
+                        <wp:posOffset>0</wp:posOffset>
+                      </wp:positionH>
+                      <wp:positionV relativeFrom="paragraph">
+                        <wp:posOffset>1270635</wp:posOffset>
+                      </wp:positionV>
+                      <wp:extent cx="1037590" cy="1119505"/>
+                      <wp:effectExtent l="0" t="0" r="0" b="0"/>
+                      <wp:wrapNone/>
+                      <wp:docPr id="1152027100" name="Text Box 2"/>
+                      <wp:cNvGraphicFramePr>
+                        <a:graphicFrameLocks xmlns:a="http://schemas.openxmlformats.org/drawingml/2006/main"/>
+                      </wp:cNvGraphicFramePr>
+                      <a:graphic xmlns:a="http://schemas.openxmlformats.org/drawingml/2006/main">
+                        <a:graphicData uri="http://schemas.microsoft.com/office/word/2010/wordprocessingShape">
+                          <wps:wsp>
+                            <wps:cNvSpPr txBox="1">
+                              <a:spLocks noChangeArrowheads="1"/>
+                            </wps:cNvSpPr>
+                            <wps:spPr bwMode="auto">
+                              <a:xfrm>
+                                <a:off x="0" y="0"/>
+                                <a:ext cx="1037590" cy="1119505"/>
+                              </a:xfrm>
+                              <a:prstGeom prst="rect">
+                                <a:avLst/>
+                              </a:prstGeom>
+                              <a:noFill/>
+                              <a:ln w="9525">
+                                <a:noFill/>
+                                <a:miter lim="800000"/>
+                                <a:headEnd/>
+                                <a:tailEnd/>
+                              </a:ln>
+                            </wps:spPr>
+                            <wps:txbx>
+                              <w:txbxContent>
+                                <w:p>
+                                  <w:pPr>
+                                    <w:rPr>
+                                      <w:sz w:val="16"/>
+                                      <w:szCs w:val="16"/>
+                                      <w:lang w:val="en-GB"/>
+                                    </w:rPr>
+                                  </w:pPr>
+                                  <w:r>
+                                    <w:rPr>
+                                      <w:sz w:val="16"/>
+                                      <w:szCs w:val="16"/>
+                                      <w:lang w:val="en-GB"/>
+                                    </w:rPr>
+                                    <w:t>A central “pin” icon shows the user’s current location relative to the crime hotspots.</w:t>
+                                  </w:r>
+                                  <w:r>
+                                    <w:rPr>
+                                      <w:sz w:val="16"/>
+                                      <w:szCs w:val="16"/>
+                                      <w:lang w:val="en-GB"/>
+                                    </w:rPr>
+                                    <w:t xml:space="preserve"> </w:t>
+                                  </w:r>
+                                </w:p>
+                              </w:txbxContent>
+                            </wps:txbx>
+                            <wps:bodyPr rot="0" vert="horz" wrap="square" lIns="91440" tIns="45720" rIns="91440" bIns="45720" anchor="t" anchorCtr="0">
+                              <a:noAutofit/>
+                            </wps:bodyPr>
+                          </wps:wsp>
+                        </a:graphicData>
+                      </a:graphic>
+                      <wp14:sizeRelH relativeFrom="margin">
+                        <wp14:pctWidth>0</wp14:pctWidth>
+                      </wp14:sizeRelH>
+                      <wp14:sizeRelV relativeFrom="margin">
+                        <wp14:pctHeight>0</wp14:pctHeight>
+                      </wp14:sizeRelV>
+                    </wp:anchor>
+                  </w:drawing>
+                </mc:Choice>
+                <mc:Fallback>
+                  <w:pict>
+                    <v:shape w14:anchorId="24CE9348" id="_x0000_s1041" type="#_x0000_t202" style="position:absolute;left:0;text-align:left;margin-left:0;margin-top:100.05pt;width:81.7pt;height:88.15pt;z-index:251782144;visibility:visible;mso-wrap-style:square;mso-width-percent:0;mso-height-percent:0;mso-wrap-distance-left:9pt;mso-wrap-distance-top:3.6pt;mso-wrap-distance-right:9pt;mso-wrap-distance-bottom:3.6pt;mso-position-horizontal:absolute;mso-position-horizontal-relative:text;mso-position-vertical:absolute;mso-position-vertical-relative:text;mso-width-percent:0;mso-height-percent:0;mso-width-relative:margin;mso-height-relative:margin;v-text-anchor:top" o:gfxdata="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" filled="f" stroked="f">
+                      <v:textbox>
+                        <w:txbxContent>
+                          <w:p>
+                            <w:pPr>
+                              <w:rPr>
+                                <w:sz w:val="16"/>
+                                <w:szCs w:val="16"/>
+                                <w:lang w:val="en-GB"/>
+                              </w:rPr>
+                            </w:pPr>
+                            <w:r>
+                              <w:rPr>
+                                <w:sz w:val="16"/>
+                                <w:szCs w:val="16"/>
+                                <w:lang w:val="en-GB"/>
+                              </w:rPr>
+                              <w:t>A central “pin” icon shows the user’s current location relative to the crime hotspots.</w:t>
+                            </w:r>
+                            <w:r>
+                              <w:rPr>
+                                <w:sz w:val="16"/>
+                                <w:szCs w:val="16"/>
+                                <w:lang w:val="en-GB"/>
+                              </w:rPr>
+                              <w:t xml:space="preserve"> </w:t>
+                            </w:r>
+                          </w:p>
+                        </w:txbxContent>
+                      </v:textbox>
+                    </v:shape>
+                  </w:pict>
+                </mc:Fallback>
+              </mc:AlternateContent>
+            </w:r>
+            <w:r>
+              <w:rPr>
+                <w:b/>
+                <w:bCs/>
+                <w:noProof/>
+                <w:sz w:val="18"/>
+                <w:szCs w:val="18"/>
+              </w:rPr>
+              <mc:AlternateContent>
+                <mc:Choice Requires="wps">
+                  <w:drawing>
+                    <wp:anchor distT="0" distB="0" distL="114300" distR="114300" simplePos="0" relativeHeight="251783168" behindDoc="0" locked="0" layoutInCell="1" allowOverlap="1" wp14:anchorId="068C1A2A" wp14:editId="3ABF2CA2">
+                      <wp:simplePos x="0" y="0"/>
+                      <wp:positionH relativeFrom="column">
+                        <wp:posOffset>962269</wp:posOffset>
+                      </wp:positionH>
+                      <wp:positionV relativeFrom="paragraph">
+                        <wp:posOffset>1671026</wp:posOffset>
+                      </wp:positionV>
+                      <wp:extent cx="928077" cy="144731"/>
+                      <wp:effectExtent l="12700" t="12700" r="12065" b="59055"/>
+                      <wp:wrapNone/>
+                      <wp:docPr id="531689718" name="Straight Arrow Connector 6"/>
+                      <wp:cNvGraphicFramePr/>
+                      <a:graphic xmlns:a="http://schemas.openxmlformats.org/drawingml/2006/main">
+                        <a:graphicData uri="http://schemas.microsoft.com/office/word/2010/wordprocessingShape">
+                          <wps:wsp>
+                            <wps:cNvCnPr/>
+                            <wps:spPr>
+                              <a:xfrm>
+                                <a:off x="0" y="0"/>
+                                <a:ext cx="928077" cy="144731"/>
+                              </a:xfrm>
+                              <a:prstGeom prst="straightConnector1">
+                                <a:avLst/>
+                              </a:prstGeom>
+                              <a:ln>
+                                <a:solidFill>
+                                  <a:srgbClr val="EE0000"/>
+                                </a:solidFill>
+                                <a:tailEnd type="triangle"/>
+                              </a:ln>
+                            </wps:spPr>
+                            <wps:style>
+                              <a:lnRef idx="2">
+                                <a:schemeClr val="accent1"/>
+                              </a:lnRef>
+                              <a:fillRef idx="0">
+                                <a:schemeClr val="accent1"/>
+                              </a:fillRef>
+                              <a:effectRef idx="1">
+                                <a:schemeClr val="accent1"/>
+                              </a:effectRef>
+                              <a:fontRef idx="minor">
+                                <a:schemeClr val="tx1"/>
+                              </a:fontRef>
+                            </wps:style>
+                            <wps:bodyPr/>
+                          </wps:wsp>
+                        </a:graphicData>
+                      </a:graphic>
+                      <wp14:sizeRelH relativeFrom="margin">
+                        <wp14:pctWidth>0</wp14:pctWidth>
+                      </wp14:sizeRelH>
+                      <wp14:sizeRelV relativeFrom="margin">
+                        <wp14:pctHeight>0</wp14:pctHeight>
+                      </wp14:sizeRelV>
+                    </wp:anchor>
+                  </w:drawing>
+                </mc:Choice>
+                <mc:Fallback>
+                  <w:pict>
+                    <v:shape w14:anchorId="293D57F9" id="Straight Arrow Connector 6" o:spid="_x0000_s1026" type="#_x0000_t32" style="position:absolute;margin-left:75.75pt;margin-top:131.6pt;width:73.1pt;height:11.4pt;z-index:251783168;visibility:visible;mso-wrap-style:square;mso-width-percent:0;mso-height-percent:0;mso-wrap-distance-left:9pt;mso-wrap-distance-top:0;mso-wrap-distance-right:9pt;mso-wrap-distance-bottom:0;mso-position-horizontal:absolute;mso-position-horizontal-relative:text;mso-position-vertical:absolute;mso-position-vertical-relative:text;mso-width-percent:0;mso-height-percent:0;mso-width-relative:margin;mso-height-relative:margin" o:gfxdata="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" strokecolor="#e00" strokeweight="1.5pt">
+                      <v:stroke endarrow="block" joinstyle="miter"/>
+                    </v:shape>
+                  </w:pict>
+                </mc:Fallback>
+              </mc:AlternateContent>
+            </w:r>
+            <w:r>
+              <w:rPr>
+                <w:b/>
+                <w:bCs/>
+                <w:noProof/>
+                <w:sz w:val="18"/>
+                <w:szCs w:val="18"/>
+              </w:rPr>
+              <mc:AlternateContent>
+                <mc:Choice Requires="wps">
+                  <w:drawing>
+                    <wp:anchor distT="0" distB="0" distL="114300" distR="114300" simplePos="0" relativeHeight="251780096" behindDoc="0" locked="0" layoutInCell="1" allowOverlap="1" wp14:anchorId="74753E3F" wp14:editId="75B2DEAE">
+                      <wp:simplePos x="0" y="0"/>
+                      <wp:positionH relativeFrom="column">
+                        <wp:posOffset>2567363</wp:posOffset>
+                      </wp:positionH>
+                      <wp:positionV relativeFrom="paragraph">
+                        <wp:posOffset>1223893</wp:posOffset>
+                      </wp:positionV>
+                      <wp:extent cx="204116" cy="45719"/>
+                      <wp:effectExtent l="0" t="50800" r="12065" b="43815"/>
+                      <wp:wrapNone/>
+                      <wp:docPr id="2023663868" name="Straight Arrow Connector 6"/>
+                      <wp:cNvGraphicFramePr/>
+                      <a:graphic xmlns:a="http://schemas.openxmlformats.org/drawingml/2006/main">
+                        <a:graphicData uri="http://schemas.microsoft.com/office/word/2010/wordprocessingShape">
+                          <wps:wsp>
+                            <wps:cNvCnPr/>
+                            <wps:spPr>
+                              <a:xfrm flipH="1" flipV="1">
+                                <a:off x="0" y="0"/>
+                                <a:ext cx="204116" cy="45719"/>
+                              </a:xfrm>
+                              <a:prstGeom prst="straightConnector1">
+                                <a:avLst/>
+                              </a:prstGeom>
+                              <a:ln>
+                                <a:solidFill>
+                                  <a:srgbClr val="EE0000"/>
+                                </a:solidFill>
+                                <a:tailEnd type="triangle"/>
+                              </a:ln>
+                            </wps:spPr>
+                            <wps:style>
+                              <a:lnRef idx="2">
+                                <a:schemeClr val="accent1"/>
+                              </a:lnRef>
+                              <a:fillRef idx="0">
+                                <a:schemeClr val="accent1"/>
+                              </a:fillRef>
+                              <a:effectRef idx="1">
+                                <a:schemeClr val="accent1"/>
+                              </a:effectRef>
+                              <a:fontRef idx="minor">
+                                <a:schemeClr val="tx1"/>
+                              </a:fontRef>
+                            </wps:style>
+                            <wps:bodyPr/>
+                          </wps:wsp>
+                        </a:graphicData>
+                      </a:graphic>
+                      <wp14:sizeRelH relativeFrom="margin">
+                        <wp14:pctWidth>0</wp14:pctWidth>
+                      </wp14:sizeRelH>
+                      <wp14:sizeRelV relativeFrom="margin">
+                        <wp14:pctHeight>0</wp14:pctHeight>
+                      </wp14:sizeRelV>
+                    </wp:anchor>
+                  </w:drawing>
+                </mc:Choice>
+                <mc:Fallback>
+                  <w:pict>
+                    <v:shape w14:anchorId="7A8CF21F" id="Straight Arrow Connector 6" o:spid="_x0000_s1026" type="#_x0000_t32" style="position:absolute;margin-left:202.15pt;margin-top:96.35pt;width:16.05pt;height:3.6pt;flip:x y;z-index:251780096;visibility:visible;mso-wrap-style:square;mso-width-percent:0;mso-height-percent:0;mso-wrap-distance-left:9pt;mso-wrap-distance-top:0;mso-wrap-distance-right:9pt;mso-wrap-distance-bottom:0;mso-position-horizontal:absolute;mso-position-horizontal-relative:text;mso-position-vertical:absolute;mso-position-vertical-relative:text;mso-width-percent:0;mso-height-percent:0;mso-width-relative:margin;mso-height-relative:margin" o:gfxdata="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" strokecolor="#e00" strokeweight="1.5pt">
+                      <v:stroke endarrow="block" joinstyle="miter"/>
+                    </v:shape>
+                  </w:pict>
+                </mc:Fallback>
+              </mc:AlternateContent>
+            </w:r>
+            <w:r>
+              <w:rPr>
+                <w:b/>
+                <w:bCs/>
+                <w:noProof/>
+                <w:sz w:val="18"/>
+                <w:szCs w:val="18"/>
+              </w:rPr>
+              <mc:AlternateContent>
+                <mc:Choice Requires="wps">
+                  <w:drawing>
+                    <wp:anchor distT="45720" distB="45720" distL="114300" distR="114300" simplePos="0" relativeHeight="251779072" behindDoc="0" locked="0" layoutInCell="1" allowOverlap="1" wp14:anchorId="47F0FDDC" wp14:editId="6A15A854">
+                      <wp:simplePos x="0" y="0"/>
+                      <wp:positionH relativeFrom="column">
+                        <wp:posOffset>2771480</wp:posOffset>
+                      </wp:positionH>
+                      <wp:positionV relativeFrom="paragraph">
+                        <wp:posOffset>752161</wp:posOffset>
+                      </wp:positionV>
+                      <wp:extent cx="949895" cy="1404620"/>
+                      <wp:effectExtent l="0" t="0" r="0" b="0"/>
+                      <wp:wrapNone/>
+                      <wp:docPr id="1277172258" name="Text Box 2"/>
+                      <wp:cNvGraphicFramePr>
+                        <a:graphicFrameLocks xmlns:a="http://schemas.openxmlformats.org/drawingml/2006/main"/>
+                      </wp:cNvGraphicFramePr>
+                      <a:graphic xmlns:a="http://schemas.openxmlformats.org/drawingml/2006/main">
+                        <a:graphicData uri="http://schemas.microsoft.com/office/word/2010/wordprocessingShape">
+                          <wps:wsp>
+                            <wps:cNvSpPr txBox="1">
+                              <a:spLocks noChangeArrowheads="1"/>
+                            </wps:cNvSpPr>
+                            <wps:spPr bwMode="auto">
+                              <a:xfrm>
+                                <a:off x="0" y="0"/>
+                                <a:ext cx="949895" cy="1404620"/>
+                              </a:xfrm>
+                              <a:prstGeom prst="rect">
+                                <a:avLst/>
+                              </a:prstGeom>
+                              <a:noFill/>
+                              <a:ln w="9525">
+                                <a:noFill/>
+                                <a:miter lim="800000"/>
+                                <a:headEnd/>
+                                <a:tailEnd/>
+                              </a:ln>
+                            </wps:spPr>
+                            <wps:txbx>
+                              <w:txbxContent>
+                                <w:p>
+                                  <w:pPr>
+                                    <w:rPr>
+                                      <w:sz w:val="16"/>
+                                      <w:szCs w:val="16"/>
+                                      <w:lang w:val="en-GB"/>
+                                    </w:rPr>
+                                  </w:pPr>
+                                  <w:r>
+                                    <w:rPr>
+                                      <w:sz w:val="16"/>
+                                      <w:szCs w:val="16"/>
+                                      <w:lang w:val="en-GB"/>
+                                    </w:rPr>
+                                    <w:t xml:space="preserve">Heatmap style hotspots visualise crime density, with larger circles indicating crime frequency and darker circles indicating crime severity. </w:t>
+                                  </w:r>
+                                  <w:r>
+                                    <w:rPr>
+                                      <w:sz w:val="16"/>
+                                      <w:szCs w:val="16"/>
+                                      <w:lang w:val="en-GB"/>
+                                    </w:rPr>
+                                    <w:t xml:space="preserve"> </w:t>
+                                  </w:r>
+                                </w:p>
+                              </w:txbxContent>
+                            </wps:txbx>
+                            <wps:bodyPr rot="0" vert="horz" wrap="square" lIns="91440" tIns="45720" rIns="91440" bIns="45720" anchor="t" anchorCtr="0">
+                              <a:spAutoFit/>
+                            </wps:bodyPr>
+                          </wps:wsp>
+                        </a:graphicData>
+                      </a:graphic>
+                      <wp14:sizeRelH relativeFrom="margin">
+                        <wp14:pctWidth>0</wp14:pctWidth>
+                      </wp14:sizeRelH>
+                      <wp14:sizeRelV relativeFrom="margin">
+                        <wp14:pctHeight>20000</wp14:pctHeight>
+                      </wp14:sizeRelV>
+                    </wp:anchor>
+                  </w:drawing>
+                </mc:Choice>
+                <mc:Fallback>
+                  <w:pict>
+                    <v:shape w14:anchorId="47F0FDDC" id="_x0000_s1042" type="#_x0000_t202" style="position:absolute;left:0;text-align:left;margin-left:218.25pt;margin-top:59.25pt;width:74.8pt;height:110.6pt;z-index:251779072;visibility:visible;mso-wrap-style:square;mso-width-percent:0;mso-height-percent:200;mso-wrap-distance-left:9pt;mso-wrap-distance-top:3.6pt;mso-wrap-distance-right:9pt;mso-wrap-distance-bottom:3.6pt;mso-position-horizontal:absolute;mso-position-horizontal-relative:text;mso-position-vertical:absolute;mso-position-vertical-relative:text;mso-width-percent:0;mso-height-percent:200;mso-width-relative:margin;mso-height-relative:margin;v-text-anchor:top" o:gfxdata="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" filled="f" stroked="f">
+                      <v:textbox style="mso-fit-shape-to-text:t">
+                        <w:txbxContent>
+                          <w:p>
+                            <w:pPr>
+                              <w:rPr>
+                                <w:sz w:val="16"/>
+                                <w:szCs w:val="16"/>
+                                <w:lang w:val="en-GB"/>
+                              </w:rPr>
+                            </w:pPr>
+                            <w:r>
+                              <w:rPr>
+                                <w:sz w:val="16"/>
+                                <w:szCs w:val="16"/>
+                                <w:lang w:val="en-GB"/>
+                              </w:rPr>
+                              <w:t xml:space="preserve">Heatmap style hotspots visualise crime density, with larger circles indicating crime frequency and darker circles indicating crime severity. </w:t>
+                            </w:r>
+                            <w:r>
+                              <w:rPr>
+                                <w:sz w:val="16"/>
+                                <w:szCs w:val="16"/>
+                                <w:lang w:val="en-GB"/>
+                              </w:rPr>
+                              <w:t xml:space="preserve"> </w:t>
+                            </w:r>
+                          </w:p>
+                        </w:txbxContent>
+                      </v:textbox>
+                    </v:shape>
+                  </w:pict>
+                </mc:Fallback>
+              </mc:AlternateContent>
+            </w:r>
+            <w:r>
+              <w:rPr>
+                <w:noProof/>
+                <w:sz w:val="18"/>
+                <w:szCs w:val="18"/>
+              </w:rPr>
+              <w:drawing>
+                <wp:anchor distT="0" distB="0" distL="114300" distR="114300" simplePos="0" relativeHeight="251740160" behindDoc="1" locked="0" layoutInCell="1" allowOverlap="1" wp14:anchorId="23A6039B" wp14:editId="0E4F66CF">
+                  <wp:simplePos x="0" y="0"/>
+                  <wp:positionH relativeFrom="column">
+                    <wp:posOffset>1013430</wp:posOffset>
+                  </wp:positionH>
+                  <wp:positionV relativeFrom="page">
+                    <wp:posOffset>1074139</wp:posOffset>
+                  </wp:positionV>
+                  <wp:extent cx="1710690" cy="3009265"/>
+                  <wp:effectExtent l="0" t="0" r="3810" b="635"/>
+                  <wp:wrapTight wrapText="bothSides">
+                    <wp:wrapPolygon edited="0">
+                      <wp:start x="0" y="0"/>
+                      <wp:lineTo x="0" y="21513"/>
+                      <wp:lineTo x="21488" y="21513"/>
+                      <wp:lineTo x="21488" y="0"/>
+                      <wp:lineTo x="0" y="0"/>
+                    </wp:wrapPolygon>
+                  </wp:wrapTight>
+                  <wp:docPr id="387190200" name="Picture 38"/>
+                  <wp:cNvGraphicFramePr>
+                    <a:graphicFrameLocks xmlns:a="http://schemas.openxmlformats.org/drawingml/2006/main" noChangeAspect="1"/>
+                  </wp:cNvGraphicFramePr>
+                  <a:graphic xmlns:a="http://schemas.openxmlformats.org/drawingml/2006/main">
+                    <a:graphicData uri="http://schemas.openxmlformats.org/drawingml/2006/picture">
+                      <pic:pic xmlns:pic="http://schemas.openxmlformats.org/drawingml/2006/picture">
+                        <pic:nvPicPr>
+                          <pic:cNvPr id="387190200" name="Picture 387190200"/>
+                          <pic:cNvPicPr/>
+                        </pic:nvPicPr>
+                        <pic:blipFill>
+                          <a:blip r:embed="rId9" cstate="print">
+                            <a:extLst>
+                              <a:ext uri="{28A0092B-C50C-407E-A947-70E740481C1C}">
+                                <a14:useLocalDpi xmlns:a14="http://schemas.microsoft.com/office/drawing/2010/main" val="0"/>
+                              </a:ext>
+                            </a:extLst>
+                          </a:blip>
+                          <a:stretch>
+                            <a:fillRect/>
+                          </a:stretch>
+                        </pic:blipFill>
+                        <pic:spPr>
+                          <a:xfrm>
+                            <a:off x="0" y="0"/>
+                            <a:ext cx="1710690" cy="3009265"/>
+                          </a:xfrm>
+                          <a:prstGeom prst="rect">
+                            <a:avLst/>
+                          </a:prstGeom>
+                        </pic:spPr>
+                      </pic:pic>
+                    </a:graphicData>
+                  </a:graphic>
+                  <wp14:sizeRelH relativeFrom="page">
+                    <wp14:pctWidth>0</wp14:pctWidth>
+                  </wp14:sizeRelH>
+                  <wp14:sizeRelV relativeFrom="page">
+                    <wp14:pctHeight>0</wp14:pctHeight>
+                  </wp14:sizeRelV>
+                </wp:anchor>
+              </w:drawing>
+            </w:r>
           </w:p>
         </w:tc>
         <w:tc>
@@ -603,11 +4758,7 @@
                 </mc:Choice>
                 <mc:Fallback>
                   <w:pict>
-                    <v:shapetype w14:anchorId="65110478" id="_x0000_t202" coordsize="21600,21600" o:spt="202" path="m,l,21600r21600,l21600,xe">
-                      <v:stroke joinstyle="miter"/>
-                      <v:path gradientshapeok="t" o:connecttype="rect"/>
-                    </v:shapetype>
-                    <v:shape id="Text Box 2" o:spid="_x0000_s1026" type="#_x0000_t202" style="position:absolute;left:0;text-align:left;margin-left:220.6pt;margin-top:221.8pt;width:80.45pt;height:110.6pt;z-index:251671552;visibility:visible;mso-wrap-style:square;mso-width-percent:0;mso-height-percent:200;mso-wrap-distance-left:9pt;mso-wrap-distance-top:3.6pt;mso-wrap-distance-right:9pt;mso-wrap-distance-bottom:3.6pt;mso-position-horizontal:absolute;mso-position-horizontal-relative:text;mso-position-vertical:absolute;mso-position-vertical-relative:text;mso-width-percent:0;mso-height-percent:200;mso-width-relative:margin;mso-height-relative:margin;v-text-anchor:top" o:gfxdata="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" filled="f" stroked="f">
+                    <v:shape w14:anchorId="65110478" id="_x0000_s1043" type="#_x0000_t202" style="position:absolute;left:0;text-align:left;margin-left:220.6pt;margin-top:221.8pt;width:80.45pt;height:110.6pt;z-index:251671552;visibility:visible;mso-wrap-style:square;mso-width-percent:0;mso-height-percent:200;mso-wrap-distance-left:9pt;mso-wrap-distance-top:3.6pt;mso-wrap-distance-right:9pt;mso-wrap-distance-bottom:3.6pt;mso-position-horizontal:absolute;mso-position-horizontal-relative:text;mso-position-vertical:absolute;mso-position-vertical-relative:text;mso-width-percent:0;mso-height-percent:200;mso-width-relative:margin;mso-height-relative:margin;v-text-anchor:top" o:gfxdata="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" filled="f" stroked="f">
                       <v:textbox style="mso-fit-shape-to-text:t">
                         <w:txbxContent>
                           <w:p>
@@ -720,7 +4871,7 @@
                 </mc:Choice>
                 <mc:Fallback>
                   <w:pict>
-                    <v:shape w14:anchorId="0EB9EC44" id="_x0000_s1027" type="#_x0000_t202" style="position:absolute;left:0;text-align:left;margin-left:-.05pt;margin-top:193.05pt;width:1in;height:110.6pt;z-index:251669504;visibility:visible;mso-wrap-style:square;mso-width-percent:0;mso-height-percent:200;mso-wrap-distance-left:9pt;mso-wrap-distance-top:3.6pt;mso-wrap-distance-right:9pt;mso-wrap-distance-bottom:3.6pt;mso-position-horizontal:absolute;mso-position-horizontal-relative:text;mso-position-vertical:absolute;mso-position-vertical-relative:text;mso-width-percent:0;mso-height-percent:200;mso-width-relative:margin;mso-height-relative:margin;v-text-anchor:top" o:gfxdata="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" filled="f" stroked="f">
+                    <v:shape w14:anchorId="0EB9EC44" id="_x0000_s1044" type="#_x0000_t202" style="position:absolute;left:0;text-align:left;margin-left:-.05pt;margin-top:193.05pt;width:1in;height:110.6pt;z-index:251669504;visibility:visible;mso-wrap-style:square;mso-width-percent:0;mso-height-percent:200;mso-wrap-distance-left:9pt;mso-wrap-distance-top:3.6pt;mso-wrap-distance-right:9pt;mso-wrap-distance-bottom:3.6pt;mso-position-horizontal:absolute;mso-position-horizontal-relative:text;mso-position-vertical:absolute;mso-position-vertical-relative:text;mso-width-percent:0;mso-height-percent:200;mso-width-relative:margin;mso-height-relative:margin;v-text-anchor:top" o:gfxdata="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" filled="f" stroked="f">
                       <v:textbox style="mso-fit-shape-to-text:t">
                         <w:txbxContent>
                           <w:p>
@@ -851,7 +5002,7 @@
                 </mc:Choice>
                 <mc:Fallback>
                   <w:pict>
-                    <v:shape w14:anchorId="0AD9D9E6" id="_x0000_s1028" type="#_x0000_t202" style="position:absolute;left:0;text-align:left;margin-left:222.9pt;margin-top:43.4pt;width:91.25pt;height:110.6pt;z-index:251667456;visibility:visible;mso-wrap-style:square;mso-width-percent:0;mso-height-percent:200;mso-wrap-distance-left:9pt;mso-wrap-distance-top:3.6pt;mso-wrap-distance-right:9pt;mso-wrap-distance-bottom:3.6pt;mso-position-horizontal:absolute;mso-position-horizontal-relative:text;mso-position-vertical:absolute;mso-position-vertical-relative:text;mso-width-percent:0;mso-height-percent:200;mso-width-relative:margin;mso-height-relative:margin;v-text-anchor:top" o:gfxdata="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" filled="f" stroked="f">
+                    <v:shape w14:anchorId="0AD9D9E6" id="_x0000_s1045" type="#_x0000_t202" style="position:absolute;left:0;text-align:left;margin-left:222.9pt;margin-top:43.4pt;width:91.25pt;height:110.6pt;z-index:251667456;visibility:visible;mso-wrap-style:square;mso-width-percent:0;mso-height-percent:200;mso-wrap-distance-left:9pt;mso-wrap-distance-top:3.6pt;mso-wrap-distance-right:9pt;mso-wrap-distance-bottom:3.6pt;mso-position-horizontal:absolute;mso-position-horizontal-relative:text;mso-position-vertical:absolute;mso-position-vertical-relative:text;mso-width-percent:0;mso-height-percent:200;mso-width-relative:margin;mso-height-relative:margin;v-text-anchor:top" o:gfxdata="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" filled="f" stroked="f">
                       <v:textbox style="mso-fit-shape-to-text:t">
                         <w:txbxContent>
                           <w:p>
@@ -990,7 +5141,7 @@
                 </mc:Choice>
                 <mc:Fallback>
                   <w:pict>
-                    <v:shape w14:anchorId="4BE11D61" id="_x0000_s1029" type="#_x0000_t202" style="position:absolute;left:0;text-align:left;margin-left:-4.3pt;margin-top:27.9pt;width:117.2pt;height:110.6pt;z-index:251665408;visibility:visible;mso-wrap-style:square;mso-width-percent:0;mso-height-percent:200;mso-wrap-distance-left:9pt;mso-wrap-distance-top:3.6pt;mso-wrap-distance-right:9pt;mso-wrap-distance-bottom:3.6pt;mso-position-horizontal:absolute;mso-position-horizontal-relative:text;mso-position-vertical:absolute;mso-position-vertical-relative:text;mso-width-percent:0;mso-height-percent:200;mso-width-relative:margin;mso-height-relative:margin;v-text-anchor:top" o:gfxdata="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" filled="f" stroked="f">
+                    <v:shape w14:anchorId="4BE11D61" id="_x0000_s1046" type="#_x0000_t202" style="position:absolute;left:0;text-align:left;margin-left:-4.3pt;margin-top:27.9pt;width:117.2pt;height:110.6pt;z-index:251665408;visibility:visible;mso-wrap-style:square;mso-width-percent:0;mso-height-percent:200;mso-wrap-distance-left:9pt;mso-wrap-distance-top:3.6pt;mso-wrap-distance-right:9pt;mso-wrap-distance-bottom:3.6pt;mso-position-horizontal:absolute;mso-position-horizontal-relative:text;mso-position-vertical:absolute;mso-position-vertical-relative:text;mso-width-percent:0;mso-height-percent:200;mso-width-relative:margin;mso-height-relative:margin;v-text-anchor:top" o:gfxdata="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" filled="f" stroked="f">
                       <v:textbox style="mso-fit-shape-to-text:t">
                         <w:txbxContent>
                           <w:p>
@@ -1057,7 +5208,7 @@
                           <pic:cNvPicPr/>
                         </pic:nvPicPr>
                         <pic:blipFill>
-                          <a:blip r:embed="rId4" cstate="print">
+                          <a:blip r:embed="rId10" cstate="print">
                             <a:extLst>
                               <a:ext uri="{28A0092B-C50C-407E-A947-70E740481C1C}">
                                 <a14:useLocalDpi xmlns:a14="http://schemas.microsoft.com/office/drawing/2010/main" val="0"/>
@@ -1106,15 +5257,18 @@
               <w:t xml:space="preserve"> Finn</w:t>
             </w:r>
           </w:p>
+          <w:p>
+            <w:pPr>
+              <w:ind w:left="144" w:right="144"/>
+              <w:rPr>
+                <w:sz w:val="18"/>
+                <w:szCs w:val="18"/>
+              </w:rPr>
+            </w:pPr>
+          </w:p>
         </w:tc>
       </w:tr>
       <w:tr>
-        <w:tblPrEx>
-          <w:tblCellMar>
-            <w:top w:w="0" w:type="dxa"/>
-            <w:bottom w:w="0" w:type="dxa"/>
-          </w:tblCellMar>
-        </w:tblPrEx>
         <w:trPr>
           <w:cantSplit/>
           <w:trHeight w:hRule="exact" w:val="7920"/>
@@ -1479,7 +5633,7 @@
                 </mc:Choice>
                 <mc:Fallback>
                   <w:pict>
-                    <v:shape w14:anchorId="42E37670" id="_x0000_s1030" type="#_x0000_t202" style="position:absolute;left:0;text-align:left;margin-left:1.85pt;margin-top:232.4pt;width:67.75pt;height:110.6pt;z-index:251677696;visibility:visible;mso-wrap-style:square;mso-width-percent:0;mso-height-percent:200;mso-wrap-distance-left:9pt;mso-wrap-distance-top:3.6pt;mso-wrap-distance-right:9pt;mso-wrap-distance-bottom:3.6pt;mso-position-horizontal:absolute;mso-position-horizontal-relative:text;mso-position-vertical:absolute;mso-position-vertical-relative:text;mso-width-percent:0;mso-height-percent:200;mso-width-relative:margin;mso-height-relative:margin;v-text-anchor:top" o:gfxdata="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" filled="f" stroked="f">
+                    <v:shape w14:anchorId="42E37670" id="_x0000_s1047" type="#_x0000_t202" style="position:absolute;left:0;text-align:left;margin-left:1.85pt;margin-top:232.4pt;width:67.75pt;height:110.6pt;z-index:251677696;visibility:visible;mso-wrap-style:square;mso-width-percent:0;mso-height-percent:200;mso-wrap-distance-left:9pt;mso-wrap-distance-top:3.6pt;mso-wrap-distance-right:9pt;mso-wrap-distance-bottom:3.6pt;mso-position-horizontal:absolute;mso-position-horizontal-relative:text;mso-position-vertical:absolute;mso-position-vertical-relative:text;mso-width-percent:0;mso-height-percent:200;mso-width-relative:margin;mso-height-relative:margin;v-text-anchor:top" o:gfxdata="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" filled="f" stroked="f">
                       <v:textbox style="mso-fit-shape-to-text:t">
                         <w:txbxContent>
                           <w:p>
@@ -1592,7 +5746,7 @@
                 </mc:Choice>
                 <mc:Fallback>
                   <w:pict>
-                    <v:shape w14:anchorId="307B271E" id="_x0000_s1031" type="#_x0000_t202" style="position:absolute;left:0;text-align:left;margin-left:226.3pt;margin-top:190.95pt;width:88.95pt;height:110.6pt;z-index:251675648;visibility:visible;mso-wrap-style:square;mso-width-percent:0;mso-height-percent:200;mso-wrap-distance-left:9pt;mso-wrap-distance-top:3.6pt;mso-wrap-distance-right:9pt;mso-wrap-distance-bottom:3.6pt;mso-position-horizontal:absolute;mso-position-horizontal-relative:text;mso-position-vertical:absolute;mso-position-vertical-relative:text;mso-width-percent:0;mso-height-percent:200;mso-width-relative:margin;mso-height-relative:margin;v-text-anchor:top" o:gfxdata="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" filled="f" stroked="f">
+                    <v:shape w14:anchorId="307B271E" id="_x0000_s1048" type="#_x0000_t202" style="position:absolute;left:0;text-align:left;margin-left:226.3pt;margin-top:190.95pt;width:88.95pt;height:110.6pt;z-index:251675648;visibility:visible;mso-wrap-style:square;mso-width-percent:0;mso-height-percent:200;mso-wrap-distance-left:9pt;mso-wrap-distance-top:3.6pt;mso-wrap-distance-right:9pt;mso-wrap-distance-bottom:3.6pt;mso-position-horizontal:absolute;mso-position-horizontal-relative:text;mso-position-vertical:absolute;mso-position-vertical-relative:text;mso-width-percent:0;mso-height-percent:200;mso-width-relative:margin;mso-height-relative:margin;v-text-anchor:top" o:gfxdata="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" filled="f" stroked="f">
                       <v:textbox style="mso-fit-shape-to-text:t">
                         <w:txbxContent>
                           <w:p>
@@ -1705,7 +5859,7 @@
                 </mc:Choice>
                 <mc:Fallback>
                   <w:pict>
-                    <v:shape w14:anchorId="02AB6E4B" id="_x0000_s1032" type="#_x0000_t202" style="position:absolute;left:0;text-align:left;margin-left:.2pt;margin-top:26.55pt;width:117.2pt;height:110.6pt;z-index:251673600;visibility:visible;mso-wrap-style:square;mso-width-percent:0;mso-height-percent:200;mso-wrap-distance-left:9pt;mso-wrap-distance-top:3.6pt;mso-wrap-distance-right:9pt;mso-wrap-distance-bottom:3.6pt;mso-position-horizontal:absolute;mso-position-horizontal-relative:text;mso-position-vertical:absolute;mso-position-vertical-relative:text;mso-width-percent:0;mso-height-percent:200;mso-width-relative:margin;mso-height-relative:margin;v-text-anchor:top" o:gfxdata="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" filled="f" stroked="f">
+                    <v:shape w14:anchorId="02AB6E4B" id="_x0000_s1049" type="#_x0000_t202" style="position:absolute;left:0;text-align:left;margin-left:.2pt;margin-top:26.55pt;width:117.2pt;height:110.6pt;z-index:251673600;visibility:visible;mso-wrap-style:square;mso-width-percent:0;mso-height-percent:200;mso-wrap-distance-left:9pt;mso-wrap-distance-top:3.6pt;mso-wrap-distance-right:9pt;mso-wrap-distance-bottom:3.6pt;mso-position-horizontal:absolute;mso-position-horizontal-relative:text;mso-position-vertical:absolute;mso-position-vertical-relative:text;mso-width-percent:0;mso-height-percent:200;mso-width-relative:margin;mso-height-relative:margin;v-text-anchor:top" o:gfxdata="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" filled="f" stroked="f">
                       <v:textbox style="mso-fit-shape-to-text:t">
                         <w:txbxContent>
                           <w:p>
@@ -1764,7 +5918,7 @@
                           <pic:cNvPicPr/>
                         </pic:nvPicPr>
                         <pic:blipFill>
-                          <a:blip r:embed="rId5" cstate="print">
+                          <a:blip r:embed="rId11" cstate="print">
                             <a:extLst>
                               <a:ext uri="{28A0092B-C50C-407E-A947-70E740481C1C}">
                                 <a14:useLocalDpi xmlns:a14="http://schemas.microsoft.com/office/drawing/2010/main" val="0"/>
@@ -2174,7 +6328,7 @@
                 </mc:Choice>
                 <mc:Fallback>
                   <w:pict>
-                    <v:shape w14:anchorId="20CE12E1" id="_x0000_s1033" type="#_x0000_t202" style="position:absolute;left:0;text-align:left;margin-left:9.75pt;margin-top:210.7pt;width:88.45pt;height:110.6pt;z-index:251681792;visibility:visible;mso-wrap-style:square;mso-width-percent:0;mso-height-percent:200;mso-wrap-distance-left:9pt;mso-wrap-distance-top:3.6pt;mso-wrap-distance-right:9pt;mso-wrap-distance-bottom:3.6pt;mso-position-horizontal:absolute;mso-position-horizontal-relative:text;mso-position-vertical:absolute;mso-position-vertical-relative:text;mso-width-percent:0;mso-height-percent:200;mso-width-relative:margin;mso-height-relative:margin;v-text-anchor:top" o:gfxdata="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" filled="f" stroked="f">
+                    <v:shape w14:anchorId="20CE12E1" id="_x0000_s1050" type="#_x0000_t202" style="position:absolute;left:0;text-align:left;margin-left:9.75pt;margin-top:210.7pt;width:88.45pt;height:110.6pt;z-index:251681792;visibility:visible;mso-wrap-style:square;mso-width-percent:0;mso-height-percent:200;mso-wrap-distance-left:9pt;mso-wrap-distance-top:3.6pt;mso-wrap-distance-right:9pt;mso-wrap-distance-bottom:3.6pt;mso-position-horizontal:absolute;mso-position-horizontal-relative:text;mso-position-vertical:absolute;mso-position-vertical-relative:text;mso-width-percent:0;mso-height-percent:200;mso-width-relative:margin;mso-height-relative:margin;v-text-anchor:top" o:gfxdata="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" filled="f" stroked="f">
                       <v:textbox style="mso-fit-shape-to-text:t">
                         <w:txbxContent>
                           <w:p>
@@ -2303,7 +6457,7 @@
                 </mc:Choice>
                 <mc:Fallback>
                   <w:pict>
-                    <v:shape w14:anchorId="678AB47B" id="_x0000_s1034" type="#_x0000_t202" style="position:absolute;left:0;text-align:left;margin-left:-.1pt;margin-top:79.9pt;width:94.1pt;height:110.6pt;z-index:251679744;visibility:visible;mso-wrap-style:square;mso-width-percent:0;mso-height-percent:200;mso-wrap-distance-left:9pt;mso-wrap-distance-top:3.6pt;mso-wrap-distance-right:9pt;mso-wrap-distance-bottom:3.6pt;mso-position-horizontal:absolute;mso-position-horizontal-relative:text;mso-position-vertical:absolute;mso-position-vertical-relative:text;mso-width-percent:0;mso-height-percent:200;mso-width-relative:margin;mso-height-relative:margin;v-text-anchor:top" o:gfxdata="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" filled="f" stroked="f">
+                    <v:shape w14:anchorId="678AB47B" id="_x0000_s1051" type="#_x0000_t202" style="position:absolute;left:0;text-align:left;margin-left:-.1pt;margin-top:79.9pt;width:94.1pt;height:110.6pt;z-index:251679744;visibility:visible;mso-wrap-style:square;mso-width-percent:0;mso-height-percent:200;mso-wrap-distance-left:9pt;mso-wrap-distance-top:3.6pt;mso-wrap-distance-right:9pt;mso-wrap-distance-bottom:3.6pt;mso-position-horizontal:absolute;mso-position-horizontal-relative:text;mso-position-vertical:absolute;mso-position-vertical-relative:text;mso-width-percent:0;mso-height-percent:200;mso-width-relative:margin;mso-height-relative:margin;v-text-anchor:top" o:gfxdata="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" filled="f" stroked="f">
                       <v:textbox style="mso-fit-shape-to-text:t">
                         <w:txbxContent>
                           <w:p>
@@ -2432,7 +6586,7 @@
                 </mc:Choice>
                 <mc:Fallback>
                   <w:pict>
-                    <v:shape w14:anchorId="435D0853" id="_x0000_s1035" type="#_x0000_t202" style="position:absolute;left:0;text-align:left;margin-left:177.1pt;margin-top:298.6pt;width:117.2pt;height:110.6pt;z-index:251683840;visibility:visible;mso-wrap-style:square;mso-width-percent:0;mso-height-percent:200;mso-wrap-distance-left:9pt;mso-wrap-distance-top:3.6pt;mso-wrap-distance-right:9pt;mso-wrap-distance-bottom:3.6pt;mso-position-horizontal:absolute;mso-position-horizontal-relative:text;mso-position-vertical:absolute;mso-position-vertical-relative:text;mso-width-percent:0;mso-height-percent:200;mso-width-relative:margin;mso-height-relative:margin;v-text-anchor:top" o:gfxdata="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" filled="f" stroked="f">
+                    <v:shape w14:anchorId="435D0853" id="_x0000_s1052" type="#_x0000_t202" style="position:absolute;left:0;text-align:left;margin-left:177.1pt;margin-top:298.6pt;width:117.2pt;height:110.6pt;z-index:251683840;visibility:visible;mso-wrap-style:square;mso-width-percent:0;mso-height-percent:200;mso-wrap-distance-left:9pt;mso-wrap-distance-top:3.6pt;mso-wrap-distance-right:9pt;mso-wrap-distance-bottom:3.6pt;mso-position-horizontal:absolute;mso-position-horizontal-relative:text;mso-position-vertical:absolute;mso-position-vertical-relative:text;mso-width-percent:0;mso-height-percent:200;mso-width-relative:margin;mso-height-relative:margin;v-text-anchor:top" o:gfxdata="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" filled="f" stroked="f">
                       <v:textbox style="mso-fit-shape-to-text:t">
                         <w:txbxContent>
                           <w:p>
@@ -2491,7 +6645,7 @@
                           <pic:cNvPicPr/>
                         </pic:nvPicPr>
                         <pic:blipFill>
-                          <a:blip r:embed="rId6" cstate="print">
+                          <a:blip r:embed="rId12" cstate="print">
                             <a:extLst>
                               <a:ext uri="{28A0092B-C50C-407E-A947-70E740481C1C}">
                                 <a14:useLocalDpi xmlns:a14="http://schemas.microsoft.com/office/drawing/2010/main" val="0"/>
@@ -2578,12 +6732,6 @@
         <w:gridCol w:w="6120"/>
       </w:tblGrid>
       <w:tr>
-        <w:tblPrEx>
-          <w:tblCellMar>
-            <w:top w:w="0" w:type="dxa"/>
-            <w:bottom w:w="0" w:type="dxa"/>
-          </w:tblCellMar>
-        </w:tblPrEx>
         <w:trPr>
           <w:cantSplit/>
           <w:trHeight w:hRule="exact" w:val="7920"/>
@@ -2949,7 +7097,7 @@
                 </mc:Choice>
                 <mc:Fallback>
                   <w:pict>
-                    <v:shape w14:anchorId="10ECF737" id="_x0000_s1036" type="#_x0000_t202" style="position:absolute;left:0;text-align:left;margin-left:0;margin-top:189.8pt;width:75.75pt;height:110.6pt;z-index:251685888;visibility:visible;mso-wrap-style:square;mso-width-percent:0;mso-height-percent:200;mso-wrap-distance-left:9pt;mso-wrap-distance-top:3.6pt;mso-wrap-distance-right:9pt;mso-wrap-distance-bottom:3.6pt;mso-position-horizontal:absolute;mso-position-horizontal-relative:text;mso-position-vertical:absolute;mso-position-vertical-relative:text;mso-width-percent:0;mso-height-percent:200;mso-width-relative:margin;mso-height-relative:margin;v-text-anchor:top" o:gfxdata="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" filled="f" stroked="f">
+                    <v:shape w14:anchorId="10ECF737" id="_x0000_s1053" type="#_x0000_t202" style="position:absolute;left:0;text-align:left;margin-left:0;margin-top:189.8pt;width:75.75pt;height:110.6pt;z-index:251685888;visibility:visible;mso-wrap-style:square;mso-width-percent:0;mso-height-percent:200;mso-wrap-distance-left:9pt;mso-wrap-distance-top:3.6pt;mso-wrap-distance-right:9pt;mso-wrap-distance-bottom:3.6pt;mso-position-horizontal:absolute;mso-position-horizontal-relative:text;mso-position-vertical:absolute;mso-position-vertical-relative:text;mso-width-percent:0;mso-height-percent:200;mso-width-relative:margin;mso-height-relative:margin;v-text-anchor:top" o:gfxdata="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" filled="f" stroked="f">
                       <v:textbox style="mso-fit-shape-to-text:t">
                         <w:txbxContent>
                           <w:p>
@@ -3062,7 +7210,7 @@
                 </mc:Choice>
                 <mc:Fallback>
                   <w:pict>
-                    <v:shape w14:anchorId="58CA98AC" id="_x0000_s1037" type="#_x0000_t202" style="position:absolute;left:0;text-align:left;margin-left:168.7pt;margin-top:31.6pt;width:117.2pt;height:110.6pt;z-index:251689984;visibility:visible;mso-wrap-style:square;mso-width-percent:0;mso-height-percent:200;mso-wrap-distance-left:9pt;mso-wrap-distance-top:3.6pt;mso-wrap-distance-right:9pt;mso-wrap-distance-bottom:3.6pt;mso-position-horizontal:absolute;mso-position-horizontal-relative:text;mso-position-vertical:absolute;mso-position-vertical-relative:text;mso-width-percent:0;mso-height-percent:200;mso-width-relative:margin;mso-height-relative:margin;v-text-anchor:top" o:gfxdata="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" filled="f" stroked="f">
+                    <v:shape w14:anchorId="58CA98AC" id="_x0000_s1054" type="#_x0000_t202" style="position:absolute;left:0;text-align:left;margin-left:168.7pt;margin-top:31.6pt;width:117.2pt;height:110.6pt;z-index:251689984;visibility:visible;mso-wrap-style:square;mso-width-percent:0;mso-height-percent:200;mso-wrap-distance-left:9pt;mso-wrap-distance-top:3.6pt;mso-wrap-distance-right:9pt;mso-wrap-distance-bottom:3.6pt;mso-position-horizontal:absolute;mso-position-horizontal-relative:text;mso-position-vertical:absolute;mso-position-vertical-relative:text;mso-width-percent:0;mso-height-percent:200;mso-width-relative:margin;mso-height-relative:margin;v-text-anchor:top" o:gfxdata="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" filled="f" stroked="f">
                       <v:textbox style="mso-fit-shape-to-text:t">
                         <w:txbxContent>
                           <w:p>
@@ -3175,7 +7323,7 @@
                 </mc:Choice>
                 <mc:Fallback>
                   <w:pict>
-                    <v:shape w14:anchorId="739C0148" id="_x0000_s1038" type="#_x0000_t202" style="position:absolute;left:0;text-align:left;margin-left:221.15pt;margin-top:277.25pt;width:83.3pt;height:110.6pt;z-index:251687936;visibility:visible;mso-wrap-style:square;mso-width-percent:0;mso-height-percent:200;mso-wrap-distance-left:9pt;mso-wrap-distance-top:3.6pt;mso-wrap-distance-right:9pt;mso-wrap-distance-bottom:3.6pt;mso-position-horizontal:absolute;mso-position-horizontal-relative:text;mso-position-vertical:absolute;mso-position-vertical-relative:text;mso-width-percent:0;mso-height-percent:200;mso-width-relative:margin;mso-height-relative:margin;v-text-anchor:top" o:gfxdata="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" filled="f" stroked="f">
+                    <v:shape w14:anchorId="739C0148" id="_x0000_s1055" type="#_x0000_t202" style="position:absolute;left:0;text-align:left;margin-left:221.15pt;margin-top:277.25pt;width:83.3pt;height:110.6pt;z-index:251687936;visibility:visible;mso-wrap-style:square;mso-width-percent:0;mso-height-percent:200;mso-wrap-distance-left:9pt;mso-wrap-distance-top:3.6pt;mso-wrap-distance-right:9pt;mso-wrap-distance-bottom:3.6pt;mso-position-horizontal:absolute;mso-position-horizontal-relative:text;mso-position-vertical:absolute;mso-position-vertical-relative:text;mso-width-percent:0;mso-height-percent:200;mso-width-relative:margin;mso-height-relative:margin;v-text-anchor:top" o:gfxdata="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" filled="f" stroked="f">
                       <v:textbox style="mso-fit-shape-to-text:t">
                         <w:txbxContent>
                           <w:p>
@@ -3234,7 +7382,7 @@
                           <pic:cNvPicPr/>
                         </pic:nvPicPr>
                         <pic:blipFill>
-                          <a:blip r:embed="rId7" cstate="print">
+                          <a:blip r:embed="rId13" cstate="print">
                             <a:extLst>
                               <a:ext uri="{28A0092B-C50C-407E-A947-70E740481C1C}">
                                 <a14:useLocalDpi xmlns:a14="http://schemas.microsoft.com/office/drawing/2010/main" val="0"/>
@@ -3644,7 +7792,7 @@
                 </mc:Choice>
                 <mc:Fallback>
                   <w:pict>
-                    <v:shape w14:anchorId="6E302A24" id="_x0000_s1039" type="#_x0000_t202" style="position:absolute;left:0;text-align:left;margin-left:-.8pt;margin-top:37.2pt;width:117.2pt;height:110.6pt;z-index:251692032;visibility:visible;mso-wrap-style:square;mso-width-percent:0;mso-height-percent:200;mso-wrap-distance-left:9pt;mso-wrap-distance-top:3.6pt;mso-wrap-distance-right:9pt;mso-wrap-distance-bottom:3.6pt;mso-position-horizontal:absolute;mso-position-horizontal-relative:text;mso-position-vertical:absolute;mso-position-vertical-relative:text;mso-width-percent:0;mso-height-percent:200;mso-width-relative:margin;mso-height-relative:margin;v-text-anchor:top" o:gfxdata="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" filled="f" stroked="f">
+                    <v:shape w14:anchorId="6E302A24" id="_x0000_s1056" type="#_x0000_t202" style="position:absolute;left:0;text-align:left;margin-left:-.8pt;margin-top:37.2pt;width:117.2pt;height:110.6pt;z-index:251692032;visibility:visible;mso-wrap-style:square;mso-width-percent:0;mso-height-percent:200;mso-wrap-distance-left:9pt;mso-wrap-distance-top:3.6pt;mso-wrap-distance-right:9pt;mso-wrap-distance-bottom:3.6pt;mso-position-horizontal:absolute;mso-position-horizontal-relative:text;mso-position-vertical:absolute;mso-position-vertical-relative:text;mso-width-percent:0;mso-height-percent:200;mso-width-relative:margin;mso-height-relative:margin;v-text-anchor:top" o:gfxdata="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" filled="f" stroked="f">
                       <v:textbox style="mso-fit-shape-to-text:t">
                         <w:txbxContent>
                           <w:p>
@@ -3757,7 +7905,7 @@
                 </mc:Choice>
                 <mc:Fallback>
                   <w:pict>
-                    <v:shape w14:anchorId="161E5125" id="_x0000_s1040" type="#_x0000_t202" style="position:absolute;left:0;text-align:left;margin-left:249.25pt;margin-top:193.55pt;width:56.45pt;height:110.6pt;z-index:251696128;visibility:visible;mso-wrap-style:square;mso-width-percent:0;mso-height-percent:200;mso-wrap-distance-left:9pt;mso-wrap-distance-top:3.6pt;mso-wrap-distance-right:9pt;mso-wrap-distance-bottom:3.6pt;mso-position-horizontal:absolute;mso-position-horizontal-relative:text;mso-position-vertical:absolute;mso-position-vertical-relative:text;mso-width-percent:0;mso-height-percent:200;mso-width-relative:margin;mso-height-relative:margin;v-text-anchor:top" o:gfxdata="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" filled="f" stroked="f">
+                    <v:shape w14:anchorId="161E5125" id="_x0000_s1057" type="#_x0000_t202" style="position:absolute;left:0;text-align:left;margin-left:249.25pt;margin-top:193.55pt;width:56.45pt;height:110.6pt;z-index:251696128;visibility:visible;mso-wrap-style:square;mso-width-percent:0;mso-height-percent:200;mso-wrap-distance-left:9pt;mso-wrap-distance-top:3.6pt;mso-wrap-distance-right:9pt;mso-wrap-distance-bottom:3.6pt;mso-position-horizontal:absolute;mso-position-horizontal-relative:text;mso-position-vertical:absolute;mso-position-vertical-relative:text;mso-width-percent:0;mso-height-percent:200;mso-width-relative:margin;mso-height-relative:margin;v-text-anchor:top" o:gfxdata="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" filled="f" stroked="f">
                       <v:textbox style="mso-fit-shape-to-text:t">
                         <w:txbxContent>
                           <w:p>
@@ -3870,7 +8018,7 @@
                 </mc:Choice>
                 <mc:Fallback>
                   <w:pict>
-                    <v:shape w14:anchorId="658CEEDA" id="_x0000_s1041" type="#_x0000_t202" style="position:absolute;left:0;text-align:left;margin-left:-2.45pt;margin-top:233.55pt;width:82.35pt;height:110.6pt;z-index:251694080;visibility:visible;mso-wrap-style:square;mso-width-percent:0;mso-height-percent:200;mso-wrap-distance-left:9pt;mso-wrap-distance-top:3.6pt;mso-wrap-distance-right:9pt;mso-wrap-distance-bottom:3.6pt;mso-position-horizontal:absolute;mso-position-horizontal-relative:text;mso-position-vertical:absolute;mso-position-vertical-relative:text;mso-width-percent:0;mso-height-percent:200;mso-width-relative:margin;mso-height-relative:margin;v-text-anchor:top" o:gfxdata="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" filled="f" stroked="f">
+                    <v:shape w14:anchorId="658CEEDA" id="_x0000_s1058" type="#_x0000_t202" style="position:absolute;left:0;text-align:left;margin-left:-2.45pt;margin-top:233.55pt;width:82.35pt;height:110.6pt;z-index:251694080;visibility:visible;mso-wrap-style:square;mso-width-percent:0;mso-height-percent:200;mso-wrap-distance-left:9pt;mso-wrap-distance-top:3.6pt;mso-wrap-distance-right:9pt;mso-wrap-distance-bottom:3.6pt;mso-position-horizontal:absolute;mso-position-horizontal-relative:text;mso-position-vertical:absolute;mso-position-vertical-relative:text;mso-width-percent:0;mso-height-percent:200;mso-width-relative:margin;mso-height-relative:margin;v-text-anchor:top" o:gfxdata="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" filled="f" stroked="f">
                       <v:textbox style="mso-fit-shape-to-text:t">
                         <w:txbxContent>
                           <w:p>
@@ -3929,7 +8077,7 @@
                           <pic:cNvPicPr/>
                         </pic:nvPicPr>
                         <pic:blipFill>
-                          <a:blip r:embed="rId8" cstate="print">
+                          <a:blip r:embed="rId14" cstate="print">
                             <a:extLst>
                               <a:ext uri="{28A0092B-C50C-407E-A947-70E740481C1C}">
                                 <a14:useLocalDpi xmlns:a14="http://schemas.microsoft.com/office/drawing/2010/main" val="0"/>
@@ -3991,12 +8139,6 @@
         </w:tc>
       </w:tr>
       <w:tr>
-        <w:tblPrEx>
-          <w:tblCellMar>
-            <w:top w:w="0" w:type="dxa"/>
-            <w:bottom w:w="0" w:type="dxa"/>
-          </w:tblCellMar>
-        </w:tblPrEx>
         <w:trPr>
           <w:cantSplit/>
           <w:trHeight w:hRule="exact" w:val="7920"/>
@@ -4066,12 +8208,6 @@
         <w:gridCol w:w="6120"/>
       </w:tblGrid>
       <w:tr>
-        <w:tblPrEx>
-          <w:tblCellMar>
-            <w:top w:w="0" w:type="dxa"/>
-            <w:bottom w:w="0" w:type="dxa"/>
-          </w:tblCellMar>
-        </w:tblPrEx>
         <w:trPr>
           <w:cantSplit/>
           <w:trHeight w:hRule="exact" w:val="7920"/>
@@ -4106,12 +8242,6 @@
         </w:tc>
       </w:tr>
       <w:tr>
-        <w:tblPrEx>
-          <w:tblCellMar>
-            <w:top w:w="0" w:type="dxa"/>
-            <w:bottom w:w="0" w:type="dxa"/>
-          </w:tblCellMar>
-        </w:tblPrEx>
         <w:trPr>
           <w:cantSplit/>
           <w:trHeight w:hRule="exact" w:val="7920"/>
@@ -4181,12 +8311,6 @@
         <w:gridCol w:w="6120"/>
       </w:tblGrid>
       <w:tr>
-        <w:tblPrEx>
-          <w:tblCellMar>
-            <w:top w:w="0" w:type="dxa"/>
-            <w:bottom w:w="0" w:type="dxa"/>
-          </w:tblCellMar>
-        </w:tblPrEx>
         <w:trPr>
           <w:cantSplit/>
           <w:trHeight w:hRule="exact" w:val="7920"/>
@@ -4221,12 +8345,6 @@
         </w:tc>
       </w:tr>
       <w:tr>
-        <w:tblPrEx>
-          <w:tblCellMar>
-            <w:top w:w="0" w:type="dxa"/>
-            <w:bottom w:w="0" w:type="dxa"/>
-          </w:tblCellMar>
-        </w:tblPrEx>
         <w:trPr>
           <w:cantSplit/>
           <w:trHeight w:hRule="exact" w:val="7920"/>
@@ -4296,12 +8414,6 @@
         <w:gridCol w:w="6120"/>
       </w:tblGrid>
       <w:tr>
-        <w:tblPrEx>
-          <w:tblCellMar>
-            <w:top w:w="0" w:type="dxa"/>
-            <w:bottom w:w="0" w:type="dxa"/>
-          </w:tblCellMar>
-        </w:tblPrEx>
         <w:trPr>
           <w:cantSplit/>
           <w:trHeight w:hRule="exact" w:val="7920"/>
@@ -4336,12 +8448,6 @@
         </w:tc>
       </w:tr>
       <w:tr>
-        <w:tblPrEx>
-          <w:tblCellMar>
-            <w:top w:w="0" w:type="dxa"/>
-            <w:bottom w:w="0" w:type="dxa"/>
-          </w:tblCellMar>
-        </w:tblPrEx>
         <w:trPr>
           <w:cantSplit/>
           <w:trHeight w:hRule="exact" w:val="7920"/>
@@ -4411,12 +8517,6 @@
         <w:gridCol w:w="6120"/>
       </w:tblGrid>
       <w:tr>
-        <w:tblPrEx>
-          <w:tblCellMar>
-            <w:top w:w="0" w:type="dxa"/>
-            <w:bottom w:w="0" w:type="dxa"/>
-          </w:tblCellMar>
-        </w:tblPrEx>
         <w:trPr>
           <w:cantSplit/>
           <w:trHeight w:hRule="exact" w:val="7920"/>
@@ -4451,12 +8551,6 @@
         </w:tc>
       </w:tr>
       <w:tr>
-        <w:tblPrEx>
-          <w:tblCellMar>
-            <w:top w:w="0" w:type="dxa"/>
-            <w:bottom w:w="0" w:type="dxa"/>
-          </w:tblCellMar>
-        </w:tblPrEx>
         <w:trPr>
           <w:cantSplit/>
           <w:trHeight w:hRule="exact" w:val="7920"/>
@@ -4526,12 +8620,6 @@
         <w:gridCol w:w="6120"/>
       </w:tblGrid>
       <w:tr>
-        <w:tblPrEx>
-          <w:tblCellMar>
-            <w:top w:w="0" w:type="dxa"/>
-            <w:bottom w:w="0" w:type="dxa"/>
-          </w:tblCellMar>
-        </w:tblPrEx>
         <w:trPr>
           <w:cantSplit/>
           <w:trHeight w:hRule="exact" w:val="7920"/>
@@ -4566,12 +8654,6 @@
         </w:tc>
       </w:tr>
       <w:tr>
-        <w:tblPrEx>
-          <w:tblCellMar>
-            <w:top w:w="0" w:type="dxa"/>
-            <w:bottom w:w="0" w:type="dxa"/>
-          </w:tblCellMar>
-        </w:tblPrEx>
         <w:trPr>
           <w:cantSplit/>
           <w:trHeight w:hRule="exact" w:val="7920"/>
@@ -4641,12 +8723,6 @@
         <w:gridCol w:w="6120"/>
       </w:tblGrid>
       <w:tr>
-        <w:tblPrEx>
-          <w:tblCellMar>
-            <w:top w:w="0" w:type="dxa"/>
-            <w:bottom w:w="0" w:type="dxa"/>
-          </w:tblCellMar>
-        </w:tblPrEx>
         <w:trPr>
           <w:cantSplit/>
           <w:trHeight w:hRule="exact" w:val="7920"/>
@@ -4681,12 +8757,6 @@
         </w:tc>
       </w:tr>
       <w:tr>
-        <w:tblPrEx>
-          <w:tblCellMar>
-            <w:top w:w="0" w:type="dxa"/>
-            <w:bottom w:w="0" w:type="dxa"/>
-          </w:tblCellMar>
-        </w:tblPrEx>
         <w:trPr>
           <w:cantSplit/>
           <w:trHeight w:hRule="exact" w:val="7920"/>
@@ -4756,12 +8826,6 @@
         <w:gridCol w:w="6120"/>
       </w:tblGrid>
       <w:tr>
-        <w:tblPrEx>
-          <w:tblCellMar>
-            <w:top w:w="0" w:type="dxa"/>
-            <w:bottom w:w="0" w:type="dxa"/>
-          </w:tblCellMar>
-        </w:tblPrEx>
         <w:trPr>
           <w:cantSplit/>
           <w:trHeight w:hRule="exact" w:val="7920"/>
@@ -4796,12 +8860,6 @@
         </w:tc>
       </w:tr>
       <w:tr>
-        <w:tblPrEx>
-          <w:tblCellMar>
-            <w:top w:w="0" w:type="dxa"/>
-            <w:bottom w:w="0" w:type="dxa"/>
-          </w:tblCellMar>
-        </w:tblPrEx>
         <w:trPr>
           <w:cantSplit/>
           <w:trHeight w:hRule="exact" w:val="7920"/>
@@ -4871,12 +8929,6 @@
         <w:gridCol w:w="6120"/>
       </w:tblGrid>
       <w:tr>
-        <w:tblPrEx>
-          <w:tblCellMar>
-            <w:top w:w="0" w:type="dxa"/>
-            <w:bottom w:w="0" w:type="dxa"/>
-          </w:tblCellMar>
-        </w:tblPrEx>
         <w:trPr>
           <w:cantSplit/>
           <w:trHeight w:hRule="exact" w:val="7920"/>
@@ -4911,12 +8963,6 @@
         </w:tc>
       </w:tr>
       <w:tr>
-        <w:tblPrEx>
-          <w:tblCellMar>
-            <w:top w:w="0" w:type="dxa"/>
-            <w:bottom w:w="0" w:type="dxa"/>
-          </w:tblCellMar>
-        </w:tblPrEx>
         <w:trPr>
           <w:cantSplit/>
           <w:trHeight w:hRule="exact" w:val="7920"/>
@@ -4986,12 +9032,6 @@
         <w:gridCol w:w="6120"/>
       </w:tblGrid>
       <w:tr>
-        <w:tblPrEx>
-          <w:tblCellMar>
-            <w:top w:w="0" w:type="dxa"/>
-            <w:bottom w:w="0" w:type="dxa"/>
-          </w:tblCellMar>
-        </w:tblPrEx>
         <w:trPr>
           <w:cantSplit/>
           <w:trHeight w:hRule="exact" w:val="7920"/>
@@ -5026,12 +9066,6 @@
         </w:tc>
       </w:tr>
       <w:tr>
-        <w:tblPrEx>
-          <w:tblCellMar>
-            <w:top w:w="0" w:type="dxa"/>
-            <w:bottom w:w="0" w:type="dxa"/>
-          </w:tblCellMar>
-        </w:tblPrEx>
         <w:trPr>
           <w:cantSplit/>
           <w:trHeight w:hRule="exact" w:val="7920"/>
@@ -5101,12 +9135,6 @@
         <w:gridCol w:w="6120"/>
       </w:tblGrid>
       <w:tr>
-        <w:tblPrEx>
-          <w:tblCellMar>
-            <w:top w:w="0" w:type="dxa"/>
-            <w:bottom w:w="0" w:type="dxa"/>
-          </w:tblCellMar>
-        </w:tblPrEx>
         <w:trPr>
           <w:cantSplit/>
           <w:trHeight w:hRule="exact" w:val="7920"/>
@@ -5141,12 +9169,6 @@
         </w:tc>
       </w:tr>
       <w:tr>
-        <w:tblPrEx>
-          <w:tblCellMar>
-            <w:top w:w="0" w:type="dxa"/>
-            <w:bottom w:w="0" w:type="dxa"/>
-          </w:tblCellMar>
-        </w:tblPrEx>
         <w:trPr>
           <w:cantSplit/>
           <w:trHeight w:hRule="exact" w:val="7920"/>
@@ -5231,12 +9253,6 @@
         <w:gridCol w:w="6120"/>
       </w:tblGrid>
       <w:tr>
-        <w:tblPrEx>
-          <w:tblCellMar>
-            <w:top w:w="0" w:type="dxa"/>
-            <w:bottom w:w="0" w:type="dxa"/>
-          </w:tblCellMar>
-        </w:tblPrEx>
         <w:trPr>
           <w:cantSplit/>
           <w:trHeight w:hRule="exact" w:val="7920"/>
@@ -5271,12 +9287,6 @@
         </w:tc>
       </w:tr>
       <w:tr>
-        <w:tblPrEx>
-          <w:tblCellMar>
-            <w:top w:w="0" w:type="dxa"/>
-            <w:bottom w:w="0" w:type="dxa"/>
-          </w:tblCellMar>
-        </w:tblPrEx>
         <w:trPr>
           <w:cantSplit/>
           <w:trHeight w:hRule="exact" w:val="7920"/>
@@ -5330,6 +9340,100 @@
     </w:sectPr>
   </w:body>
 </w:document>
+</file>
+
+<file path=word/numbering.xml><?xml version="1.0" encoding="utf-8"?>
+<w:numbering xmlns:wpc="http://schemas.microsoft.com/office/word/2010/wordprocessingCanvas" xmlns:cx="http://schemas.microsoft.com/office/drawing/2014/chartex" xmlns:cx1="http://schemas.microsoft.com/office/drawing/2015/9/8/chartex" xmlns:cx2="http://schemas.microsoft.com/office/drawing/2015/10/21/chartex" xmlns:cx3="http://schemas.microsoft.com/office/drawing/2016/5/9/chartex" xmlns:cx4="http://schemas.microsoft.com/office/drawing/2016/5/10/chartex" xmlns:cx5="http://schemas.microsoft.com/office/drawing/2016/5/11/chartex" xmlns:cx6="http://schemas.microsoft.com/office/drawing/2016/5/12/chartex" xmlns:cx7="http://schemas.microsoft.com/office/drawing/2016/5/13/chartex" xmlns:cx8="http://schemas.microsoft.com/office/drawing/2016/5/14/chartex" xmlns:mc="http://schemas.openxmlformats.org/markup-compatibility/2006" xmlns:aink="http://schemas.microsoft.com/office/drawing/2016/ink" xmlns:am3d="http://schemas.microsoft.com/office/drawing/2017/model3d" xmlns:o="urn:schemas-microsoft-com:office:office" xmlns:oel="http://schemas.microsoft.com/office/2019/extlst" xmlns:r="http://schemas.openxmlformats.org/officeDocument/2006/relationships" xmlns:m="http://schemas.openxmlformats.org/officeDocument/2006/math" xmlns:v="urn:schemas-microsoft-com:vml" xmlns:wp14="http://schemas.microsoft.com/office/word/2010/wordprocessingDrawing" xmlns:wp="http://schemas.openxmlformats.org/drawingml/2006/wordprocessingDrawing" xmlns:w10="urn:schemas-microsoft-com:office:word" xmlns:w="http://schemas.openxmlformats.org/wordprocessingml/2006/main" xmlns:w14="http://schemas.microsoft.com/office/word/2010/wordml" xmlns:w15="http://schemas.microsoft.com/office/word/2012/wordml" xmlns:w16cex="http://schemas.microsoft.com/office/word/2018/wordml/cex" xmlns:w16cid="http://schemas.microsoft.com/office/word/2016/wordml/cid" xmlns:w16="http://schemas.microsoft.com/office/word/2018/wordml" xmlns:w16du="http://schemas.microsoft.com/office/word/2023/wordml/word16du" xmlns:w16sdtdh="http://schemas.microsoft.com/office/word/2020/wordml/sdtdatahash" xmlns:w16sdtfl="http://schemas.microsoft.com/office/word/2024/wordml/sdtformatlock" xmlns:w16se="http://schemas.microsoft.com/office/word/2015/wordml/symex" xmlns:wpg="http://schemas.microsoft.com/office/word/2010/wordprocessingGroup" xmlns:wpi="http://schemas.microsoft.com/office/word/2010/wordprocessingInk" xmlns:wne="http://schemas.microsoft.com/office/word/2006/wordml" xmlns:wps="http://schemas.microsoft.com/office/word/2010/wordprocessingShape" mc:Ignorable="w14 w15 w16se w16cid w16 w16cex w16sdtdh w16sdtfl w16du wp14">
+  <w:abstractNum w:abstractNumId="0" w15:restartNumberingAfterBreak="0">
+    <w:nsid w:val="10D02FF4"/>
+    <w:multiLevelType w:val="hybridMultilevel"/>
+    <w:tmpl w:val="FA7055E0"/>
+    <w:lvl w:ilvl="0" w:tplc="0809000F">
+      <w:start w:val="1"/>
+      <w:numFmt w:val="decimal"/>
+      <w:lvlText w:val="%1."/>
+      <w:lvlJc w:val="left"/>
+      <w:pPr>
+        <w:ind w:left="720" w:hanging="360"/>
+      </w:pPr>
+    </w:lvl>
+    <w:lvl w:ilvl="1" w:tplc="08090019" w:tentative="1">
+      <w:start w:val="1"/>
+      <w:numFmt w:val="lowerLetter"/>
+      <w:lvlText w:val="%2."/>
+      <w:lvlJc w:val="left"/>
+      <w:pPr>
+        <w:ind w:left="1440" w:hanging="360"/>
+      </w:pPr>
+    </w:lvl>
+    <w:lvl w:ilvl="2" w:tplc="0809001B" w:tentative="1">
+      <w:start w:val="1"/>
+      <w:numFmt w:val="lowerRoman"/>
+      <w:lvlText w:val="%3."/>
+      <w:lvlJc w:val="right"/>
+      <w:pPr>
+        <w:ind w:left="2160" w:hanging="180"/>
+      </w:pPr>
+    </w:lvl>
+    <w:lvl w:ilvl="3" w:tplc="0809000F" w:tentative="1">
+      <w:start w:val="1"/>
+      <w:numFmt w:val="decimal"/>
+      <w:lvlText w:val="%4."/>
+      <w:lvlJc w:val="left"/>
+      <w:pPr>
+        <w:ind w:left="2880" w:hanging="360"/>
+      </w:pPr>
+    </w:lvl>
+    <w:lvl w:ilvl="4" w:tplc="08090019" w:tentative="1">
+      <w:start w:val="1"/>
+      <w:numFmt w:val="lowerLetter"/>
+      <w:lvlText w:val="%5."/>
+      <w:lvlJc w:val="left"/>
+      <w:pPr>
+        <w:ind w:left="3600" w:hanging="360"/>
+      </w:pPr>
+    </w:lvl>
+    <w:lvl w:ilvl="5" w:tplc="0809001B" w:tentative="1">
+      <w:start w:val="1"/>
+      <w:numFmt w:val="lowerRoman"/>
+      <w:lvlText w:val="%6."/>
+      <w:lvlJc w:val="right"/>
+      <w:pPr>
+        <w:ind w:left="4320" w:hanging="180"/>
+      </w:pPr>
+    </w:lvl>
+    <w:lvl w:ilvl="6" w:tplc="0809000F" w:tentative="1">
+      <w:start w:val="1"/>
+      <w:numFmt w:val="decimal"/>
+      <w:lvlText w:val="%7."/>
+      <w:lvlJc w:val="left"/>
+      <w:pPr>
+        <w:ind w:left="5040" w:hanging="360"/>
+      </w:pPr>
+    </w:lvl>
+    <w:lvl w:ilvl="7" w:tplc="08090019" w:tentative="1">
+      <w:start w:val="1"/>
+      <w:numFmt w:val="lowerLetter"/>
+      <w:lvlText w:val="%8."/>
+      <w:lvlJc w:val="left"/>
+      <w:pPr>
+        <w:ind w:left="5760" w:hanging="360"/>
+      </w:pPr>
+    </w:lvl>
+    <w:lvl w:ilvl="8" w:tplc="0809001B" w:tentative="1">
+      <w:start w:val="1"/>
+      <w:numFmt w:val="lowerRoman"/>
+      <w:lvlText w:val="%9."/>
+      <w:lvlJc w:val="right"/>
+      <w:pPr>
+        <w:ind w:left="6480" w:hanging="180"/>
+      </w:pPr>
+    </w:lvl>
+  </w:abstractNum>
+  <w:num w:numId="1" w16cid:durableId="1380938352">
+    <w:abstractNumId w:val="0"/>
+  </w:num>
+</w:numbering>
 </file>
 
 <file path=word/styles.xml><?xml version="1.0" encoding="utf-8"?>
@@ -5935,7 +10039,6 @@
   <w:style w:type="character" w:default="1" w:styleId="DefaultParagraphFont">
     <w:name w:val="Default Paragraph Font"/>
     <w:uiPriority w:val="1"/>
-    <w:semiHidden/>
     <w:unhideWhenUsed/>
   </w:style>
   <w:style w:type="table" w:default="1" w:styleId="TableNormal">

</xml_diff>

<commit_message>
add lofi sketches for user stories 23-27
</commit_message>
<xml_diff>
--- a/CAB302-Assessment1-LoFi.docx
+++ b/CAB302-Assessment1-LoFi.docx
@@ -205,7 +205,7 @@
                       <v:stroke joinstyle="miter"/>
                       <v:path gradientshapeok="t" o:connecttype="rect"/>
                     </v:shapetype>
-                    <v:shape id="Text Box 2" o:spid="_x0000_s1026" type="#_x0000_t202" style="position:absolute;left:0;text-align:left;margin-left:5.6pt;margin-top:163.15pt;width:81.7pt;height:134.25pt;z-index:251766784;visibility:visible;mso-wrap-style:square;mso-width-percent:0;mso-height-percent:0;mso-wrap-distance-left:9pt;mso-wrap-distance-top:3.6pt;mso-wrap-distance-right:9pt;mso-wrap-distance-bottom:3.6pt;mso-position-horizontal:absolute;mso-position-horizontal-relative:text;mso-position-vertical:absolute;mso-position-vertical-relative:text;mso-width-percent:0;mso-height-percent:0;mso-width-relative:margin;mso-height-relative:margin;v-text-anchor:top" o:gfxdata="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" filled="f" stroked="f">
+                    <v:shape id="Text Box 2" o:spid="_x0000_s1026" type="#_x0000_t202" style="position:absolute;left:0;text-align:left;margin-left:5.6pt;margin-top:163.15pt;width:81.7pt;height:134.25pt;z-index:251766784;visibility:visible;mso-wrap-style:square;mso-width-percent:0;mso-height-percent:0;mso-wrap-distance-left:9pt;mso-wrap-distance-top:3.6pt;mso-wrap-distance-right:9pt;mso-wrap-distance-bottom:3.6pt;mso-position-horizontal:absolute;mso-position-horizontal-relative:text;mso-position-vertical:absolute;mso-position-vertical-relative:text;mso-width-percent:0;mso-height-percent:0;mso-width-relative:margin;mso-height-relative:margin;v-text-anchor:top" o:gfxdata="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" filled="f" stroked="f">
                       <v:textbox>
                         <w:txbxContent>
                           <w:p>
@@ -308,7 +308,7 @@
                       <v:path arrowok="t" fillok="f" o:connecttype="none"/>
                       <o:lock v:ext="edit" shapetype="t"/>
                     </v:shapetype>
-                    <v:shape id="Straight Arrow Connector 6" o:spid="_x0000_s1026" type="#_x0000_t32" style="position:absolute;margin-left:81pt;margin-top:197.15pt;width:24.05pt;height:15.2pt;z-index:251767808;visibility:visible;mso-wrap-style:square;mso-width-percent:0;mso-height-percent:0;mso-wrap-distance-left:9pt;mso-wrap-distance-top:0;mso-wrap-distance-right:9pt;mso-wrap-distance-bottom:0;mso-position-horizontal:absolute;mso-position-horizontal-relative:text;mso-position-vertical:absolute;mso-position-vertical-relative:text;mso-width-percent:0;mso-height-percent:0;mso-width-relative:margin;mso-height-relative:margin" o:gfxdata="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" strokecolor="#e00" strokeweight="1.5pt">
+                    <v:shape id="Straight Arrow Connector 6" o:spid="_x0000_s1026" type="#_x0000_t32" style="position:absolute;margin-left:81pt;margin-top:197.15pt;width:24.05pt;height:15.2pt;z-index:251767808;visibility:visible;mso-wrap-style:square;mso-width-percent:0;mso-height-percent:0;mso-wrap-distance-left:9pt;mso-wrap-distance-top:0;mso-wrap-distance-right:9pt;mso-wrap-distance-bottom:0;mso-position-horizontal:absolute;mso-position-horizontal-relative:text;mso-position-vertical:absolute;mso-position-vertical-relative:text;mso-width-percent:0;mso-height-percent:0;mso-width-relative:margin;mso-height-relative:margin" o:gfxdata="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" strokecolor="#e00" strokeweight="1.5pt">
                       <v:stroke endarrow="block" joinstyle="miter"/>
                     </v:shape>
                   </w:pict>
@@ -387,7 +387,7 @@
                 </mc:Choice>
                 <mc:Fallback>
                   <w:pict>
-                    <v:shape w14:anchorId="5EC805E6" id="Straight Arrow Connector 6" o:spid="_x0000_s1026" type="#_x0000_t32" style="position:absolute;margin-left:213.5pt;margin-top:105.3pt;width:19.65pt;height:15pt;flip:x;z-index:251764736;visibility:visible;mso-wrap-style:square;mso-width-percent:0;mso-height-percent:0;mso-wrap-distance-left:9pt;mso-wrap-distance-top:0;mso-wrap-distance-right:9pt;mso-wrap-distance-bottom:0;mso-position-horizontal:absolute;mso-position-horizontal-relative:text;mso-position-vertical:absolute;mso-position-vertical-relative:text;mso-width-percent:0;mso-height-percent:0;mso-width-relative:margin;mso-height-relative:margin" o:gfxdata="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" strokecolor="#e00" strokeweight="1.5pt">
+                    <v:shape w14:anchorId="5EC805E6" id="Straight Arrow Connector 6" o:spid="_x0000_s1026" type="#_x0000_t32" style="position:absolute;margin-left:213.5pt;margin-top:105.3pt;width:19.65pt;height:15pt;flip:x;z-index:251764736;visibility:visible;mso-wrap-style:square;mso-width-percent:0;mso-height-percent:0;mso-wrap-distance-left:9pt;mso-wrap-distance-top:0;mso-wrap-distance-right:9pt;mso-wrap-distance-bottom:0;mso-position-horizontal:absolute;mso-position-horizontal-relative:text;mso-position-vertical:absolute;mso-position-vertical-relative:text;mso-width-percent:0;mso-height-percent:0;mso-width-relative:margin;mso-height-relative:margin" o:gfxdata="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" strokecolor="#e00" strokeweight="1.5pt">
                       <v:stroke endarrow="block" joinstyle="miter"/>
                     </v:shape>
                   </w:pict>
@@ -498,7 +498,7 @@
                 </mc:Choice>
                 <mc:Fallback>
                   <w:pict>
-                    <v:shape w14:anchorId="2D6AF764" id="_x0000_s1027" type="#_x0000_t202" style="position:absolute;left:0;text-align:left;margin-left:229.05pt;margin-top:65.75pt;width:70.8pt;height:110.6pt;z-index:251763712;visibility:visible;mso-wrap-style:square;mso-width-percent:0;mso-height-percent:200;mso-wrap-distance-left:9pt;mso-wrap-distance-top:3.6pt;mso-wrap-distance-right:9pt;mso-wrap-distance-bottom:3.6pt;mso-position-horizontal:absolute;mso-position-horizontal-relative:text;mso-position-vertical:absolute;mso-position-vertical-relative:text;mso-width-percent:0;mso-height-percent:200;mso-width-relative:margin;mso-height-relative:margin;v-text-anchor:top" o:gfxdata="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" filled="f" stroked="f">
+                    <v:shape w14:anchorId="2D6AF764" id="_x0000_s1027" type="#_x0000_t202" style="position:absolute;left:0;text-align:left;margin-left:229.05pt;margin-top:65.75pt;width:70.8pt;height:110.6pt;z-index:251763712;visibility:visible;mso-wrap-style:square;mso-width-percent:0;mso-height-percent:200;mso-wrap-distance-left:9pt;mso-wrap-distance-top:3.6pt;mso-wrap-distance-right:9pt;mso-wrap-distance-bottom:3.6pt;mso-position-horizontal:absolute;mso-position-horizontal-relative:text;mso-position-vertical:absolute;mso-position-vertical-relative:text;mso-width-percent:0;mso-height-percent:200;mso-width-relative:margin;mso-height-relative:margin;v-text-anchor:top" o:gfxdata="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" filled="f" stroked="f">
                       <v:textbox style="mso-fit-shape-to-text:t">
                         <w:txbxContent>
                           <w:p>
@@ -638,7 +638,7 @@
                 </mc:Choice>
                 <mc:Fallback>
                   <w:pict>
-                    <v:shape w14:anchorId="118C16D0" id="_x0000_s1028" type="#_x0000_t202" style="position:absolute;left:0;text-align:left;margin-left:5.65pt;margin-top:4.1pt;width:81.7pt;height:134.3pt;z-index:251735040;visibility:visible;mso-wrap-style:square;mso-width-percent:0;mso-height-percent:0;mso-wrap-distance-left:9pt;mso-wrap-distance-top:3.6pt;mso-wrap-distance-right:9pt;mso-wrap-distance-bottom:3.6pt;mso-position-horizontal:absolute;mso-position-horizontal-relative:text;mso-position-vertical:absolute;mso-position-vertical-relative:text;mso-width-percent:0;mso-height-percent:0;mso-width-relative:margin;mso-height-relative:margin;v-text-anchor:top" o:gfxdata="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" filled="f" stroked="f">
+                    <v:shape w14:anchorId="118C16D0" id="_x0000_s1028" type="#_x0000_t202" style="position:absolute;left:0;text-align:left;margin-left:5.65pt;margin-top:4.1pt;width:81.7pt;height:134.3pt;z-index:251735040;visibility:visible;mso-wrap-style:square;mso-width-percent:0;mso-height-percent:0;mso-wrap-distance-left:9pt;mso-wrap-distance-top:3.6pt;mso-wrap-distance-right:9pt;mso-wrap-distance-bottom:3.6pt;mso-position-horizontal:absolute;mso-position-horizontal-relative:text;mso-position-vertical:absolute;mso-position-vertical-relative:text;mso-width-percent:0;mso-height-percent:0;mso-width-relative:margin;mso-height-relative:margin;v-text-anchor:top" o:gfxdata="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" filled="f" stroked="f">
                       <v:textbox>
                         <w:txbxContent>
                           <w:p>
@@ -746,7 +746,7 @@
                 </mc:Choice>
                 <mc:Fallback>
                   <w:pict>
-                    <v:shape w14:anchorId="1B5A6216" id="Straight Arrow Connector 6" o:spid="_x0000_s1026" type="#_x0000_t32" style="position:absolute;margin-left:81.1pt;margin-top:40.7pt;width:24.05pt;height:15.2pt;z-index:251736064;visibility:visible;mso-wrap-style:square;mso-width-percent:0;mso-height-percent:0;mso-wrap-distance-left:9pt;mso-wrap-distance-top:0;mso-wrap-distance-right:9pt;mso-wrap-distance-bottom:0;mso-position-horizontal:absolute;mso-position-horizontal-relative:text;mso-position-vertical:absolute;mso-position-vertical-relative:text;mso-width-percent:0;mso-height-percent:0;mso-width-relative:margin;mso-height-relative:margin" o:gfxdata="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" strokecolor="#e00" strokeweight="1.5pt">
+                    <v:shape w14:anchorId="1B5A6216" id="Straight Arrow Connector 6" o:spid="_x0000_s1026" type="#_x0000_t32" style="position:absolute;margin-left:81.1pt;margin-top:40.7pt;width:24.05pt;height:15.2pt;z-index:251736064;visibility:visible;mso-wrap-style:square;mso-width-percent:0;mso-height-percent:0;mso-wrap-distance-left:9pt;mso-wrap-distance-top:0;mso-wrap-distance-right:9pt;mso-wrap-distance-bottom:0;mso-position-horizontal:absolute;mso-position-horizontal-relative:text;mso-position-vertical:absolute;mso-position-vertical-relative:text;mso-width-percent:0;mso-height-percent:0;mso-width-relative:margin;mso-height-relative:margin" o:gfxdata="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" strokecolor="#e00" strokeweight="1.5pt">
                       <v:stroke endarrow="block" joinstyle="miter"/>
                     </v:shape>
                   </w:pict>
@@ -1017,7 +1017,7 @@
                 </mc:Choice>
                 <mc:Fallback>
                   <w:pict>
-                    <v:shape w14:anchorId="1CCB0DE9" id="_x0000_s1029" type="#_x0000_t202" style="position:absolute;left:0;text-align:left;margin-left:231.05pt;margin-top:188.25pt;width:70.75pt;height:110.6pt;z-index:251760640;visibility:visible;mso-wrap-style:square;mso-width-percent:0;mso-height-percent:200;mso-wrap-distance-left:9pt;mso-wrap-distance-top:3.6pt;mso-wrap-distance-right:9pt;mso-wrap-distance-bottom:3.6pt;mso-position-horizontal:absolute;mso-position-horizontal-relative:text;mso-position-vertical:absolute;mso-position-vertical-relative:text;mso-width-percent:0;mso-height-percent:200;mso-width-relative:margin;mso-height-relative:margin;v-text-anchor:top" o:gfxdata="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" filled="f" stroked="f">
+                    <v:shape w14:anchorId="1CCB0DE9" id="_x0000_s1029" type="#_x0000_t202" style="position:absolute;left:0;text-align:left;margin-left:231.05pt;margin-top:188.25pt;width:70.75pt;height:110.6pt;z-index:251760640;visibility:visible;mso-wrap-style:square;mso-width-percent:0;mso-height-percent:200;mso-wrap-distance-left:9pt;mso-wrap-distance-top:3.6pt;mso-wrap-distance-right:9pt;mso-wrap-distance-bottom:3.6pt;mso-position-horizontal:absolute;mso-position-horizontal-relative:text;mso-position-vertical:absolute;mso-position-vertical-relative:text;mso-width-percent:0;mso-height-percent:200;mso-width-relative:margin;mso-height-relative:margin;v-text-anchor:top" o:gfxdata="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" filled="f" stroked="f">
                       <v:textbox style="mso-fit-shape-to-text:t">
                         <w:txbxContent>
                           <w:p>
@@ -1116,7 +1116,7 @@
                 </mc:Choice>
                 <mc:Fallback>
                   <w:pict>
-                    <v:shape w14:anchorId="6F92ECB5" id="Straight Arrow Connector 6" o:spid="_x0000_s1026" type="#_x0000_t32" style="position:absolute;margin-left:198pt;margin-top:228.15pt;width:37.1pt;height:15pt;flip:x;z-index:251761664;visibility:visible;mso-wrap-style:square;mso-width-percent:0;mso-height-percent:0;mso-wrap-distance-left:9pt;mso-wrap-distance-top:0;mso-wrap-distance-right:9pt;mso-wrap-distance-bottom:0;mso-position-horizontal:absolute;mso-position-horizontal-relative:text;mso-position-vertical:absolute;mso-position-vertical-relative:text;mso-width-percent:0;mso-height-percent:0;mso-width-relative:margin;mso-height-relative:margin" o:gfxdata="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" strokecolor="#e00" strokeweight="1.5pt">
+                    <v:shape w14:anchorId="6F92ECB5" id="Straight Arrow Connector 6" o:spid="_x0000_s1026" type="#_x0000_t32" style="position:absolute;margin-left:198pt;margin-top:228.15pt;width:37.1pt;height:15pt;flip:x;z-index:251761664;visibility:visible;mso-wrap-style:square;mso-width-percent:0;mso-height-percent:0;mso-wrap-distance-left:9pt;mso-wrap-distance-top:0;mso-wrap-distance-right:9pt;mso-wrap-distance-bottom:0;mso-position-horizontal:absolute;mso-position-horizontal-relative:text;mso-position-vertical:absolute;mso-position-vertical-relative:text;mso-width-percent:0;mso-height-percent:0;mso-width-relative:margin;mso-height-relative:margin" o:gfxdata="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" strokecolor="#e00" strokeweight="1.5pt">
                       <v:stroke endarrow="block" joinstyle="miter"/>
                     </v:shape>
                   </w:pict>
@@ -1195,7 +1195,7 @@
                 </mc:Choice>
                 <mc:Fallback>
                   <w:pict>
-                    <v:shape w14:anchorId="3E5DFD87" id="Straight Arrow Connector 6" o:spid="_x0000_s1026" type="#_x0000_t32" style="position:absolute;margin-left:219.3pt;margin-top:88.5pt;width:19.65pt;height:15pt;flip:x;z-index:251758592;visibility:visible;mso-wrap-style:square;mso-width-percent:0;mso-height-percent:0;mso-wrap-distance-left:9pt;mso-wrap-distance-top:0;mso-wrap-distance-right:9pt;mso-wrap-distance-bottom:0;mso-position-horizontal:absolute;mso-position-horizontal-relative:text;mso-position-vertical:absolute;mso-position-vertical-relative:text;mso-width-percent:0;mso-height-percent:0;mso-width-relative:margin;mso-height-relative:margin" o:gfxdata="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" strokecolor="#e00" strokeweight="1.5pt">
+                    <v:shape w14:anchorId="3E5DFD87" id="Straight Arrow Connector 6" o:spid="_x0000_s1026" type="#_x0000_t32" style="position:absolute;margin-left:219.3pt;margin-top:88.5pt;width:19.65pt;height:15pt;flip:x;z-index:251758592;visibility:visible;mso-wrap-style:square;mso-width-percent:0;mso-height-percent:0;mso-wrap-distance-left:9pt;mso-wrap-distance-top:0;mso-wrap-distance-right:9pt;mso-wrap-distance-bottom:0;mso-position-horizontal:absolute;mso-position-horizontal-relative:text;mso-position-vertical:absolute;mso-position-vertical-relative:text;mso-width-percent:0;mso-height-percent:0;mso-width-relative:margin;mso-height-relative:margin" o:gfxdata="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" strokecolor="#e00" strokeweight="1.5pt">
                       <v:stroke endarrow="block" joinstyle="miter"/>
                     </v:shape>
                   </w:pict>
@@ -1288,7 +1288,7 @@
                 </mc:Choice>
                 <mc:Fallback>
                   <w:pict>
-                    <v:shape w14:anchorId="653B4ED0" id="_x0000_s1030" type="#_x0000_t202" style="position:absolute;left:0;text-align:left;margin-left:234.85pt;margin-top:49pt;width:70.8pt;height:110.6pt;z-index:251757568;visibility:visible;mso-wrap-style:square;mso-width-percent:0;mso-height-percent:200;mso-wrap-distance-left:9pt;mso-wrap-distance-top:3.6pt;mso-wrap-distance-right:9pt;mso-wrap-distance-bottom:3.6pt;mso-position-horizontal:absolute;mso-position-horizontal-relative:text;mso-position-vertical:absolute;mso-position-vertical-relative:text;mso-width-percent:0;mso-height-percent:200;mso-width-relative:margin;mso-height-relative:margin;v-text-anchor:top" o:gfxdata="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" filled="f" stroked="f">
+                    <v:shape w14:anchorId="653B4ED0" id="_x0000_s1030" type="#_x0000_t202" style="position:absolute;left:0;text-align:left;margin-left:234.85pt;margin-top:49pt;width:70.8pt;height:110.6pt;z-index:251757568;visibility:visible;mso-wrap-style:square;mso-width-percent:0;mso-height-percent:200;mso-wrap-distance-left:9pt;mso-wrap-distance-top:3.6pt;mso-wrap-distance-right:9pt;mso-wrap-distance-bottom:3.6pt;mso-position-horizontal:absolute;mso-position-horizontal-relative:text;mso-position-vertical:absolute;mso-position-vertical-relative:text;mso-width-percent:0;mso-height-percent:200;mso-width-relative:margin;mso-height-relative:margin;v-text-anchor:top" o:gfxdata="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" filled="f" stroked="f">
                       <v:textbox style="mso-fit-shape-to-text:t">
                         <w:txbxContent>
                           <w:p>
@@ -1410,7 +1410,7 @@
                 </mc:Choice>
                 <mc:Fallback>
                   <w:pict>
-                    <v:shape w14:anchorId="0EC614DE" id="_x0000_s1031" type="#_x0000_t202" style="position:absolute;left:0;text-align:left;margin-left:-.35pt;margin-top:55.5pt;width:93.2pt;height:101pt;z-index:251754496;visibility:visible;mso-wrap-style:square;mso-width-percent:0;mso-height-percent:0;mso-wrap-distance-left:9pt;mso-wrap-distance-top:3.6pt;mso-wrap-distance-right:9pt;mso-wrap-distance-bottom:3.6pt;mso-position-horizontal:absolute;mso-position-horizontal-relative:text;mso-position-vertical:absolute;mso-position-vertical-relative:text;mso-width-percent:0;mso-height-percent:0;mso-width-relative:margin;mso-height-relative:margin;v-text-anchor:top" o:gfxdata="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" filled="f" stroked="f">
+                    <v:shape w14:anchorId="0EC614DE" id="_x0000_s1031" type="#_x0000_t202" style="position:absolute;left:0;text-align:left;margin-left:-.35pt;margin-top:55.5pt;width:93.2pt;height:101pt;z-index:251754496;visibility:visible;mso-wrap-style:square;mso-width-percent:0;mso-height-percent:0;mso-wrap-distance-left:9pt;mso-wrap-distance-top:3.6pt;mso-wrap-distance-right:9pt;mso-wrap-distance-bottom:3.6pt;mso-position-horizontal:absolute;mso-position-horizontal-relative:text;mso-position-vertical:absolute;mso-position-vertical-relative:text;mso-width-percent:0;mso-height-percent:0;mso-width-relative:margin;mso-height-relative:margin;v-text-anchor:top" o:gfxdata="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" filled="f" stroked="f">
                       <v:textbox>
                         <w:txbxContent>
                           <w:p>
@@ -1518,7 +1518,7 @@
                 </mc:Choice>
                 <mc:Fallback>
                   <w:pict>
-                    <v:shape w14:anchorId="4D9844A5" id="Straight Arrow Connector 6" o:spid="_x0000_s1026" type="#_x0000_t32" style="position:absolute;margin-left:78.85pt;margin-top:93.7pt;width:26.1pt;height:12.7pt;z-index:251755520;visibility:visible;mso-wrap-style:square;mso-width-percent:0;mso-height-percent:0;mso-wrap-distance-left:9pt;mso-wrap-distance-top:0;mso-wrap-distance-right:9pt;mso-wrap-distance-bottom:0;mso-position-horizontal:absolute;mso-position-horizontal-relative:text;mso-position-vertical:absolute;mso-position-vertical-relative:text;mso-width-percent:0;mso-height-percent:0;mso-width-relative:margin;mso-height-relative:margin" o:gfxdata="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" strokecolor="#e00" strokeweight="1.5pt">
+                    <v:shape w14:anchorId="4D9844A5" id="Straight Arrow Connector 6" o:spid="_x0000_s1026" type="#_x0000_t32" style="position:absolute;margin-left:78.85pt;margin-top:93.7pt;width:26.1pt;height:12.7pt;z-index:251755520;visibility:visible;mso-wrap-style:square;mso-width-percent:0;mso-height-percent:0;mso-wrap-distance-left:9pt;mso-wrap-distance-top:0;mso-wrap-distance-right:9pt;mso-wrap-distance-bottom:0;mso-position-horizontal:absolute;mso-position-horizontal-relative:text;mso-position-vertical:absolute;mso-position-vertical-relative:text;mso-width-percent:0;mso-height-percent:0;mso-width-relative:margin;mso-height-relative:margin" o:gfxdata="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" strokecolor="#e00" strokeweight="1.5pt">
                       <v:stroke endarrow="block" joinstyle="miter"/>
                     </v:shape>
                   </w:pict>
@@ -1761,7 +1761,7 @@
                 </mc:Choice>
                 <mc:Fallback>
                   <w:pict>
-                    <v:shape w14:anchorId="4FC23DE8" id="Straight Arrow Connector 6" o:spid="_x0000_s1026" type="#_x0000_t32" style="position:absolute;margin-left:80.3pt;margin-top:173.25pt;width:30.55pt;height:7.45pt;flip:y;z-index:251777024;visibility:visible;mso-wrap-style:square;mso-width-percent:0;mso-height-percent:0;mso-wrap-distance-left:9pt;mso-wrap-distance-top:0;mso-wrap-distance-right:9pt;mso-wrap-distance-bottom:0;mso-position-horizontal:absolute;mso-position-horizontal-relative:text;mso-position-vertical:absolute;mso-position-vertical-relative:text;mso-width-percent:0;mso-height-percent:0;mso-width-relative:margin;mso-height-relative:margin" o:gfxdata="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" strokecolor="#e00" strokeweight="1.5pt">
+                    <v:shape w14:anchorId="4FC23DE8" id="Straight Arrow Connector 6" o:spid="_x0000_s1026" type="#_x0000_t32" style="position:absolute;margin-left:80.3pt;margin-top:173.25pt;width:30.55pt;height:7.45pt;flip:y;z-index:251777024;visibility:visible;mso-wrap-style:square;mso-width-percent:0;mso-height-percent:0;mso-wrap-distance-left:9pt;mso-wrap-distance-top:0;mso-wrap-distance-right:9pt;mso-wrap-distance-bottom:0;mso-position-horizontal:absolute;mso-position-horizontal-relative:text;mso-position-vertical:absolute;mso-position-vertical-relative:text;mso-width-percent:0;mso-height-percent:0;mso-width-relative:margin;mso-height-relative:margin" o:gfxdata="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" strokecolor="#e00" strokeweight="1.5pt">
                       <v:stroke endarrow="block" joinstyle="miter"/>
                     </v:shape>
                   </w:pict>
@@ -1854,7 +1854,7 @@
                 </mc:Choice>
                 <mc:Fallback>
                   <w:pict>
-                    <v:shape w14:anchorId="266719B1" id="_x0000_s1032" type="#_x0000_t202" style="position:absolute;left:0;text-align:left;margin-left:4.85pt;margin-top:149.8pt;width:81.7pt;height:88.2pt;z-index:251776000;visibility:visible;mso-wrap-style:square;mso-width-percent:0;mso-height-percent:0;mso-wrap-distance-left:9pt;mso-wrap-distance-top:3.6pt;mso-wrap-distance-right:9pt;mso-wrap-distance-bottom:3.6pt;mso-position-horizontal:absolute;mso-position-horizontal-relative:text;mso-position-vertical:absolute;mso-position-vertical-relative:text;mso-width-percent:0;mso-height-percent:0;mso-width-relative:margin;mso-height-relative:margin;v-text-anchor:top" o:gfxdata="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" filled="f" stroked="f">
+                    <v:shape w14:anchorId="266719B1" id="_x0000_s1032" type="#_x0000_t202" style="position:absolute;left:0;text-align:left;margin-left:4.85pt;margin-top:149.8pt;width:81.7pt;height:88.2pt;z-index:251776000;visibility:visible;mso-wrap-style:square;mso-width-percent:0;mso-height-percent:0;mso-wrap-distance-left:9pt;mso-wrap-distance-top:3.6pt;mso-wrap-distance-right:9pt;mso-wrap-distance-bottom:3.6pt;mso-position-horizontal:absolute;mso-position-horizontal-relative:text;mso-position-vertical:absolute;mso-position-vertical-relative:text;mso-width-percent:0;mso-height-percent:0;mso-width-relative:margin;mso-height-relative:margin;v-text-anchor:top" o:gfxdata="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" filled="f" stroked="f">
                       <v:textbox>
                         <w:txbxContent>
                           <w:p>
@@ -1953,7 +1953,7 @@
                 </mc:Choice>
                 <mc:Fallback>
                   <w:pict>
-                    <v:shape w14:anchorId="54C059BE" id="Straight Arrow Connector 6" o:spid="_x0000_s1026" type="#_x0000_t32" style="position:absolute;margin-left:187.65pt;margin-top:128.65pt;width:32.95pt;height:6.65pt;flip:x y;z-index:251773952;visibility:visible;mso-wrap-style:square;mso-width-percent:0;mso-height-percent:0;mso-wrap-distance-left:9pt;mso-wrap-distance-top:0;mso-wrap-distance-right:9pt;mso-wrap-distance-bottom:0;mso-position-horizontal:absolute;mso-position-horizontal-relative:text;mso-position-vertical:absolute;mso-position-vertical-relative:text;mso-width-percent:0;mso-height-percent:0;mso-width-relative:margin;mso-height-relative:margin" o:gfxdata="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" strokecolor="#e00" strokeweight="1.5pt">
+                    <v:shape w14:anchorId="54C059BE" id="Straight Arrow Connector 6" o:spid="_x0000_s1026" type="#_x0000_t32" style="position:absolute;margin-left:187.65pt;margin-top:128.65pt;width:32.95pt;height:6.65pt;flip:x y;z-index:251773952;visibility:visible;mso-wrap-style:square;mso-width-percent:0;mso-height-percent:0;mso-wrap-distance-left:9pt;mso-wrap-distance-top:0;mso-wrap-distance-right:9pt;mso-wrap-distance-bottom:0;mso-position-horizontal:absolute;mso-position-horizontal-relative:text;mso-position-vertical:absolute;mso-position-vertical-relative:text;mso-width-percent:0;mso-height-percent:0;mso-width-relative:margin;mso-height-relative:margin" o:gfxdata="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" strokecolor="#e00" strokeweight="1.5pt">
                       <v:stroke endarrow="block" joinstyle="miter"/>
                     </v:shape>
                   </w:pict>
@@ -2046,7 +2046,7 @@
                 </mc:Choice>
                 <mc:Fallback>
                   <w:pict>
-                    <v:shape w14:anchorId="4B96C39F" id="_x0000_s1033" type="#_x0000_t202" style="position:absolute;left:0;text-align:left;margin-left:224.75pt;margin-top:95.1pt;width:74.8pt;height:110.6pt;z-index:251772928;visibility:visible;mso-wrap-style:square;mso-width-percent:0;mso-height-percent:200;mso-wrap-distance-left:9pt;mso-wrap-distance-top:3.6pt;mso-wrap-distance-right:9pt;mso-wrap-distance-bottom:3.6pt;mso-position-horizontal:absolute;mso-position-horizontal-relative:text;mso-position-vertical:absolute;mso-position-vertical-relative:text;mso-width-percent:0;mso-height-percent:200;mso-width-relative:margin;mso-height-relative:margin;v-text-anchor:top" o:gfxdata="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" filled="f" stroked="f">
+                    <v:shape w14:anchorId="4B96C39F" id="_x0000_s1033" type="#_x0000_t202" style="position:absolute;left:0;text-align:left;margin-left:224.75pt;margin-top:95.1pt;width:74.8pt;height:110.6pt;z-index:251772928;visibility:visible;mso-wrap-style:square;mso-width-percent:0;mso-height-percent:200;mso-wrap-distance-left:9pt;mso-wrap-distance-top:3.6pt;mso-wrap-distance-right:9pt;mso-wrap-distance-bottom:3.6pt;mso-position-horizontal:absolute;mso-position-horizontal-relative:text;mso-position-vertical:absolute;mso-position-vertical-relative:text;mso-width-percent:0;mso-height-percent:200;mso-width-relative:margin;mso-height-relative:margin;v-text-anchor:top" o:gfxdata="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" filled="f" stroked="f">
                       <v:textbox style="mso-fit-shape-to-text:t">
                         <w:txbxContent>
                           <w:p>
@@ -2137,15 +2137,7 @@
                                       <w:szCs w:val="16"/>
                                       <w:lang w:val="en-GB"/>
                                     </w:rPr>
-                                    <w:t>An overlay pop-up that appears after a submission, providing instant feedback that the report was received.</w:t>
-                                  </w:r>
-                                  <w:r>
-                                    <w:rPr>
-                                      <w:sz w:val="16"/>
-                                      <w:szCs w:val="16"/>
-                                      <w:lang w:val="en-GB"/>
-                                    </w:rPr>
-                                    <w:t xml:space="preserve">  </w:t>
+                                    <w:t xml:space="preserve">An overlay pop-up that appears after a submission, providing instant feedback that the report was received.  </w:t>
                                   </w:r>
                                 </w:p>
                               </w:txbxContent>
@@ -2167,7 +2159,7 @@
                 </mc:Choice>
                 <mc:Fallback>
                   <w:pict>
-                    <v:shape w14:anchorId="7212F7D0" id="_x0000_s1034" type="#_x0000_t202" style="position:absolute;left:0;text-align:left;margin-left:4.85pt;margin-top:48.7pt;width:81.7pt;height:88.2pt;z-index:251769856;visibility:visible;mso-wrap-style:square;mso-width-percent:0;mso-height-percent:0;mso-wrap-distance-left:9pt;mso-wrap-distance-top:3.6pt;mso-wrap-distance-right:9pt;mso-wrap-distance-bottom:3.6pt;mso-position-horizontal:absolute;mso-position-horizontal-relative:text;mso-position-vertical:absolute;mso-position-vertical-relative:text;mso-width-percent:0;mso-height-percent:0;mso-width-relative:margin;mso-height-relative:margin;v-text-anchor:top" o:gfxdata="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" filled="f" stroked="f">
+                    <v:shape w14:anchorId="7212F7D0" id="_x0000_s1034" type="#_x0000_t202" style="position:absolute;left:0;text-align:left;margin-left:4.85pt;margin-top:48.7pt;width:81.7pt;height:88.2pt;z-index:251769856;visibility:visible;mso-wrap-style:square;mso-width-percent:0;mso-height-percent:0;mso-wrap-distance-left:9pt;mso-wrap-distance-top:3.6pt;mso-wrap-distance-right:9pt;mso-wrap-distance-bottom:3.6pt;mso-position-horizontal:absolute;mso-position-horizontal-relative:text;mso-position-vertical:absolute;mso-position-vertical-relative:text;mso-width-percent:0;mso-height-percent:0;mso-width-relative:margin;mso-height-relative:margin;v-text-anchor:top" o:gfxdata="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" filled="f" stroked="f">
                       <v:textbox>
                         <w:txbxContent>
                           <w:p>
@@ -2184,15 +2176,7 @@
                                 <w:szCs w:val="16"/>
                                 <w:lang w:val="en-GB"/>
                               </w:rPr>
-                              <w:t>An overlay pop-up that appears after a submission, providing instant feedback that the report was received.</w:t>
-                            </w:r>
-                            <w:r>
-                              <w:rPr>
-                                <w:sz w:val="16"/>
-                                <w:szCs w:val="16"/>
-                                <w:lang w:val="en-GB"/>
-                              </w:rPr>
-                              <w:t xml:space="preserve">  </w:t>
+                              <w:t xml:space="preserve">An overlay pop-up that appears after a submission, providing instant feedback that the report was received.  </w:t>
                             </w:r>
                           </w:p>
                         </w:txbxContent>
@@ -2274,7 +2258,7 @@
                 </mc:Choice>
                 <mc:Fallback>
                   <w:pict>
-                    <v:shape w14:anchorId="56AAFC5B" id="Straight Arrow Connector 6" o:spid="_x0000_s1026" type="#_x0000_t32" style="position:absolute;margin-left:80.3pt;margin-top:82.05pt;width:39.45pt;height:7.3pt;z-index:251770880;visibility:visible;mso-wrap-style:square;mso-width-percent:0;mso-height-percent:0;mso-wrap-distance-left:9pt;mso-wrap-distance-top:0;mso-wrap-distance-right:9pt;mso-wrap-distance-bottom:0;mso-position-horizontal:absolute;mso-position-horizontal-relative:text;mso-position-vertical:absolute;mso-position-vertical-relative:text;mso-width-percent:0;mso-height-percent:0;mso-width-relative:margin;mso-height-relative:margin" o:gfxdata="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" strokecolor="#e00" strokeweight="1.5pt">
+                    <v:shape w14:anchorId="56AAFC5B" id="Straight Arrow Connector 6" o:spid="_x0000_s1026" type="#_x0000_t32" style="position:absolute;margin-left:80.3pt;margin-top:82.05pt;width:39.45pt;height:7.3pt;z-index:251770880;visibility:visible;mso-wrap-style:square;mso-width-percent:0;mso-height-percent:0;mso-wrap-distance-left:9pt;mso-wrap-distance-top:0;mso-wrap-distance-right:9pt;mso-wrap-distance-bottom:0;mso-position-horizontal:absolute;mso-position-horizontal-relative:text;mso-position-vertical:absolute;mso-position-vertical-relative:text;mso-width-percent:0;mso-height-percent:0;mso-width-relative:margin;mso-height-relative:margin" o:gfxdata="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" strokecolor="#e00" strokeweight="1.5pt">
                       <v:stroke endarrow="block" joinstyle="miter"/>
                     </v:shape>
                   </w:pict>
@@ -2485,7 +2469,7 @@
                 </mc:Choice>
                 <mc:Fallback>
                   <w:pict>
-                    <v:shape w14:anchorId="592FCA11" id="_x0000_s1035" type="#_x0000_t202" style="position:absolute;left:0;text-align:left;margin-left:230.8pt;margin-top:9.35pt;width:70.8pt;height:110.6pt;z-index:251748352;visibility:visible;mso-wrap-style:square;mso-width-percent:0;mso-height-percent:200;mso-wrap-distance-left:9pt;mso-wrap-distance-top:3.6pt;mso-wrap-distance-right:9pt;mso-wrap-distance-bottom:3.6pt;mso-position-horizontal:absolute;mso-position-horizontal-relative:text;mso-position-vertical:absolute;mso-position-vertical-relative:text;mso-width-percent:0;mso-height-percent:200;mso-width-relative:margin;mso-height-relative:margin;v-text-anchor:top" o:gfxdata="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" filled="f" stroked="f">
+                    <v:shape w14:anchorId="592FCA11" id="_x0000_s1035" type="#_x0000_t202" style="position:absolute;left:0;text-align:left;margin-left:230.8pt;margin-top:9.35pt;width:70.8pt;height:110.6pt;z-index:251748352;visibility:visible;mso-wrap-style:square;mso-width-percent:0;mso-height-percent:200;mso-wrap-distance-left:9pt;mso-wrap-distance-top:3.6pt;mso-wrap-distance-right:9pt;mso-wrap-distance-bottom:3.6pt;mso-position-horizontal:absolute;mso-position-horizontal-relative:text;mso-position-vertical:absolute;mso-position-vertical-relative:text;mso-width-percent:0;mso-height-percent:200;mso-width-relative:margin;mso-height-relative:margin;v-text-anchor:top" o:gfxdata="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" filled="f" stroked="f">
                       <v:textbox style="mso-fit-shape-to-text:t">
                         <w:txbxContent>
                           <w:p>
@@ -2636,7 +2620,7 @@
                 </mc:Choice>
                 <mc:Fallback>
                   <w:pict>
-                    <v:shape w14:anchorId="3FBAE0CB" id="_x0000_s1036" type="#_x0000_t202" style="position:absolute;left:0;text-align:left;margin-left:235pt;margin-top:225.8pt;width:74.8pt;height:110.6pt;z-index:251751424;visibility:visible;mso-wrap-style:square;mso-width-percent:0;mso-height-percent:200;mso-wrap-distance-left:9pt;mso-wrap-distance-top:3.6pt;mso-wrap-distance-right:9pt;mso-wrap-distance-bottom:3.6pt;mso-position-horizontal:absolute;mso-position-horizontal-relative:text;mso-position-vertical:absolute;mso-position-vertical-relative:text;mso-width-percent:0;mso-height-percent:200;mso-width-relative:margin;mso-height-relative:margin;v-text-anchor:top" o:gfxdata="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" filled="f" stroked="f">
+                    <v:shape w14:anchorId="3FBAE0CB" id="_x0000_s1036" type="#_x0000_t202" style="position:absolute;left:0;text-align:left;margin-left:235pt;margin-top:225.8pt;width:74.8pt;height:110.6pt;z-index:251751424;visibility:visible;mso-wrap-style:square;mso-width-percent:0;mso-height-percent:200;mso-wrap-distance-left:9pt;mso-wrap-distance-top:3.6pt;mso-wrap-distance-right:9pt;mso-wrap-distance-bottom:3.6pt;mso-position-horizontal:absolute;mso-position-horizontal-relative:text;mso-position-vertical:absolute;mso-position-vertical-relative:text;mso-width-percent:0;mso-height-percent:200;mso-width-relative:margin;mso-height-relative:margin;v-text-anchor:top" o:gfxdata="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" filled="f" stroked="f">
                       <v:textbox style="mso-fit-shape-to-text:t">
                         <w:txbxContent>
                           <w:p>
@@ -2735,7 +2719,7 @@
                 </mc:Choice>
                 <mc:Fallback>
                   <w:pict>
-                    <v:shape w14:anchorId="089FE53E" id="Straight Arrow Connector 6" o:spid="_x0000_s1026" type="#_x0000_t32" style="position:absolute;margin-left:198pt;margin-top:259pt;width:33pt;height:6.65pt;flip:x y;z-index:251752448;visibility:visible;mso-wrap-style:square;mso-width-percent:0;mso-height-percent:0;mso-wrap-distance-left:9pt;mso-wrap-distance-top:0;mso-wrap-distance-right:9pt;mso-wrap-distance-bottom:0;mso-position-horizontal:absolute;mso-position-horizontal-relative:text;mso-position-vertical:absolute;mso-position-vertical-relative:text;mso-width-percent:0;mso-height-percent:0;mso-width-relative:margin;mso-height-relative:margin" o:gfxdata="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" strokecolor="#e00" strokeweight="1.5pt">
+                    <v:shape w14:anchorId="089FE53E" id="Straight Arrow Connector 6" o:spid="_x0000_s1026" type="#_x0000_t32" style="position:absolute;margin-left:198pt;margin-top:259pt;width:33pt;height:6.65pt;flip:x y;z-index:251752448;visibility:visible;mso-wrap-style:square;mso-width-percent:0;mso-height-percent:0;mso-wrap-distance-left:9pt;mso-wrap-distance-top:0;mso-wrap-distance-right:9pt;mso-wrap-distance-bottom:0;mso-position-horizontal:absolute;mso-position-horizontal-relative:text;mso-position-vertical:absolute;mso-position-vertical-relative:text;mso-width-percent:0;mso-height-percent:0;mso-width-relative:margin;mso-height-relative:margin" o:gfxdata="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" strokecolor="#e00" strokeweight="1.5pt">
                       <v:stroke endarrow="block" joinstyle="miter"/>
                     </v:shape>
                   </w:pict>
@@ -2814,7 +2798,7 @@
                 </mc:Choice>
                 <mc:Fallback>
                   <w:pict>
-                    <v:shape w14:anchorId="78D7F28C" id="Straight Arrow Connector 6" o:spid="_x0000_s1026" type="#_x0000_t32" style="position:absolute;margin-left:215.2pt;margin-top:29.5pt;width:19.65pt;height:15pt;flip:x;z-index:251749376;visibility:visible;mso-wrap-style:square;mso-width-percent:0;mso-height-percent:0;mso-wrap-distance-left:9pt;mso-wrap-distance-top:0;mso-wrap-distance-right:9pt;mso-wrap-distance-bottom:0;mso-position-horizontal:absolute;mso-position-horizontal-relative:text;mso-position-vertical:absolute;mso-position-vertical-relative:text;mso-width-percent:0;mso-height-percent:0;mso-width-relative:margin;mso-height-relative:margin" o:gfxdata="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" strokecolor="#e00" strokeweight="1.5pt">
+                    <v:shape w14:anchorId="78D7F28C" id="Straight Arrow Connector 6" o:spid="_x0000_s1026" type="#_x0000_t32" style="position:absolute;margin-left:215.2pt;margin-top:29.5pt;width:19.65pt;height:15pt;flip:x;z-index:251749376;visibility:visible;mso-wrap-style:square;mso-width-percent:0;mso-height-percent:0;mso-wrap-distance-left:9pt;mso-wrap-distance-top:0;mso-wrap-distance-right:9pt;mso-wrap-distance-bottom:0;mso-position-horizontal:absolute;mso-position-horizontal-relative:text;mso-position-vertical:absolute;mso-position-vertical-relative:text;mso-width-percent:0;mso-height-percent:0;mso-width-relative:margin;mso-height-relative:margin" o:gfxdata="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" strokecolor="#e00" strokeweight="1.5pt">
                       <v:stroke endarrow="block" joinstyle="miter"/>
                     </v:shape>
                   </w:pict>
@@ -2893,7 +2877,7 @@
                 </mc:Choice>
                 <mc:Fallback>
                   <w:pict>
-                    <v:shape w14:anchorId="775D0471" id="Straight Arrow Connector 6" o:spid="_x0000_s1026" type="#_x0000_t32" style="position:absolute;margin-left:83.45pt;margin-top:182.8pt;width:21.6pt;height:6.8pt;z-index:251746304;visibility:visible;mso-wrap-style:square;mso-width-percent:0;mso-height-percent:0;mso-wrap-distance-left:9pt;mso-wrap-distance-top:0;mso-wrap-distance-right:9pt;mso-wrap-distance-bottom:0;mso-position-horizontal:absolute;mso-position-horizontal-relative:text;mso-position-vertical:absolute;mso-position-vertical-relative:text;mso-width-percent:0;mso-height-percent:0;mso-width-relative:margin;mso-height-relative:margin" o:gfxdata="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" strokecolor="#e00" strokeweight="1.5pt">
+                    <v:shape w14:anchorId="775D0471" id="Straight Arrow Connector 6" o:spid="_x0000_s1026" type="#_x0000_t32" style="position:absolute;margin-left:83.45pt;margin-top:182.8pt;width:21.6pt;height:6.8pt;z-index:251746304;visibility:visible;mso-wrap-style:square;mso-width-percent:0;mso-height-percent:0;mso-wrap-distance-left:9pt;mso-wrap-distance-top:0;mso-wrap-distance-right:9pt;mso-wrap-distance-bottom:0;mso-position-horizontal:absolute;mso-position-horizontal-relative:text;mso-position-vertical:absolute;mso-position-vertical-relative:text;mso-width-percent:0;mso-height-percent:0;mso-width-relative:margin;mso-height-relative:margin" o:gfxdata="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" strokecolor="#e00" strokeweight="1.5pt">
                       <v:stroke endarrow="block" joinstyle="miter"/>
                     </v:shape>
                   </w:pict>
@@ -3004,7 +2988,7 @@
                 </mc:Choice>
                 <mc:Fallback>
                   <w:pict>
-                    <v:shape w14:anchorId="1BC29829" id="_x0000_s1037" type="#_x0000_t202" style="position:absolute;left:0;text-align:left;margin-left:3.2pt;margin-top:146.65pt;width:89.3pt;height:127.55pt;z-index:251745280;visibility:visible;mso-wrap-style:square;mso-width-percent:0;mso-height-percent:0;mso-wrap-distance-left:9pt;mso-wrap-distance-top:3.6pt;mso-wrap-distance-right:9pt;mso-wrap-distance-bottom:3.6pt;mso-position-horizontal:absolute;mso-position-horizontal-relative:text;mso-position-vertical:absolute;mso-position-vertical-relative:text;mso-width-percent:0;mso-height-percent:0;mso-width-relative:margin;mso-height-relative:margin;v-text-anchor:top" o:gfxdata="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" filled="f" stroked="f">
+                    <v:shape w14:anchorId="1BC29829" id="_x0000_s1037" type="#_x0000_t202" style="position:absolute;left:0;text-align:left;margin-left:3.2pt;margin-top:146.65pt;width:89.3pt;height:127.55pt;z-index:251745280;visibility:visible;mso-wrap-style:square;mso-width-percent:0;mso-height-percent:0;mso-wrap-distance-left:9pt;mso-wrap-distance-top:3.6pt;mso-wrap-distance-right:9pt;mso-wrap-distance-bottom:3.6pt;mso-position-horizontal:absolute;mso-position-horizontal-relative:text;mso-position-vertical:absolute;mso-position-vertical-relative:text;mso-width-percent:0;mso-height-percent:0;mso-width-relative:margin;mso-height-relative:margin;v-text-anchor:top" o:gfxdata="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" filled="f" stroked="f">
                       <v:textbox>
                         <w:txbxContent>
                           <w:p>
@@ -3121,7 +3105,7 @@
                 </mc:Choice>
                 <mc:Fallback>
                   <w:pict>
-                    <v:shape w14:anchorId="00AF8DB2" id="Straight Arrow Connector 6" o:spid="_x0000_s1026" type="#_x0000_t32" style="position:absolute;margin-left:79.1pt;margin-top:89.7pt;width:26.1pt;height:12.7pt;z-index:251743232;visibility:visible;mso-wrap-style:square;mso-width-percent:0;mso-height-percent:0;mso-wrap-distance-left:9pt;mso-wrap-distance-top:0;mso-wrap-distance-right:9pt;mso-wrap-distance-bottom:0;mso-position-horizontal:absolute;mso-position-horizontal-relative:text;mso-position-vertical:absolute;mso-position-vertical-relative:text;mso-width-percent:0;mso-height-percent:0;mso-width-relative:margin;mso-height-relative:margin" o:gfxdata="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" strokecolor="#e00" strokeweight="1.5pt">
+                    <v:shape w14:anchorId="00AF8DB2" id="Straight Arrow Connector 6" o:spid="_x0000_s1026" type="#_x0000_t32" style="position:absolute;margin-left:79.1pt;margin-top:89.7pt;width:26.1pt;height:12.7pt;z-index:251743232;visibility:visible;mso-wrap-style:square;mso-width-percent:0;mso-height-percent:0;mso-wrap-distance-left:9pt;mso-wrap-distance-top:0;mso-wrap-distance-right:9pt;mso-wrap-distance-bottom:0;mso-position-horizontal:absolute;mso-position-horizontal-relative:text;mso-position-vertical:absolute;mso-position-vertical-relative:text;mso-width-percent:0;mso-height-percent:0;mso-width-relative:margin;mso-height-relative:margin" o:gfxdata="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" strokecolor="#e00" strokeweight="1.5pt">
                       <v:stroke endarrow="block" joinstyle="miter"/>
                     </v:shape>
                   </w:pict>
@@ -3214,7 +3198,7 @@
                 </mc:Choice>
                 <mc:Fallback>
                   <w:pict>
-                    <v:shape w14:anchorId="643BFB18" id="_x0000_s1038" type="#_x0000_t202" style="position:absolute;left:0;text-align:left;margin-left:-.15pt;margin-top:49pt;width:93.2pt;height:101pt;z-index:251742208;visibility:visible;mso-wrap-style:square;mso-width-percent:0;mso-height-percent:0;mso-wrap-distance-left:9pt;mso-wrap-distance-top:3.6pt;mso-wrap-distance-right:9pt;mso-wrap-distance-bottom:3.6pt;mso-position-horizontal:absolute;mso-position-horizontal-relative:text;mso-position-vertical:absolute;mso-position-vertical-relative:text;mso-width-percent:0;mso-height-percent:0;mso-width-relative:margin;mso-height-relative:margin;v-text-anchor:top" o:gfxdata="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" filled="f" stroked="f">
+                    <v:shape w14:anchorId="643BFB18" id="_x0000_s1038" type="#_x0000_t202" style="position:absolute;left:0;text-align:left;margin-left:-.15pt;margin-top:49pt;width:93.2pt;height:101pt;z-index:251742208;visibility:visible;mso-wrap-style:square;mso-width-percent:0;mso-height-percent:0;mso-wrap-distance-left:9pt;mso-wrap-distance-top:3.6pt;mso-wrap-distance-right:9pt;mso-wrap-distance-bottom:3.6pt;mso-position-horizontal:absolute;mso-position-horizontal-relative:text;mso-position-vertical:absolute;mso-position-vertical-relative:text;mso-width-percent:0;mso-height-percent:0;mso-width-relative:margin;mso-height-relative:margin;v-text-anchor:top" o:gfxdata="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" filled="f" stroked="f">
                       <v:textbox>
                         <w:txbxContent>
                           <w:p>
@@ -3505,7 +3489,7 @@
                 </mc:Choice>
                 <mc:Fallback>
                   <w:pict>
-                    <v:shape w14:anchorId="5AE2C5C8" id="Straight Arrow Connector 6" o:spid="_x0000_s1026" type="#_x0000_t32" style="position:absolute;margin-left:191.1pt;margin-top:232.2pt;width:27.15pt;height:4.65pt;flip:x;z-index:251789312;visibility:visible;mso-wrap-style:square;mso-width-percent:0;mso-height-percent:0;mso-wrap-distance-left:9pt;mso-wrap-distance-top:0;mso-wrap-distance-right:9pt;mso-wrap-distance-bottom:0;mso-position-horizontal:absolute;mso-position-horizontal-relative:text;mso-position-vertical:absolute;mso-position-vertical-relative:text;mso-width-percent:0;mso-height-percent:0;mso-width-relative:margin;mso-height-relative:margin" o:gfxdata="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" strokecolor="#e00" strokeweight="1.5pt">
+                    <v:shape w14:anchorId="5AE2C5C8" id="Straight Arrow Connector 6" o:spid="_x0000_s1026" type="#_x0000_t32" style="position:absolute;margin-left:191.1pt;margin-top:232.2pt;width:27.15pt;height:4.65pt;flip:x;z-index:251789312;visibility:visible;mso-wrap-style:square;mso-width-percent:0;mso-height-percent:0;mso-wrap-distance-left:9pt;mso-wrap-distance-top:0;mso-wrap-distance-right:9pt;mso-wrap-distance-bottom:0;mso-position-horizontal:absolute;mso-position-horizontal-relative:text;mso-position-vertical:absolute;mso-position-vertical-relative:text;mso-width-percent:0;mso-height-percent:0;mso-width-relative:margin;mso-height-relative:margin" o:gfxdata="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" strokecolor="#e00" strokeweight="1.5pt">
                       <v:stroke endarrow="block" joinstyle="miter"/>
                     </v:shape>
                   </w:pict>
@@ -3598,7 +3582,7 @@
                 </mc:Choice>
                 <mc:Fallback>
                   <w:pict>
-                    <v:shape w14:anchorId="36390698" id="_x0000_s1039" type="#_x0000_t202" style="position:absolute;left:0;text-align:left;margin-left:218.1pt;margin-top:191.45pt;width:74.8pt;height:110.6pt;z-index:251788288;visibility:visible;mso-wrap-style:square;mso-width-percent:0;mso-height-percent:200;mso-wrap-distance-left:9pt;mso-wrap-distance-top:3.6pt;mso-wrap-distance-right:9pt;mso-wrap-distance-bottom:3.6pt;mso-position-horizontal:absolute;mso-position-horizontal-relative:text;mso-position-vertical:absolute;mso-position-vertical-relative:text;mso-width-percent:0;mso-height-percent:200;mso-width-relative:margin;mso-height-relative:margin;v-text-anchor:top" o:gfxdata="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" filled="f" stroked="f">
+                    <v:shape w14:anchorId="36390698" id="_x0000_s1039" type="#_x0000_t202" style="position:absolute;left:0;text-align:left;margin-left:218.1pt;margin-top:191.45pt;width:74.8pt;height:110.6pt;z-index:251788288;visibility:visible;mso-wrap-style:square;mso-width-percent:0;mso-height-percent:200;mso-wrap-distance-left:9pt;mso-wrap-distance-top:3.6pt;mso-wrap-distance-right:9pt;mso-wrap-distance-bottom:3.6pt;mso-position-horizontal:absolute;mso-position-horizontal-relative:text;mso-position-vertical:absolute;mso-position-vertical-relative:text;mso-width-percent:0;mso-height-percent:200;mso-width-relative:margin;mso-height-relative:margin;v-text-anchor:top" o:gfxdata="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" filled="f" stroked="f">
                       <v:textbox style="mso-fit-shape-to-text:t">
                         <w:txbxContent>
                           <w:p>
@@ -3689,15 +3673,7 @@
                                       <w:szCs w:val="16"/>
                                       <w:lang w:val="en-GB"/>
                                     </w:rPr>
-                                    <w:t xml:space="preserve">Simple legend explaining the map symbols so the user can understand the map functionality. </w:t>
-                                  </w:r>
-                                  <w:r>
-                                    <w:rPr>
-                                      <w:sz w:val="16"/>
-                                      <w:szCs w:val="16"/>
-                                      <w:lang w:val="en-GB"/>
-                                    </w:rPr>
-                                    <w:t xml:space="preserve"> </w:t>
+                                    <w:t xml:space="preserve">Simple legend explaining the map symbols so the user can understand the map functionality.  </w:t>
                                   </w:r>
                                 </w:p>
                               </w:txbxContent>
@@ -3719,7 +3695,7 @@
                 </mc:Choice>
                 <mc:Fallback>
                   <w:pict>
-                    <v:shape w14:anchorId="7624B96C" id="_x0000_s1040" type="#_x0000_t202" style="position:absolute;left:0;text-align:left;margin-left:0;margin-top:205.3pt;width:81.7pt;height:88.15pt;z-index:251785216;visibility:visible;mso-wrap-style:square;mso-width-percent:0;mso-height-percent:0;mso-wrap-distance-left:9pt;mso-wrap-distance-top:3.6pt;mso-wrap-distance-right:9pt;mso-wrap-distance-bottom:3.6pt;mso-position-horizontal:absolute;mso-position-horizontal-relative:text;mso-position-vertical:absolute;mso-position-vertical-relative:text;mso-width-percent:0;mso-height-percent:0;mso-width-relative:margin;mso-height-relative:margin;v-text-anchor:top" o:gfxdata="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" filled="f" stroked="f">
+                    <v:shape w14:anchorId="7624B96C" id="_x0000_s1040" type="#_x0000_t202" style="position:absolute;left:0;text-align:left;margin-left:0;margin-top:205.3pt;width:81.7pt;height:88.15pt;z-index:251785216;visibility:visible;mso-wrap-style:square;mso-width-percent:0;mso-height-percent:0;mso-wrap-distance-left:9pt;mso-wrap-distance-top:3.6pt;mso-wrap-distance-right:9pt;mso-wrap-distance-bottom:3.6pt;mso-position-horizontal:absolute;mso-position-horizontal-relative:text;mso-position-vertical:absolute;mso-position-vertical-relative:text;mso-width-percent:0;mso-height-percent:0;mso-width-relative:margin;mso-height-relative:margin;v-text-anchor:top" o:gfxdata="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" filled="f" stroked="f">
                       <v:textbox>
                         <w:txbxContent>
                           <w:p>
@@ -3736,15 +3712,7 @@
                                 <w:szCs w:val="16"/>
                                 <w:lang w:val="en-GB"/>
                               </w:rPr>
-                              <w:t xml:space="preserve">Simple legend explaining the map symbols so the user can understand the map functionality. </w:t>
-                            </w:r>
-                            <w:r>
-                              <w:rPr>
-                                <w:sz w:val="16"/>
-                                <w:szCs w:val="16"/>
-                                <w:lang w:val="en-GB"/>
-                              </w:rPr>
-                              <w:t xml:space="preserve"> </w:t>
+                              <w:t xml:space="preserve">Simple legend explaining the map symbols so the user can understand the map functionality.  </w:t>
                             </w:r>
                           </w:p>
                         </w:txbxContent>
@@ -3826,7 +3794,7 @@
                 </mc:Choice>
                 <mc:Fallback>
                   <w:pict>
-                    <v:shape w14:anchorId="22432F5D" id="Straight Arrow Connector 6" o:spid="_x0000_s1026" type="#_x0000_t32" style="position:absolute;margin-left:75.75pt;margin-top:229.35pt;width:12.95pt;height:7.45pt;flip:y;z-index:251786240;visibility:visible;mso-wrap-style:square;mso-width-percent:0;mso-height-percent:0;mso-wrap-distance-left:9pt;mso-wrap-distance-top:0;mso-wrap-distance-right:9pt;mso-wrap-distance-bottom:0;mso-position-horizontal:absolute;mso-position-horizontal-relative:text;mso-position-vertical:absolute;mso-position-vertical-relative:text;mso-width-percent:0;mso-height-percent:0;mso-width-relative:margin;mso-height-relative:margin" o:gfxdata="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" strokecolor="#e00" strokeweight="1.5pt">
+                    <v:shape w14:anchorId="22432F5D" id="Straight Arrow Connector 6" o:spid="_x0000_s1026" type="#_x0000_t32" style="position:absolute;margin-left:75.75pt;margin-top:229.35pt;width:12.95pt;height:7.45pt;flip:y;z-index:251786240;visibility:visible;mso-wrap-style:square;mso-width-percent:0;mso-height-percent:0;mso-wrap-distance-left:9pt;mso-wrap-distance-top:0;mso-wrap-distance-right:9pt;mso-wrap-distance-bottom:0;mso-position-horizontal:absolute;mso-position-horizontal-relative:text;mso-position-vertical:absolute;mso-position-vertical-relative:text;mso-width-percent:0;mso-height-percent:0;mso-width-relative:margin;mso-height-relative:margin" o:gfxdata="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" strokecolor="#e00" strokeweight="1.5pt">
                       <v:stroke endarrow="block" joinstyle="miter"/>
                     </v:shape>
                   </w:pict>
@@ -3897,15 +3865,7 @@
                                       <w:szCs w:val="16"/>
                                       <w:lang w:val="en-GB"/>
                                     </w:rPr>
-                                    <w:t>A central “pin” icon shows the user’s current location relative to the crime hotspots.</w:t>
-                                  </w:r>
-                                  <w:r>
-                                    <w:rPr>
-                                      <w:sz w:val="16"/>
-                                      <w:szCs w:val="16"/>
-                                      <w:lang w:val="en-GB"/>
-                                    </w:rPr>
-                                    <w:t xml:space="preserve"> </w:t>
+                                    <w:t xml:space="preserve">A central “pin” icon shows the user’s current location relative to the crime hotspots. </w:t>
                                   </w:r>
                                 </w:p>
                               </w:txbxContent>
@@ -3927,7 +3887,7 @@
                 </mc:Choice>
                 <mc:Fallback>
                   <w:pict>
-                    <v:shape w14:anchorId="24CE9348" id="_x0000_s1041" type="#_x0000_t202" style="position:absolute;left:0;text-align:left;margin-left:0;margin-top:100.05pt;width:81.7pt;height:88.15pt;z-index:251782144;visibility:visible;mso-wrap-style:square;mso-width-percent:0;mso-height-percent:0;mso-wrap-distance-left:9pt;mso-wrap-distance-top:3.6pt;mso-wrap-distance-right:9pt;mso-wrap-distance-bottom:3.6pt;mso-position-horizontal:absolute;mso-position-horizontal-relative:text;mso-position-vertical:absolute;mso-position-vertical-relative:text;mso-width-percent:0;mso-height-percent:0;mso-width-relative:margin;mso-height-relative:margin;v-text-anchor:top" o:gfxdata="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" filled="f" stroked="f">
+                    <v:shape w14:anchorId="24CE9348" id="_x0000_s1041" type="#_x0000_t202" style="position:absolute;left:0;text-align:left;margin-left:0;margin-top:100.05pt;width:81.7pt;height:88.15pt;z-index:251782144;visibility:visible;mso-wrap-style:square;mso-width-percent:0;mso-height-percent:0;mso-wrap-distance-left:9pt;mso-wrap-distance-top:3.6pt;mso-wrap-distance-right:9pt;mso-wrap-distance-bottom:3.6pt;mso-position-horizontal:absolute;mso-position-horizontal-relative:text;mso-position-vertical:absolute;mso-position-vertical-relative:text;mso-width-percent:0;mso-height-percent:0;mso-width-relative:margin;mso-height-relative:margin;v-text-anchor:top" o:gfxdata="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" filled="f" stroked="f">
                       <v:textbox>
                         <w:txbxContent>
                           <w:p>
@@ -3944,15 +3904,7 @@
                                 <w:szCs w:val="16"/>
                                 <w:lang w:val="en-GB"/>
                               </w:rPr>
-                              <w:t>A central “pin” icon shows the user’s current location relative to the crime hotspots.</w:t>
-                            </w:r>
-                            <w:r>
-                              <w:rPr>
-                                <w:sz w:val="16"/>
-                                <w:szCs w:val="16"/>
-                                <w:lang w:val="en-GB"/>
-                              </w:rPr>
-                              <w:t xml:space="preserve"> </w:t>
+                              <w:t xml:space="preserve">A central “pin” icon shows the user’s current location relative to the crime hotspots. </w:t>
                             </w:r>
                           </w:p>
                         </w:txbxContent>
@@ -4034,7 +3986,7 @@
                 </mc:Choice>
                 <mc:Fallback>
                   <w:pict>
-                    <v:shape w14:anchorId="293D57F9" id="Straight Arrow Connector 6" o:spid="_x0000_s1026" type="#_x0000_t32" style="position:absolute;margin-left:75.75pt;margin-top:131.6pt;width:73.1pt;height:11.4pt;z-index:251783168;visibility:visible;mso-wrap-style:square;mso-width-percent:0;mso-height-percent:0;mso-wrap-distance-left:9pt;mso-wrap-distance-top:0;mso-wrap-distance-right:9pt;mso-wrap-distance-bottom:0;mso-position-horizontal:absolute;mso-position-horizontal-relative:text;mso-position-vertical:absolute;mso-position-vertical-relative:text;mso-width-percent:0;mso-height-percent:0;mso-width-relative:margin;mso-height-relative:margin" o:gfxdata="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" strokecolor="#e00" strokeweight="1.5pt">
+                    <v:shape w14:anchorId="293D57F9" id="Straight Arrow Connector 6" o:spid="_x0000_s1026" type="#_x0000_t32" style="position:absolute;margin-left:75.75pt;margin-top:131.6pt;width:73.1pt;height:11.4pt;z-index:251783168;visibility:visible;mso-wrap-style:square;mso-width-percent:0;mso-height-percent:0;mso-wrap-distance-left:9pt;mso-wrap-distance-top:0;mso-wrap-distance-right:9pt;mso-wrap-distance-bottom:0;mso-position-horizontal:absolute;mso-position-horizontal-relative:text;mso-position-vertical:absolute;mso-position-vertical-relative:text;mso-width-percent:0;mso-height-percent:0;mso-width-relative:margin;mso-height-relative:margin" o:gfxdata="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" strokecolor="#e00" strokeweight="1.5pt">
                       <v:stroke endarrow="block" joinstyle="miter"/>
                     </v:shape>
                   </w:pict>
@@ -4113,7 +4065,7 @@
                 </mc:Choice>
                 <mc:Fallback>
                   <w:pict>
-                    <v:shape w14:anchorId="7A8CF21F" id="Straight Arrow Connector 6" o:spid="_x0000_s1026" type="#_x0000_t32" style="position:absolute;margin-left:202.15pt;margin-top:96.35pt;width:16.05pt;height:3.6pt;flip:x y;z-index:251780096;visibility:visible;mso-wrap-style:square;mso-width-percent:0;mso-height-percent:0;mso-wrap-distance-left:9pt;mso-wrap-distance-top:0;mso-wrap-distance-right:9pt;mso-wrap-distance-bottom:0;mso-position-horizontal:absolute;mso-position-horizontal-relative:text;mso-position-vertical:absolute;mso-position-vertical-relative:text;mso-width-percent:0;mso-height-percent:0;mso-width-relative:margin;mso-height-relative:margin" o:gfxdata="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" strokecolor="#e00" strokeweight="1.5pt">
+                    <v:shape w14:anchorId="7A8CF21F" id="Straight Arrow Connector 6" o:spid="_x0000_s1026" type="#_x0000_t32" style="position:absolute;margin-left:202.15pt;margin-top:96.35pt;width:16.05pt;height:3.6pt;flip:x y;z-index:251780096;visibility:visible;mso-wrap-style:square;mso-width-percent:0;mso-height-percent:0;mso-wrap-distance-left:9pt;mso-wrap-distance-top:0;mso-wrap-distance-right:9pt;mso-wrap-distance-bottom:0;mso-position-horizontal:absolute;mso-position-horizontal-relative:text;mso-position-vertical:absolute;mso-position-vertical-relative:text;mso-width-percent:0;mso-height-percent:0;mso-width-relative:margin;mso-height-relative:margin" o:gfxdata="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" strokecolor="#e00" strokeweight="1.5pt">
                       <v:stroke endarrow="block" joinstyle="miter"/>
                     </v:shape>
                   </w:pict>
@@ -4184,15 +4136,7 @@
                                       <w:szCs w:val="16"/>
                                       <w:lang w:val="en-GB"/>
                                     </w:rPr>
-                                    <w:t xml:space="preserve">Heatmap style hotspots visualise crime density, with larger circles indicating crime frequency and darker circles indicating crime severity. </w:t>
-                                  </w:r>
-                                  <w:r>
-                                    <w:rPr>
-                                      <w:sz w:val="16"/>
-                                      <w:szCs w:val="16"/>
-                                      <w:lang w:val="en-GB"/>
-                                    </w:rPr>
-                                    <w:t xml:space="preserve"> </w:t>
+                                    <w:t xml:space="preserve">Heatmap style hotspots visualise crime density, with larger circles indicating crime frequency and darker circles indicating crime severity.  </w:t>
                                   </w:r>
                                 </w:p>
                               </w:txbxContent>
@@ -4214,7 +4158,7 @@
                 </mc:Choice>
                 <mc:Fallback>
                   <w:pict>
-                    <v:shape w14:anchorId="47F0FDDC" id="_x0000_s1042" type="#_x0000_t202" style="position:absolute;left:0;text-align:left;margin-left:218.25pt;margin-top:59.25pt;width:74.8pt;height:110.6pt;z-index:251779072;visibility:visible;mso-wrap-style:square;mso-width-percent:0;mso-height-percent:200;mso-wrap-distance-left:9pt;mso-wrap-distance-top:3.6pt;mso-wrap-distance-right:9pt;mso-wrap-distance-bottom:3.6pt;mso-position-horizontal:absolute;mso-position-horizontal-relative:text;mso-position-vertical:absolute;mso-position-vertical-relative:text;mso-width-percent:0;mso-height-percent:200;mso-width-relative:margin;mso-height-relative:margin;v-text-anchor:top" o:gfxdata="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" filled="f" stroked="f">
+                    <v:shape w14:anchorId="47F0FDDC" id="_x0000_s1042" type="#_x0000_t202" style="position:absolute;left:0;text-align:left;margin-left:218.25pt;margin-top:59.25pt;width:74.8pt;height:110.6pt;z-index:251779072;visibility:visible;mso-wrap-style:square;mso-width-percent:0;mso-height-percent:200;mso-wrap-distance-left:9pt;mso-wrap-distance-top:3.6pt;mso-wrap-distance-right:9pt;mso-wrap-distance-bottom:3.6pt;mso-position-horizontal:absolute;mso-position-horizontal-relative:text;mso-position-vertical:absolute;mso-position-vertical-relative:text;mso-width-percent:0;mso-height-percent:200;mso-width-relative:margin;mso-height-relative:margin;v-text-anchor:top" o:gfxdata="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" filled="f" stroked="f">
                       <v:textbox style="mso-fit-shape-to-text:t">
                         <w:txbxContent>
                           <w:p>
@@ -4231,15 +4175,7 @@
                                 <w:szCs w:val="16"/>
                                 <w:lang w:val="en-GB"/>
                               </w:rPr>
-                              <w:t xml:space="preserve">Heatmap style hotspots visualise crime density, with larger circles indicating crime frequency and darker circles indicating crime severity. </w:t>
-                            </w:r>
-                            <w:r>
-                              <w:rPr>
-                                <w:sz w:val="16"/>
-                                <w:szCs w:val="16"/>
-                                <w:lang w:val="en-GB"/>
-                              </w:rPr>
-                              <w:t xml:space="preserve"> </w:t>
+                              <w:t xml:space="preserve">Heatmap style hotspots visualise crime density, with larger circles indicating crime frequency and darker circles indicating crime severity.  </w:t>
                             </w:r>
                           </w:p>
                         </w:txbxContent>
@@ -4758,7 +4694,7 @@
                 </mc:Choice>
                 <mc:Fallback>
                   <w:pict>
-                    <v:shape w14:anchorId="65110478" id="_x0000_s1043" type="#_x0000_t202" style="position:absolute;left:0;text-align:left;margin-left:220.6pt;margin-top:221.8pt;width:80.45pt;height:110.6pt;z-index:251671552;visibility:visible;mso-wrap-style:square;mso-width-percent:0;mso-height-percent:200;mso-wrap-distance-left:9pt;mso-wrap-distance-top:3.6pt;mso-wrap-distance-right:9pt;mso-wrap-distance-bottom:3.6pt;mso-position-horizontal:absolute;mso-position-horizontal-relative:text;mso-position-vertical:absolute;mso-position-vertical-relative:text;mso-width-percent:0;mso-height-percent:200;mso-width-relative:margin;mso-height-relative:margin;v-text-anchor:top" o:gfxdata="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" filled="f" stroked="f">
+                    <v:shape w14:anchorId="65110478" id="_x0000_s1043" type="#_x0000_t202" style="position:absolute;left:0;text-align:left;margin-left:220.6pt;margin-top:221.8pt;width:80.45pt;height:110.6pt;z-index:251671552;visibility:visible;mso-wrap-style:square;mso-width-percent:0;mso-height-percent:200;mso-wrap-distance-left:9pt;mso-wrap-distance-top:3.6pt;mso-wrap-distance-right:9pt;mso-wrap-distance-bottom:3.6pt;mso-position-horizontal:absolute;mso-position-horizontal-relative:text;mso-position-vertical:absolute;mso-position-vertical-relative:text;mso-width-percent:0;mso-height-percent:200;mso-width-relative:margin;mso-height-relative:margin;v-text-anchor:top" o:gfxdata="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" filled="f" stroked="f">
                       <v:textbox style="mso-fit-shape-to-text:t">
                         <w:txbxContent>
                           <w:p>
@@ -4871,7 +4807,7 @@
                 </mc:Choice>
                 <mc:Fallback>
                   <w:pict>
-                    <v:shape w14:anchorId="0EB9EC44" id="_x0000_s1044" type="#_x0000_t202" style="position:absolute;left:0;text-align:left;margin-left:-.05pt;margin-top:193.05pt;width:1in;height:110.6pt;z-index:251669504;visibility:visible;mso-wrap-style:square;mso-width-percent:0;mso-height-percent:200;mso-wrap-distance-left:9pt;mso-wrap-distance-top:3.6pt;mso-wrap-distance-right:9pt;mso-wrap-distance-bottom:3.6pt;mso-position-horizontal:absolute;mso-position-horizontal-relative:text;mso-position-vertical:absolute;mso-position-vertical-relative:text;mso-width-percent:0;mso-height-percent:200;mso-width-relative:margin;mso-height-relative:margin;v-text-anchor:top" o:gfxdata="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" filled="f" stroked="f">
+                    <v:shape w14:anchorId="0EB9EC44" id="_x0000_s1044" type="#_x0000_t202" style="position:absolute;left:0;text-align:left;margin-left:-.05pt;margin-top:193.05pt;width:1in;height:110.6pt;z-index:251669504;visibility:visible;mso-wrap-style:square;mso-width-percent:0;mso-height-percent:200;mso-wrap-distance-left:9pt;mso-wrap-distance-top:3.6pt;mso-wrap-distance-right:9pt;mso-wrap-distance-bottom:3.6pt;mso-position-horizontal:absolute;mso-position-horizontal-relative:text;mso-position-vertical:absolute;mso-position-vertical-relative:text;mso-width-percent:0;mso-height-percent:200;mso-width-relative:margin;mso-height-relative:margin;v-text-anchor:top" o:gfxdata="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" filled="f" stroked="f">
                       <v:textbox style="mso-fit-shape-to-text:t">
                         <w:txbxContent>
                           <w:p>
@@ -5002,7 +4938,7 @@
                 </mc:Choice>
                 <mc:Fallback>
                   <w:pict>
-                    <v:shape w14:anchorId="0AD9D9E6" id="_x0000_s1045" type="#_x0000_t202" style="position:absolute;left:0;text-align:left;margin-left:222.9pt;margin-top:43.4pt;width:91.25pt;height:110.6pt;z-index:251667456;visibility:visible;mso-wrap-style:square;mso-width-percent:0;mso-height-percent:200;mso-wrap-distance-left:9pt;mso-wrap-distance-top:3.6pt;mso-wrap-distance-right:9pt;mso-wrap-distance-bottom:3.6pt;mso-position-horizontal:absolute;mso-position-horizontal-relative:text;mso-position-vertical:absolute;mso-position-vertical-relative:text;mso-width-percent:0;mso-height-percent:200;mso-width-relative:margin;mso-height-relative:margin;v-text-anchor:top" o:gfxdata="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" filled="f" stroked="f">
+                    <v:shape w14:anchorId="0AD9D9E6" id="_x0000_s1045" type="#_x0000_t202" style="position:absolute;left:0;text-align:left;margin-left:222.9pt;margin-top:43.4pt;width:91.25pt;height:110.6pt;z-index:251667456;visibility:visible;mso-wrap-style:square;mso-width-percent:0;mso-height-percent:200;mso-wrap-distance-left:9pt;mso-wrap-distance-top:3.6pt;mso-wrap-distance-right:9pt;mso-wrap-distance-bottom:3.6pt;mso-position-horizontal:absolute;mso-position-horizontal-relative:text;mso-position-vertical:absolute;mso-position-vertical-relative:text;mso-width-percent:0;mso-height-percent:200;mso-width-relative:margin;mso-height-relative:margin;v-text-anchor:top" o:gfxdata="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" filled="f" stroked="f">
                       <v:textbox style="mso-fit-shape-to-text:t">
                         <w:txbxContent>
                           <w:p>
@@ -5141,7 +5077,7 @@
                 </mc:Choice>
                 <mc:Fallback>
                   <w:pict>
-                    <v:shape w14:anchorId="4BE11D61" id="_x0000_s1046" type="#_x0000_t202" style="position:absolute;left:0;text-align:left;margin-left:-4.3pt;margin-top:27.9pt;width:117.2pt;height:110.6pt;z-index:251665408;visibility:visible;mso-wrap-style:square;mso-width-percent:0;mso-height-percent:200;mso-wrap-distance-left:9pt;mso-wrap-distance-top:3.6pt;mso-wrap-distance-right:9pt;mso-wrap-distance-bottom:3.6pt;mso-position-horizontal:absolute;mso-position-horizontal-relative:text;mso-position-vertical:absolute;mso-position-vertical-relative:text;mso-width-percent:0;mso-height-percent:200;mso-width-relative:margin;mso-height-relative:margin;v-text-anchor:top" o:gfxdata="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" filled="f" stroked="f">
+                    <v:shape w14:anchorId="4BE11D61" id="_x0000_s1046" type="#_x0000_t202" style="position:absolute;left:0;text-align:left;margin-left:-4.3pt;margin-top:27.9pt;width:117.2pt;height:110.6pt;z-index:251665408;visibility:visible;mso-wrap-style:square;mso-width-percent:0;mso-height-percent:200;mso-wrap-distance-left:9pt;mso-wrap-distance-top:3.6pt;mso-wrap-distance-right:9pt;mso-wrap-distance-bottom:3.6pt;mso-position-horizontal:absolute;mso-position-horizontal-relative:text;mso-position-vertical:absolute;mso-position-vertical-relative:text;mso-width-percent:0;mso-height-percent:200;mso-width-relative:margin;mso-height-relative:margin;v-text-anchor:top" o:gfxdata="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" filled="f" stroked="f">
                       <v:textbox style="mso-fit-shape-to-text:t">
                         <w:txbxContent>
                           <w:p>
@@ -5633,7 +5569,7 @@
                 </mc:Choice>
                 <mc:Fallback>
                   <w:pict>
-                    <v:shape w14:anchorId="42E37670" id="_x0000_s1047" type="#_x0000_t202" style="position:absolute;left:0;text-align:left;margin-left:1.85pt;margin-top:232.4pt;width:67.75pt;height:110.6pt;z-index:251677696;visibility:visible;mso-wrap-style:square;mso-width-percent:0;mso-height-percent:200;mso-wrap-distance-left:9pt;mso-wrap-distance-top:3.6pt;mso-wrap-distance-right:9pt;mso-wrap-distance-bottom:3.6pt;mso-position-horizontal:absolute;mso-position-horizontal-relative:text;mso-position-vertical:absolute;mso-position-vertical-relative:text;mso-width-percent:0;mso-height-percent:200;mso-width-relative:margin;mso-height-relative:margin;v-text-anchor:top" o:gfxdata="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" filled="f" stroked="f">
+                    <v:shape w14:anchorId="42E37670" id="_x0000_s1047" type="#_x0000_t202" style="position:absolute;left:0;text-align:left;margin-left:1.85pt;margin-top:232.4pt;width:67.75pt;height:110.6pt;z-index:251677696;visibility:visible;mso-wrap-style:square;mso-width-percent:0;mso-height-percent:200;mso-wrap-distance-left:9pt;mso-wrap-distance-top:3.6pt;mso-wrap-distance-right:9pt;mso-wrap-distance-bottom:3.6pt;mso-position-horizontal:absolute;mso-position-horizontal-relative:text;mso-position-vertical:absolute;mso-position-vertical-relative:text;mso-width-percent:0;mso-height-percent:200;mso-width-relative:margin;mso-height-relative:margin;v-text-anchor:top" o:gfxdata="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" filled="f" stroked="f">
                       <v:textbox style="mso-fit-shape-to-text:t">
                         <w:txbxContent>
                           <w:p>
@@ -5746,7 +5682,7 @@
                 </mc:Choice>
                 <mc:Fallback>
                   <w:pict>
-                    <v:shape w14:anchorId="307B271E" id="_x0000_s1048" type="#_x0000_t202" style="position:absolute;left:0;text-align:left;margin-left:226.3pt;margin-top:190.95pt;width:88.95pt;height:110.6pt;z-index:251675648;visibility:visible;mso-wrap-style:square;mso-width-percent:0;mso-height-percent:200;mso-wrap-distance-left:9pt;mso-wrap-distance-top:3.6pt;mso-wrap-distance-right:9pt;mso-wrap-distance-bottom:3.6pt;mso-position-horizontal:absolute;mso-position-horizontal-relative:text;mso-position-vertical:absolute;mso-position-vertical-relative:text;mso-width-percent:0;mso-height-percent:200;mso-width-relative:margin;mso-height-relative:margin;v-text-anchor:top" o:gfxdata="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" filled="f" stroked="f">
+                    <v:shape w14:anchorId="307B271E" id="_x0000_s1048" type="#_x0000_t202" style="position:absolute;left:0;text-align:left;margin-left:226.3pt;margin-top:190.95pt;width:88.95pt;height:110.6pt;z-index:251675648;visibility:visible;mso-wrap-style:square;mso-width-percent:0;mso-height-percent:200;mso-wrap-distance-left:9pt;mso-wrap-distance-top:3.6pt;mso-wrap-distance-right:9pt;mso-wrap-distance-bottom:3.6pt;mso-position-horizontal:absolute;mso-position-horizontal-relative:text;mso-position-vertical:absolute;mso-position-vertical-relative:text;mso-width-percent:0;mso-height-percent:200;mso-width-relative:margin;mso-height-relative:margin;v-text-anchor:top" o:gfxdata="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" filled="f" stroked="f">
                       <v:textbox style="mso-fit-shape-to-text:t">
                         <w:txbxContent>
                           <w:p>
@@ -5859,7 +5795,7 @@
                 </mc:Choice>
                 <mc:Fallback>
                   <w:pict>
-                    <v:shape w14:anchorId="02AB6E4B" id="_x0000_s1049" type="#_x0000_t202" style="position:absolute;left:0;text-align:left;margin-left:.2pt;margin-top:26.55pt;width:117.2pt;height:110.6pt;z-index:251673600;visibility:visible;mso-wrap-style:square;mso-width-percent:0;mso-height-percent:200;mso-wrap-distance-left:9pt;mso-wrap-distance-top:3.6pt;mso-wrap-distance-right:9pt;mso-wrap-distance-bottom:3.6pt;mso-position-horizontal:absolute;mso-position-horizontal-relative:text;mso-position-vertical:absolute;mso-position-vertical-relative:text;mso-width-percent:0;mso-height-percent:200;mso-width-relative:margin;mso-height-relative:margin;v-text-anchor:top" o:gfxdata="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" filled="f" stroked="f">
+                    <v:shape w14:anchorId="02AB6E4B" id="_x0000_s1049" type="#_x0000_t202" style="position:absolute;left:0;text-align:left;margin-left:.2pt;margin-top:26.55pt;width:117.2pt;height:110.6pt;z-index:251673600;visibility:visible;mso-wrap-style:square;mso-width-percent:0;mso-height-percent:200;mso-wrap-distance-left:9pt;mso-wrap-distance-top:3.6pt;mso-wrap-distance-right:9pt;mso-wrap-distance-bottom:3.6pt;mso-position-horizontal:absolute;mso-position-horizontal-relative:text;mso-position-vertical:absolute;mso-position-vertical-relative:text;mso-width-percent:0;mso-height-percent:200;mso-width-relative:margin;mso-height-relative:margin;v-text-anchor:top" o:gfxdata="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" filled="f" stroked="f">
                       <v:textbox style="mso-fit-shape-to-text:t">
                         <w:txbxContent>
                           <w:p>
@@ -6328,7 +6264,7 @@
                 </mc:Choice>
                 <mc:Fallback>
                   <w:pict>
-                    <v:shape w14:anchorId="20CE12E1" id="_x0000_s1050" type="#_x0000_t202" style="position:absolute;left:0;text-align:left;margin-left:9.75pt;margin-top:210.7pt;width:88.45pt;height:110.6pt;z-index:251681792;visibility:visible;mso-wrap-style:square;mso-width-percent:0;mso-height-percent:200;mso-wrap-distance-left:9pt;mso-wrap-distance-top:3.6pt;mso-wrap-distance-right:9pt;mso-wrap-distance-bottom:3.6pt;mso-position-horizontal:absolute;mso-position-horizontal-relative:text;mso-position-vertical:absolute;mso-position-vertical-relative:text;mso-width-percent:0;mso-height-percent:200;mso-width-relative:margin;mso-height-relative:margin;v-text-anchor:top" o:gfxdata="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" filled="f" stroked="f">
+                    <v:shape w14:anchorId="20CE12E1" id="_x0000_s1050" type="#_x0000_t202" style="position:absolute;left:0;text-align:left;margin-left:9.75pt;margin-top:210.7pt;width:88.45pt;height:110.6pt;z-index:251681792;visibility:visible;mso-wrap-style:square;mso-width-percent:0;mso-height-percent:200;mso-wrap-distance-left:9pt;mso-wrap-distance-top:3.6pt;mso-wrap-distance-right:9pt;mso-wrap-distance-bottom:3.6pt;mso-position-horizontal:absolute;mso-position-horizontal-relative:text;mso-position-vertical:absolute;mso-position-vertical-relative:text;mso-width-percent:0;mso-height-percent:200;mso-width-relative:margin;mso-height-relative:margin;v-text-anchor:top" o:gfxdata="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" filled="f" stroked="f">
                       <v:textbox style="mso-fit-shape-to-text:t">
                         <w:txbxContent>
                           <w:p>
@@ -6457,7 +6393,7 @@
                 </mc:Choice>
                 <mc:Fallback>
                   <w:pict>
-                    <v:shape w14:anchorId="678AB47B" id="_x0000_s1051" type="#_x0000_t202" style="position:absolute;left:0;text-align:left;margin-left:-.1pt;margin-top:79.9pt;width:94.1pt;height:110.6pt;z-index:251679744;visibility:visible;mso-wrap-style:square;mso-width-percent:0;mso-height-percent:200;mso-wrap-distance-left:9pt;mso-wrap-distance-top:3.6pt;mso-wrap-distance-right:9pt;mso-wrap-distance-bottom:3.6pt;mso-position-horizontal:absolute;mso-position-horizontal-relative:text;mso-position-vertical:absolute;mso-position-vertical-relative:text;mso-width-percent:0;mso-height-percent:200;mso-width-relative:margin;mso-height-relative:margin;v-text-anchor:top" o:gfxdata="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" filled="f" stroked="f">
+                    <v:shape w14:anchorId="678AB47B" id="_x0000_s1051" type="#_x0000_t202" style="position:absolute;left:0;text-align:left;margin-left:-.1pt;margin-top:79.9pt;width:94.1pt;height:110.6pt;z-index:251679744;visibility:visible;mso-wrap-style:square;mso-width-percent:0;mso-height-percent:200;mso-wrap-distance-left:9pt;mso-wrap-distance-top:3.6pt;mso-wrap-distance-right:9pt;mso-wrap-distance-bottom:3.6pt;mso-position-horizontal:absolute;mso-position-horizontal-relative:text;mso-position-vertical:absolute;mso-position-vertical-relative:text;mso-width-percent:0;mso-height-percent:200;mso-width-relative:margin;mso-height-relative:margin;v-text-anchor:top" o:gfxdata="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" filled="f" stroked="f">
                       <v:textbox style="mso-fit-shape-to-text:t">
                         <w:txbxContent>
                           <w:p>
@@ -6586,7 +6522,7 @@
                 </mc:Choice>
                 <mc:Fallback>
                   <w:pict>
-                    <v:shape w14:anchorId="435D0853" id="_x0000_s1052" type="#_x0000_t202" style="position:absolute;left:0;text-align:left;margin-left:177.1pt;margin-top:298.6pt;width:117.2pt;height:110.6pt;z-index:251683840;visibility:visible;mso-wrap-style:square;mso-width-percent:0;mso-height-percent:200;mso-wrap-distance-left:9pt;mso-wrap-distance-top:3.6pt;mso-wrap-distance-right:9pt;mso-wrap-distance-bottom:3.6pt;mso-position-horizontal:absolute;mso-position-horizontal-relative:text;mso-position-vertical:absolute;mso-position-vertical-relative:text;mso-width-percent:0;mso-height-percent:200;mso-width-relative:margin;mso-height-relative:margin;v-text-anchor:top" o:gfxdata="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" filled="f" stroked="f">
+                    <v:shape w14:anchorId="435D0853" id="_x0000_s1052" type="#_x0000_t202" style="position:absolute;left:0;text-align:left;margin-left:177.1pt;margin-top:298.6pt;width:117.2pt;height:110.6pt;z-index:251683840;visibility:visible;mso-wrap-style:square;mso-width-percent:0;mso-height-percent:200;mso-wrap-distance-left:9pt;mso-wrap-distance-top:3.6pt;mso-wrap-distance-right:9pt;mso-wrap-distance-bottom:3.6pt;mso-position-horizontal:absolute;mso-position-horizontal-relative:text;mso-position-vertical:absolute;mso-position-vertical-relative:text;mso-width-percent:0;mso-height-percent:200;mso-width-relative:margin;mso-height-relative:margin;v-text-anchor:top" o:gfxdata="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" filled="f" stroked="f">
                       <v:textbox style="mso-fit-shape-to-text:t">
                         <w:txbxContent>
                           <w:p>
@@ -7097,7 +7033,7 @@
                 </mc:Choice>
                 <mc:Fallback>
                   <w:pict>
-                    <v:shape w14:anchorId="10ECF737" id="_x0000_s1053" type="#_x0000_t202" style="position:absolute;left:0;text-align:left;margin-left:0;margin-top:189.8pt;width:75.75pt;height:110.6pt;z-index:251685888;visibility:visible;mso-wrap-style:square;mso-width-percent:0;mso-height-percent:200;mso-wrap-distance-left:9pt;mso-wrap-distance-top:3.6pt;mso-wrap-distance-right:9pt;mso-wrap-distance-bottom:3.6pt;mso-position-horizontal:absolute;mso-position-horizontal-relative:text;mso-position-vertical:absolute;mso-position-vertical-relative:text;mso-width-percent:0;mso-height-percent:200;mso-width-relative:margin;mso-height-relative:margin;v-text-anchor:top" o:gfxdata="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" filled="f" stroked="f">
+                    <v:shape w14:anchorId="10ECF737" id="_x0000_s1053" type="#_x0000_t202" style="position:absolute;left:0;text-align:left;margin-left:0;margin-top:189.8pt;width:75.75pt;height:110.6pt;z-index:251685888;visibility:visible;mso-wrap-style:square;mso-width-percent:0;mso-height-percent:200;mso-wrap-distance-left:9pt;mso-wrap-distance-top:3.6pt;mso-wrap-distance-right:9pt;mso-wrap-distance-bottom:3.6pt;mso-position-horizontal:absolute;mso-position-horizontal-relative:text;mso-position-vertical:absolute;mso-position-vertical-relative:text;mso-width-percent:0;mso-height-percent:200;mso-width-relative:margin;mso-height-relative:margin;v-text-anchor:top" o:gfxdata="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" filled="f" stroked="f">
                       <v:textbox style="mso-fit-shape-to-text:t">
                         <w:txbxContent>
                           <w:p>
@@ -7210,7 +7146,7 @@
                 </mc:Choice>
                 <mc:Fallback>
                   <w:pict>
-                    <v:shape w14:anchorId="58CA98AC" id="_x0000_s1054" type="#_x0000_t202" style="position:absolute;left:0;text-align:left;margin-left:168.7pt;margin-top:31.6pt;width:117.2pt;height:110.6pt;z-index:251689984;visibility:visible;mso-wrap-style:square;mso-width-percent:0;mso-height-percent:200;mso-wrap-distance-left:9pt;mso-wrap-distance-top:3.6pt;mso-wrap-distance-right:9pt;mso-wrap-distance-bottom:3.6pt;mso-position-horizontal:absolute;mso-position-horizontal-relative:text;mso-position-vertical:absolute;mso-position-vertical-relative:text;mso-width-percent:0;mso-height-percent:200;mso-width-relative:margin;mso-height-relative:margin;v-text-anchor:top" o:gfxdata="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" filled="f" stroked="f">
+                    <v:shape w14:anchorId="58CA98AC" id="_x0000_s1054" type="#_x0000_t202" style="position:absolute;left:0;text-align:left;margin-left:168.7pt;margin-top:31.6pt;width:117.2pt;height:110.6pt;z-index:251689984;visibility:visible;mso-wrap-style:square;mso-width-percent:0;mso-height-percent:200;mso-wrap-distance-left:9pt;mso-wrap-distance-top:3.6pt;mso-wrap-distance-right:9pt;mso-wrap-distance-bottom:3.6pt;mso-position-horizontal:absolute;mso-position-horizontal-relative:text;mso-position-vertical:absolute;mso-position-vertical-relative:text;mso-width-percent:0;mso-height-percent:200;mso-width-relative:margin;mso-height-relative:margin;v-text-anchor:top" o:gfxdata="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" filled="f" stroked="f">
                       <v:textbox style="mso-fit-shape-to-text:t">
                         <w:txbxContent>
                           <w:p>
@@ -7323,7 +7259,7 @@
                 </mc:Choice>
                 <mc:Fallback>
                   <w:pict>
-                    <v:shape w14:anchorId="739C0148" id="_x0000_s1055" type="#_x0000_t202" style="position:absolute;left:0;text-align:left;margin-left:221.15pt;margin-top:277.25pt;width:83.3pt;height:110.6pt;z-index:251687936;visibility:visible;mso-wrap-style:square;mso-width-percent:0;mso-height-percent:200;mso-wrap-distance-left:9pt;mso-wrap-distance-top:3.6pt;mso-wrap-distance-right:9pt;mso-wrap-distance-bottom:3.6pt;mso-position-horizontal:absolute;mso-position-horizontal-relative:text;mso-position-vertical:absolute;mso-position-vertical-relative:text;mso-width-percent:0;mso-height-percent:200;mso-width-relative:margin;mso-height-relative:margin;v-text-anchor:top" o:gfxdata="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" filled="f" stroked="f">
+                    <v:shape w14:anchorId="739C0148" id="_x0000_s1055" type="#_x0000_t202" style="position:absolute;left:0;text-align:left;margin-left:221.15pt;margin-top:277.25pt;width:83.3pt;height:110.6pt;z-index:251687936;visibility:visible;mso-wrap-style:square;mso-width-percent:0;mso-height-percent:200;mso-wrap-distance-left:9pt;mso-wrap-distance-top:3.6pt;mso-wrap-distance-right:9pt;mso-wrap-distance-bottom:3.6pt;mso-position-horizontal:absolute;mso-position-horizontal-relative:text;mso-position-vertical:absolute;mso-position-vertical-relative:text;mso-width-percent:0;mso-height-percent:200;mso-width-relative:margin;mso-height-relative:margin;v-text-anchor:top" o:gfxdata="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" filled="f" stroked="f">
                       <v:textbox style="mso-fit-shape-to-text:t">
                         <w:txbxContent>
                           <w:p>
@@ -7792,7 +7728,7 @@
                 </mc:Choice>
                 <mc:Fallback>
                   <w:pict>
-                    <v:shape w14:anchorId="6E302A24" id="_x0000_s1056" type="#_x0000_t202" style="position:absolute;left:0;text-align:left;margin-left:-.8pt;margin-top:37.2pt;width:117.2pt;height:110.6pt;z-index:251692032;visibility:visible;mso-wrap-style:square;mso-width-percent:0;mso-height-percent:200;mso-wrap-distance-left:9pt;mso-wrap-distance-top:3.6pt;mso-wrap-distance-right:9pt;mso-wrap-distance-bottom:3.6pt;mso-position-horizontal:absolute;mso-position-horizontal-relative:text;mso-position-vertical:absolute;mso-position-vertical-relative:text;mso-width-percent:0;mso-height-percent:200;mso-width-relative:margin;mso-height-relative:margin;v-text-anchor:top" o:gfxdata="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" filled="f" stroked="f">
+                    <v:shape w14:anchorId="6E302A24" id="_x0000_s1056" type="#_x0000_t202" style="position:absolute;left:0;text-align:left;margin-left:-.8pt;margin-top:37.2pt;width:117.2pt;height:110.6pt;z-index:251692032;visibility:visible;mso-wrap-style:square;mso-width-percent:0;mso-height-percent:200;mso-wrap-distance-left:9pt;mso-wrap-distance-top:3.6pt;mso-wrap-distance-right:9pt;mso-wrap-distance-bottom:3.6pt;mso-position-horizontal:absolute;mso-position-horizontal-relative:text;mso-position-vertical:absolute;mso-position-vertical-relative:text;mso-width-percent:0;mso-height-percent:200;mso-width-relative:margin;mso-height-relative:margin;v-text-anchor:top" o:gfxdata="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" filled="f" stroked="f">
                       <v:textbox style="mso-fit-shape-to-text:t">
                         <w:txbxContent>
                           <w:p>
@@ -7905,7 +7841,7 @@
                 </mc:Choice>
                 <mc:Fallback>
                   <w:pict>
-                    <v:shape w14:anchorId="161E5125" id="_x0000_s1057" type="#_x0000_t202" style="position:absolute;left:0;text-align:left;margin-left:249.25pt;margin-top:193.55pt;width:56.45pt;height:110.6pt;z-index:251696128;visibility:visible;mso-wrap-style:square;mso-width-percent:0;mso-height-percent:200;mso-wrap-distance-left:9pt;mso-wrap-distance-top:3.6pt;mso-wrap-distance-right:9pt;mso-wrap-distance-bottom:3.6pt;mso-position-horizontal:absolute;mso-position-horizontal-relative:text;mso-position-vertical:absolute;mso-position-vertical-relative:text;mso-width-percent:0;mso-height-percent:200;mso-width-relative:margin;mso-height-relative:margin;v-text-anchor:top" o:gfxdata="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" filled="f" stroked="f">
+                    <v:shape w14:anchorId="161E5125" id="_x0000_s1057" type="#_x0000_t202" style="position:absolute;left:0;text-align:left;margin-left:249.25pt;margin-top:193.55pt;width:56.45pt;height:110.6pt;z-index:251696128;visibility:visible;mso-wrap-style:square;mso-width-percent:0;mso-height-percent:200;mso-wrap-distance-left:9pt;mso-wrap-distance-top:3.6pt;mso-wrap-distance-right:9pt;mso-wrap-distance-bottom:3.6pt;mso-position-horizontal:absolute;mso-position-horizontal-relative:text;mso-position-vertical:absolute;mso-position-vertical-relative:text;mso-width-percent:0;mso-height-percent:200;mso-width-relative:margin;mso-height-relative:margin;v-text-anchor:top" o:gfxdata="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" filled="f" stroked="f">
                       <v:textbox style="mso-fit-shape-to-text:t">
                         <w:txbxContent>
                           <w:p>
@@ -8018,7 +7954,7 @@
                 </mc:Choice>
                 <mc:Fallback>
                   <w:pict>
-                    <v:shape w14:anchorId="658CEEDA" id="_x0000_s1058" type="#_x0000_t202" style="position:absolute;left:0;text-align:left;margin-left:-2.45pt;margin-top:233.55pt;width:82.35pt;height:110.6pt;z-index:251694080;visibility:visible;mso-wrap-style:square;mso-width-percent:0;mso-height-percent:200;mso-wrap-distance-left:9pt;mso-wrap-distance-top:3.6pt;mso-wrap-distance-right:9pt;mso-wrap-distance-bottom:3.6pt;mso-position-horizontal:absolute;mso-position-horizontal-relative:text;mso-position-vertical:absolute;mso-position-vertical-relative:text;mso-width-percent:0;mso-height-percent:200;mso-width-relative:margin;mso-height-relative:margin;v-text-anchor:top" o:gfxdata="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" filled="f" stroked="f">
+                    <v:shape w14:anchorId="658CEEDA" id="_x0000_s1058" type="#_x0000_t202" style="position:absolute;left:0;text-align:left;margin-left:-2.45pt;margin-top:233.55pt;width:82.35pt;height:110.6pt;z-index:251694080;visibility:visible;mso-wrap-style:square;mso-width-percent:0;mso-height-percent:200;mso-wrap-distance-left:9pt;mso-wrap-distance-top:3.6pt;mso-wrap-distance-right:9pt;mso-wrap-distance-bottom:3.6pt;mso-position-horizontal:absolute;mso-position-horizontal-relative:text;mso-position-vertical:absolute;mso-position-vertical-relative:text;mso-width-percent:0;mso-height-percent:200;mso-width-relative:margin;mso-height-relative:margin;v-text-anchor:top" o:gfxdata="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" filled="f" stroked="f">
                       <v:textbox style="mso-fit-shape-to-text:t">
                         <w:txbxContent>
                           <w:p>
@@ -8224,6 +8160,798 @@
                 <w:szCs w:val="18"/>
               </w:rPr>
             </w:pPr>
+            <w:r>
+              <w:rPr>
+                <w:b/>
+                <w:bCs/>
+                <w:sz w:val="18"/>
+                <w:szCs w:val="18"/>
+              </w:rPr>
+              <w:lastRenderedPageBreak/>
+              <w:t>User Story 23</w:t>
+            </w:r>
+            <w:r>
+              <w:rPr>
+                <w:sz w:val="18"/>
+                <w:szCs w:val="18"/>
+              </w:rPr>
+              <w:t xml:space="preserve"> - </w:t>
+            </w:r>
+            <w:r>
+              <w:rPr>
+                <w:sz w:val="18"/>
+                <w:szCs w:val="18"/>
+              </w:rPr>
+              <w:t>As a police officer, I want to see a leaderboard of which officers have closed the most reports so that I can compare my performance against colleagues.</w:t>
+            </w:r>
+          </w:p>
+          <w:p>
+            <w:pPr>
+              <w:ind w:left="144" w:right="144"/>
+              <w:rPr>
+                <w:sz w:val="18"/>
+                <w:szCs w:val="18"/>
+              </w:rPr>
+            </w:pPr>
+            <w:r>
+              <w:rPr>
+                <w:b/>
+                <w:bCs/>
+                <w:sz w:val="18"/>
+                <w:szCs w:val="18"/>
+              </w:rPr>
+              <w:t>Author</w:t>
+            </w:r>
+            <w:r>
+              <w:rPr>
+                <w:sz w:val="18"/>
+                <w:szCs w:val="18"/>
+              </w:rPr>
+              <w:t>: Mitchell</w:t>
+            </w:r>
+          </w:p>
+          <w:p>
+            <w:pPr>
+              <w:ind w:left="144" w:right="144"/>
+              <w:rPr>
+                <w:sz w:val="18"/>
+                <w:szCs w:val="18"/>
+              </w:rPr>
+            </w:pPr>
+          </w:p>
+          <w:p>
+            <w:pPr>
+              <w:ind w:left="144" w:right="144"/>
+              <w:rPr>
+                <w:sz w:val="18"/>
+                <w:szCs w:val="18"/>
+              </w:rPr>
+            </w:pPr>
+          </w:p>
+          <w:p>
+            <w:pPr>
+              <w:ind w:left="144" w:right="144"/>
+              <w:jc w:val="center"/>
+              <w:rPr>
+                <w:sz w:val="18"/>
+                <w:szCs w:val="18"/>
+              </w:rPr>
+            </w:pPr>
+            <w:r>
+              <w:rPr>
+                <w:b/>
+                <w:bCs/>
+                <w:noProof/>
+                <w:sz w:val="18"/>
+                <w:szCs w:val="18"/>
+              </w:rPr>
+              <mc:AlternateContent>
+                <mc:Choice Requires="wps">
+                  <w:drawing>
+                    <wp:anchor distT="0" distB="0" distL="114300" distR="114300" simplePos="0" relativeHeight="251803648" behindDoc="0" locked="0" layoutInCell="1" allowOverlap="1" wp14:anchorId="110C5F4C" wp14:editId="45ABF68E">
+                      <wp:simplePos x="0" y="0"/>
+                      <wp:positionH relativeFrom="column">
+                        <wp:posOffset>2514600</wp:posOffset>
+                      </wp:positionH>
+                      <wp:positionV relativeFrom="paragraph">
+                        <wp:posOffset>862330</wp:posOffset>
+                      </wp:positionV>
+                      <wp:extent cx="381000" cy="196850"/>
+                      <wp:effectExtent l="38100" t="38100" r="19050" b="31750"/>
+                      <wp:wrapNone/>
+                      <wp:docPr id="883587444" name="Straight Arrow Connector 6"/>
+                      <wp:cNvGraphicFramePr/>
+                      <a:graphic xmlns:a="http://schemas.openxmlformats.org/drawingml/2006/main">
+                        <a:graphicData uri="http://schemas.microsoft.com/office/word/2010/wordprocessingShape">
+                          <wps:wsp>
+                            <wps:cNvCnPr/>
+                            <wps:spPr>
+                              <a:xfrm flipH="1" flipV="1">
+                                <a:off x="0" y="0"/>
+                                <a:ext cx="381000" cy="196850"/>
+                              </a:xfrm>
+                              <a:prstGeom prst="straightConnector1">
+                                <a:avLst/>
+                              </a:prstGeom>
+                              <a:ln>
+                                <a:solidFill>
+                                  <a:srgbClr val="EE0000"/>
+                                </a:solidFill>
+                                <a:tailEnd type="triangle"/>
+                              </a:ln>
+                            </wps:spPr>
+                            <wps:style>
+                              <a:lnRef idx="2">
+                                <a:schemeClr val="accent1"/>
+                              </a:lnRef>
+                              <a:fillRef idx="0">
+                                <a:schemeClr val="accent1"/>
+                              </a:fillRef>
+                              <a:effectRef idx="1">
+                                <a:schemeClr val="accent1"/>
+                              </a:effectRef>
+                              <a:fontRef idx="minor">
+                                <a:schemeClr val="tx1"/>
+                              </a:fontRef>
+                            </wps:style>
+                            <wps:bodyPr/>
+                          </wps:wsp>
+                        </a:graphicData>
+                      </a:graphic>
+                      <wp14:sizeRelH relativeFrom="margin">
+                        <wp14:pctWidth>0</wp14:pctWidth>
+                      </wp14:sizeRelH>
+                      <wp14:sizeRelV relativeFrom="margin">
+                        <wp14:pctHeight>0</wp14:pctHeight>
+                      </wp14:sizeRelV>
+                    </wp:anchor>
+                  </w:drawing>
+                </mc:Choice>
+                <mc:Fallback>
+                  <w:pict>
+                    <v:shapetype w14:anchorId="47FD61A1" id="_x0000_t32" coordsize="21600,21600" o:spt="32" o:oned="t" path="m,l21600,21600e" filled="f">
+                      <v:path arrowok="t" fillok="f" o:connecttype="none"/>
+                      <o:lock v:ext="edit" shapetype="t"/>
+                    </v:shapetype>
+                    <v:shape id="Straight Arrow Connector 6" o:spid="_x0000_s1026" type="#_x0000_t32" style="position:absolute;margin-left:198pt;margin-top:67.9pt;width:30pt;height:15.5pt;flip:x y;z-index:251803648;visibility:visible;mso-wrap-style:square;mso-width-percent:0;mso-height-percent:0;mso-wrap-distance-left:9pt;mso-wrap-distance-top:0;mso-wrap-distance-right:9pt;mso-wrap-distance-bottom:0;mso-position-horizontal:absolute;mso-position-horizontal-relative:text;mso-position-vertical:absolute;mso-position-vertical-relative:text;mso-width-percent:0;mso-height-percent:0;mso-width-relative:margin;mso-height-relative:margin" o:gfxdata="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" strokecolor="#e00" strokeweight="1.5pt">
+                      <v:stroke endarrow="block" joinstyle="miter"/>
+                    </v:shape>
+                  </w:pict>
+                </mc:Fallback>
+              </mc:AlternateContent>
+            </w:r>
+            <w:r>
+              <w:rPr>
+                <w:b/>
+                <w:bCs/>
+                <w:noProof/>
+                <w:sz w:val="18"/>
+                <w:szCs w:val="18"/>
+              </w:rPr>
+              <mc:AlternateContent>
+                <mc:Choice Requires="wps">
+                  <w:drawing>
+                    <wp:anchor distT="0" distB="0" distL="114300" distR="114300" simplePos="0" relativeHeight="251801600" behindDoc="0" locked="0" layoutInCell="1" allowOverlap="1" wp14:anchorId="54B25F73" wp14:editId="0648F576">
+                      <wp:simplePos x="0" y="0"/>
+                      <wp:positionH relativeFrom="column">
+                        <wp:posOffset>762000</wp:posOffset>
+                      </wp:positionH>
+                      <wp:positionV relativeFrom="paragraph">
+                        <wp:posOffset>210819</wp:posOffset>
+                      </wp:positionV>
+                      <wp:extent cx="400050" cy="168275"/>
+                      <wp:effectExtent l="0" t="38100" r="57150" b="22225"/>
+                      <wp:wrapNone/>
+                      <wp:docPr id="1329281038" name="Straight Arrow Connector 6"/>
+                      <wp:cNvGraphicFramePr/>
+                      <a:graphic xmlns:a="http://schemas.openxmlformats.org/drawingml/2006/main">
+                        <a:graphicData uri="http://schemas.microsoft.com/office/word/2010/wordprocessingShape">
+                          <wps:wsp>
+                            <wps:cNvCnPr/>
+                            <wps:spPr>
+                              <a:xfrm flipV="1">
+                                <a:off x="0" y="0"/>
+                                <a:ext cx="400050" cy="168275"/>
+                              </a:xfrm>
+                              <a:prstGeom prst="straightConnector1">
+                                <a:avLst/>
+                              </a:prstGeom>
+                              <a:ln>
+                                <a:solidFill>
+                                  <a:srgbClr val="EE0000"/>
+                                </a:solidFill>
+                                <a:tailEnd type="triangle"/>
+                              </a:ln>
+                            </wps:spPr>
+                            <wps:style>
+                              <a:lnRef idx="2">
+                                <a:schemeClr val="accent1"/>
+                              </a:lnRef>
+                              <a:fillRef idx="0">
+                                <a:schemeClr val="accent1"/>
+                              </a:fillRef>
+                              <a:effectRef idx="1">
+                                <a:schemeClr val="accent1"/>
+                              </a:effectRef>
+                              <a:fontRef idx="minor">
+                                <a:schemeClr val="tx1"/>
+                              </a:fontRef>
+                            </wps:style>
+                            <wps:bodyPr/>
+                          </wps:wsp>
+                        </a:graphicData>
+                      </a:graphic>
+                      <wp14:sizeRelH relativeFrom="margin">
+                        <wp14:pctWidth>0</wp14:pctWidth>
+                      </wp14:sizeRelH>
+                      <wp14:sizeRelV relativeFrom="margin">
+                        <wp14:pctHeight>0</wp14:pctHeight>
+                      </wp14:sizeRelV>
+                    </wp:anchor>
+                  </w:drawing>
+                </mc:Choice>
+                <mc:Fallback>
+                  <w:pict>
+                    <v:shape w14:anchorId="0CEC8C2A" id="Straight Arrow Connector 6" o:spid="_x0000_s1026" type="#_x0000_t32" style="position:absolute;margin-left:60pt;margin-top:16.6pt;width:31.5pt;height:13.25pt;flip:y;z-index:251801600;visibility:visible;mso-wrap-style:square;mso-width-percent:0;mso-height-percent:0;mso-wrap-distance-left:9pt;mso-wrap-distance-top:0;mso-wrap-distance-right:9pt;mso-wrap-distance-bottom:0;mso-position-horizontal:absolute;mso-position-horizontal-relative:text;mso-position-vertical:absolute;mso-position-vertical-relative:text;mso-width-percent:0;mso-height-percent:0;mso-width-relative:margin;mso-height-relative:margin" o:gfxdata="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" strokecolor="#e00" strokeweight="1.5pt">
+                      <v:stroke endarrow="block" joinstyle="miter"/>
+                    </v:shape>
+                  </w:pict>
+                </mc:Fallback>
+              </mc:AlternateContent>
+            </w:r>
+            <w:r>
+              <w:rPr>
+                <w:b/>
+                <w:bCs/>
+                <w:noProof/>
+                <w:sz w:val="18"/>
+                <w:szCs w:val="18"/>
+              </w:rPr>
+              <mc:AlternateContent>
+                <mc:Choice Requires="wps">
+                  <w:drawing>
+                    <wp:anchor distT="45720" distB="45720" distL="114300" distR="114300" simplePos="0" relativeHeight="251799552" behindDoc="0" locked="0" layoutInCell="1" allowOverlap="1" wp14:anchorId="2960BF1C" wp14:editId="12006FD8">
+                      <wp:simplePos x="0" y="0"/>
+                      <wp:positionH relativeFrom="column">
+                        <wp:posOffset>104775</wp:posOffset>
+                      </wp:positionH>
+                      <wp:positionV relativeFrom="paragraph">
+                        <wp:posOffset>39370</wp:posOffset>
+                      </wp:positionV>
+                      <wp:extent cx="819150" cy="1119883"/>
+                      <wp:effectExtent l="0" t="0" r="0" b="4445"/>
+                      <wp:wrapNone/>
+                      <wp:docPr id="386161514" name="Text Box 2"/>
+                      <wp:cNvGraphicFramePr>
+                        <a:graphicFrameLocks xmlns:a="http://schemas.openxmlformats.org/drawingml/2006/main"/>
+                      </wp:cNvGraphicFramePr>
+                      <a:graphic xmlns:a="http://schemas.openxmlformats.org/drawingml/2006/main">
+                        <a:graphicData uri="http://schemas.microsoft.com/office/word/2010/wordprocessingShape">
+                          <wps:wsp>
+                            <wps:cNvSpPr txBox="1">
+                              <a:spLocks noChangeArrowheads="1"/>
+                            </wps:cNvSpPr>
+                            <wps:spPr bwMode="auto">
+                              <a:xfrm>
+                                <a:off x="0" y="0"/>
+                                <a:ext cx="819150" cy="1119883"/>
+                              </a:xfrm>
+                              <a:prstGeom prst="rect">
+                                <a:avLst/>
+                              </a:prstGeom>
+                              <a:noFill/>
+                              <a:ln w="9525">
+                                <a:noFill/>
+                                <a:miter lim="800000"/>
+                                <a:headEnd/>
+                                <a:tailEnd/>
+                              </a:ln>
+                            </wps:spPr>
+                            <wps:txbx>
+                              <w:txbxContent>
+                                <w:p>
+                                  <w:pPr>
+                                    <w:rPr>
+                                      <w:sz w:val="16"/>
+                                      <w:szCs w:val="16"/>
+                                      <w:lang w:val="en-GB"/>
+                                    </w:rPr>
+                                  </w:pPr>
+                                  <w:r>
+                                    <w:rPr>
+                                      <w:sz w:val="16"/>
+                                      <w:szCs w:val="16"/>
+                                      <w:lang w:val="en-GB"/>
+                                    </w:rPr>
+                                    <w:t>Hamburger menu to navigate application</w:t>
+                                  </w:r>
+                                  <w:r>
+                                    <w:rPr>
+                                      <w:sz w:val="16"/>
+                                      <w:szCs w:val="16"/>
+                                      <w:lang w:val="en-GB"/>
+                                    </w:rPr>
+                                    <w:t xml:space="preserve"> </w:t>
+                                  </w:r>
+                                </w:p>
+                              </w:txbxContent>
+                            </wps:txbx>
+                            <wps:bodyPr rot="0" vert="horz" wrap="square" lIns="91440" tIns="45720" rIns="91440" bIns="45720" anchor="t" anchorCtr="0">
+                              <a:noAutofit/>
+                            </wps:bodyPr>
+                          </wps:wsp>
+                        </a:graphicData>
+                      </a:graphic>
+                      <wp14:sizeRelH relativeFrom="margin">
+                        <wp14:pctWidth>0</wp14:pctWidth>
+                      </wp14:sizeRelH>
+                      <wp14:sizeRelV relativeFrom="margin">
+                        <wp14:pctHeight>0</wp14:pctHeight>
+                      </wp14:sizeRelV>
+                    </wp:anchor>
+                  </w:drawing>
+                </mc:Choice>
+                <mc:Fallback>
+                  <w:pict>
+                    <v:shape w14:anchorId="2960BF1C" id="_x0000_s1059" type="#_x0000_t202" style="position:absolute;left:0;text-align:left;margin-left:8.25pt;margin-top:3.1pt;width:64.5pt;height:88.2pt;z-index:251799552;visibility:visible;mso-wrap-style:square;mso-width-percent:0;mso-height-percent:0;mso-wrap-distance-left:9pt;mso-wrap-distance-top:3.6pt;mso-wrap-distance-right:9pt;mso-wrap-distance-bottom:3.6pt;mso-position-horizontal:absolute;mso-position-horizontal-relative:text;mso-position-vertical:absolute;mso-position-vertical-relative:text;mso-width-percent:0;mso-height-percent:0;mso-width-relative:margin;mso-height-relative:margin;v-text-anchor:top" o:gfxdata="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" filled="f" stroked="f">
+                      <v:textbox>
+                        <w:txbxContent>
+                          <w:p>
+                            <w:pPr>
+                              <w:rPr>
+                                <w:sz w:val="16"/>
+                                <w:szCs w:val="16"/>
+                                <w:lang w:val="en-GB"/>
+                              </w:rPr>
+                            </w:pPr>
+                            <w:r>
+                              <w:rPr>
+                                <w:sz w:val="16"/>
+                                <w:szCs w:val="16"/>
+                                <w:lang w:val="en-GB"/>
+                              </w:rPr>
+                              <w:t>Hamburger menu to navigate application</w:t>
+                            </w:r>
+                            <w:r>
+                              <w:rPr>
+                                <w:sz w:val="16"/>
+                                <w:szCs w:val="16"/>
+                                <w:lang w:val="en-GB"/>
+                              </w:rPr>
+                              <w:t xml:space="preserve"> </w:t>
+                            </w:r>
+                          </w:p>
+                        </w:txbxContent>
+                      </v:textbox>
+                    </v:shape>
+                  </w:pict>
+                </mc:Fallback>
+              </mc:AlternateContent>
+            </w:r>
+            <w:r>
+              <w:rPr>
+                <w:b/>
+                <w:bCs/>
+                <w:noProof/>
+                <w:sz w:val="18"/>
+                <w:szCs w:val="18"/>
+              </w:rPr>
+              <mc:AlternateContent>
+                <mc:Choice Requires="wps">
+                  <w:drawing>
+                    <wp:anchor distT="0" distB="0" distL="114300" distR="114300" simplePos="0" relativeHeight="251795456" behindDoc="0" locked="0" layoutInCell="1" allowOverlap="1" wp14:anchorId="49F2E299" wp14:editId="307CDEC0">
+                      <wp:simplePos x="0" y="0"/>
+                      <wp:positionH relativeFrom="column">
+                        <wp:posOffset>942976</wp:posOffset>
+                      </wp:positionH>
+                      <wp:positionV relativeFrom="paragraph">
+                        <wp:posOffset>2017394</wp:posOffset>
+                      </wp:positionV>
+                      <wp:extent cx="266700" cy="355600"/>
+                      <wp:effectExtent l="0" t="0" r="57150" b="63500"/>
+                      <wp:wrapNone/>
+                      <wp:docPr id="767479183" name="Straight Arrow Connector 6"/>
+                      <wp:cNvGraphicFramePr/>
+                      <a:graphic xmlns:a="http://schemas.openxmlformats.org/drawingml/2006/main">
+                        <a:graphicData uri="http://schemas.microsoft.com/office/word/2010/wordprocessingShape">
+                          <wps:wsp>
+                            <wps:cNvCnPr/>
+                            <wps:spPr>
+                              <a:xfrm>
+                                <a:off x="0" y="0"/>
+                                <a:ext cx="266700" cy="355600"/>
+                              </a:xfrm>
+                              <a:prstGeom prst="straightConnector1">
+                                <a:avLst/>
+                              </a:prstGeom>
+                              <a:ln>
+                                <a:solidFill>
+                                  <a:srgbClr val="EE0000"/>
+                                </a:solidFill>
+                                <a:tailEnd type="triangle"/>
+                              </a:ln>
+                            </wps:spPr>
+                            <wps:style>
+                              <a:lnRef idx="2">
+                                <a:schemeClr val="accent1"/>
+                              </a:lnRef>
+                              <a:fillRef idx="0">
+                                <a:schemeClr val="accent1"/>
+                              </a:fillRef>
+                              <a:effectRef idx="1">
+                                <a:schemeClr val="accent1"/>
+                              </a:effectRef>
+                              <a:fontRef idx="minor">
+                                <a:schemeClr val="tx1"/>
+                              </a:fontRef>
+                            </wps:style>
+                            <wps:bodyPr/>
+                          </wps:wsp>
+                        </a:graphicData>
+                      </a:graphic>
+                      <wp14:sizeRelH relativeFrom="margin">
+                        <wp14:pctWidth>0</wp14:pctWidth>
+                      </wp14:sizeRelH>
+                      <wp14:sizeRelV relativeFrom="margin">
+                        <wp14:pctHeight>0</wp14:pctHeight>
+                      </wp14:sizeRelV>
+                    </wp:anchor>
+                  </w:drawing>
+                </mc:Choice>
+                <mc:Fallback>
+                  <w:pict>
+                    <v:shape w14:anchorId="3B391B7B" id="Straight Arrow Connector 6" o:spid="_x0000_s1026" type="#_x0000_t32" style="position:absolute;margin-left:74.25pt;margin-top:158.85pt;width:21pt;height:28pt;z-index:251795456;visibility:visible;mso-wrap-style:square;mso-width-percent:0;mso-height-percent:0;mso-wrap-distance-left:9pt;mso-wrap-distance-top:0;mso-wrap-distance-right:9pt;mso-wrap-distance-bottom:0;mso-position-horizontal:absolute;mso-position-horizontal-relative:text;mso-position-vertical:absolute;mso-position-vertical-relative:text;mso-width-percent:0;mso-height-percent:0;mso-width-relative:margin;mso-height-relative:margin" o:gfxdata="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" strokecolor="#e00" strokeweight="1.5pt">
+                      <v:stroke endarrow="block" joinstyle="miter"/>
+                    </v:shape>
+                  </w:pict>
+                </mc:Fallback>
+              </mc:AlternateContent>
+            </w:r>
+            <w:r>
+              <w:rPr>
+                <w:b/>
+                <w:bCs/>
+                <w:noProof/>
+                <w:sz w:val="18"/>
+                <w:szCs w:val="18"/>
+              </w:rPr>
+              <mc:AlternateContent>
+                <mc:Choice Requires="wps">
+                  <w:drawing>
+                    <wp:anchor distT="45720" distB="45720" distL="114300" distR="114300" simplePos="0" relativeHeight="251793408" behindDoc="0" locked="0" layoutInCell="1" allowOverlap="1" wp14:anchorId="54B9B1B6" wp14:editId="6C292460">
+                      <wp:simplePos x="0" y="0"/>
+                      <wp:positionH relativeFrom="column">
+                        <wp:posOffset>114300</wp:posOffset>
+                      </wp:positionH>
+                      <wp:positionV relativeFrom="paragraph">
+                        <wp:posOffset>1688465</wp:posOffset>
+                      </wp:positionV>
+                      <wp:extent cx="962025" cy="1119883"/>
+                      <wp:effectExtent l="0" t="0" r="0" b="4445"/>
+                      <wp:wrapNone/>
+                      <wp:docPr id="518828868" name="Text Box 2"/>
+                      <wp:cNvGraphicFramePr>
+                        <a:graphicFrameLocks xmlns:a="http://schemas.openxmlformats.org/drawingml/2006/main"/>
+                      </wp:cNvGraphicFramePr>
+                      <a:graphic xmlns:a="http://schemas.openxmlformats.org/drawingml/2006/main">
+                        <a:graphicData uri="http://schemas.microsoft.com/office/word/2010/wordprocessingShape">
+                          <wps:wsp>
+                            <wps:cNvSpPr txBox="1">
+                              <a:spLocks noChangeArrowheads="1"/>
+                            </wps:cNvSpPr>
+                            <wps:spPr bwMode="auto">
+                              <a:xfrm>
+                                <a:off x="0" y="0"/>
+                                <a:ext cx="962025" cy="1119883"/>
+                              </a:xfrm>
+                              <a:prstGeom prst="rect">
+                                <a:avLst/>
+                              </a:prstGeom>
+                              <a:noFill/>
+                              <a:ln w="9525">
+                                <a:noFill/>
+                                <a:miter lim="800000"/>
+                                <a:headEnd/>
+                                <a:tailEnd/>
+                              </a:ln>
+                            </wps:spPr>
+                            <wps:txbx>
+                              <w:txbxContent>
+                                <w:p>
+                                  <w:pPr>
+                                    <w:rPr>
+                                      <w:sz w:val="16"/>
+                                      <w:szCs w:val="16"/>
+                                      <w:lang w:val="en-GB"/>
+                                    </w:rPr>
+                                  </w:pPr>
+                                  <w:r>
+                                    <w:rPr>
+                                      <w:sz w:val="16"/>
+                                      <w:szCs w:val="16"/>
+                                      <w:lang w:val="en-GB"/>
+                                    </w:rPr>
+                                    <w:t>Individual statistics listed below graph for more in-depth data analysis</w:t>
+                                  </w:r>
+                                  <w:r>
+                                    <w:rPr>
+                                      <w:sz w:val="16"/>
+                                      <w:szCs w:val="16"/>
+                                      <w:lang w:val="en-GB"/>
+                                    </w:rPr>
+                                    <w:t xml:space="preserve"> </w:t>
+                                  </w:r>
+                                </w:p>
+                              </w:txbxContent>
+                            </wps:txbx>
+                            <wps:bodyPr rot="0" vert="horz" wrap="square" lIns="91440" tIns="45720" rIns="91440" bIns="45720" anchor="t" anchorCtr="0">
+                              <a:noAutofit/>
+                            </wps:bodyPr>
+                          </wps:wsp>
+                        </a:graphicData>
+                      </a:graphic>
+                      <wp14:sizeRelH relativeFrom="margin">
+                        <wp14:pctWidth>0</wp14:pctWidth>
+                      </wp14:sizeRelH>
+                      <wp14:sizeRelV relativeFrom="margin">
+                        <wp14:pctHeight>0</wp14:pctHeight>
+                      </wp14:sizeRelV>
+                    </wp:anchor>
+                  </w:drawing>
+                </mc:Choice>
+                <mc:Fallback>
+                  <w:pict>
+                    <v:shape w14:anchorId="54B9B1B6" id="_x0000_s1060" type="#_x0000_t202" style="position:absolute;left:0;text-align:left;margin-left:9pt;margin-top:132.95pt;width:75.75pt;height:88.2pt;z-index:251793408;visibility:visible;mso-wrap-style:square;mso-width-percent:0;mso-height-percent:0;mso-wrap-distance-left:9pt;mso-wrap-distance-top:3.6pt;mso-wrap-distance-right:9pt;mso-wrap-distance-bottom:3.6pt;mso-position-horizontal:absolute;mso-position-horizontal-relative:text;mso-position-vertical:absolute;mso-position-vertical-relative:text;mso-width-percent:0;mso-height-percent:0;mso-width-relative:margin;mso-height-relative:margin;v-text-anchor:top" o:gfxdata="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" filled="f" stroked="f">
+                      <v:textbox>
+                        <w:txbxContent>
+                          <w:p>
+                            <w:pPr>
+                              <w:rPr>
+                                <w:sz w:val="16"/>
+                                <w:szCs w:val="16"/>
+                                <w:lang w:val="en-GB"/>
+                              </w:rPr>
+                            </w:pPr>
+                            <w:r>
+                              <w:rPr>
+                                <w:sz w:val="16"/>
+                                <w:szCs w:val="16"/>
+                                <w:lang w:val="en-GB"/>
+                              </w:rPr>
+                              <w:t>Individual statistics listed below graph for more in-depth data analysis</w:t>
+                            </w:r>
+                            <w:r>
+                              <w:rPr>
+                                <w:sz w:val="16"/>
+                                <w:szCs w:val="16"/>
+                                <w:lang w:val="en-GB"/>
+                              </w:rPr>
+                              <w:t xml:space="preserve"> </w:t>
+                            </w:r>
+                          </w:p>
+                        </w:txbxContent>
+                      </v:textbox>
+                    </v:shape>
+                  </w:pict>
+                </mc:Fallback>
+              </mc:AlternateContent>
+            </w:r>
+            <w:r>
+              <w:rPr>
+                <w:b/>
+                <w:bCs/>
+                <w:noProof/>
+                <w:sz w:val="18"/>
+                <w:szCs w:val="18"/>
+              </w:rPr>
+              <mc:AlternateContent>
+                <mc:Choice Requires="wps">
+                  <w:drawing>
+                    <wp:anchor distT="45720" distB="45720" distL="114300" distR="114300" simplePos="0" relativeHeight="251791360" behindDoc="0" locked="0" layoutInCell="1" allowOverlap="1" wp14:anchorId="009579F7" wp14:editId="7942B35B">
+                      <wp:simplePos x="0" y="0"/>
+                      <wp:positionH relativeFrom="column">
+                        <wp:posOffset>2867025</wp:posOffset>
+                      </wp:positionH>
+                      <wp:positionV relativeFrom="paragraph">
+                        <wp:posOffset>448945</wp:posOffset>
+                      </wp:positionV>
+                      <wp:extent cx="962025" cy="1119883"/>
+                      <wp:effectExtent l="0" t="0" r="0" b="4445"/>
+                      <wp:wrapNone/>
+                      <wp:docPr id="962810752" name="Text Box 2"/>
+                      <wp:cNvGraphicFramePr>
+                        <a:graphicFrameLocks xmlns:a="http://schemas.openxmlformats.org/drawingml/2006/main"/>
+                      </wp:cNvGraphicFramePr>
+                      <a:graphic xmlns:a="http://schemas.openxmlformats.org/drawingml/2006/main">
+                        <a:graphicData uri="http://schemas.microsoft.com/office/word/2010/wordprocessingShape">
+                          <wps:wsp>
+                            <wps:cNvSpPr txBox="1">
+                              <a:spLocks noChangeArrowheads="1"/>
+                            </wps:cNvSpPr>
+                            <wps:spPr bwMode="auto">
+                              <a:xfrm>
+                                <a:off x="0" y="0"/>
+                                <a:ext cx="962025" cy="1119883"/>
+                              </a:xfrm>
+                              <a:prstGeom prst="rect">
+                                <a:avLst/>
+                              </a:prstGeom>
+                              <a:noFill/>
+                              <a:ln w="9525">
+                                <a:noFill/>
+                                <a:miter lim="800000"/>
+                                <a:headEnd/>
+                                <a:tailEnd/>
+                              </a:ln>
+                            </wps:spPr>
+                            <wps:txbx>
+                              <w:txbxContent>
+                                <w:p>
+                                  <w:pPr>
+                                    <w:rPr>
+                                      <w:sz w:val="16"/>
+                                      <w:szCs w:val="16"/>
+                                      <w:lang w:val="en-GB"/>
+                                    </w:rPr>
+                                  </w:pPr>
+                                  <w:r>
+                                    <w:rPr>
+                                      <w:sz w:val="16"/>
+                                      <w:szCs w:val="16"/>
+                                      <w:lang w:val="en-GB"/>
+                                    </w:rPr>
+                                    <w:t xml:space="preserve">Graph </w:t>
+                                  </w:r>
+                                  <w:r>
+                                    <w:rPr>
+                                      <w:sz w:val="16"/>
+                                      <w:szCs w:val="16"/>
+                                      <w:lang w:val="en-GB"/>
+                                    </w:rPr>
+                                    <w:t xml:space="preserve">shows visualised </w:t>
+                                  </w:r>
+                                  <w:r>
+                                    <w:rPr>
+                                      <w:sz w:val="16"/>
+                                      <w:szCs w:val="16"/>
+                                      <w:lang w:val="en-GB"/>
+                                    </w:rPr>
+                                    <w:t>performance metrics for all officers in a district for quick comparison.</w:t>
+                                  </w:r>
+                                  <w:r>
+                                    <w:rPr>
+                                      <w:sz w:val="16"/>
+                                      <w:szCs w:val="16"/>
+                                      <w:lang w:val="en-GB"/>
+                                    </w:rPr>
+                                    <w:t xml:space="preserve"> </w:t>
+                                  </w:r>
+                                </w:p>
+                              </w:txbxContent>
+                            </wps:txbx>
+                            <wps:bodyPr rot="0" vert="horz" wrap="square" lIns="91440" tIns="45720" rIns="91440" bIns="45720" anchor="t" anchorCtr="0">
+                              <a:noAutofit/>
+                            </wps:bodyPr>
+                          </wps:wsp>
+                        </a:graphicData>
+                      </a:graphic>
+                      <wp14:sizeRelH relativeFrom="margin">
+                        <wp14:pctWidth>0</wp14:pctWidth>
+                      </wp14:sizeRelH>
+                      <wp14:sizeRelV relativeFrom="margin">
+                        <wp14:pctHeight>0</wp14:pctHeight>
+                      </wp14:sizeRelV>
+                    </wp:anchor>
+                  </w:drawing>
+                </mc:Choice>
+                <mc:Fallback>
+                  <w:pict>
+                    <v:shape w14:anchorId="009579F7" id="_x0000_s1061" type="#_x0000_t202" style="position:absolute;left:0;text-align:left;margin-left:225.75pt;margin-top:35.35pt;width:75.75pt;height:88.2pt;z-index:251791360;visibility:visible;mso-wrap-style:square;mso-width-percent:0;mso-height-percent:0;mso-wrap-distance-left:9pt;mso-wrap-distance-top:3.6pt;mso-wrap-distance-right:9pt;mso-wrap-distance-bottom:3.6pt;mso-position-horizontal:absolute;mso-position-horizontal-relative:text;mso-position-vertical:absolute;mso-position-vertical-relative:text;mso-width-percent:0;mso-height-percent:0;mso-width-relative:margin;mso-height-relative:margin;v-text-anchor:top" o:gfxdata="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" filled="f" stroked="f">
+                      <v:textbox>
+                        <w:txbxContent>
+                          <w:p>
+                            <w:pPr>
+                              <w:rPr>
+                                <w:sz w:val="16"/>
+                                <w:szCs w:val="16"/>
+                                <w:lang w:val="en-GB"/>
+                              </w:rPr>
+                            </w:pPr>
+                            <w:r>
+                              <w:rPr>
+                                <w:sz w:val="16"/>
+                                <w:szCs w:val="16"/>
+                                <w:lang w:val="en-GB"/>
+                              </w:rPr>
+                              <w:t xml:space="preserve">Graph </w:t>
+                            </w:r>
+                            <w:r>
+                              <w:rPr>
+                                <w:sz w:val="16"/>
+                                <w:szCs w:val="16"/>
+                                <w:lang w:val="en-GB"/>
+                              </w:rPr>
+                              <w:t xml:space="preserve">shows visualised </w:t>
+                            </w:r>
+                            <w:r>
+                              <w:rPr>
+                                <w:sz w:val="16"/>
+                                <w:szCs w:val="16"/>
+                                <w:lang w:val="en-GB"/>
+                              </w:rPr>
+                              <w:t>performance metrics for all officers in a district for quick comparison.</w:t>
+                            </w:r>
+                            <w:r>
+                              <w:rPr>
+                                <w:sz w:val="16"/>
+                                <w:szCs w:val="16"/>
+                                <w:lang w:val="en-GB"/>
+                              </w:rPr>
+                              <w:t xml:space="preserve"> </w:t>
+                            </w:r>
+                          </w:p>
+                        </w:txbxContent>
+                      </v:textbox>
+                    </v:shape>
+                  </w:pict>
+                </mc:Fallback>
+              </mc:AlternateContent>
+            </w:r>
+            <w:r>
+              <w:rPr>
+                <w:noProof/>
+                <w:sz w:val="18"/>
+                <w:szCs w:val="18"/>
+              </w:rPr>
+              <w:drawing>
+                <wp:inline distT="0" distB="0" distL="0" distR="0" wp14:anchorId="49E1E1A9" wp14:editId="34414BFB">
+                  <wp:extent cx="1746647" cy="3105150"/>
+                  <wp:effectExtent l="0" t="0" r="6350" b="0"/>
+                  <wp:docPr id="1041607091" name="Picture 69"/>
+                  <wp:cNvGraphicFramePr>
+                    <a:graphicFrameLocks xmlns:a="http://schemas.openxmlformats.org/drawingml/2006/main" noChangeAspect="1"/>
+                  </wp:cNvGraphicFramePr>
+                  <a:graphic xmlns:a="http://schemas.openxmlformats.org/drawingml/2006/main">
+                    <a:graphicData uri="http://schemas.openxmlformats.org/drawingml/2006/picture">
+                      <pic:pic xmlns:pic="http://schemas.openxmlformats.org/drawingml/2006/picture">
+                        <pic:nvPicPr>
+                          <pic:cNvPr id="0" name="Picture 3"/>
+                          <pic:cNvPicPr>
+                            <a:picLocks noChangeAspect="1" noChangeArrowheads="1"/>
+                          </pic:cNvPicPr>
+                        </pic:nvPicPr>
+                        <pic:blipFill>
+                          <a:blip r:embed="rId15" cstate="print">
+                            <a:extLst>
+                              <a:ext uri="{28A0092B-C50C-407E-A947-70E740481C1C}">
+                                <a14:useLocalDpi xmlns:a14="http://schemas.microsoft.com/office/drawing/2010/main" val="0"/>
+                              </a:ext>
+                            </a:extLst>
+                          </a:blip>
+                          <a:srcRect/>
+                          <a:stretch>
+                            <a:fillRect/>
+                          </a:stretch>
+                        </pic:blipFill>
+                        <pic:spPr bwMode="auto">
+                          <a:xfrm>
+                            <a:off x="0" y="0"/>
+                            <a:ext cx="1760042" cy="3128963"/>
+                          </a:xfrm>
+                          <a:prstGeom prst="rect">
+                            <a:avLst/>
+                          </a:prstGeom>
+                          <a:noFill/>
+                          <a:ln>
+                            <a:noFill/>
+                          </a:ln>
+                        </pic:spPr>
+                      </pic:pic>
+                    </a:graphicData>
+                  </a:graphic>
+                </wp:inline>
+              </w:drawing>
+            </w:r>
           </w:p>
         </w:tc>
         <w:tc>
@@ -8238,6 +8966,770 @@
                 <w:szCs w:val="18"/>
               </w:rPr>
             </w:pPr>
+            <w:r>
+              <w:rPr>
+                <w:b/>
+                <w:bCs/>
+                <w:sz w:val="18"/>
+                <w:szCs w:val="18"/>
+              </w:rPr>
+              <w:t>User Story 2</w:t>
+            </w:r>
+            <w:r>
+              <w:rPr>
+                <w:b/>
+                <w:bCs/>
+                <w:sz w:val="18"/>
+                <w:szCs w:val="18"/>
+              </w:rPr>
+              <w:t>4</w:t>
+            </w:r>
+            <w:r>
+              <w:rPr>
+                <w:sz w:val="18"/>
+                <w:szCs w:val="18"/>
+              </w:rPr>
+              <w:t xml:space="preserve"> - </w:t>
+            </w:r>
+            <w:r>
+              <w:rPr>
+                <w:sz w:val="18"/>
+                <w:szCs w:val="18"/>
+              </w:rPr>
+              <w:t>As a public user, I want to attach a photo to my report so that I can provide visual evidence of the incident.</w:t>
+            </w:r>
+          </w:p>
+          <w:p>
+            <w:pPr>
+              <w:ind w:left="144" w:right="144"/>
+              <w:rPr>
+                <w:sz w:val="18"/>
+                <w:szCs w:val="18"/>
+              </w:rPr>
+            </w:pPr>
+            <w:r>
+              <w:rPr>
+                <w:b/>
+                <w:bCs/>
+                <w:sz w:val="18"/>
+                <w:szCs w:val="18"/>
+              </w:rPr>
+              <w:t>Author</w:t>
+            </w:r>
+            <w:r>
+              <w:rPr>
+                <w:sz w:val="18"/>
+                <w:szCs w:val="18"/>
+              </w:rPr>
+              <w:t>: Mitchell</w:t>
+            </w:r>
+          </w:p>
+          <w:p>
+            <w:pPr>
+              <w:ind w:left="144" w:right="144"/>
+              <w:rPr>
+                <w:sz w:val="18"/>
+                <w:szCs w:val="18"/>
+              </w:rPr>
+            </w:pPr>
+          </w:p>
+          <w:p>
+            <w:pPr>
+              <w:ind w:left="144" w:right="144"/>
+              <w:rPr>
+                <w:sz w:val="18"/>
+                <w:szCs w:val="18"/>
+              </w:rPr>
+            </w:pPr>
+          </w:p>
+          <w:p>
+            <w:pPr>
+              <w:ind w:left="144" w:right="144"/>
+              <w:jc w:val="center"/>
+              <w:rPr>
+                <w:sz w:val="18"/>
+                <w:szCs w:val="18"/>
+              </w:rPr>
+            </w:pPr>
+            <w:r>
+              <w:rPr>
+                <w:b/>
+                <w:bCs/>
+                <w:noProof/>
+                <w:sz w:val="18"/>
+                <w:szCs w:val="18"/>
+              </w:rPr>
+              <mc:AlternateContent>
+                <mc:Choice Requires="wps">
+                  <w:drawing>
+                    <wp:anchor distT="0" distB="0" distL="114300" distR="114300" simplePos="0" relativeHeight="251828224" behindDoc="0" locked="0" layoutInCell="1" allowOverlap="1" wp14:anchorId="1AA771AB" wp14:editId="5BE9BA05">
+                      <wp:simplePos x="0" y="0"/>
+                      <wp:positionH relativeFrom="column">
+                        <wp:posOffset>2695575</wp:posOffset>
+                      </wp:positionH>
+                      <wp:positionV relativeFrom="paragraph">
+                        <wp:posOffset>1330960</wp:posOffset>
+                      </wp:positionV>
+                      <wp:extent cx="533400" cy="666750"/>
+                      <wp:effectExtent l="38100" t="0" r="19050" b="57150"/>
+                      <wp:wrapNone/>
+                      <wp:docPr id="1617468183" name="Straight Arrow Connector 6"/>
+                      <wp:cNvGraphicFramePr/>
+                      <a:graphic xmlns:a="http://schemas.openxmlformats.org/drawingml/2006/main">
+                        <a:graphicData uri="http://schemas.microsoft.com/office/word/2010/wordprocessingShape">
+                          <wps:wsp>
+                            <wps:cNvCnPr/>
+                            <wps:spPr>
+                              <a:xfrm flipH="1">
+                                <a:off x="0" y="0"/>
+                                <a:ext cx="533400" cy="666750"/>
+                              </a:xfrm>
+                              <a:prstGeom prst="straightConnector1">
+                                <a:avLst/>
+                              </a:prstGeom>
+                              <a:ln>
+                                <a:solidFill>
+                                  <a:srgbClr val="EE0000"/>
+                                </a:solidFill>
+                                <a:tailEnd type="triangle"/>
+                              </a:ln>
+                            </wps:spPr>
+                            <wps:style>
+                              <a:lnRef idx="2">
+                                <a:schemeClr val="accent1"/>
+                              </a:lnRef>
+                              <a:fillRef idx="0">
+                                <a:schemeClr val="accent1"/>
+                              </a:fillRef>
+                              <a:effectRef idx="1">
+                                <a:schemeClr val="accent1"/>
+                              </a:effectRef>
+                              <a:fontRef idx="minor">
+                                <a:schemeClr val="tx1"/>
+                              </a:fontRef>
+                            </wps:style>
+                            <wps:bodyPr/>
+                          </wps:wsp>
+                        </a:graphicData>
+                      </a:graphic>
+                      <wp14:sizeRelH relativeFrom="margin">
+                        <wp14:pctWidth>0</wp14:pctWidth>
+                      </wp14:sizeRelH>
+                      <wp14:sizeRelV relativeFrom="margin">
+                        <wp14:pctHeight>0</wp14:pctHeight>
+                      </wp14:sizeRelV>
+                    </wp:anchor>
+                  </w:drawing>
+                </mc:Choice>
+                <mc:Fallback>
+                  <w:pict>
+                    <v:shape w14:anchorId="01FCEEAD" id="Straight Arrow Connector 6" o:spid="_x0000_s1026" type="#_x0000_t32" style="position:absolute;margin-left:212.25pt;margin-top:104.8pt;width:42pt;height:52.5pt;flip:x;z-index:251828224;visibility:visible;mso-wrap-style:square;mso-width-percent:0;mso-height-percent:0;mso-wrap-distance-left:9pt;mso-wrap-distance-top:0;mso-wrap-distance-right:9pt;mso-wrap-distance-bottom:0;mso-position-horizontal:absolute;mso-position-horizontal-relative:text;mso-position-vertical:absolute;mso-position-vertical-relative:text;mso-width-percent:0;mso-height-percent:0;mso-width-relative:margin;mso-height-relative:margin" o:gfxdata="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" strokecolor="#e00" strokeweight="1.5pt">
+                      <v:stroke endarrow="block" joinstyle="miter"/>
+                    </v:shape>
+                  </w:pict>
+                </mc:Fallback>
+              </mc:AlternateContent>
+            </w:r>
+            <w:r>
+              <w:rPr>
+                <w:b/>
+                <w:bCs/>
+                <w:noProof/>
+                <w:sz w:val="18"/>
+                <w:szCs w:val="18"/>
+              </w:rPr>
+              <mc:AlternateContent>
+                <mc:Choice Requires="wps">
+                  <w:drawing>
+                    <wp:anchor distT="0" distB="0" distL="114300" distR="114300" simplePos="0" relativeHeight="251826176" behindDoc="0" locked="0" layoutInCell="1" allowOverlap="1" wp14:anchorId="15F30E5D" wp14:editId="011B49C0">
+                      <wp:simplePos x="0" y="0"/>
+                      <wp:positionH relativeFrom="column">
+                        <wp:posOffset>809624</wp:posOffset>
+                      </wp:positionH>
+                      <wp:positionV relativeFrom="paragraph">
+                        <wp:posOffset>2216784</wp:posOffset>
+                      </wp:positionV>
+                      <wp:extent cx="438150" cy="257175"/>
+                      <wp:effectExtent l="0" t="0" r="76200" b="47625"/>
+                      <wp:wrapNone/>
+                      <wp:docPr id="1777360592" name="Straight Arrow Connector 6"/>
+                      <wp:cNvGraphicFramePr/>
+                      <a:graphic xmlns:a="http://schemas.openxmlformats.org/drawingml/2006/main">
+                        <a:graphicData uri="http://schemas.microsoft.com/office/word/2010/wordprocessingShape">
+                          <wps:wsp>
+                            <wps:cNvCnPr/>
+                            <wps:spPr>
+                              <a:xfrm>
+                                <a:off x="0" y="0"/>
+                                <a:ext cx="438150" cy="257175"/>
+                              </a:xfrm>
+                              <a:prstGeom prst="straightConnector1">
+                                <a:avLst/>
+                              </a:prstGeom>
+                              <a:ln>
+                                <a:solidFill>
+                                  <a:srgbClr val="EE0000"/>
+                                </a:solidFill>
+                                <a:tailEnd type="triangle"/>
+                              </a:ln>
+                            </wps:spPr>
+                            <wps:style>
+                              <a:lnRef idx="2">
+                                <a:schemeClr val="accent1"/>
+                              </a:lnRef>
+                              <a:fillRef idx="0">
+                                <a:schemeClr val="accent1"/>
+                              </a:fillRef>
+                              <a:effectRef idx="1">
+                                <a:schemeClr val="accent1"/>
+                              </a:effectRef>
+                              <a:fontRef idx="minor">
+                                <a:schemeClr val="tx1"/>
+                              </a:fontRef>
+                            </wps:style>
+                            <wps:bodyPr/>
+                          </wps:wsp>
+                        </a:graphicData>
+                      </a:graphic>
+                      <wp14:sizeRelH relativeFrom="margin">
+                        <wp14:pctWidth>0</wp14:pctWidth>
+                      </wp14:sizeRelH>
+                      <wp14:sizeRelV relativeFrom="margin">
+                        <wp14:pctHeight>0</wp14:pctHeight>
+                      </wp14:sizeRelV>
+                    </wp:anchor>
+                  </w:drawing>
+                </mc:Choice>
+                <mc:Fallback>
+                  <w:pict>
+                    <v:shape w14:anchorId="58A6C3E9" id="Straight Arrow Connector 6" o:spid="_x0000_s1026" type="#_x0000_t32" style="position:absolute;margin-left:63.75pt;margin-top:174.55pt;width:34.5pt;height:20.25pt;z-index:251826176;visibility:visible;mso-wrap-style:square;mso-width-percent:0;mso-height-percent:0;mso-wrap-distance-left:9pt;mso-wrap-distance-top:0;mso-wrap-distance-right:9pt;mso-wrap-distance-bottom:0;mso-position-horizontal:absolute;mso-position-horizontal-relative:text;mso-position-vertical:absolute;mso-position-vertical-relative:text;mso-width-percent:0;mso-height-percent:0;mso-width-relative:margin;mso-height-relative:margin" o:gfxdata="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" strokecolor="#e00" strokeweight="1.5pt">
+                      <v:stroke endarrow="block" joinstyle="miter"/>
+                    </v:shape>
+                  </w:pict>
+                </mc:Fallback>
+              </mc:AlternateContent>
+            </w:r>
+            <w:r>
+              <w:rPr>
+                <w:b/>
+                <w:bCs/>
+                <w:noProof/>
+                <w:sz w:val="18"/>
+                <w:szCs w:val="18"/>
+              </w:rPr>
+              <mc:AlternateContent>
+                <mc:Choice Requires="wps">
+                  <w:drawing>
+                    <wp:anchor distT="0" distB="0" distL="114300" distR="114300" simplePos="0" relativeHeight="251824128" behindDoc="0" locked="0" layoutInCell="1" allowOverlap="1" wp14:anchorId="79ED4F83" wp14:editId="70C49B6B">
+                      <wp:simplePos x="0" y="0"/>
+                      <wp:positionH relativeFrom="column">
+                        <wp:posOffset>771524</wp:posOffset>
+                      </wp:positionH>
+                      <wp:positionV relativeFrom="paragraph">
+                        <wp:posOffset>664209</wp:posOffset>
+                      </wp:positionV>
+                      <wp:extent cx="457200" cy="390525"/>
+                      <wp:effectExtent l="0" t="0" r="57150" b="47625"/>
+                      <wp:wrapNone/>
+                      <wp:docPr id="2056362348" name="Straight Arrow Connector 6"/>
+                      <wp:cNvGraphicFramePr/>
+                      <a:graphic xmlns:a="http://schemas.openxmlformats.org/drawingml/2006/main">
+                        <a:graphicData uri="http://schemas.microsoft.com/office/word/2010/wordprocessingShape">
+                          <wps:wsp>
+                            <wps:cNvCnPr/>
+                            <wps:spPr>
+                              <a:xfrm>
+                                <a:off x="0" y="0"/>
+                                <a:ext cx="457200" cy="390525"/>
+                              </a:xfrm>
+                              <a:prstGeom prst="straightConnector1">
+                                <a:avLst/>
+                              </a:prstGeom>
+                              <a:ln>
+                                <a:solidFill>
+                                  <a:srgbClr val="EE0000"/>
+                                </a:solidFill>
+                                <a:tailEnd type="triangle"/>
+                              </a:ln>
+                            </wps:spPr>
+                            <wps:style>
+                              <a:lnRef idx="2">
+                                <a:schemeClr val="accent1"/>
+                              </a:lnRef>
+                              <a:fillRef idx="0">
+                                <a:schemeClr val="accent1"/>
+                              </a:fillRef>
+                              <a:effectRef idx="1">
+                                <a:schemeClr val="accent1"/>
+                              </a:effectRef>
+                              <a:fontRef idx="minor">
+                                <a:schemeClr val="tx1"/>
+                              </a:fontRef>
+                            </wps:style>
+                            <wps:bodyPr/>
+                          </wps:wsp>
+                        </a:graphicData>
+                      </a:graphic>
+                      <wp14:sizeRelH relativeFrom="margin">
+                        <wp14:pctWidth>0</wp14:pctWidth>
+                      </wp14:sizeRelH>
+                      <wp14:sizeRelV relativeFrom="margin">
+                        <wp14:pctHeight>0</wp14:pctHeight>
+                      </wp14:sizeRelV>
+                    </wp:anchor>
+                  </w:drawing>
+                </mc:Choice>
+                <mc:Fallback>
+                  <w:pict>
+                    <v:shape w14:anchorId="1AFFFF3D" id="Straight Arrow Connector 6" o:spid="_x0000_s1026" type="#_x0000_t32" style="position:absolute;margin-left:60.75pt;margin-top:52.3pt;width:36pt;height:30.75pt;z-index:251824128;visibility:visible;mso-wrap-style:square;mso-width-percent:0;mso-height-percent:0;mso-wrap-distance-left:9pt;mso-wrap-distance-top:0;mso-wrap-distance-right:9pt;mso-wrap-distance-bottom:0;mso-position-horizontal:absolute;mso-position-horizontal-relative:text;mso-position-vertical:absolute;mso-position-vertical-relative:text;mso-width-percent:0;mso-height-percent:0;mso-width-relative:margin;mso-height-relative:margin" o:gfxdata="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" strokecolor="#e00" strokeweight="1.5pt">
+                      <v:stroke endarrow="block" joinstyle="miter"/>
+                    </v:shape>
+                  </w:pict>
+                </mc:Fallback>
+              </mc:AlternateContent>
+            </w:r>
+            <w:r>
+              <w:rPr>
+                <w:b/>
+                <w:bCs/>
+                <w:noProof/>
+                <w:sz w:val="18"/>
+                <w:szCs w:val="18"/>
+              </w:rPr>
+              <mc:AlternateContent>
+                <mc:Choice Requires="wps">
+                  <w:drawing>
+                    <wp:anchor distT="45720" distB="45720" distL="114300" distR="114300" simplePos="0" relativeHeight="251822080" behindDoc="0" locked="0" layoutInCell="1" allowOverlap="1" wp14:anchorId="6D9CFC0E" wp14:editId="364F94FF">
+                      <wp:simplePos x="0" y="0"/>
+                      <wp:positionH relativeFrom="column">
+                        <wp:posOffset>2924175</wp:posOffset>
+                      </wp:positionH>
+                      <wp:positionV relativeFrom="paragraph">
+                        <wp:posOffset>916940</wp:posOffset>
+                      </wp:positionV>
+                      <wp:extent cx="962025" cy="1119883"/>
+                      <wp:effectExtent l="0" t="0" r="0" b="4445"/>
+                      <wp:wrapNone/>
+                      <wp:docPr id="392798255" name="Text Box 2"/>
+                      <wp:cNvGraphicFramePr>
+                        <a:graphicFrameLocks xmlns:a="http://schemas.openxmlformats.org/drawingml/2006/main"/>
+                      </wp:cNvGraphicFramePr>
+                      <a:graphic xmlns:a="http://schemas.openxmlformats.org/drawingml/2006/main">
+                        <a:graphicData uri="http://schemas.microsoft.com/office/word/2010/wordprocessingShape">
+                          <wps:wsp>
+                            <wps:cNvSpPr txBox="1">
+                              <a:spLocks noChangeArrowheads="1"/>
+                            </wps:cNvSpPr>
+                            <wps:spPr bwMode="auto">
+                              <a:xfrm>
+                                <a:off x="0" y="0"/>
+                                <a:ext cx="962025" cy="1119883"/>
+                              </a:xfrm>
+                              <a:prstGeom prst="rect">
+                                <a:avLst/>
+                              </a:prstGeom>
+                              <a:noFill/>
+                              <a:ln w="9525">
+                                <a:noFill/>
+                                <a:miter lim="800000"/>
+                                <a:headEnd/>
+                                <a:tailEnd/>
+                              </a:ln>
+                            </wps:spPr>
+                            <wps:txbx>
+                              <w:txbxContent>
+                                <w:p>
+                                  <w:pPr>
+                                    <w:rPr>
+                                      <w:sz w:val="16"/>
+                                      <w:szCs w:val="16"/>
+                                      <w:lang w:val="en-GB"/>
+                                    </w:rPr>
+                                  </w:pPr>
+                                  <w:r>
+                                    <w:rPr>
+                                      <w:sz w:val="16"/>
+                                      <w:szCs w:val="16"/>
+                                      <w:lang w:val="en-GB"/>
+                                    </w:rPr>
+                                    <w:t>Attach new photo button</w:t>
+                                  </w:r>
+                                  <w:r>
+                                    <w:rPr>
+                                      <w:sz w:val="16"/>
+                                      <w:szCs w:val="16"/>
+                                      <w:lang w:val="en-GB"/>
+                                    </w:rPr>
+                                    <w:t xml:space="preserve"> </w:t>
+                                  </w:r>
+                                </w:p>
+                              </w:txbxContent>
+                            </wps:txbx>
+                            <wps:bodyPr rot="0" vert="horz" wrap="square" lIns="91440" tIns="45720" rIns="91440" bIns="45720" anchor="t" anchorCtr="0">
+                              <a:noAutofit/>
+                            </wps:bodyPr>
+                          </wps:wsp>
+                        </a:graphicData>
+                      </a:graphic>
+                      <wp14:sizeRelH relativeFrom="margin">
+                        <wp14:pctWidth>0</wp14:pctWidth>
+                      </wp14:sizeRelH>
+                      <wp14:sizeRelV relativeFrom="margin">
+                        <wp14:pctHeight>0</wp14:pctHeight>
+                      </wp14:sizeRelV>
+                    </wp:anchor>
+                  </w:drawing>
+                </mc:Choice>
+                <mc:Fallback>
+                  <w:pict>
+                    <v:shape w14:anchorId="6D9CFC0E" id="_x0000_s1062" type="#_x0000_t202" style="position:absolute;left:0;text-align:left;margin-left:230.25pt;margin-top:72.2pt;width:75.75pt;height:88.2pt;z-index:251822080;visibility:visible;mso-wrap-style:square;mso-width-percent:0;mso-height-percent:0;mso-wrap-distance-left:9pt;mso-wrap-distance-top:3.6pt;mso-wrap-distance-right:9pt;mso-wrap-distance-bottom:3.6pt;mso-position-horizontal:absolute;mso-position-horizontal-relative:text;mso-position-vertical:absolute;mso-position-vertical-relative:text;mso-width-percent:0;mso-height-percent:0;mso-width-relative:margin;mso-height-relative:margin;v-text-anchor:top" o:gfxdata="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" filled="f" stroked="f">
+                      <v:textbox>
+                        <w:txbxContent>
+                          <w:p>
+                            <w:pPr>
+                              <w:rPr>
+                                <w:sz w:val="16"/>
+                                <w:szCs w:val="16"/>
+                                <w:lang w:val="en-GB"/>
+                              </w:rPr>
+                            </w:pPr>
+                            <w:r>
+                              <w:rPr>
+                                <w:sz w:val="16"/>
+                                <w:szCs w:val="16"/>
+                                <w:lang w:val="en-GB"/>
+                              </w:rPr>
+                              <w:t>Attach new photo button</w:t>
+                            </w:r>
+                            <w:r>
+                              <w:rPr>
+                                <w:sz w:val="16"/>
+                                <w:szCs w:val="16"/>
+                                <w:lang w:val="en-GB"/>
+                              </w:rPr>
+                              <w:t xml:space="preserve"> </w:t>
+                            </w:r>
+                          </w:p>
+                        </w:txbxContent>
+                      </v:textbox>
+                    </v:shape>
+                  </w:pict>
+                </mc:Fallback>
+              </mc:AlternateContent>
+            </w:r>
+            <w:r>
+              <w:rPr>
+                <w:b/>
+                <w:bCs/>
+                <w:noProof/>
+                <w:sz w:val="18"/>
+                <w:szCs w:val="18"/>
+              </w:rPr>
+              <mc:AlternateContent>
+                <mc:Choice Requires="wps">
+                  <w:drawing>
+                    <wp:anchor distT="45720" distB="45720" distL="114300" distR="114300" simplePos="0" relativeHeight="251820032" behindDoc="0" locked="0" layoutInCell="1" allowOverlap="1" wp14:anchorId="68253186" wp14:editId="78E53F90">
+                      <wp:simplePos x="0" y="0"/>
+                      <wp:positionH relativeFrom="column">
+                        <wp:posOffset>-47625</wp:posOffset>
+                      </wp:positionH>
+                      <wp:positionV relativeFrom="paragraph">
+                        <wp:posOffset>2059305</wp:posOffset>
+                      </wp:positionV>
+                      <wp:extent cx="962025" cy="1119883"/>
+                      <wp:effectExtent l="0" t="0" r="0" b="4445"/>
+                      <wp:wrapNone/>
+                      <wp:docPr id="2109050907" name="Text Box 2"/>
+                      <wp:cNvGraphicFramePr>
+                        <a:graphicFrameLocks xmlns:a="http://schemas.openxmlformats.org/drawingml/2006/main"/>
+                      </wp:cNvGraphicFramePr>
+                      <a:graphic xmlns:a="http://schemas.openxmlformats.org/drawingml/2006/main">
+                        <a:graphicData uri="http://schemas.microsoft.com/office/word/2010/wordprocessingShape">
+                          <wps:wsp>
+                            <wps:cNvSpPr txBox="1">
+                              <a:spLocks noChangeArrowheads="1"/>
+                            </wps:cNvSpPr>
+                            <wps:spPr bwMode="auto">
+                              <a:xfrm>
+                                <a:off x="0" y="0"/>
+                                <a:ext cx="962025" cy="1119883"/>
+                              </a:xfrm>
+                              <a:prstGeom prst="rect">
+                                <a:avLst/>
+                              </a:prstGeom>
+                              <a:noFill/>
+                              <a:ln w="9525">
+                                <a:noFill/>
+                                <a:miter lim="800000"/>
+                                <a:headEnd/>
+                                <a:tailEnd/>
+                              </a:ln>
+                            </wps:spPr>
+                            <wps:txbx>
+                              <w:txbxContent>
+                                <w:p>
+                                  <w:pPr>
+                                    <w:rPr>
+                                      <w:sz w:val="16"/>
+                                      <w:szCs w:val="16"/>
+                                      <w:lang w:val="en-GB"/>
+                                    </w:rPr>
+                                  </w:pPr>
+                                  <w:r>
+                                    <w:rPr>
+                                      <w:sz w:val="16"/>
+                                      <w:szCs w:val="16"/>
+                                      <w:lang w:val="en-GB"/>
+                                    </w:rPr>
+                                    <w:t>Preview area for attached photos</w:t>
+                                  </w:r>
+                                  <w:r>
+                                    <w:rPr>
+                                      <w:sz w:val="16"/>
+                                      <w:szCs w:val="16"/>
+                                      <w:lang w:val="en-GB"/>
+                                    </w:rPr>
+                                    <w:t xml:space="preserve"> </w:t>
+                                  </w:r>
+                                </w:p>
+                              </w:txbxContent>
+                            </wps:txbx>
+                            <wps:bodyPr rot="0" vert="horz" wrap="square" lIns="91440" tIns="45720" rIns="91440" bIns="45720" anchor="t" anchorCtr="0">
+                              <a:noAutofit/>
+                            </wps:bodyPr>
+                          </wps:wsp>
+                        </a:graphicData>
+                      </a:graphic>
+                      <wp14:sizeRelH relativeFrom="margin">
+                        <wp14:pctWidth>0</wp14:pctWidth>
+                      </wp14:sizeRelH>
+                      <wp14:sizeRelV relativeFrom="margin">
+                        <wp14:pctHeight>0</wp14:pctHeight>
+                      </wp14:sizeRelV>
+                    </wp:anchor>
+                  </w:drawing>
+                </mc:Choice>
+                <mc:Fallback>
+                  <w:pict>
+                    <v:shape w14:anchorId="68253186" id="_x0000_s1063" type="#_x0000_t202" style="position:absolute;left:0;text-align:left;margin-left:-3.75pt;margin-top:162.15pt;width:75.75pt;height:88.2pt;z-index:251820032;visibility:visible;mso-wrap-style:square;mso-width-percent:0;mso-height-percent:0;mso-wrap-distance-left:9pt;mso-wrap-distance-top:3.6pt;mso-wrap-distance-right:9pt;mso-wrap-distance-bottom:3.6pt;mso-position-horizontal:absolute;mso-position-horizontal-relative:text;mso-position-vertical:absolute;mso-position-vertical-relative:text;mso-width-percent:0;mso-height-percent:0;mso-width-relative:margin;mso-height-relative:margin;v-text-anchor:top" o:gfxdata="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" filled="f" stroked="f">
+                      <v:textbox>
+                        <w:txbxContent>
+                          <w:p>
+                            <w:pPr>
+                              <w:rPr>
+                                <w:sz w:val="16"/>
+                                <w:szCs w:val="16"/>
+                                <w:lang w:val="en-GB"/>
+                              </w:rPr>
+                            </w:pPr>
+                            <w:r>
+                              <w:rPr>
+                                <w:sz w:val="16"/>
+                                <w:szCs w:val="16"/>
+                                <w:lang w:val="en-GB"/>
+                              </w:rPr>
+                              <w:t>Preview area for attached photos</w:t>
+                            </w:r>
+                            <w:r>
+                              <w:rPr>
+                                <w:sz w:val="16"/>
+                                <w:szCs w:val="16"/>
+                                <w:lang w:val="en-GB"/>
+                              </w:rPr>
+                              <w:t xml:space="preserve"> </w:t>
+                            </w:r>
+                          </w:p>
+                        </w:txbxContent>
+                      </v:textbox>
+                    </v:shape>
+                  </w:pict>
+                </mc:Fallback>
+              </mc:AlternateContent>
+            </w:r>
+            <w:r>
+              <w:rPr>
+                <w:b/>
+                <w:bCs/>
+                <w:noProof/>
+                <w:sz w:val="18"/>
+                <w:szCs w:val="18"/>
+              </w:rPr>
+              <mc:AlternateContent>
+                <mc:Choice Requires="wps">
+                  <w:drawing>
+                    <wp:anchor distT="45720" distB="45720" distL="114300" distR="114300" simplePos="0" relativeHeight="251817984" behindDoc="0" locked="0" layoutInCell="1" allowOverlap="1" wp14:anchorId="267092E2" wp14:editId="0BE99232">
+                      <wp:simplePos x="0" y="0"/>
+                      <wp:positionH relativeFrom="column">
+                        <wp:posOffset>0</wp:posOffset>
+                      </wp:positionH>
+                      <wp:positionV relativeFrom="paragraph">
+                        <wp:posOffset>316865</wp:posOffset>
+                      </wp:positionV>
+                      <wp:extent cx="962025" cy="1119883"/>
+                      <wp:effectExtent l="0" t="0" r="0" b="4445"/>
+                      <wp:wrapNone/>
+                      <wp:docPr id="301613736" name="Text Box 2"/>
+                      <wp:cNvGraphicFramePr>
+                        <a:graphicFrameLocks xmlns:a="http://schemas.openxmlformats.org/drawingml/2006/main"/>
+                      </wp:cNvGraphicFramePr>
+                      <a:graphic xmlns:a="http://schemas.openxmlformats.org/drawingml/2006/main">
+                        <a:graphicData uri="http://schemas.microsoft.com/office/word/2010/wordprocessingShape">
+                          <wps:wsp>
+                            <wps:cNvSpPr txBox="1">
+                              <a:spLocks noChangeArrowheads="1"/>
+                            </wps:cNvSpPr>
+                            <wps:spPr bwMode="auto">
+                              <a:xfrm>
+                                <a:off x="0" y="0"/>
+                                <a:ext cx="962025" cy="1119883"/>
+                              </a:xfrm>
+                              <a:prstGeom prst="rect">
+                                <a:avLst/>
+                              </a:prstGeom>
+                              <a:noFill/>
+                              <a:ln w="9525">
+                                <a:noFill/>
+                                <a:miter lim="800000"/>
+                                <a:headEnd/>
+                                <a:tailEnd/>
+                              </a:ln>
+                            </wps:spPr>
+                            <wps:txbx>
+                              <w:txbxContent>
+                                <w:p>
+                                  <w:pPr>
+                                    <w:rPr>
+                                      <w:sz w:val="16"/>
+                                      <w:szCs w:val="16"/>
+                                      <w:lang w:val="en-GB"/>
+                                    </w:rPr>
+                                  </w:pPr>
+                                  <w:r>
+                                    <w:rPr>
+                                      <w:sz w:val="16"/>
+                                      <w:szCs w:val="16"/>
+                                      <w:lang w:val="en-GB"/>
+                                    </w:rPr>
+                                    <w:t>Fields for report submission details</w:t>
+                                  </w:r>
+                                  <w:r>
+                                    <w:rPr>
+                                      <w:sz w:val="16"/>
+                                      <w:szCs w:val="16"/>
+                                      <w:lang w:val="en-GB"/>
+                                    </w:rPr>
+                                    <w:t xml:space="preserve"> </w:t>
+                                  </w:r>
+                                </w:p>
+                              </w:txbxContent>
+                            </wps:txbx>
+                            <wps:bodyPr rot="0" vert="horz" wrap="square" lIns="91440" tIns="45720" rIns="91440" bIns="45720" anchor="t" anchorCtr="0">
+                              <a:noAutofit/>
+                            </wps:bodyPr>
+                          </wps:wsp>
+                        </a:graphicData>
+                      </a:graphic>
+                      <wp14:sizeRelH relativeFrom="margin">
+                        <wp14:pctWidth>0</wp14:pctWidth>
+                      </wp14:sizeRelH>
+                      <wp14:sizeRelV relativeFrom="margin">
+                        <wp14:pctHeight>0</wp14:pctHeight>
+                      </wp14:sizeRelV>
+                    </wp:anchor>
+                  </w:drawing>
+                </mc:Choice>
+                <mc:Fallback>
+                  <w:pict>
+                    <v:shape w14:anchorId="267092E2" id="_x0000_s1064" type="#_x0000_t202" style="position:absolute;left:0;text-align:left;margin-left:0;margin-top:24.95pt;width:75.75pt;height:88.2pt;z-index:251817984;visibility:visible;mso-wrap-style:square;mso-width-percent:0;mso-height-percent:0;mso-wrap-distance-left:9pt;mso-wrap-distance-top:3.6pt;mso-wrap-distance-right:9pt;mso-wrap-distance-bottom:3.6pt;mso-position-horizontal:absolute;mso-position-horizontal-relative:text;mso-position-vertical:absolute;mso-position-vertical-relative:text;mso-width-percent:0;mso-height-percent:0;mso-width-relative:margin;mso-height-relative:margin;v-text-anchor:top" o:gfxdata="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" filled="f" stroked="f">
+                      <v:textbox>
+                        <w:txbxContent>
+                          <w:p>
+                            <w:pPr>
+                              <w:rPr>
+                                <w:sz w:val="16"/>
+                                <w:szCs w:val="16"/>
+                                <w:lang w:val="en-GB"/>
+                              </w:rPr>
+                            </w:pPr>
+                            <w:r>
+                              <w:rPr>
+                                <w:sz w:val="16"/>
+                                <w:szCs w:val="16"/>
+                                <w:lang w:val="en-GB"/>
+                              </w:rPr>
+                              <w:t>Fields for report submission details</w:t>
+                            </w:r>
+                            <w:r>
+                              <w:rPr>
+                                <w:sz w:val="16"/>
+                                <w:szCs w:val="16"/>
+                                <w:lang w:val="en-GB"/>
+                              </w:rPr>
+                              <w:t xml:space="preserve"> </w:t>
+                            </w:r>
+                          </w:p>
+                        </w:txbxContent>
+                      </v:textbox>
+                    </v:shape>
+                  </w:pict>
+                </mc:Fallback>
+              </mc:AlternateContent>
+            </w:r>
+            <w:r>
+              <w:rPr>
+                <w:noProof/>
+                <w:sz w:val="18"/>
+                <w:szCs w:val="18"/>
+              </w:rPr>
+              <w:drawing>
+                <wp:inline distT="0" distB="0" distL="0" distR="0" wp14:anchorId="03512704" wp14:editId="3092462E">
+                  <wp:extent cx="1792010" cy="3185795"/>
+                  <wp:effectExtent l="0" t="0" r="0" b="0"/>
+                  <wp:docPr id="1121456413" name="Picture 72"/>
+                  <wp:cNvGraphicFramePr>
+                    <a:graphicFrameLocks xmlns:a="http://schemas.openxmlformats.org/drawingml/2006/main" noChangeAspect="1"/>
+                  </wp:cNvGraphicFramePr>
+                  <a:graphic xmlns:a="http://schemas.openxmlformats.org/drawingml/2006/main">
+                    <a:graphicData uri="http://schemas.openxmlformats.org/drawingml/2006/picture">
+                      <pic:pic xmlns:pic="http://schemas.openxmlformats.org/drawingml/2006/picture">
+                        <pic:nvPicPr>
+                          <pic:cNvPr id="0" name="Picture 6"/>
+                          <pic:cNvPicPr>
+                            <a:picLocks noChangeAspect="1" noChangeArrowheads="1"/>
+                          </pic:cNvPicPr>
+                        </pic:nvPicPr>
+                        <pic:blipFill>
+                          <a:blip r:embed="rId16" cstate="print">
+                            <a:extLst>
+                              <a:ext uri="{28A0092B-C50C-407E-A947-70E740481C1C}">
+                                <a14:useLocalDpi xmlns:a14="http://schemas.microsoft.com/office/drawing/2010/main" val="0"/>
+                              </a:ext>
+                            </a:extLst>
+                          </a:blip>
+                          <a:srcRect/>
+                          <a:stretch>
+                            <a:fillRect/>
+                          </a:stretch>
+                        </pic:blipFill>
+                        <pic:spPr bwMode="auto">
+                          <a:xfrm>
+                            <a:off x="0" y="0"/>
+                            <a:ext cx="1798969" cy="3198167"/>
+                          </a:xfrm>
+                          <a:prstGeom prst="rect">
+                            <a:avLst/>
+                          </a:prstGeom>
+                          <a:noFill/>
+                          <a:ln>
+                            <a:noFill/>
+                          </a:ln>
+                        </pic:spPr>
+                      </pic:pic>
+                    </a:graphicData>
+                  </a:graphic>
+                </wp:inline>
+              </w:drawing>
+            </w:r>
           </w:p>
         </w:tc>
       </w:tr>
@@ -8258,6 +9750,768 @@
                 <w:szCs w:val="18"/>
               </w:rPr>
             </w:pPr>
+            <w:r>
+              <w:rPr>
+                <w:b/>
+                <w:bCs/>
+                <w:sz w:val="18"/>
+                <w:szCs w:val="18"/>
+              </w:rPr>
+              <w:t>User Story 2</w:t>
+            </w:r>
+            <w:r>
+              <w:rPr>
+                <w:b/>
+                <w:bCs/>
+                <w:sz w:val="18"/>
+                <w:szCs w:val="18"/>
+              </w:rPr>
+              <w:t>5</w:t>
+            </w:r>
+            <w:r>
+              <w:rPr>
+                <w:sz w:val="18"/>
+                <w:szCs w:val="18"/>
+              </w:rPr>
+              <w:t xml:space="preserve"> </w:t>
+            </w:r>
+            <w:r>
+              <w:rPr>
+                <w:sz w:val="18"/>
+                <w:szCs w:val="18"/>
+              </w:rPr>
+              <w:t>- As</w:t>
+            </w:r>
+            <w:r>
+              <w:rPr>
+                <w:sz w:val="18"/>
+                <w:szCs w:val="18"/>
+              </w:rPr>
+              <w:t xml:space="preserve"> a police officer, I want to add internal notes to a report so that I can record investigative observations without them being visible to the public.</w:t>
+            </w:r>
+          </w:p>
+          <w:p>
+            <w:pPr>
+              <w:ind w:left="144" w:right="144"/>
+              <w:rPr>
+                <w:sz w:val="18"/>
+                <w:szCs w:val="18"/>
+              </w:rPr>
+            </w:pPr>
+            <w:r>
+              <w:rPr>
+                <w:b/>
+                <w:bCs/>
+                <w:sz w:val="18"/>
+                <w:szCs w:val="18"/>
+              </w:rPr>
+              <w:t>Author</w:t>
+            </w:r>
+            <w:r>
+              <w:rPr>
+                <w:sz w:val="18"/>
+                <w:szCs w:val="18"/>
+              </w:rPr>
+              <w:t>: Mitchell</w:t>
+            </w:r>
+          </w:p>
+          <w:p>
+            <w:pPr>
+              <w:ind w:left="144" w:right="144"/>
+              <w:rPr>
+                <w:sz w:val="18"/>
+                <w:szCs w:val="18"/>
+              </w:rPr>
+            </w:pPr>
+          </w:p>
+          <w:p>
+            <w:pPr>
+              <w:ind w:left="144" w:right="144"/>
+              <w:jc w:val="center"/>
+              <w:rPr>
+                <w:sz w:val="18"/>
+                <w:szCs w:val="18"/>
+              </w:rPr>
+            </w:pPr>
+            <w:r>
+              <w:rPr>
+                <w:b/>
+                <w:bCs/>
+                <w:noProof/>
+                <w:sz w:val="18"/>
+                <w:szCs w:val="18"/>
+              </w:rPr>
+              <mc:AlternateContent>
+                <mc:Choice Requires="wps">
+                  <w:drawing>
+                    <wp:anchor distT="0" distB="0" distL="114300" distR="114300" simplePos="0" relativeHeight="251815936" behindDoc="0" locked="0" layoutInCell="1" allowOverlap="1" wp14:anchorId="1C8167D4" wp14:editId="72CD5166">
+                      <wp:simplePos x="0" y="0"/>
+                      <wp:positionH relativeFrom="column">
+                        <wp:posOffset>876299</wp:posOffset>
+                      </wp:positionH>
+                      <wp:positionV relativeFrom="paragraph">
+                        <wp:posOffset>2407285</wp:posOffset>
+                      </wp:positionV>
+                      <wp:extent cx="352425" cy="314325"/>
+                      <wp:effectExtent l="0" t="38100" r="47625" b="28575"/>
+                      <wp:wrapNone/>
+                      <wp:docPr id="1404090895" name="Straight Arrow Connector 6"/>
+                      <wp:cNvGraphicFramePr/>
+                      <a:graphic xmlns:a="http://schemas.openxmlformats.org/drawingml/2006/main">
+                        <a:graphicData uri="http://schemas.microsoft.com/office/word/2010/wordprocessingShape">
+                          <wps:wsp>
+                            <wps:cNvCnPr/>
+                            <wps:spPr>
+                              <a:xfrm flipV="1">
+                                <a:off x="0" y="0"/>
+                                <a:ext cx="352425" cy="314325"/>
+                              </a:xfrm>
+                              <a:prstGeom prst="straightConnector1">
+                                <a:avLst/>
+                              </a:prstGeom>
+                              <a:ln>
+                                <a:solidFill>
+                                  <a:srgbClr val="EE0000"/>
+                                </a:solidFill>
+                                <a:tailEnd type="triangle"/>
+                              </a:ln>
+                            </wps:spPr>
+                            <wps:style>
+                              <a:lnRef idx="2">
+                                <a:schemeClr val="accent1"/>
+                              </a:lnRef>
+                              <a:fillRef idx="0">
+                                <a:schemeClr val="accent1"/>
+                              </a:fillRef>
+                              <a:effectRef idx="1">
+                                <a:schemeClr val="accent1"/>
+                              </a:effectRef>
+                              <a:fontRef idx="minor">
+                                <a:schemeClr val="tx1"/>
+                              </a:fontRef>
+                            </wps:style>
+                            <wps:bodyPr/>
+                          </wps:wsp>
+                        </a:graphicData>
+                      </a:graphic>
+                      <wp14:sizeRelH relativeFrom="margin">
+                        <wp14:pctWidth>0</wp14:pctWidth>
+                      </wp14:sizeRelH>
+                      <wp14:sizeRelV relativeFrom="margin">
+                        <wp14:pctHeight>0</wp14:pctHeight>
+                      </wp14:sizeRelV>
+                    </wp:anchor>
+                  </w:drawing>
+                </mc:Choice>
+                <mc:Fallback>
+                  <w:pict>
+                    <v:shape w14:anchorId="6A4B8596" id="Straight Arrow Connector 6" o:spid="_x0000_s1026" type="#_x0000_t32" style="position:absolute;margin-left:69pt;margin-top:189.55pt;width:27.75pt;height:24.75pt;flip:y;z-index:251815936;visibility:visible;mso-wrap-style:square;mso-width-percent:0;mso-height-percent:0;mso-wrap-distance-left:9pt;mso-wrap-distance-top:0;mso-wrap-distance-right:9pt;mso-wrap-distance-bottom:0;mso-position-horizontal:absolute;mso-position-horizontal-relative:text;mso-position-vertical:absolute;mso-position-vertical-relative:text;mso-width-percent:0;mso-height-percent:0;mso-width-relative:margin;mso-height-relative:margin" o:gfxdata="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" strokecolor="#e00" strokeweight="1.5pt">
+                      <v:stroke endarrow="block" joinstyle="miter"/>
+                    </v:shape>
+                  </w:pict>
+                </mc:Fallback>
+              </mc:AlternateContent>
+            </w:r>
+            <w:r>
+              <w:rPr>
+                <w:b/>
+                <w:bCs/>
+                <w:noProof/>
+                <w:sz w:val="18"/>
+                <w:szCs w:val="18"/>
+              </w:rPr>
+              <mc:AlternateContent>
+                <mc:Choice Requires="wps">
+                  <w:drawing>
+                    <wp:anchor distT="0" distB="0" distL="114300" distR="114300" simplePos="0" relativeHeight="251813888" behindDoc="0" locked="0" layoutInCell="1" allowOverlap="1" wp14:anchorId="1281768A" wp14:editId="742AC0D3">
+                      <wp:simplePos x="0" y="0"/>
+                      <wp:positionH relativeFrom="column">
+                        <wp:posOffset>2657475</wp:posOffset>
+                      </wp:positionH>
+                      <wp:positionV relativeFrom="paragraph">
+                        <wp:posOffset>1702435</wp:posOffset>
+                      </wp:positionV>
+                      <wp:extent cx="304800" cy="476250"/>
+                      <wp:effectExtent l="38100" t="0" r="19050" b="57150"/>
+                      <wp:wrapNone/>
+                      <wp:docPr id="982992939" name="Straight Arrow Connector 6"/>
+                      <wp:cNvGraphicFramePr/>
+                      <a:graphic xmlns:a="http://schemas.openxmlformats.org/drawingml/2006/main">
+                        <a:graphicData uri="http://schemas.microsoft.com/office/word/2010/wordprocessingShape">
+                          <wps:wsp>
+                            <wps:cNvCnPr/>
+                            <wps:spPr>
+                              <a:xfrm flipH="1">
+                                <a:off x="0" y="0"/>
+                                <a:ext cx="304800" cy="476250"/>
+                              </a:xfrm>
+                              <a:prstGeom prst="straightConnector1">
+                                <a:avLst/>
+                              </a:prstGeom>
+                              <a:ln>
+                                <a:solidFill>
+                                  <a:srgbClr val="EE0000"/>
+                                </a:solidFill>
+                                <a:tailEnd type="triangle"/>
+                              </a:ln>
+                            </wps:spPr>
+                            <wps:style>
+                              <a:lnRef idx="2">
+                                <a:schemeClr val="accent1"/>
+                              </a:lnRef>
+                              <a:fillRef idx="0">
+                                <a:schemeClr val="accent1"/>
+                              </a:fillRef>
+                              <a:effectRef idx="1">
+                                <a:schemeClr val="accent1"/>
+                              </a:effectRef>
+                              <a:fontRef idx="minor">
+                                <a:schemeClr val="tx1"/>
+                              </a:fontRef>
+                            </wps:style>
+                            <wps:bodyPr/>
+                          </wps:wsp>
+                        </a:graphicData>
+                      </a:graphic>
+                      <wp14:sizeRelH relativeFrom="margin">
+                        <wp14:pctWidth>0</wp14:pctWidth>
+                      </wp14:sizeRelH>
+                      <wp14:sizeRelV relativeFrom="margin">
+                        <wp14:pctHeight>0</wp14:pctHeight>
+                      </wp14:sizeRelV>
+                    </wp:anchor>
+                  </w:drawing>
+                </mc:Choice>
+                <mc:Fallback>
+                  <w:pict>
+                    <v:shape w14:anchorId="363F57B2" id="Straight Arrow Connector 6" o:spid="_x0000_s1026" type="#_x0000_t32" style="position:absolute;margin-left:209.25pt;margin-top:134.05pt;width:24pt;height:37.5pt;flip:x;z-index:251813888;visibility:visible;mso-wrap-style:square;mso-width-percent:0;mso-height-percent:0;mso-wrap-distance-left:9pt;mso-wrap-distance-top:0;mso-wrap-distance-right:9pt;mso-wrap-distance-bottom:0;mso-position-horizontal:absolute;mso-position-horizontal-relative:text;mso-position-vertical:absolute;mso-position-vertical-relative:text;mso-width-percent:0;mso-height-percent:0;mso-width-relative:margin;mso-height-relative:margin" o:gfxdata="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" strokecolor="#e00" strokeweight="1.5pt">
+                      <v:stroke endarrow="block" joinstyle="miter"/>
+                    </v:shape>
+                  </w:pict>
+                </mc:Fallback>
+              </mc:AlternateContent>
+            </w:r>
+            <w:r>
+              <w:rPr>
+                <w:b/>
+                <w:bCs/>
+                <w:noProof/>
+                <w:sz w:val="18"/>
+                <w:szCs w:val="18"/>
+              </w:rPr>
+              <mc:AlternateContent>
+                <mc:Choice Requires="wps">
+                  <w:drawing>
+                    <wp:anchor distT="0" distB="0" distL="114300" distR="114300" simplePos="0" relativeHeight="251811840" behindDoc="0" locked="0" layoutInCell="1" allowOverlap="1" wp14:anchorId="10530107" wp14:editId="5C5990E6">
+                      <wp:simplePos x="0" y="0"/>
+                      <wp:positionH relativeFrom="column">
+                        <wp:posOffset>838200</wp:posOffset>
+                      </wp:positionH>
+                      <wp:positionV relativeFrom="paragraph">
+                        <wp:posOffset>530860</wp:posOffset>
+                      </wp:positionV>
+                      <wp:extent cx="323850" cy="419100"/>
+                      <wp:effectExtent l="0" t="38100" r="57150" b="19050"/>
+                      <wp:wrapNone/>
+                      <wp:docPr id="572238179" name="Straight Arrow Connector 6"/>
+                      <wp:cNvGraphicFramePr/>
+                      <a:graphic xmlns:a="http://schemas.openxmlformats.org/drawingml/2006/main">
+                        <a:graphicData uri="http://schemas.microsoft.com/office/word/2010/wordprocessingShape">
+                          <wps:wsp>
+                            <wps:cNvCnPr/>
+                            <wps:spPr>
+                              <a:xfrm flipV="1">
+                                <a:off x="0" y="0"/>
+                                <a:ext cx="323850" cy="419100"/>
+                              </a:xfrm>
+                              <a:prstGeom prst="straightConnector1">
+                                <a:avLst/>
+                              </a:prstGeom>
+                              <a:ln>
+                                <a:solidFill>
+                                  <a:srgbClr val="EE0000"/>
+                                </a:solidFill>
+                                <a:tailEnd type="triangle"/>
+                              </a:ln>
+                            </wps:spPr>
+                            <wps:style>
+                              <a:lnRef idx="2">
+                                <a:schemeClr val="accent1"/>
+                              </a:lnRef>
+                              <a:fillRef idx="0">
+                                <a:schemeClr val="accent1"/>
+                              </a:fillRef>
+                              <a:effectRef idx="1">
+                                <a:schemeClr val="accent1"/>
+                              </a:effectRef>
+                              <a:fontRef idx="minor">
+                                <a:schemeClr val="tx1"/>
+                              </a:fontRef>
+                            </wps:style>
+                            <wps:bodyPr/>
+                          </wps:wsp>
+                        </a:graphicData>
+                      </a:graphic>
+                      <wp14:sizeRelH relativeFrom="margin">
+                        <wp14:pctWidth>0</wp14:pctWidth>
+                      </wp14:sizeRelH>
+                      <wp14:sizeRelV relativeFrom="margin">
+                        <wp14:pctHeight>0</wp14:pctHeight>
+                      </wp14:sizeRelV>
+                    </wp:anchor>
+                  </w:drawing>
+                </mc:Choice>
+                <mc:Fallback>
+                  <w:pict>
+                    <v:shape w14:anchorId="7A525120" id="Straight Arrow Connector 6" o:spid="_x0000_s1026" type="#_x0000_t32" style="position:absolute;margin-left:66pt;margin-top:41.8pt;width:25.5pt;height:33pt;flip:y;z-index:251811840;visibility:visible;mso-wrap-style:square;mso-width-percent:0;mso-height-percent:0;mso-wrap-distance-left:9pt;mso-wrap-distance-top:0;mso-wrap-distance-right:9pt;mso-wrap-distance-bottom:0;mso-position-horizontal:absolute;mso-position-horizontal-relative:text;mso-position-vertical:absolute;mso-position-vertical-relative:text;mso-width-percent:0;mso-height-percent:0;mso-width-relative:margin;mso-height-relative:margin" o:gfxdata="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" strokecolor="#e00" strokeweight="1.5pt">
+                      <v:stroke endarrow="block" joinstyle="miter"/>
+                    </v:shape>
+                  </w:pict>
+                </mc:Fallback>
+              </mc:AlternateContent>
+            </w:r>
+            <w:r>
+              <w:rPr>
+                <w:b/>
+                <w:bCs/>
+                <w:noProof/>
+                <w:sz w:val="18"/>
+                <w:szCs w:val="18"/>
+              </w:rPr>
+              <mc:AlternateContent>
+                <mc:Choice Requires="wps">
+                  <w:drawing>
+                    <wp:anchor distT="45720" distB="45720" distL="114300" distR="114300" simplePos="0" relativeHeight="251809792" behindDoc="0" locked="0" layoutInCell="1" allowOverlap="1" wp14:anchorId="750425CB" wp14:editId="4EF1B4BF">
+                      <wp:simplePos x="0" y="0"/>
+                      <wp:positionH relativeFrom="column">
+                        <wp:posOffset>2943225</wp:posOffset>
+                      </wp:positionH>
+                      <wp:positionV relativeFrom="paragraph">
+                        <wp:posOffset>1497965</wp:posOffset>
+                      </wp:positionV>
+                      <wp:extent cx="962025" cy="1119883"/>
+                      <wp:effectExtent l="0" t="0" r="0" b="4445"/>
+                      <wp:wrapNone/>
+                      <wp:docPr id="1964709125" name="Text Box 2"/>
+                      <wp:cNvGraphicFramePr>
+                        <a:graphicFrameLocks xmlns:a="http://schemas.openxmlformats.org/drawingml/2006/main"/>
+                      </wp:cNvGraphicFramePr>
+                      <a:graphic xmlns:a="http://schemas.openxmlformats.org/drawingml/2006/main">
+                        <a:graphicData uri="http://schemas.microsoft.com/office/word/2010/wordprocessingShape">
+                          <wps:wsp>
+                            <wps:cNvSpPr txBox="1">
+                              <a:spLocks noChangeArrowheads="1"/>
+                            </wps:cNvSpPr>
+                            <wps:spPr bwMode="auto">
+                              <a:xfrm>
+                                <a:off x="0" y="0"/>
+                                <a:ext cx="962025" cy="1119883"/>
+                              </a:xfrm>
+                              <a:prstGeom prst="rect">
+                                <a:avLst/>
+                              </a:prstGeom>
+                              <a:noFill/>
+                              <a:ln w="9525">
+                                <a:noFill/>
+                                <a:miter lim="800000"/>
+                                <a:headEnd/>
+                                <a:tailEnd/>
+                              </a:ln>
+                            </wps:spPr>
+                            <wps:txbx>
+                              <w:txbxContent>
+                                <w:p>
+                                  <w:pPr>
+                                    <w:rPr>
+                                      <w:sz w:val="16"/>
+                                      <w:szCs w:val="16"/>
+                                      <w:lang w:val="en-GB"/>
+                                    </w:rPr>
+                                  </w:pPr>
+                                  <w:r>
+                                    <w:rPr>
+                                      <w:sz w:val="16"/>
+                                      <w:szCs w:val="16"/>
+                                      <w:lang w:val="en-GB"/>
+                                    </w:rPr>
+                                    <w:t>Button to add additional officer notes to report</w:t>
+                                  </w:r>
+                                  <w:r>
+                                    <w:rPr>
+                                      <w:sz w:val="16"/>
+                                      <w:szCs w:val="16"/>
+                                      <w:lang w:val="en-GB"/>
+                                    </w:rPr>
+                                    <w:t xml:space="preserve"> </w:t>
+                                  </w:r>
+                                </w:p>
+                              </w:txbxContent>
+                            </wps:txbx>
+                            <wps:bodyPr rot="0" vert="horz" wrap="square" lIns="91440" tIns="45720" rIns="91440" bIns="45720" anchor="t" anchorCtr="0">
+                              <a:noAutofit/>
+                            </wps:bodyPr>
+                          </wps:wsp>
+                        </a:graphicData>
+                      </a:graphic>
+                      <wp14:sizeRelH relativeFrom="margin">
+                        <wp14:pctWidth>0</wp14:pctWidth>
+                      </wp14:sizeRelH>
+                      <wp14:sizeRelV relativeFrom="margin">
+                        <wp14:pctHeight>0</wp14:pctHeight>
+                      </wp14:sizeRelV>
+                    </wp:anchor>
+                  </w:drawing>
+                </mc:Choice>
+                <mc:Fallback>
+                  <w:pict>
+                    <v:shape w14:anchorId="750425CB" id="_x0000_s1065" type="#_x0000_t202" style="position:absolute;left:0;text-align:left;margin-left:231.75pt;margin-top:117.95pt;width:75.75pt;height:88.2pt;z-index:251809792;visibility:visible;mso-wrap-style:square;mso-width-percent:0;mso-height-percent:0;mso-wrap-distance-left:9pt;mso-wrap-distance-top:3.6pt;mso-wrap-distance-right:9pt;mso-wrap-distance-bottom:3.6pt;mso-position-horizontal:absolute;mso-position-horizontal-relative:text;mso-position-vertical:absolute;mso-position-vertical-relative:text;mso-width-percent:0;mso-height-percent:0;mso-width-relative:margin;mso-height-relative:margin;v-text-anchor:top" o:gfxdata="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" filled="f" stroked="f">
+                      <v:textbox>
+                        <w:txbxContent>
+                          <w:p>
+                            <w:pPr>
+                              <w:rPr>
+                                <w:sz w:val="16"/>
+                                <w:szCs w:val="16"/>
+                                <w:lang w:val="en-GB"/>
+                              </w:rPr>
+                            </w:pPr>
+                            <w:r>
+                              <w:rPr>
+                                <w:sz w:val="16"/>
+                                <w:szCs w:val="16"/>
+                                <w:lang w:val="en-GB"/>
+                              </w:rPr>
+                              <w:t>Button to add additional officer notes to report</w:t>
+                            </w:r>
+                            <w:r>
+                              <w:rPr>
+                                <w:sz w:val="16"/>
+                                <w:szCs w:val="16"/>
+                                <w:lang w:val="en-GB"/>
+                              </w:rPr>
+                              <w:t xml:space="preserve"> </w:t>
+                            </w:r>
+                          </w:p>
+                        </w:txbxContent>
+                      </v:textbox>
+                    </v:shape>
+                  </w:pict>
+                </mc:Fallback>
+              </mc:AlternateContent>
+            </w:r>
+            <w:r>
+              <w:rPr>
+                <w:b/>
+                <w:bCs/>
+                <w:noProof/>
+                <w:sz w:val="18"/>
+                <w:szCs w:val="18"/>
+              </w:rPr>
+              <mc:AlternateContent>
+                <mc:Choice Requires="wps">
+                  <w:drawing>
+                    <wp:anchor distT="45720" distB="45720" distL="114300" distR="114300" simplePos="0" relativeHeight="251807744" behindDoc="0" locked="0" layoutInCell="1" allowOverlap="1" wp14:anchorId="5D7DAA15" wp14:editId="2D990471">
+                      <wp:simplePos x="0" y="0"/>
+                      <wp:positionH relativeFrom="column">
+                        <wp:posOffset>9525</wp:posOffset>
+                      </wp:positionH>
+                      <wp:positionV relativeFrom="paragraph">
+                        <wp:posOffset>2155190</wp:posOffset>
+                      </wp:positionV>
+                      <wp:extent cx="962025" cy="1119883"/>
+                      <wp:effectExtent l="0" t="0" r="0" b="4445"/>
+                      <wp:wrapNone/>
+                      <wp:docPr id="1028324176" name="Text Box 2"/>
+                      <wp:cNvGraphicFramePr>
+                        <a:graphicFrameLocks xmlns:a="http://schemas.openxmlformats.org/drawingml/2006/main"/>
+                      </wp:cNvGraphicFramePr>
+                      <a:graphic xmlns:a="http://schemas.openxmlformats.org/drawingml/2006/main">
+                        <a:graphicData uri="http://schemas.microsoft.com/office/word/2010/wordprocessingShape">
+                          <wps:wsp>
+                            <wps:cNvSpPr txBox="1">
+                              <a:spLocks noChangeArrowheads="1"/>
+                            </wps:cNvSpPr>
+                            <wps:spPr bwMode="auto">
+                              <a:xfrm>
+                                <a:off x="0" y="0"/>
+                                <a:ext cx="962025" cy="1119883"/>
+                              </a:xfrm>
+                              <a:prstGeom prst="rect">
+                                <a:avLst/>
+                              </a:prstGeom>
+                              <a:noFill/>
+                              <a:ln w="9525">
+                                <a:noFill/>
+                                <a:miter lim="800000"/>
+                                <a:headEnd/>
+                                <a:tailEnd/>
+                              </a:ln>
+                            </wps:spPr>
+                            <wps:txbx>
+                              <w:txbxContent>
+                                <w:p>
+                                  <w:pPr>
+                                    <w:rPr>
+                                      <w:sz w:val="16"/>
+                                      <w:szCs w:val="16"/>
+                                      <w:lang w:val="en-GB"/>
+                                    </w:rPr>
+                                  </w:pPr>
+                                  <w:r>
+                                    <w:rPr>
+                                      <w:sz w:val="16"/>
+                                      <w:szCs w:val="16"/>
+                                      <w:lang w:val="en-GB"/>
+                                    </w:rPr>
+                                    <w:t>Officer notes section for additional non-public information related to the report</w:t>
+                                  </w:r>
+                                  <w:r>
+                                    <w:rPr>
+                                      <w:sz w:val="16"/>
+                                      <w:szCs w:val="16"/>
+                                      <w:lang w:val="en-GB"/>
+                                    </w:rPr>
+                                    <w:t xml:space="preserve"> </w:t>
+                                  </w:r>
+                                </w:p>
+                              </w:txbxContent>
+                            </wps:txbx>
+                            <wps:bodyPr rot="0" vert="horz" wrap="square" lIns="91440" tIns="45720" rIns="91440" bIns="45720" anchor="t" anchorCtr="0">
+                              <a:noAutofit/>
+                            </wps:bodyPr>
+                          </wps:wsp>
+                        </a:graphicData>
+                      </a:graphic>
+                      <wp14:sizeRelH relativeFrom="margin">
+                        <wp14:pctWidth>0</wp14:pctWidth>
+                      </wp14:sizeRelH>
+                      <wp14:sizeRelV relativeFrom="margin">
+                        <wp14:pctHeight>0</wp14:pctHeight>
+                      </wp14:sizeRelV>
+                    </wp:anchor>
+                  </w:drawing>
+                </mc:Choice>
+                <mc:Fallback>
+                  <w:pict>
+                    <v:shape w14:anchorId="5D7DAA15" id="_x0000_s1066" type="#_x0000_t202" style="position:absolute;left:0;text-align:left;margin-left:.75pt;margin-top:169.7pt;width:75.75pt;height:88.2pt;z-index:251807744;visibility:visible;mso-wrap-style:square;mso-width-percent:0;mso-height-percent:0;mso-wrap-distance-left:9pt;mso-wrap-distance-top:3.6pt;mso-wrap-distance-right:9pt;mso-wrap-distance-bottom:3.6pt;mso-position-horizontal:absolute;mso-position-horizontal-relative:text;mso-position-vertical:absolute;mso-position-vertical-relative:text;mso-width-percent:0;mso-height-percent:0;mso-width-relative:margin;mso-height-relative:margin;v-text-anchor:top" o:gfxdata="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" filled="f" stroked="f">
+                      <v:textbox>
+                        <w:txbxContent>
+                          <w:p>
+                            <w:pPr>
+                              <w:rPr>
+                                <w:sz w:val="16"/>
+                                <w:szCs w:val="16"/>
+                                <w:lang w:val="en-GB"/>
+                              </w:rPr>
+                            </w:pPr>
+                            <w:r>
+                              <w:rPr>
+                                <w:sz w:val="16"/>
+                                <w:szCs w:val="16"/>
+                                <w:lang w:val="en-GB"/>
+                              </w:rPr>
+                              <w:t>Officer notes section for additional non-public information related to the report</w:t>
+                            </w:r>
+                            <w:r>
+                              <w:rPr>
+                                <w:sz w:val="16"/>
+                                <w:szCs w:val="16"/>
+                                <w:lang w:val="en-GB"/>
+                              </w:rPr>
+                              <w:t xml:space="preserve"> </w:t>
+                            </w:r>
+                          </w:p>
+                        </w:txbxContent>
+                      </v:textbox>
+                    </v:shape>
+                  </w:pict>
+                </mc:Fallback>
+              </mc:AlternateContent>
+            </w:r>
+            <w:r>
+              <w:rPr>
+                <w:b/>
+                <w:bCs/>
+                <w:noProof/>
+                <w:sz w:val="18"/>
+                <w:szCs w:val="18"/>
+              </w:rPr>
+              <mc:AlternateContent>
+                <mc:Choice Requires="wps">
+                  <w:drawing>
+                    <wp:anchor distT="45720" distB="45720" distL="114300" distR="114300" simplePos="0" relativeHeight="251805696" behindDoc="0" locked="0" layoutInCell="1" allowOverlap="1" wp14:anchorId="23239E4D" wp14:editId="7762A2C0">
+                      <wp:simplePos x="0" y="0"/>
+                      <wp:positionH relativeFrom="column">
+                        <wp:posOffset>47625</wp:posOffset>
+                      </wp:positionH>
+                      <wp:positionV relativeFrom="paragraph">
+                        <wp:posOffset>154940</wp:posOffset>
+                      </wp:positionV>
+                      <wp:extent cx="962025" cy="1119883"/>
+                      <wp:effectExtent l="0" t="0" r="0" b="4445"/>
+                      <wp:wrapNone/>
+                      <wp:docPr id="980653435" name="Text Box 2"/>
+                      <wp:cNvGraphicFramePr>
+                        <a:graphicFrameLocks xmlns:a="http://schemas.openxmlformats.org/drawingml/2006/main"/>
+                      </wp:cNvGraphicFramePr>
+                      <a:graphic xmlns:a="http://schemas.openxmlformats.org/drawingml/2006/main">
+                        <a:graphicData uri="http://schemas.microsoft.com/office/word/2010/wordprocessingShape">
+                          <wps:wsp>
+                            <wps:cNvSpPr txBox="1">
+                              <a:spLocks noChangeArrowheads="1"/>
+                            </wps:cNvSpPr>
+                            <wps:spPr bwMode="auto">
+                              <a:xfrm>
+                                <a:off x="0" y="0"/>
+                                <a:ext cx="962025" cy="1119883"/>
+                              </a:xfrm>
+                              <a:prstGeom prst="rect">
+                                <a:avLst/>
+                              </a:prstGeom>
+                              <a:noFill/>
+                              <a:ln w="9525">
+                                <a:noFill/>
+                                <a:miter lim="800000"/>
+                                <a:headEnd/>
+                                <a:tailEnd/>
+                              </a:ln>
+                            </wps:spPr>
+                            <wps:txbx>
+                              <w:txbxContent>
+                                <w:p>
+                                  <w:pPr>
+                                    <w:rPr>
+                                      <w:sz w:val="16"/>
+                                      <w:szCs w:val="16"/>
+                                      <w:lang w:val="en-GB"/>
+                                    </w:rPr>
+                                  </w:pPr>
+                                  <w:r>
+                                    <w:rPr>
+                                      <w:sz w:val="16"/>
+                                      <w:szCs w:val="16"/>
+                                      <w:lang w:val="en-GB"/>
+                                    </w:rPr>
+                                    <w:t>Report summary containing information about the crime, as well as additional relevant details</w:t>
+                                  </w:r>
+                                  <w:r>
+                                    <w:rPr>
+                                      <w:sz w:val="16"/>
+                                      <w:szCs w:val="16"/>
+                                      <w:lang w:val="en-GB"/>
+                                    </w:rPr>
+                                    <w:t xml:space="preserve"> </w:t>
+                                  </w:r>
+                                </w:p>
+                              </w:txbxContent>
+                            </wps:txbx>
+                            <wps:bodyPr rot="0" vert="horz" wrap="square" lIns="91440" tIns="45720" rIns="91440" bIns="45720" anchor="t" anchorCtr="0">
+                              <a:noAutofit/>
+                            </wps:bodyPr>
+                          </wps:wsp>
+                        </a:graphicData>
+                      </a:graphic>
+                      <wp14:sizeRelH relativeFrom="margin">
+                        <wp14:pctWidth>0</wp14:pctWidth>
+                      </wp14:sizeRelH>
+                      <wp14:sizeRelV relativeFrom="margin">
+                        <wp14:pctHeight>0</wp14:pctHeight>
+                      </wp14:sizeRelV>
+                    </wp:anchor>
+                  </w:drawing>
+                </mc:Choice>
+                <mc:Fallback>
+                  <w:pict>
+                    <v:shape w14:anchorId="23239E4D" id="_x0000_s1067" type="#_x0000_t202" style="position:absolute;left:0;text-align:left;margin-left:3.75pt;margin-top:12.2pt;width:75.75pt;height:88.2pt;z-index:251805696;visibility:visible;mso-wrap-style:square;mso-width-percent:0;mso-height-percent:0;mso-wrap-distance-left:9pt;mso-wrap-distance-top:3.6pt;mso-wrap-distance-right:9pt;mso-wrap-distance-bottom:3.6pt;mso-position-horizontal:absolute;mso-position-horizontal-relative:text;mso-position-vertical:absolute;mso-position-vertical-relative:text;mso-width-percent:0;mso-height-percent:0;mso-width-relative:margin;mso-height-relative:margin;v-text-anchor:top" o:gfxdata="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" filled="f" stroked="f">
+                      <v:textbox>
+                        <w:txbxContent>
+                          <w:p>
+                            <w:pPr>
+                              <w:rPr>
+                                <w:sz w:val="16"/>
+                                <w:szCs w:val="16"/>
+                                <w:lang w:val="en-GB"/>
+                              </w:rPr>
+                            </w:pPr>
+                            <w:r>
+                              <w:rPr>
+                                <w:sz w:val="16"/>
+                                <w:szCs w:val="16"/>
+                                <w:lang w:val="en-GB"/>
+                              </w:rPr>
+                              <w:t>Report summary containing information about the crime, as well as additional relevant details</w:t>
+                            </w:r>
+                            <w:r>
+                              <w:rPr>
+                                <w:sz w:val="16"/>
+                                <w:szCs w:val="16"/>
+                                <w:lang w:val="en-GB"/>
+                              </w:rPr>
+                              <w:t xml:space="preserve"> </w:t>
+                            </w:r>
+                          </w:p>
+                        </w:txbxContent>
+                      </v:textbox>
+                    </v:shape>
+                  </w:pict>
+                </mc:Fallback>
+              </mc:AlternateContent>
+            </w:r>
+            <w:r>
+              <w:rPr>
+                <w:noProof/>
+                <w:sz w:val="18"/>
+                <w:szCs w:val="18"/>
+              </w:rPr>
+              <w:drawing>
+                <wp:inline distT="0" distB="0" distL="0" distR="0" wp14:anchorId="5334337C" wp14:editId="4EEFAB3E">
+                  <wp:extent cx="1815822" cy="3228129"/>
+                  <wp:effectExtent l="0" t="0" r="0" b="0"/>
+                  <wp:docPr id="878524832" name="Picture 71"/>
+                  <wp:cNvGraphicFramePr>
+                    <a:graphicFrameLocks xmlns:a="http://schemas.openxmlformats.org/drawingml/2006/main" noChangeAspect="1"/>
+                  </wp:cNvGraphicFramePr>
+                  <a:graphic xmlns:a="http://schemas.openxmlformats.org/drawingml/2006/main">
+                    <a:graphicData uri="http://schemas.openxmlformats.org/drawingml/2006/picture">
+                      <pic:pic xmlns:pic="http://schemas.openxmlformats.org/drawingml/2006/picture">
+                        <pic:nvPicPr>
+                          <pic:cNvPr id="0" name="Picture 5"/>
+                          <pic:cNvPicPr>
+                            <a:picLocks noChangeAspect="1" noChangeArrowheads="1"/>
+                          </pic:cNvPicPr>
+                        </pic:nvPicPr>
+                        <pic:blipFill>
+                          <a:blip r:embed="rId17" cstate="print">
+                            <a:extLst>
+                              <a:ext uri="{28A0092B-C50C-407E-A947-70E740481C1C}">
+                                <a14:useLocalDpi xmlns:a14="http://schemas.microsoft.com/office/drawing/2010/main" val="0"/>
+                              </a:ext>
+                            </a:extLst>
+                          </a:blip>
+                          <a:srcRect/>
+                          <a:stretch>
+                            <a:fillRect/>
+                          </a:stretch>
+                        </pic:blipFill>
+                        <pic:spPr bwMode="auto">
+                          <a:xfrm>
+                            <a:off x="0" y="0"/>
+                            <a:ext cx="1840186" cy="3271442"/>
+                          </a:xfrm>
+                          <a:prstGeom prst="rect">
+                            <a:avLst/>
+                          </a:prstGeom>
+                          <a:noFill/>
+                          <a:ln>
+                            <a:noFill/>
+                          </a:ln>
+                        </pic:spPr>
+                      </pic:pic>
+                    </a:graphicData>
+                  </a:graphic>
+                </wp:inline>
+              </w:drawing>
+            </w:r>
           </w:p>
         </w:tc>
         <w:tc>
@@ -8272,6 +10526,555 @@
                 <w:szCs w:val="18"/>
               </w:rPr>
             </w:pPr>
+            <w:r>
+              <w:rPr>
+                <w:b/>
+                <w:bCs/>
+                <w:sz w:val="18"/>
+                <w:szCs w:val="18"/>
+              </w:rPr>
+              <w:t>User Story 2</w:t>
+            </w:r>
+            <w:r>
+              <w:rPr>
+                <w:b/>
+                <w:bCs/>
+                <w:sz w:val="18"/>
+                <w:szCs w:val="18"/>
+              </w:rPr>
+              <w:t>6</w:t>
+            </w:r>
+            <w:r>
+              <w:rPr>
+                <w:sz w:val="18"/>
+                <w:szCs w:val="18"/>
+              </w:rPr>
+              <w:t xml:space="preserve"> </w:t>
+            </w:r>
+            <w:r>
+              <w:rPr>
+                <w:sz w:val="18"/>
+                <w:szCs w:val="18"/>
+              </w:rPr>
+              <w:t>- As</w:t>
+            </w:r>
+            <w:r>
+              <w:rPr>
+                <w:sz w:val="18"/>
+                <w:szCs w:val="18"/>
+              </w:rPr>
+              <w:t xml:space="preserve"> a public user, I want to filter the hotspot map by crime type so that I can see where specific incidents are occurring near me.</w:t>
+            </w:r>
+          </w:p>
+          <w:p>
+            <w:pPr>
+              <w:ind w:left="144" w:right="144"/>
+              <w:rPr>
+                <w:sz w:val="18"/>
+                <w:szCs w:val="18"/>
+              </w:rPr>
+            </w:pPr>
+            <w:r>
+              <w:rPr>
+                <w:b/>
+                <w:bCs/>
+                <w:sz w:val="18"/>
+                <w:szCs w:val="18"/>
+              </w:rPr>
+              <w:t>Author</w:t>
+            </w:r>
+            <w:r>
+              <w:rPr>
+                <w:sz w:val="18"/>
+                <w:szCs w:val="18"/>
+              </w:rPr>
+              <w:t>: Mitchell</w:t>
+            </w:r>
+          </w:p>
+          <w:p>
+            <w:pPr>
+              <w:ind w:left="144" w:right="144"/>
+              <w:rPr>
+                <w:sz w:val="18"/>
+                <w:szCs w:val="18"/>
+              </w:rPr>
+            </w:pPr>
+          </w:p>
+          <w:p>
+            <w:pPr>
+              <w:ind w:left="144" w:right="144"/>
+              <w:rPr>
+                <w:sz w:val="18"/>
+                <w:szCs w:val="18"/>
+              </w:rPr>
+            </w:pPr>
+          </w:p>
+          <w:p>
+            <w:pPr>
+              <w:ind w:left="144" w:right="144"/>
+              <w:jc w:val="center"/>
+              <w:rPr>
+                <w:sz w:val="18"/>
+                <w:szCs w:val="18"/>
+              </w:rPr>
+            </w:pPr>
+            <w:r>
+              <w:rPr>
+                <w:b/>
+                <w:bCs/>
+                <w:noProof/>
+                <w:sz w:val="18"/>
+                <w:szCs w:val="18"/>
+              </w:rPr>
+              <mc:AlternateContent>
+                <mc:Choice Requires="wps">
+                  <w:drawing>
+                    <wp:anchor distT="0" distB="0" distL="114300" distR="114300" simplePos="0" relativeHeight="251838464" behindDoc="0" locked="0" layoutInCell="1" allowOverlap="1" wp14:anchorId="01506E23" wp14:editId="03C41773">
+                      <wp:simplePos x="0" y="0"/>
+                      <wp:positionH relativeFrom="column">
+                        <wp:posOffset>2514600</wp:posOffset>
+                      </wp:positionH>
+                      <wp:positionV relativeFrom="paragraph">
+                        <wp:posOffset>1378584</wp:posOffset>
+                      </wp:positionV>
+                      <wp:extent cx="781050" cy="295275"/>
+                      <wp:effectExtent l="38100" t="38100" r="19050" b="28575"/>
+                      <wp:wrapNone/>
+                      <wp:docPr id="2048442055" name="Straight Arrow Connector 6"/>
+                      <wp:cNvGraphicFramePr/>
+                      <a:graphic xmlns:a="http://schemas.openxmlformats.org/drawingml/2006/main">
+                        <a:graphicData uri="http://schemas.microsoft.com/office/word/2010/wordprocessingShape">
+                          <wps:wsp>
+                            <wps:cNvCnPr/>
+                            <wps:spPr>
+                              <a:xfrm flipH="1" flipV="1">
+                                <a:off x="0" y="0"/>
+                                <a:ext cx="781050" cy="295275"/>
+                              </a:xfrm>
+                              <a:prstGeom prst="straightConnector1">
+                                <a:avLst/>
+                              </a:prstGeom>
+                              <a:ln>
+                                <a:solidFill>
+                                  <a:srgbClr val="EE0000"/>
+                                </a:solidFill>
+                                <a:tailEnd type="triangle"/>
+                              </a:ln>
+                            </wps:spPr>
+                            <wps:style>
+                              <a:lnRef idx="2">
+                                <a:schemeClr val="accent1"/>
+                              </a:lnRef>
+                              <a:fillRef idx="0">
+                                <a:schemeClr val="accent1"/>
+                              </a:fillRef>
+                              <a:effectRef idx="1">
+                                <a:schemeClr val="accent1"/>
+                              </a:effectRef>
+                              <a:fontRef idx="minor">
+                                <a:schemeClr val="tx1"/>
+                              </a:fontRef>
+                            </wps:style>
+                            <wps:bodyPr/>
+                          </wps:wsp>
+                        </a:graphicData>
+                      </a:graphic>
+                      <wp14:sizeRelH relativeFrom="margin">
+                        <wp14:pctWidth>0</wp14:pctWidth>
+                      </wp14:sizeRelH>
+                      <wp14:sizeRelV relativeFrom="margin">
+                        <wp14:pctHeight>0</wp14:pctHeight>
+                      </wp14:sizeRelV>
+                    </wp:anchor>
+                  </w:drawing>
+                </mc:Choice>
+                <mc:Fallback>
+                  <w:pict>
+                    <v:shape w14:anchorId="4C90474D" id="Straight Arrow Connector 6" o:spid="_x0000_s1026" type="#_x0000_t32" style="position:absolute;margin-left:198pt;margin-top:108.55pt;width:61.5pt;height:23.25pt;flip:x y;z-index:251838464;visibility:visible;mso-wrap-style:square;mso-width-percent:0;mso-height-percent:0;mso-wrap-distance-left:9pt;mso-wrap-distance-top:0;mso-wrap-distance-right:9pt;mso-wrap-distance-bottom:0;mso-position-horizontal:absolute;mso-position-horizontal-relative:text;mso-position-vertical:absolute;mso-position-vertical-relative:text;mso-width-percent:0;mso-height-percent:0;mso-width-relative:margin;mso-height-relative:margin" o:gfxdata="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" strokecolor="#e00" strokeweight="1.5pt">
+                      <v:stroke endarrow="block" joinstyle="miter"/>
+                    </v:shape>
+                  </w:pict>
+                </mc:Fallback>
+              </mc:AlternateContent>
+            </w:r>
+            <w:r>
+              <w:rPr>
+                <w:b/>
+                <w:bCs/>
+                <w:noProof/>
+                <w:sz w:val="18"/>
+                <w:szCs w:val="18"/>
+              </w:rPr>
+              <mc:AlternateContent>
+                <mc:Choice Requires="wps">
+                  <w:drawing>
+                    <wp:anchor distT="0" distB="0" distL="114300" distR="114300" simplePos="0" relativeHeight="251836416" behindDoc="0" locked="0" layoutInCell="1" allowOverlap="1" wp14:anchorId="6FAD8D92" wp14:editId="0DFEA731">
+                      <wp:simplePos x="0" y="0"/>
+                      <wp:positionH relativeFrom="column">
+                        <wp:posOffset>819149</wp:posOffset>
+                      </wp:positionH>
+                      <wp:positionV relativeFrom="paragraph">
+                        <wp:posOffset>2178685</wp:posOffset>
+                      </wp:positionV>
+                      <wp:extent cx="352425" cy="443230"/>
+                      <wp:effectExtent l="0" t="0" r="66675" b="52070"/>
+                      <wp:wrapNone/>
+                      <wp:docPr id="1287043191" name="Straight Arrow Connector 6"/>
+                      <wp:cNvGraphicFramePr/>
+                      <a:graphic xmlns:a="http://schemas.openxmlformats.org/drawingml/2006/main">
+                        <a:graphicData uri="http://schemas.microsoft.com/office/word/2010/wordprocessingShape">
+                          <wps:wsp>
+                            <wps:cNvCnPr/>
+                            <wps:spPr>
+                              <a:xfrm>
+                                <a:off x="0" y="0"/>
+                                <a:ext cx="352425" cy="443230"/>
+                              </a:xfrm>
+                              <a:prstGeom prst="straightConnector1">
+                                <a:avLst/>
+                              </a:prstGeom>
+                              <a:ln>
+                                <a:solidFill>
+                                  <a:srgbClr val="EE0000"/>
+                                </a:solidFill>
+                                <a:tailEnd type="triangle"/>
+                              </a:ln>
+                            </wps:spPr>
+                            <wps:style>
+                              <a:lnRef idx="2">
+                                <a:schemeClr val="accent1"/>
+                              </a:lnRef>
+                              <a:fillRef idx="0">
+                                <a:schemeClr val="accent1"/>
+                              </a:fillRef>
+                              <a:effectRef idx="1">
+                                <a:schemeClr val="accent1"/>
+                              </a:effectRef>
+                              <a:fontRef idx="minor">
+                                <a:schemeClr val="tx1"/>
+                              </a:fontRef>
+                            </wps:style>
+                            <wps:bodyPr/>
+                          </wps:wsp>
+                        </a:graphicData>
+                      </a:graphic>
+                      <wp14:sizeRelH relativeFrom="margin">
+                        <wp14:pctWidth>0</wp14:pctWidth>
+                      </wp14:sizeRelH>
+                      <wp14:sizeRelV relativeFrom="margin">
+                        <wp14:pctHeight>0</wp14:pctHeight>
+                      </wp14:sizeRelV>
+                    </wp:anchor>
+                  </w:drawing>
+                </mc:Choice>
+                <mc:Fallback>
+                  <w:pict>
+                    <v:shape w14:anchorId="5B640027" id="Straight Arrow Connector 6" o:spid="_x0000_s1026" type="#_x0000_t32" style="position:absolute;margin-left:64.5pt;margin-top:171.55pt;width:27.75pt;height:34.9pt;z-index:251836416;visibility:visible;mso-wrap-style:square;mso-width-percent:0;mso-height-percent:0;mso-wrap-distance-left:9pt;mso-wrap-distance-top:0;mso-wrap-distance-right:9pt;mso-wrap-distance-bottom:0;mso-position-horizontal:absolute;mso-position-horizontal-relative:text;mso-position-vertical:absolute;mso-position-vertical-relative:text;mso-width-percent:0;mso-height-percent:0;mso-width-relative:margin;mso-height-relative:margin" o:gfxdata="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" strokecolor="#e00" strokeweight="1.5pt">
+                      <v:stroke endarrow="block" joinstyle="miter"/>
+                    </v:shape>
+                  </w:pict>
+                </mc:Fallback>
+              </mc:AlternateContent>
+            </w:r>
+            <w:r>
+              <w:rPr>
+                <w:b/>
+                <w:bCs/>
+                <w:noProof/>
+                <w:sz w:val="18"/>
+                <w:szCs w:val="18"/>
+              </w:rPr>
+              <mc:AlternateContent>
+                <mc:Choice Requires="wps">
+                  <w:drawing>
+                    <wp:anchor distT="45720" distB="45720" distL="114300" distR="114300" simplePos="0" relativeHeight="251834368" behindDoc="0" locked="0" layoutInCell="1" allowOverlap="1" wp14:anchorId="669A78C5" wp14:editId="017EA562">
+                      <wp:simplePos x="0" y="0"/>
+                      <wp:positionH relativeFrom="column">
+                        <wp:posOffset>2924175</wp:posOffset>
+                      </wp:positionH>
+                      <wp:positionV relativeFrom="paragraph">
+                        <wp:posOffset>764540</wp:posOffset>
+                      </wp:positionV>
+                      <wp:extent cx="962025" cy="1119883"/>
+                      <wp:effectExtent l="0" t="0" r="0" b="4445"/>
+                      <wp:wrapNone/>
+                      <wp:docPr id="838362691" name="Text Box 2"/>
+                      <wp:cNvGraphicFramePr>
+                        <a:graphicFrameLocks xmlns:a="http://schemas.openxmlformats.org/drawingml/2006/main"/>
+                      </wp:cNvGraphicFramePr>
+                      <a:graphic xmlns:a="http://schemas.openxmlformats.org/drawingml/2006/main">
+                        <a:graphicData uri="http://schemas.microsoft.com/office/word/2010/wordprocessingShape">
+                          <wps:wsp>
+                            <wps:cNvSpPr txBox="1">
+                              <a:spLocks noChangeArrowheads="1"/>
+                            </wps:cNvSpPr>
+                            <wps:spPr bwMode="auto">
+                              <a:xfrm>
+                                <a:off x="0" y="0"/>
+                                <a:ext cx="962025" cy="1119883"/>
+                              </a:xfrm>
+                              <a:prstGeom prst="rect">
+                                <a:avLst/>
+                              </a:prstGeom>
+                              <a:noFill/>
+                              <a:ln w="9525">
+                                <a:noFill/>
+                                <a:miter lim="800000"/>
+                                <a:headEnd/>
+                                <a:tailEnd/>
+                              </a:ln>
+                            </wps:spPr>
+                            <wps:txbx>
+                              <w:txbxContent>
+                                <w:p>
+                                  <w:pPr>
+                                    <w:rPr>
+                                      <w:sz w:val="16"/>
+                                      <w:szCs w:val="16"/>
+                                      <w:lang w:val="en-GB"/>
+                                    </w:rPr>
+                                  </w:pPr>
+                                  <w:r>
+                                    <w:rPr>
+                                      <w:sz w:val="16"/>
+                                      <w:szCs w:val="16"/>
+                                      <w:lang w:val="en-GB"/>
+                                    </w:rPr>
+                                    <w:t>Map displaying location of hotspots for selected crime types</w:t>
+                                  </w:r>
+                                </w:p>
+                                <w:p>
+                                  <w:pPr>
+                                    <w:rPr>
+                                      <w:sz w:val="16"/>
+                                      <w:szCs w:val="16"/>
+                                      <w:lang w:val="en-GB"/>
+                                    </w:rPr>
+                                  </w:pPr>
+                                </w:p>
+                              </w:txbxContent>
+                            </wps:txbx>
+                            <wps:bodyPr rot="0" vert="horz" wrap="square" lIns="91440" tIns="45720" rIns="91440" bIns="45720" anchor="t" anchorCtr="0">
+                              <a:noAutofit/>
+                            </wps:bodyPr>
+                          </wps:wsp>
+                        </a:graphicData>
+                      </a:graphic>
+                      <wp14:sizeRelH relativeFrom="margin">
+                        <wp14:pctWidth>0</wp14:pctWidth>
+                      </wp14:sizeRelH>
+                      <wp14:sizeRelV relativeFrom="margin">
+                        <wp14:pctHeight>0</wp14:pctHeight>
+                      </wp14:sizeRelV>
+                    </wp:anchor>
+                  </w:drawing>
+                </mc:Choice>
+                <mc:Fallback>
+                  <w:pict>
+                    <v:shape w14:anchorId="669A78C5" id="_x0000_s1068" type="#_x0000_t202" style="position:absolute;left:0;text-align:left;margin-left:230.25pt;margin-top:60.2pt;width:75.75pt;height:88.2pt;z-index:251834368;visibility:visible;mso-wrap-style:square;mso-width-percent:0;mso-height-percent:0;mso-wrap-distance-left:9pt;mso-wrap-distance-top:3.6pt;mso-wrap-distance-right:9pt;mso-wrap-distance-bottom:3.6pt;mso-position-horizontal:absolute;mso-position-horizontal-relative:text;mso-position-vertical:absolute;mso-position-vertical-relative:text;mso-width-percent:0;mso-height-percent:0;mso-width-relative:margin;mso-height-relative:margin;v-text-anchor:top" o:gfxdata="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" filled="f" stroked="f">
+                      <v:textbox>
+                        <w:txbxContent>
+                          <w:p>
+                            <w:pPr>
+                              <w:rPr>
+                                <w:sz w:val="16"/>
+                                <w:szCs w:val="16"/>
+                                <w:lang w:val="en-GB"/>
+                              </w:rPr>
+                            </w:pPr>
+                            <w:r>
+                              <w:rPr>
+                                <w:sz w:val="16"/>
+                                <w:szCs w:val="16"/>
+                                <w:lang w:val="en-GB"/>
+                              </w:rPr>
+                              <w:t>Map displaying location of hotspots for selected crime types</w:t>
+                            </w:r>
+                          </w:p>
+                          <w:p>
+                            <w:pPr>
+                              <w:rPr>
+                                <w:sz w:val="16"/>
+                                <w:szCs w:val="16"/>
+                                <w:lang w:val="en-GB"/>
+                              </w:rPr>
+                            </w:pPr>
+                          </w:p>
+                        </w:txbxContent>
+                      </v:textbox>
+                    </v:shape>
+                  </w:pict>
+                </mc:Fallback>
+              </mc:AlternateContent>
+            </w:r>
+            <w:r>
+              <w:rPr>
+                <w:b/>
+                <w:bCs/>
+                <w:noProof/>
+                <w:sz w:val="18"/>
+                <w:szCs w:val="18"/>
+              </w:rPr>
+              <mc:AlternateContent>
+                <mc:Choice Requires="wps">
+                  <w:drawing>
+                    <wp:anchor distT="45720" distB="45720" distL="114300" distR="114300" simplePos="0" relativeHeight="251832320" behindDoc="0" locked="0" layoutInCell="1" allowOverlap="1" wp14:anchorId="2EFA9464" wp14:editId="472BAE8C">
+                      <wp:simplePos x="0" y="0"/>
+                      <wp:positionH relativeFrom="column">
+                        <wp:posOffset>-95250</wp:posOffset>
+                      </wp:positionH>
+                      <wp:positionV relativeFrom="paragraph">
+                        <wp:posOffset>2012315</wp:posOffset>
+                      </wp:positionV>
+                      <wp:extent cx="962025" cy="1119883"/>
+                      <wp:effectExtent l="0" t="0" r="0" b="4445"/>
+                      <wp:wrapNone/>
+                      <wp:docPr id="1893129378" name="Text Box 2"/>
+                      <wp:cNvGraphicFramePr>
+                        <a:graphicFrameLocks xmlns:a="http://schemas.openxmlformats.org/drawingml/2006/main"/>
+                      </wp:cNvGraphicFramePr>
+                      <a:graphic xmlns:a="http://schemas.openxmlformats.org/drawingml/2006/main">
+                        <a:graphicData uri="http://schemas.microsoft.com/office/word/2010/wordprocessingShape">
+                          <wps:wsp>
+                            <wps:cNvSpPr txBox="1">
+                              <a:spLocks noChangeArrowheads="1"/>
+                            </wps:cNvSpPr>
+                            <wps:spPr bwMode="auto">
+                              <a:xfrm>
+                                <a:off x="0" y="0"/>
+                                <a:ext cx="962025" cy="1119883"/>
+                              </a:xfrm>
+                              <a:prstGeom prst="rect">
+                                <a:avLst/>
+                              </a:prstGeom>
+                              <a:noFill/>
+                              <a:ln w="9525">
+                                <a:noFill/>
+                                <a:miter lim="800000"/>
+                                <a:headEnd/>
+                                <a:tailEnd/>
+                              </a:ln>
+                            </wps:spPr>
+                            <wps:txbx>
+                              <w:txbxContent>
+                                <w:p>
+                                  <w:pPr>
+                                    <w:rPr>
+                                      <w:sz w:val="16"/>
+                                      <w:szCs w:val="16"/>
+                                      <w:lang w:val="en-GB"/>
+                                    </w:rPr>
+                                  </w:pPr>
+                                  <w:r>
+                                    <w:rPr>
+                                      <w:sz w:val="16"/>
+                                      <w:szCs w:val="16"/>
+                                      <w:lang w:val="en-GB"/>
+                                    </w:rPr>
+                                    <w:t>Filter for different types of reported crimes</w:t>
+                                  </w:r>
+                                </w:p>
+                              </w:txbxContent>
+                            </wps:txbx>
+                            <wps:bodyPr rot="0" vert="horz" wrap="square" lIns="91440" tIns="45720" rIns="91440" bIns="45720" anchor="t" anchorCtr="0">
+                              <a:noAutofit/>
+                            </wps:bodyPr>
+                          </wps:wsp>
+                        </a:graphicData>
+                      </a:graphic>
+                      <wp14:sizeRelH relativeFrom="margin">
+                        <wp14:pctWidth>0</wp14:pctWidth>
+                      </wp14:sizeRelH>
+                      <wp14:sizeRelV relativeFrom="margin">
+                        <wp14:pctHeight>0</wp14:pctHeight>
+                      </wp14:sizeRelV>
+                    </wp:anchor>
+                  </w:drawing>
+                </mc:Choice>
+                <mc:Fallback>
+                  <w:pict>
+                    <v:shape w14:anchorId="2EFA9464" id="_x0000_s1069" type="#_x0000_t202" style="position:absolute;left:0;text-align:left;margin-left:-7.5pt;margin-top:158.45pt;width:75.75pt;height:88.2pt;z-index:251832320;visibility:visible;mso-wrap-style:square;mso-width-percent:0;mso-height-percent:0;mso-wrap-distance-left:9pt;mso-wrap-distance-top:3.6pt;mso-wrap-distance-right:9pt;mso-wrap-distance-bottom:3.6pt;mso-position-horizontal:absolute;mso-position-horizontal-relative:text;mso-position-vertical:absolute;mso-position-vertical-relative:text;mso-width-percent:0;mso-height-percent:0;mso-width-relative:margin;mso-height-relative:margin;v-text-anchor:top" o:gfxdata="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" filled="f" stroked="f">
+                      <v:textbox>
+                        <w:txbxContent>
+                          <w:p>
+                            <w:pPr>
+                              <w:rPr>
+                                <w:sz w:val="16"/>
+                                <w:szCs w:val="16"/>
+                                <w:lang w:val="en-GB"/>
+                              </w:rPr>
+                            </w:pPr>
+                            <w:r>
+                              <w:rPr>
+                                <w:sz w:val="16"/>
+                                <w:szCs w:val="16"/>
+                                <w:lang w:val="en-GB"/>
+                              </w:rPr>
+                              <w:t>Filter for different types of reported crimes</w:t>
+                            </w:r>
+                          </w:p>
+                        </w:txbxContent>
+                      </v:textbox>
+                    </v:shape>
+                  </w:pict>
+                </mc:Fallback>
+              </mc:AlternateContent>
+            </w:r>
+            <w:r>
+              <w:rPr>
+                <w:noProof/>
+                <w:sz w:val="18"/>
+                <w:szCs w:val="18"/>
+              </w:rPr>
+              <w:drawing>
+                <wp:inline distT="0" distB="0" distL="0" distR="0" wp14:anchorId="59BA8250" wp14:editId="25B2DF24">
+                  <wp:extent cx="1845945" cy="3281680"/>
+                  <wp:effectExtent l="0" t="0" r="1905" b="0"/>
+                  <wp:docPr id="1646869391" name="Picture 74"/>
+                  <wp:cNvGraphicFramePr>
+                    <a:graphicFrameLocks xmlns:a="http://schemas.openxmlformats.org/drawingml/2006/main" noChangeAspect="1"/>
+                  </wp:cNvGraphicFramePr>
+                  <a:graphic xmlns:a="http://schemas.openxmlformats.org/drawingml/2006/main">
+                    <a:graphicData uri="http://schemas.openxmlformats.org/drawingml/2006/picture">
+                      <pic:pic xmlns:pic="http://schemas.openxmlformats.org/drawingml/2006/picture">
+                        <pic:nvPicPr>
+                          <pic:cNvPr id="0" name="Picture 8"/>
+                          <pic:cNvPicPr>
+                            <a:picLocks noChangeAspect="1" noChangeArrowheads="1"/>
+                          </pic:cNvPicPr>
+                        </pic:nvPicPr>
+                        <pic:blipFill>
+                          <a:blip r:embed="rId18" cstate="print">
+                            <a:extLst>
+                              <a:ext uri="{28A0092B-C50C-407E-A947-70E740481C1C}">
+                                <a14:useLocalDpi xmlns:a14="http://schemas.microsoft.com/office/drawing/2010/main" val="0"/>
+                              </a:ext>
+                            </a:extLst>
+                          </a:blip>
+                          <a:srcRect/>
+                          <a:stretch>
+                            <a:fillRect/>
+                          </a:stretch>
+                        </pic:blipFill>
+                        <pic:spPr bwMode="auto">
+                          <a:xfrm>
+                            <a:off x="0" y="0"/>
+                            <a:ext cx="1855560" cy="3298773"/>
+                          </a:xfrm>
+                          <a:prstGeom prst="rect">
+                            <a:avLst/>
+                          </a:prstGeom>
+                          <a:noFill/>
+                          <a:ln>
+                            <a:noFill/>
+                          </a:ln>
+                        </pic:spPr>
+                      </pic:pic>
+                    </a:graphicData>
+                  </a:graphic>
+                </wp:inline>
+              </w:drawing>
+            </w:r>
           </w:p>
         </w:tc>
       </w:tr>
@@ -8327,6 +11130,570 @@
                 <w:szCs w:val="18"/>
               </w:rPr>
             </w:pPr>
+            <w:r>
+              <w:rPr>
+                <w:b/>
+                <w:bCs/>
+                <w:sz w:val="18"/>
+                <w:szCs w:val="18"/>
+              </w:rPr>
+              <w:lastRenderedPageBreak/>
+              <w:t>User Story 2</w:t>
+            </w:r>
+            <w:r>
+              <w:rPr>
+                <w:b/>
+                <w:bCs/>
+                <w:sz w:val="18"/>
+                <w:szCs w:val="18"/>
+              </w:rPr>
+              <w:t>7</w:t>
+            </w:r>
+            <w:r>
+              <w:rPr>
+                <w:sz w:val="18"/>
+                <w:szCs w:val="18"/>
+              </w:rPr>
+              <w:t xml:space="preserve"> </w:t>
+            </w:r>
+            <w:r>
+              <w:rPr>
+                <w:sz w:val="18"/>
+                <w:szCs w:val="18"/>
+              </w:rPr>
+              <w:t>- As</w:t>
+            </w:r>
+            <w:r>
+              <w:rPr>
+                <w:sz w:val="18"/>
+                <w:szCs w:val="18"/>
+              </w:rPr>
+              <w:t xml:space="preserve"> a user, I want to register a new account so that I can access the app.</w:t>
+            </w:r>
+          </w:p>
+          <w:p>
+            <w:pPr>
+              <w:ind w:left="144" w:right="144"/>
+              <w:rPr>
+                <w:sz w:val="18"/>
+                <w:szCs w:val="18"/>
+              </w:rPr>
+            </w:pPr>
+            <w:r>
+              <w:rPr>
+                <w:b/>
+                <w:bCs/>
+                <w:sz w:val="18"/>
+                <w:szCs w:val="18"/>
+              </w:rPr>
+              <w:t>Author</w:t>
+            </w:r>
+            <w:r>
+              <w:rPr>
+                <w:sz w:val="18"/>
+                <w:szCs w:val="18"/>
+              </w:rPr>
+              <w:t>: Mitchell</w:t>
+            </w:r>
+          </w:p>
+          <w:p>
+            <w:pPr>
+              <w:ind w:left="144" w:right="144"/>
+              <w:rPr>
+                <w:sz w:val="18"/>
+                <w:szCs w:val="18"/>
+              </w:rPr>
+            </w:pPr>
+          </w:p>
+          <w:p>
+            <w:pPr>
+              <w:ind w:left="144" w:right="144"/>
+              <w:rPr>
+                <w:sz w:val="18"/>
+                <w:szCs w:val="18"/>
+              </w:rPr>
+            </w:pPr>
+          </w:p>
+          <w:p>
+            <w:pPr>
+              <w:ind w:left="144" w:right="144"/>
+              <w:jc w:val="center"/>
+              <w:rPr>
+                <w:sz w:val="18"/>
+                <w:szCs w:val="18"/>
+              </w:rPr>
+            </w:pPr>
+            <w:r>
+              <w:rPr>
+                <w:b/>
+                <w:bCs/>
+                <w:noProof/>
+                <w:sz w:val="18"/>
+                <w:szCs w:val="18"/>
+              </w:rPr>
+              <mc:AlternateContent>
+                <mc:Choice Requires="wps">
+                  <w:drawing>
+                    <wp:anchor distT="0" distB="0" distL="114300" distR="114300" simplePos="0" relativeHeight="251846656" behindDoc="0" locked="0" layoutInCell="1" allowOverlap="1" wp14:anchorId="3D873256" wp14:editId="665B91BC">
+                      <wp:simplePos x="0" y="0"/>
+                      <wp:positionH relativeFrom="column">
+                        <wp:posOffset>695324</wp:posOffset>
+                      </wp:positionH>
+                      <wp:positionV relativeFrom="paragraph">
+                        <wp:posOffset>2578734</wp:posOffset>
+                      </wp:positionV>
+                      <wp:extent cx="704850" cy="104775"/>
+                      <wp:effectExtent l="0" t="0" r="76200" b="85725"/>
+                      <wp:wrapNone/>
+                      <wp:docPr id="2114864486" name="Straight Arrow Connector 6"/>
+                      <wp:cNvGraphicFramePr/>
+                      <a:graphic xmlns:a="http://schemas.openxmlformats.org/drawingml/2006/main">
+                        <a:graphicData uri="http://schemas.microsoft.com/office/word/2010/wordprocessingShape">
+                          <wps:wsp>
+                            <wps:cNvCnPr/>
+                            <wps:spPr>
+                              <a:xfrm>
+                                <a:off x="0" y="0"/>
+                                <a:ext cx="704850" cy="104775"/>
+                              </a:xfrm>
+                              <a:prstGeom prst="straightConnector1">
+                                <a:avLst/>
+                              </a:prstGeom>
+                              <a:ln>
+                                <a:solidFill>
+                                  <a:srgbClr val="EE0000"/>
+                                </a:solidFill>
+                                <a:tailEnd type="triangle"/>
+                              </a:ln>
+                            </wps:spPr>
+                            <wps:style>
+                              <a:lnRef idx="2">
+                                <a:schemeClr val="accent1"/>
+                              </a:lnRef>
+                              <a:fillRef idx="0">
+                                <a:schemeClr val="accent1"/>
+                              </a:fillRef>
+                              <a:effectRef idx="1">
+                                <a:schemeClr val="accent1"/>
+                              </a:effectRef>
+                              <a:fontRef idx="minor">
+                                <a:schemeClr val="tx1"/>
+                              </a:fontRef>
+                            </wps:style>
+                            <wps:bodyPr/>
+                          </wps:wsp>
+                        </a:graphicData>
+                      </a:graphic>
+                      <wp14:sizeRelH relativeFrom="margin">
+                        <wp14:pctWidth>0</wp14:pctWidth>
+                      </wp14:sizeRelH>
+                      <wp14:sizeRelV relativeFrom="margin">
+                        <wp14:pctHeight>0</wp14:pctHeight>
+                      </wp14:sizeRelV>
+                    </wp:anchor>
+                  </w:drawing>
+                </mc:Choice>
+                <mc:Fallback>
+                  <w:pict>
+                    <v:shape w14:anchorId="2EF4532F" id="Straight Arrow Connector 6" o:spid="_x0000_s1026" type="#_x0000_t32" style="position:absolute;margin-left:54.75pt;margin-top:203.05pt;width:55.5pt;height:8.25pt;z-index:251846656;visibility:visible;mso-wrap-style:square;mso-width-percent:0;mso-height-percent:0;mso-wrap-distance-left:9pt;mso-wrap-distance-top:0;mso-wrap-distance-right:9pt;mso-wrap-distance-bottom:0;mso-position-horizontal:absolute;mso-position-horizontal-relative:text;mso-position-vertical:absolute;mso-position-vertical-relative:text;mso-width-percent:0;mso-height-percent:0;mso-width-relative:margin;mso-height-relative:margin" o:gfxdata="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" strokecolor="#e00" strokeweight="1.5pt">
+                      <v:stroke endarrow="block" joinstyle="miter"/>
+                    </v:shape>
+                  </w:pict>
+                </mc:Fallback>
+              </mc:AlternateContent>
+            </w:r>
+            <w:r>
+              <w:rPr>
+                <w:b/>
+                <w:bCs/>
+                <w:noProof/>
+                <w:sz w:val="18"/>
+                <w:szCs w:val="18"/>
+              </w:rPr>
+              <mc:AlternateContent>
+                <mc:Choice Requires="wps">
+                  <w:drawing>
+                    <wp:anchor distT="0" distB="0" distL="114300" distR="114300" simplePos="0" relativeHeight="251844608" behindDoc="0" locked="0" layoutInCell="1" allowOverlap="1" wp14:anchorId="22EBB3BB" wp14:editId="322CF92E">
+                      <wp:simplePos x="0" y="0"/>
+                      <wp:positionH relativeFrom="column">
+                        <wp:posOffset>542924</wp:posOffset>
+                      </wp:positionH>
+                      <wp:positionV relativeFrom="paragraph">
+                        <wp:posOffset>349884</wp:posOffset>
+                      </wp:positionV>
+                      <wp:extent cx="504825" cy="371475"/>
+                      <wp:effectExtent l="0" t="0" r="47625" b="47625"/>
+                      <wp:wrapNone/>
+                      <wp:docPr id="1726135917" name="Straight Arrow Connector 6"/>
+                      <wp:cNvGraphicFramePr/>
+                      <a:graphic xmlns:a="http://schemas.openxmlformats.org/drawingml/2006/main">
+                        <a:graphicData uri="http://schemas.microsoft.com/office/word/2010/wordprocessingShape">
+                          <wps:wsp>
+                            <wps:cNvCnPr/>
+                            <wps:spPr>
+                              <a:xfrm>
+                                <a:off x="0" y="0"/>
+                                <a:ext cx="504825" cy="371475"/>
+                              </a:xfrm>
+                              <a:prstGeom prst="straightConnector1">
+                                <a:avLst/>
+                              </a:prstGeom>
+                              <a:ln>
+                                <a:solidFill>
+                                  <a:srgbClr val="EE0000"/>
+                                </a:solidFill>
+                                <a:tailEnd type="triangle"/>
+                              </a:ln>
+                            </wps:spPr>
+                            <wps:style>
+                              <a:lnRef idx="2">
+                                <a:schemeClr val="accent1"/>
+                              </a:lnRef>
+                              <a:fillRef idx="0">
+                                <a:schemeClr val="accent1"/>
+                              </a:fillRef>
+                              <a:effectRef idx="1">
+                                <a:schemeClr val="accent1"/>
+                              </a:effectRef>
+                              <a:fontRef idx="minor">
+                                <a:schemeClr val="tx1"/>
+                              </a:fontRef>
+                            </wps:style>
+                            <wps:bodyPr/>
+                          </wps:wsp>
+                        </a:graphicData>
+                      </a:graphic>
+                      <wp14:sizeRelH relativeFrom="margin">
+                        <wp14:pctWidth>0</wp14:pctWidth>
+                      </wp14:sizeRelH>
+                      <wp14:sizeRelV relativeFrom="margin">
+                        <wp14:pctHeight>0</wp14:pctHeight>
+                      </wp14:sizeRelV>
+                    </wp:anchor>
+                  </w:drawing>
+                </mc:Choice>
+                <mc:Fallback>
+                  <w:pict>
+                    <v:shape w14:anchorId="17DD39CB" id="Straight Arrow Connector 6" o:spid="_x0000_s1026" type="#_x0000_t32" style="position:absolute;margin-left:42.75pt;margin-top:27.55pt;width:39.75pt;height:29.25pt;z-index:251844608;visibility:visible;mso-wrap-style:square;mso-width-percent:0;mso-height-percent:0;mso-wrap-distance-left:9pt;mso-wrap-distance-top:0;mso-wrap-distance-right:9pt;mso-wrap-distance-bottom:0;mso-position-horizontal:absolute;mso-position-horizontal-relative:text;mso-position-vertical:absolute;mso-position-vertical-relative:text;mso-width-percent:0;mso-height-percent:0;mso-width-relative:margin;mso-height-relative:margin" o:gfxdata="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" strokecolor="#e00" strokeweight="1.5pt">
+                      <v:stroke endarrow="block" joinstyle="miter"/>
+                    </v:shape>
+                  </w:pict>
+                </mc:Fallback>
+              </mc:AlternateContent>
+            </w:r>
+            <w:r>
+              <w:rPr>
+                <w:b/>
+                <w:bCs/>
+                <w:noProof/>
+                <w:sz w:val="18"/>
+                <w:szCs w:val="18"/>
+              </w:rPr>
+              <mc:AlternateContent>
+                <mc:Choice Requires="wps">
+                  <w:drawing>
+                    <wp:anchor distT="45720" distB="45720" distL="114300" distR="114300" simplePos="0" relativeHeight="251842560" behindDoc="0" locked="0" layoutInCell="1" allowOverlap="1" wp14:anchorId="2556DB88" wp14:editId="795355DF">
+                      <wp:simplePos x="0" y="0"/>
+                      <wp:positionH relativeFrom="column">
+                        <wp:posOffset>0</wp:posOffset>
+                      </wp:positionH>
+                      <wp:positionV relativeFrom="paragraph">
+                        <wp:posOffset>2326640</wp:posOffset>
+                      </wp:positionV>
+                      <wp:extent cx="962025" cy="1119883"/>
+                      <wp:effectExtent l="0" t="0" r="0" b="4445"/>
+                      <wp:wrapNone/>
+                      <wp:docPr id="2004284942" name="Text Box 2"/>
+                      <wp:cNvGraphicFramePr>
+                        <a:graphicFrameLocks xmlns:a="http://schemas.openxmlformats.org/drawingml/2006/main"/>
+                      </wp:cNvGraphicFramePr>
+                      <a:graphic xmlns:a="http://schemas.openxmlformats.org/drawingml/2006/main">
+                        <a:graphicData uri="http://schemas.microsoft.com/office/word/2010/wordprocessingShape">
+                          <wps:wsp>
+                            <wps:cNvSpPr txBox="1">
+                              <a:spLocks noChangeArrowheads="1"/>
+                            </wps:cNvSpPr>
+                            <wps:spPr bwMode="auto">
+                              <a:xfrm>
+                                <a:off x="0" y="0"/>
+                                <a:ext cx="962025" cy="1119883"/>
+                              </a:xfrm>
+                              <a:prstGeom prst="rect">
+                                <a:avLst/>
+                              </a:prstGeom>
+                              <a:noFill/>
+                              <a:ln w="9525">
+                                <a:noFill/>
+                                <a:miter lim="800000"/>
+                                <a:headEnd/>
+                                <a:tailEnd/>
+                              </a:ln>
+                            </wps:spPr>
+                            <wps:txbx>
+                              <w:txbxContent>
+                                <w:p>
+                                  <w:pPr>
+                                    <w:rPr>
+                                      <w:sz w:val="16"/>
+                                      <w:szCs w:val="16"/>
+                                      <w:lang w:val="en-GB"/>
+                                    </w:rPr>
+                                  </w:pPr>
+                                  <w:r>
+                                    <w:rPr>
+                                      <w:sz w:val="16"/>
+                                      <w:szCs w:val="16"/>
+                                      <w:lang w:val="en-GB"/>
+                                    </w:rPr>
+                                    <w:t>Confirm and create user</w:t>
+                                  </w:r>
+                                  <w:r>
+                                    <w:rPr>
+                                      <w:sz w:val="16"/>
+                                      <w:szCs w:val="16"/>
+                                      <w:lang w:val="en-GB"/>
+                                    </w:rPr>
+                                    <w:t xml:space="preserve"> </w:t>
+                                  </w:r>
+                                </w:p>
+                              </w:txbxContent>
+                            </wps:txbx>
+                            <wps:bodyPr rot="0" vert="horz" wrap="square" lIns="91440" tIns="45720" rIns="91440" bIns="45720" anchor="t" anchorCtr="0">
+                              <a:noAutofit/>
+                            </wps:bodyPr>
+                          </wps:wsp>
+                        </a:graphicData>
+                      </a:graphic>
+                      <wp14:sizeRelH relativeFrom="margin">
+                        <wp14:pctWidth>0</wp14:pctWidth>
+                      </wp14:sizeRelH>
+                      <wp14:sizeRelV relativeFrom="margin">
+                        <wp14:pctHeight>0</wp14:pctHeight>
+                      </wp14:sizeRelV>
+                    </wp:anchor>
+                  </w:drawing>
+                </mc:Choice>
+                <mc:Fallback>
+                  <w:pict>
+                    <v:shape w14:anchorId="2556DB88" id="_x0000_s1070" type="#_x0000_t202" style="position:absolute;left:0;text-align:left;margin-left:0;margin-top:183.2pt;width:75.75pt;height:88.2pt;z-index:251842560;visibility:visible;mso-wrap-style:square;mso-width-percent:0;mso-height-percent:0;mso-wrap-distance-left:9pt;mso-wrap-distance-top:3.6pt;mso-wrap-distance-right:9pt;mso-wrap-distance-bottom:3.6pt;mso-position-horizontal:absolute;mso-position-horizontal-relative:text;mso-position-vertical:absolute;mso-position-vertical-relative:text;mso-width-percent:0;mso-height-percent:0;mso-width-relative:margin;mso-height-relative:margin;v-text-anchor:top" o:gfxdata="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" filled="f" stroked="f">
+                      <v:textbox>
+                        <w:txbxContent>
+                          <w:p>
+                            <w:pPr>
+                              <w:rPr>
+                                <w:sz w:val="16"/>
+                                <w:szCs w:val="16"/>
+                                <w:lang w:val="en-GB"/>
+                              </w:rPr>
+                            </w:pPr>
+                            <w:r>
+                              <w:rPr>
+                                <w:sz w:val="16"/>
+                                <w:szCs w:val="16"/>
+                                <w:lang w:val="en-GB"/>
+                              </w:rPr>
+                              <w:t>Confirm and create user</w:t>
+                            </w:r>
+                            <w:r>
+                              <w:rPr>
+                                <w:sz w:val="16"/>
+                                <w:szCs w:val="16"/>
+                                <w:lang w:val="en-GB"/>
+                              </w:rPr>
+                              <w:t xml:space="preserve"> </w:t>
+                            </w:r>
+                          </w:p>
+                        </w:txbxContent>
+                      </v:textbox>
+                    </v:shape>
+                  </w:pict>
+                </mc:Fallback>
+              </mc:AlternateContent>
+            </w:r>
+            <w:r>
+              <w:rPr>
+                <w:b/>
+                <w:bCs/>
+                <w:noProof/>
+                <w:sz w:val="18"/>
+                <w:szCs w:val="18"/>
+              </w:rPr>
+              <mc:AlternateContent>
+                <mc:Choice Requires="wps">
+                  <w:drawing>
+                    <wp:anchor distT="45720" distB="45720" distL="114300" distR="114300" simplePos="0" relativeHeight="251840512" behindDoc="0" locked="0" layoutInCell="1" allowOverlap="1" wp14:anchorId="07699BC8" wp14:editId="798A010C">
+                      <wp:simplePos x="0" y="0"/>
+                      <wp:positionH relativeFrom="column">
+                        <wp:posOffset>0</wp:posOffset>
+                      </wp:positionH>
+                      <wp:positionV relativeFrom="paragraph">
+                        <wp:posOffset>50165</wp:posOffset>
+                      </wp:positionV>
+                      <wp:extent cx="962025" cy="1119883"/>
+                      <wp:effectExtent l="0" t="0" r="0" b="4445"/>
+                      <wp:wrapNone/>
+                      <wp:docPr id="1035000398" name="Text Box 2"/>
+                      <wp:cNvGraphicFramePr>
+                        <a:graphicFrameLocks xmlns:a="http://schemas.openxmlformats.org/drawingml/2006/main"/>
+                      </wp:cNvGraphicFramePr>
+                      <a:graphic xmlns:a="http://schemas.openxmlformats.org/drawingml/2006/main">
+                        <a:graphicData uri="http://schemas.microsoft.com/office/word/2010/wordprocessingShape">
+                          <wps:wsp>
+                            <wps:cNvSpPr txBox="1">
+                              <a:spLocks noChangeArrowheads="1"/>
+                            </wps:cNvSpPr>
+                            <wps:spPr bwMode="auto">
+                              <a:xfrm>
+                                <a:off x="0" y="0"/>
+                                <a:ext cx="962025" cy="1119883"/>
+                              </a:xfrm>
+                              <a:prstGeom prst="rect">
+                                <a:avLst/>
+                              </a:prstGeom>
+                              <a:noFill/>
+                              <a:ln w="9525">
+                                <a:noFill/>
+                                <a:miter lim="800000"/>
+                                <a:headEnd/>
+                                <a:tailEnd/>
+                              </a:ln>
+                            </wps:spPr>
+                            <wps:txbx>
+                              <w:txbxContent>
+                                <w:p>
+                                  <w:pPr>
+                                    <w:rPr>
+                                      <w:sz w:val="16"/>
+                                      <w:szCs w:val="16"/>
+                                      <w:lang w:val="en-GB"/>
+                                    </w:rPr>
+                                  </w:pPr>
+                                  <w:r>
+                                    <w:rPr>
+                                      <w:sz w:val="16"/>
+                                      <w:szCs w:val="16"/>
+                                      <w:lang w:val="en-GB"/>
+                                    </w:rPr>
+                                    <w:t>New user details entry</w:t>
+                                  </w:r>
+                                  <w:r>
+                                    <w:rPr>
+                                      <w:sz w:val="16"/>
+                                      <w:szCs w:val="16"/>
+                                      <w:lang w:val="en-GB"/>
+                                    </w:rPr>
+                                    <w:t xml:space="preserve"> </w:t>
+                                  </w:r>
+                                </w:p>
+                              </w:txbxContent>
+                            </wps:txbx>
+                            <wps:bodyPr rot="0" vert="horz" wrap="square" lIns="91440" tIns="45720" rIns="91440" bIns="45720" anchor="t" anchorCtr="0">
+                              <a:noAutofit/>
+                            </wps:bodyPr>
+                          </wps:wsp>
+                        </a:graphicData>
+                      </a:graphic>
+                      <wp14:sizeRelH relativeFrom="margin">
+                        <wp14:pctWidth>0</wp14:pctWidth>
+                      </wp14:sizeRelH>
+                      <wp14:sizeRelV relativeFrom="margin">
+                        <wp14:pctHeight>0</wp14:pctHeight>
+                      </wp14:sizeRelV>
+                    </wp:anchor>
+                  </w:drawing>
+                </mc:Choice>
+                <mc:Fallback>
+                  <w:pict>
+                    <v:shape w14:anchorId="07699BC8" id="_x0000_s1071" type="#_x0000_t202" style="position:absolute;left:0;text-align:left;margin-left:0;margin-top:3.95pt;width:75.75pt;height:88.2pt;z-index:251840512;visibility:visible;mso-wrap-style:square;mso-width-percent:0;mso-height-percent:0;mso-wrap-distance-left:9pt;mso-wrap-distance-top:3.6pt;mso-wrap-distance-right:9pt;mso-wrap-distance-bottom:3.6pt;mso-position-horizontal:absolute;mso-position-horizontal-relative:text;mso-position-vertical:absolute;mso-position-vertical-relative:text;mso-width-percent:0;mso-height-percent:0;mso-width-relative:margin;mso-height-relative:margin;v-text-anchor:top" o:gfxdata="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" filled="f" stroked="f">
+                      <v:textbox>
+                        <w:txbxContent>
+                          <w:p>
+                            <w:pPr>
+                              <w:rPr>
+                                <w:sz w:val="16"/>
+                                <w:szCs w:val="16"/>
+                                <w:lang w:val="en-GB"/>
+                              </w:rPr>
+                            </w:pPr>
+                            <w:r>
+                              <w:rPr>
+                                <w:sz w:val="16"/>
+                                <w:szCs w:val="16"/>
+                                <w:lang w:val="en-GB"/>
+                              </w:rPr>
+                              <w:t>New user details entry</w:t>
+                            </w:r>
+                            <w:r>
+                              <w:rPr>
+                                <w:sz w:val="16"/>
+                                <w:szCs w:val="16"/>
+                                <w:lang w:val="en-GB"/>
+                              </w:rPr>
+                              <w:t xml:space="preserve"> </w:t>
+                            </w:r>
+                          </w:p>
+                        </w:txbxContent>
+                      </v:textbox>
+                    </v:shape>
+                  </w:pict>
+                </mc:Fallback>
+              </mc:AlternateContent>
+            </w:r>
+            <w:r>
+              <w:rPr>
+                <w:noProof/>
+                <w:sz w:val="18"/>
+                <w:szCs w:val="18"/>
+              </w:rPr>
+              <w:drawing>
+                <wp:inline distT="0" distB="0" distL="0" distR="0" wp14:anchorId="3A98B00D" wp14:editId="6C737DED">
+                  <wp:extent cx="1805583" cy="3209925"/>
+                  <wp:effectExtent l="0" t="0" r="4445" b="0"/>
+                  <wp:docPr id="853928530" name="Picture 75"/>
+                  <wp:cNvGraphicFramePr>
+                    <a:graphicFrameLocks xmlns:a="http://schemas.openxmlformats.org/drawingml/2006/main" noChangeAspect="1"/>
+                  </wp:cNvGraphicFramePr>
+                  <a:graphic xmlns:a="http://schemas.openxmlformats.org/drawingml/2006/main">
+                    <a:graphicData uri="http://schemas.openxmlformats.org/drawingml/2006/picture">
+                      <pic:pic xmlns:pic="http://schemas.openxmlformats.org/drawingml/2006/picture">
+                        <pic:nvPicPr>
+                          <pic:cNvPr id="0" name="Picture 9"/>
+                          <pic:cNvPicPr>
+                            <a:picLocks noChangeAspect="1" noChangeArrowheads="1"/>
+                          </pic:cNvPicPr>
+                        </pic:nvPicPr>
+                        <pic:blipFill>
+                          <a:blip r:embed="rId19" cstate="print">
+                            <a:extLst>
+                              <a:ext uri="{28A0092B-C50C-407E-A947-70E740481C1C}">
+                                <a14:useLocalDpi xmlns:a14="http://schemas.microsoft.com/office/drawing/2010/main" val="0"/>
+                              </a:ext>
+                            </a:extLst>
+                          </a:blip>
+                          <a:srcRect/>
+                          <a:stretch>
+                            <a:fillRect/>
+                          </a:stretch>
+                        </pic:blipFill>
+                        <pic:spPr bwMode="auto">
+                          <a:xfrm>
+                            <a:off x="0" y="0"/>
+                            <a:ext cx="1816792" cy="3229852"/>
+                          </a:xfrm>
+                          <a:prstGeom prst="rect">
+                            <a:avLst/>
+                          </a:prstGeom>
+                          <a:noFill/>
+                          <a:ln>
+                            <a:noFill/>
+                          </a:ln>
+                        </pic:spPr>
+                      </pic:pic>
+                    </a:graphicData>
+                  </a:graphic>
+                </wp:inline>
+              </w:drawing>
+            </w:r>
           </w:p>
         </w:tc>
         <w:tc>
@@ -10039,6 +13406,7 @@
   <w:style w:type="character" w:default="1" w:styleId="DefaultParagraphFont">
     <w:name w:val="Default Paragraph Font"/>
     <w:uiPriority w:val="1"/>
+    <w:semiHidden/>
     <w:unhideWhenUsed/>
   </w:style>
   <w:style w:type="table" w:default="1" w:styleId="TableNormal">

</xml_diff>